<commit_message>
docs(report): mise a jour des rapports PFE docx et pdf
</commit_message>
<xml_diff>
--- a/Rapport-PFE/finalreport/Rapport_PFE_Haythem_Bargaoui_beta.docx
+++ b/Rapport-PFE/finalreport/Rapport_PFE_Haythem_Bargaoui_beta.docx
@@ -1787,7 +1787,7 @@
       <w:r>
         <w:t>4.4 Tests</w:t>
         <w:tab/>
-        <w:t>53</w:t>
+        <w:t>58</w:t>
       </w:r>
     </w:p>
     <w:p>
@@ -1805,7 +1805,7 @@
       <w:r>
         <w:t>4.4.1 Tests unitaires (JUnit 5 / Mockito)</w:t>
         <w:tab/>
-        <w:t>53</w:t>
+        <w:t>58</w:t>
       </w:r>
     </w:p>
     <w:p>
@@ -1823,7 +1823,7 @@
       <w:r>
         <w:t>4.4.2 Tests fonctionnels manuels</w:t>
         <w:tab/>
-        <w:t>54</w:t>
+        <w:t>58</w:t>
       </w:r>
     </w:p>
     <w:p>
@@ -1841,7 +1841,7 @@
       <w:r>
         <w:t>4.4.3 Tests des API avec Postman et Swagger</w:t>
         <w:tab/>
-        <w:t>55</w:t>
+        <w:t>60</w:t>
       </w:r>
     </w:p>
     <w:p>
@@ -1859,7 +1859,7 @@
       <w:r>
         <w:t>4.4.4 Vérification de bout en bout</w:t>
         <w:tab/>
-        <w:t>56</w:t>
+        <w:t>60</w:t>
       </w:r>
     </w:p>
     <w:p>
@@ -1877,7 +1877,7 @@
       <w:r>
         <w:t>4.5 Difficultés rencontrées et solutions apportées</w:t>
         <w:tab/>
-        <w:t>56</w:t>
+        <w:t>60</w:t>
       </w:r>
     </w:p>
     <w:p>
@@ -1895,7 +1895,7 @@
       <w:r>
         <w:t>4.5.1 Notification incomplète des managers</w:t>
         <w:tab/>
-        <w:t>56</w:t>
+        <w:t>60</w:t>
       </w:r>
     </w:p>
     <w:p>
@@ -1913,7 +1913,7 @@
       <w:r>
         <w:t>4.5.2 Distinguer un rejet RH d’un rejet manager</w:t>
         <w:tab/>
-        <w:t>56</w:t>
+        <w:t>61</w:t>
       </w:r>
     </w:p>
     <w:p>
@@ -1931,7 +1931,7 @@
       <w:r>
         <w:t>4.5.3 Cohérence des transitions de statut</w:t>
         <w:tab/>
-        <w:t>56</w:t>
+        <w:t>61</w:t>
       </w:r>
     </w:p>
     <w:p>
@@ -1949,7 +1949,7 @@
       <w:r>
         <w:t>4.5.4 Filtrage incomplet des routes de lecture pour les managers</w:t>
         <w:tab/>
-        <w:t>57</w:t>
+        <w:t>61</w:t>
       </w:r>
     </w:p>
     <w:p>
@@ -1967,7 +1967,7 @@
       <w:r>
         <w:t>4.5.5 Solliciter le manager au bon moment du processus</w:t>
         <w:tab/>
-        <w:t>57</w:t>
+        <w:t>61</w:t>
       </w:r>
     </w:p>
     <w:p>
@@ -1985,7 +1985,7 @@
       <w:r>
         <w:t>4.5.6 Pertinence du matching Job idéal</w:t>
         <w:tab/>
-        <w:t>57</w:t>
+        <w:t>62</w:t>
       </w:r>
     </w:p>
     <w:p>
@@ -2003,7 +2003,7 @@
       <w:r>
         <w:t>4.5.7 Traitement distinct des candidatures retirées</w:t>
         <w:tab/>
-        <w:t>57</w:t>
+        <w:t>62</w:t>
       </w:r>
     </w:p>
     <w:p>
@@ -2021,7 +2021,7 @@
       <w:r>
         <w:t>4.5.8 Entretien téléphonique RH obligatoire avant acceptation</w:t>
         <w:tab/>
-        <w:t>58</w:t>
+        <w:t>62</w:t>
       </w:r>
     </w:p>
     <w:p>
@@ -2039,7 +2039,7 @@
       <w:r>
         <w:t>4.5.9 Découplage entre planification d’entretien et statut du candidat</w:t>
         <w:tab/>
-        <w:t>58</w:t>
+        <w:t>62</w:t>
       </w:r>
     </w:p>
     <w:p>
@@ -2057,7 +2057,7 @@
       <w:r>
         <w:t>4.5.10 Fiabiliser l’intégration Google Meet et le format des webhooks n8n</w:t>
         <w:tab/>
-        <w:t>58</w:t>
+        <w:t>63</w:t>
       </w:r>
     </w:p>
     <w:p>
@@ -2075,7 +2075,7 @@
       <w:r>
         <w:t>4.5.11 Cloisonnement des données dans le chatbot candidat</w:t>
         <w:tab/>
-        <w:t>58</w:t>
+        <w:t>63</w:t>
       </w:r>
     </w:p>
     <w:p>
@@ -2093,7 +2093,7 @@
       <w:r>
         <w:t>4.6 Protection des données et éthique de l’IA</w:t>
         <w:tab/>
-        <w:t>59</w:t>
+        <w:t>63</w:t>
       </w:r>
     </w:p>
     <w:p>
@@ -2111,7 +2111,7 @@
       <w:r>
         <w:t>4.7 Bilan des fonctionnalités réalisées</w:t>
         <w:tab/>
-        <w:t>60</w:t>
+        <w:t>65</w:t>
       </w:r>
     </w:p>
     <w:p>
@@ -2129,7 +2129,7 @@
       <w:r>
         <w:t>4.8 Conclusion</w:t>
         <w:tab/>
-        <w:t>61</w:t>
+        <w:t>66</w:t>
       </w:r>
     </w:p>
     <w:p>
@@ -2147,7 +2147,7 @@
       <w:r>
         <w:t>Conclusion Générale et Perspectives</w:t>
         <w:tab/>
-        <w:t>62</w:t>
+        <w:t>67</w:t>
       </w:r>
     </w:p>
     <w:p>
@@ -2165,7 +2165,7 @@
       <w:r>
         <w:t>Bibliographie</w:t>
         <w:tab/>
-        <w:t>63</w:t>
+        <w:t>68</w:t>
       </w:r>
     </w:p>
     <w:p>
@@ -2183,7 +2183,7 @@
       <w:r>
         <w:t>Glossaire</w:t>
         <w:tab/>
-        <w:t>65</w:t>
+        <w:t>70</w:t>
       </w:r>
     </w:p>
     <w:p>
@@ -2477,7 +2477,7 @@
       <w:r>
         <w:t>Figure 4.3 : Gestion des offres d’emploi (espace RH)</w:t>
         <w:tab/>
-        <w:t>45</w:t>
+        <w:t>46</w:t>
       </w:r>
     </w:p>
     <w:p>
@@ -2501,7 +2501,7 @@
       <w:r>
         <w:t>Figure 4.5 : Modification d’un dossier candidat</w:t>
         <w:tab/>
-        <w:t>46</w:t>
+        <w:t>47</w:t>
       </w:r>
     </w:p>
     <w:p>
@@ -2513,7 +2513,7 @@
       <w:r>
         <w:t>Figure 4.6 : Tableau Kanban du pipeline de recrutement</w:t>
         <w:tab/>
-        <w:t>47</w:t>
+        <w:t>48</w:t>
       </w:r>
     </w:p>
     <w:p>
@@ -2525,7 +2525,7 @@
       <w:r>
         <w:t>Figure 4.7 : Gestion des entretiens</w:t>
         <w:tab/>
-        <w:t>47</w:t>
+        <w:t>48</w:t>
       </w:r>
     </w:p>
     <w:p>
@@ -2537,7 +2537,7 @@
       <w:r>
         <w:t>Figure 4.8 : Gestion des feedbacks</w:t>
         <w:tab/>
-        <w:t>48</w:t>
+        <w:t>49</w:t>
       </w:r>
     </w:p>
     <w:p>
@@ -2549,7 +2549,7 @@
       <w:r>
         <w:t>Figure 4.9 : Gestion des utilisateurs et des rôles (espace Administrateur)</w:t>
         <w:tab/>
-        <w:t>48</w:t>
+        <w:t>49</w:t>
       </w:r>
     </w:p>
     <w:p>
@@ -2561,7 +2561,7 @@
       <w:r>
         <w:t>Figure 4.10 : Paramétrage du scoring IA par famille de métier</w:t>
         <w:tab/>
-        <w:t>49</w:t>
+        <w:t>50</w:t>
       </w:r>
     </w:p>
     <w:p>
@@ -2573,7 +2573,7 @@
       <w:r>
         <w:t>Figure 4.11 : Journal d’audit</w:t>
         <w:tab/>
-        <w:t>49</w:t>
+        <w:t>50</w:t>
       </w:r>
     </w:p>
     <w:p>
@@ -2585,7 +2585,7 @@
       <w:r>
         <w:t>Figure 4.12 : Assistant conversationnel candidat (chatbot)</w:t>
         <w:tab/>
-        <w:t>50</w:t>
+        <w:t>51</w:t>
       </w:r>
     </w:p>
     <w:p>
@@ -2597,7 +2597,7 @@
       <w:r>
         <w:t>Figure 4.13 : Soumission d’une candidature avec dépôt de CV</w:t>
         <w:tab/>
-        <w:t>51</w:t>
+        <w:t>52</w:t>
       </w:r>
     </w:p>
     <w:p>
@@ -2609,7 +2609,7 @@
       <w:r>
         <w:t xml:space="preserve">Figure 4.14 : Fonctionnalité « Job idéal » — suggestions d’offres selon le CV</w:t>
         <w:tab/>
-        <w:t>52</w:t>
+        <w:t>53</w:t>
       </w:r>
     </w:p>
     <w:p>
@@ -2621,7 +2621,7 @@
       <w:r>
         <w:t>Figure 4.15 : Analyse détaillée d’une candidature par intelligence artificielle</w:t>
         <w:tab/>
-        <w:t>52</w:t>
+        <w:t>54</w:t>
       </w:r>
     </w:p>
     <w:p>
@@ -2633,19 +2633,8 @@
       <w:r>
         <w:t>Figure 4.16 : Espace Manager — candidatures relevant du périmètre du manager</w:t>
         <w:tab/>
-        <w:t>53</w:t>
-      </w:r>
-    </w:p>
-    <w:p>
-      <w:pPr>
-        <w:pStyle w:val="Titre1"/>
-        <w:pageBreakBefore/>
-      </w:pPr>
-      <w:bookmarkStart w:id="2" w:name="_Toc240315692"/>
-      <w:r>
-        <w:t>Liste des tableaux</w:t>
-      </w:r>
-      <w:bookmarkEnd w:id="2"/>
+        <w:t>55</w:t>
+      </w:r>
     </w:p>
     <w:p>
       <w:pPr>
@@ -2654,6 +2643,65 @@
         </w:tabs>
       </w:pPr>
       <w:r>
+        <w:t>Figure 4.17  : Espace Manager — page « Mon calendrier », entretiens et rappels</w:t>
+        <w:tab/>
+        <w:t>56</w:t>
+      </w:r>
+    </w:p>
+    <w:p>
+      <w:pPr>
+        <w:tabs>
+          <w:tab w:val="right" w:leader="dot" w:pos="9066"/>
+        </w:tabs>
+      </w:pPr>
+      <w:r>
+        <w:t>Figure 4.18  : Console n8n — les trois flux d’automatisation publiés et leurs statistiques</w:t>
+        <w:tab/>
+        <w:t>56</w:t>
+      </w:r>
+    </w:p>
+    <w:p>
+      <w:pPr>
+        <w:tabs>
+          <w:tab w:val="right" w:leader="dot" w:pos="9066"/>
+        </w:tabs>
+      </w:pPr>
+      <w:r>
+        <w:t>Figure 4.19 : Flux n8n de l’Agent 1 — webhook de candidature, appel du scoring Cohere puis e-mail au candidat</w:t>
+        <w:tab/>
+        <w:t>57</w:t>
+      </w:r>
+    </w:p>
+    <w:p>
+      <w:pPr>
+        <w:tabs>
+          <w:tab w:val="right" w:leader="dot" w:pos="9066"/>
+        </w:tabs>
+      </w:pPr>
+      <w:r>
+        <w:t>Figure 4.20 : E-mail automatique de confirmation de candidature reçu par le candidat</w:t>
+        <w:tab/>
+        <w:t>57</w:t>
+      </w:r>
+    </w:p>
+    <w:p>
+      <w:pPr>
+        <w:pStyle w:val="Titre1"/>
+        <w:pageBreakBefore/>
+      </w:pPr>
+      <w:bookmarkStart w:id="2" w:name="_Toc240315692"/>
+      <w:r>
+        <w:t>Liste des tableaux</w:t>
+      </w:r>
+      <w:bookmarkEnd w:id="2"/>
+    </w:p>
+    <w:p>
+      <w:pPr>
+        <w:tabs>
+          <w:tab w:val="right" w:leader="dot" w:pos="9066"/>
+        </w:tabs>
+      </w:pPr>
+      <w:r>
         <w:t xml:space="preserve">Tableau 1.1 : Macro-planification des phases du projet</w:t>
         <w:tab/>
         <w:t>16</w:t>
@@ -2704,7 +2752,7 @@
       <w:r>
         <w:t>Tableau 4.1 : Synthèse des tests fonctionnels réalisés</w:t>
         <w:tab/>
-        <w:t>54</w:t>
+        <w:t>59</w:t>
       </w:r>
     </w:p>
     <w:p>
@@ -2716,7 +2764,7 @@
       <w:r>
         <w:t>Tableau 4.2 : Bilan des fonctionnalités réalisées</w:t>
         <w:tab/>
-        <w:t>60</w:t>
+        <w:t>65</w:t>
       </w:r>
     </w:p>
     <w:p>
@@ -7082,7 +7130,7 @@
           <w:noProof/>
         </w:rPr>
         <w:pict w14:anchorId="650581FA">
-          <v:shape id="Image 13" o:spid="_x0000_i1040" type="#_x0000_t75" style="width:420pt;height:249.6pt;visibility:visible;mso-wrap-style:square">
+          <v:shape id="Image 13" o:spid="_x0000_i1040" type="#_x0000_t75" style="width:425.0pt;height:299.4pt;visibility:visible;mso-wrap-style:square">
             <v:imagedata r:id="rId26" o:title=""/>
           </v:shape>
         </w:pict>
@@ -7119,7 +7167,7 @@
           <w:noProof/>
         </w:rPr>
         <w:pict w14:anchorId="5BF0AF37">
-          <v:shape id="Image 14" o:spid="_x0000_i1041" type="#_x0000_t75" style="width:349.8pt;height:207.6pt;visibility:visible;mso-wrap-style:square">
+          <v:shape id="Image 14" o:spid="_x0000_i1041" type="#_x0000_t75" style="width:235.3pt;height:470.0pt;visibility:visible;mso-wrap-style:square">
             <v:imagedata r:id="rId27" o:title=""/>
           </v:shape>
         </w:pict>
@@ -7156,7 +7204,7 @@
           <w:noProof/>
         </w:rPr>
         <w:pict w14:anchorId="1EEBD083">
-          <v:shape id="Image 15" o:spid="_x0000_i1042" type="#_x0000_t75" style="width:420pt;height:249.6pt;visibility:visible;mso-wrap-style:square">
+          <v:shape id="Image 15" o:spid="_x0000_i1042" type="#_x0000_t75" style="width:425.0pt;height:236.5pt;visibility:visible;mso-wrap-style:square">
             <v:imagedata r:id="rId28" o:title=""/>
           </v:shape>
         </w:pict>
@@ -7230,7 +7278,7 @@
           <w:noProof/>
         </w:rPr>
         <w:pict w14:anchorId="0B44AC1E">
-          <v:shape id="Image 17" o:spid="_x0000_i1044" type="#_x0000_t75" style="width:420pt;height:249.6pt;visibility:visible;mso-wrap-style:square">
+          <v:shape id="Image 17" o:spid="_x0000_i1044" type="#_x0000_t75" style="width:275.2pt;height:470.0pt;visibility:visible;mso-wrap-style:square">
             <v:imagedata r:id="rId30" o:title=""/>
           </v:shape>
         </w:pict>
@@ -7267,7 +7315,7 @@
           <w:noProof/>
         </w:rPr>
         <w:pict w14:anchorId="3DE79FED">
-          <v:shape id="Image 18" o:spid="_x0000_i1045" type="#_x0000_t75" style="width:420pt;height:249.6pt;visibility:visible;mso-wrap-style:square">
+          <v:shape id="Image 18" o:spid="_x0000_i1045" type="#_x0000_t75" style="width:425.0pt;height:264.5pt;visibility:visible;mso-wrap-style:square">
             <v:imagedata r:id="rId31" o:title=""/>
           </v:shape>
         </w:pict>
@@ -7304,7 +7352,7 @@
           <w:noProof/>
         </w:rPr>
         <w:pict w14:anchorId="61C2271E">
-          <v:shape id="Image 19" o:spid="_x0000_i1046" type="#_x0000_t75" style="width:420pt;height:249.6pt;visibility:visible;mso-wrap-style:square">
+          <v:shape id="Image 19" o:spid="_x0000_i1046" type="#_x0000_t75" style="width:425.0pt;height:244.0pt;visibility:visible;mso-wrap-style:square">
             <v:imagedata r:id="rId32" o:title=""/>
           </v:shape>
         </w:pict>
@@ -7341,7 +7389,7 @@
           <w:noProof/>
         </w:rPr>
         <w:pict w14:anchorId="4A63A72C">
-          <v:shape id="Image 20" o:spid="_x0000_i1047" type="#_x0000_t75" style="width:420pt;height:249.6pt;visibility:visible;mso-wrap-style:square">
+          <v:shape id="Image 20" o:spid="_x0000_i1047" type="#_x0000_t75" style="width:425.0pt;height:235.5pt;visibility:visible;mso-wrap-style:square">
             <v:imagedata r:id="rId33" o:title=""/>
           </v:shape>
         </w:pict>
@@ -7378,7 +7426,7 @@
           <w:noProof/>
         </w:rPr>
         <w:pict w14:anchorId="1C64D113">
-          <v:shape id="Image 21" o:spid="_x0000_i1048" type="#_x0000_t75" style="width:420pt;height:249.6pt;visibility:visible;mso-wrap-style:square">
+          <v:shape id="Image 21" o:spid="_x0000_i1048" type="#_x0000_t75" style="width:425.0pt;height:240.2pt;visibility:visible;mso-wrap-style:square">
             <v:imagedata r:id="rId34" o:title=""/>
           </v:shape>
         </w:pict>
@@ -7415,7 +7463,7 @@
           <w:noProof/>
         </w:rPr>
         <w:pict w14:anchorId="30680820">
-          <v:shape id="Image 22" o:spid="_x0000_i1049" type="#_x0000_t75" style="width:420pt;height:249.6pt;visibility:visible;mso-wrap-style:square">
+          <v:shape id="Image 22" o:spid="_x0000_i1049" type="#_x0000_t75" style="width:425.0pt;height:278.5pt;visibility:visible;mso-wrap-style:square">
             <v:imagedata r:id="rId35" o:title=""/>
           </v:shape>
         </w:pict>
@@ -7452,7 +7500,7 @@
           <w:noProof/>
         </w:rPr>
         <w:pict w14:anchorId="66625CE5">
-          <v:shape id="Image 23" o:spid="_x0000_i1050" type="#_x0000_t75" style="width:420pt;height:249.6pt;visibility:visible;mso-wrap-style:square">
+          <v:shape id="Image 23" o:spid="_x0000_i1050" type="#_x0000_t75" style="width:425.0pt;height:245.2pt;visibility:visible;mso-wrap-style:square">
             <v:imagedata r:id="rId36" o:title=""/>
           </v:shape>
         </w:pict>
@@ -7532,7 +7580,7 @@
           <w:noProof/>
         </w:rPr>
         <w:pict w14:anchorId="65301F00">
-          <v:shape id="Picture 8" o:spid="_x0000_i1051" type="#_x0000_t75" style="visibility:visible;mso-wrap-style:square;width:388.3pt;height:455.0pt;visibility:visible">
+          <v:shape id="Picture 8" o:spid="_x0000_i1051" type="#_x0000_t75" style="visibility:visible;mso-wrap-style:square;width:317.6pt;height:470.0pt;visibility:visible">
             <v:imagedata r:id="rId37" o:title=""/>
           </v:shape>
         </w:pict>
@@ -7606,7 +7654,7 @@
           <w:noProof/>
         </w:rPr>
         <w:pict w14:anchorId="6E2178D7">
-          <v:shape id="Picture 9" o:spid="_x0000_i1053" type="#_x0000_t75" style="visibility:visible;mso-wrap-style:square;width:314.1pt;height:368.0pt;visibility:visible">
+          <v:shape id="Picture 9" o:spid="_x0000_i1053" type="#_x0000_t75" style="visibility:visible;mso-wrap-style:square;width:284.2pt;height:470.0pt;visibility:visible">
             <v:imagedata r:id="rId39" o:title=""/>
           </v:shape>
         </w:pict>
@@ -7643,7 +7691,7 @@
           <w:noProof/>
         </w:rPr>
         <w:pict w14:anchorId="1ABB31E4">
-          <v:shape id="Picture 7" o:spid="_x0000_i1054" type="#_x0000_t75" style="width:424.8pt;height:191.4pt;visibility:visible;mso-wrap-style:square">
+          <v:shape id="Picture 7" o:spid="_x0000_i1054" type="#_x0000_t75" style="width:425.0pt;height:243.0pt;visibility:visible;mso-wrap-style:square">
             <v:imagedata r:id="rId40" o:title=""/>
           </v:shape>
         </w:pict>
@@ -7668,6 +7716,154 @@
     <w:p>
       <w:r>
         <w:t>Un manager ne voit que les candidatures relevant de son périmètre (département, ou à défaut famille de métier — voir ManagerRoutingService, section 3.5.4), à partir de leur entrée en évaluation technique (statut TECHNICAL_TEST), et non dès la validation du CV par le RH. Cette vue cloisonnée est distincte de la liste globale accessible au RH et à l’administrateur (Figure 4.4).</w:t>
+      </w:r>
+    </w:p>
+    <w:p>
+      <w:r>
+        <w:t>Le manager dispose en outre d’une page « Mon calendrier » qui centralise ses propres entretiens : prochaine session, lien de visioconférence, répartition par statut et vue mensuelle, avec un rappel automatique planifié deux heures avant chaque entretien dont il est intervieweur. La liste reste filtrée côté serveur selon son département, sa famille de métier ou son affectation, de sorte qu’aucun dossier hors de son périmètre ne peut y apparaître.</w:t>
+      </w:r>
+    </w:p>
+    <w:p>
+      <w:pPr>
+        <w:keepNext/>
+        <w:jc w:val="center"/>
+      </w:pPr>
+      <w:r>
+        <w:rPr>
+          <w:noProof/>
+        </w:rPr>
+        <w:pict w14:anchorId="1ABB31E4">
+          <v:shape id="Picture 17" o:spid="_x0000_i1060" type="#_x0000_t75" style="width:425.0pt;height:289.2pt;visibility:visible;mso-wrap-style:square">
+            <v:imagedata r:id="rId902" o:title=""/>
+          </v:shape>
+        </w:pict>
+      </w:r>
+    </w:p>
+    <w:p>
+      <w:pPr>
+        <w:jc w:val="center"/>
+        <w:rPr>
+          <w:i/>
+          <w:sz w:val="21"/>
+        </w:rPr>
+      </w:pPr>
+      <w:r>
+        <w:rPr>
+          <w:i/>
+          <w:sz w:val="21"/>
+        </w:rPr>
+        <w:t>Figure 4.17  : Espace Manager — page « Mon calendrier », entretiens et rappels</w:t>
+      </w:r>
+    </w:p>
+    <w:p>
+      <w:r>
+        <w:t>Au-delà des interfaces de la plateforme, la chaîne d’automatisation a été vérifiée dans la console n8n elle-même. La figure 4.18 montre les trois flux déclarés dans l’application — « Agent 1 — CV Parser + Score IA + Email Candidat », « Agent 2 — Planification entretien + Email participants » et « Agent 3 — RH vers Manager (dossier validé) » — tous trois à l’état Publié, avec quinze exécutions de production, aucun échec (taux d’échec 0 %) et une durée moyenne d’exécution de 3,61 s.</w:t>
+      </w:r>
+    </w:p>
+    <w:p>
+      <w:pPr>
+        <w:keepNext/>
+        <w:jc w:val="center"/>
+      </w:pPr>
+      <w:r>
+        <w:rPr>
+          <w:noProof/>
+        </w:rPr>
+        <w:pict w14:anchorId="1ABB31E4">
+          <v:shape id="Picture 18" o:spid="_x0000_i1061" type="#_x0000_t75" style="width:425.0pt;height:215.3pt;visibility:visible;mso-wrap-style:square">
+            <v:imagedata r:id="rId903" o:title=""/>
+          </v:shape>
+        </w:pict>
+      </w:r>
+    </w:p>
+    <w:p>
+      <w:pPr>
+        <w:jc w:val="center"/>
+        <w:rPr>
+          <w:i/>
+          <w:sz w:val="21"/>
+        </w:rPr>
+      </w:pPr>
+      <w:r>
+        <w:rPr>
+          <w:i/>
+          <w:sz w:val="21"/>
+        </w:rPr>
+        <w:t>Figure 4.18  : Console n8n — les trois flux d’automatisation publiés et leurs statistiques</w:t>
+      </w:r>
+    </w:p>
+    <w:p>
+      <w:r>
+        <w:t>Le détail de l’Agent 1 (figure 4.19) confirme le découpage des responsabilités décrit au chapitre 3 : le webhook « Nouvelle candidature » reçoit l’événement POST émis par Spring Boot, le nœud « Cohere — Score IA (Spring Boot) » rappelle le back-end qui interroge réellement l’API de Cohere et persiste le score, puis « Préparer données email » alimente le nœud d’envoi de la confirmation au candidat.</w:t>
+      </w:r>
+    </w:p>
+    <w:p>
+      <w:pPr>
+        <w:keepNext/>
+        <w:jc w:val="center"/>
+      </w:pPr>
+      <w:r>
+        <w:rPr>
+          <w:noProof/>
+        </w:rPr>
+        <w:pict w14:anchorId="1ABB31E4">
+          <v:shape id="Picture 19" o:spid="_x0000_i1062" type="#_x0000_t75" style="width:425.0pt;height:189.3pt;visibility:visible;mso-wrap-style:square">
+            <v:imagedata r:id="rId904" o:title=""/>
+          </v:shape>
+        </w:pict>
+      </w:r>
+    </w:p>
+    <w:p>
+      <w:pPr>
+        <w:jc w:val="center"/>
+        <w:rPr>
+          <w:i/>
+          <w:sz w:val="21"/>
+        </w:rPr>
+      </w:pPr>
+      <w:r>
+        <w:rPr>
+          <w:i/>
+          <w:sz w:val="21"/>
+        </w:rPr>
+        <w:t>Figure 4.19 : Flux n8n de l’Agent 1 — webhook de candidature, appel du scoring Cohere puis e-mail au candidat</w:t>
+      </w:r>
+    </w:p>
+    <w:p>
+      <w:r>
+        <w:t>Côté candidat, la notification produite par ce flux arrive bien dans sa boîte de réception (figure 4.20) : accusé de réception nominatif pour le poste visé, score d’analyse IA obtenu et horodatage du traitement, avec la mention d’envoi automatique par n8n.</w:t>
+      </w:r>
+    </w:p>
+    <w:p>
+      <w:pPr>
+        <w:keepNext/>
+        <w:jc w:val="center"/>
+      </w:pPr>
+      <w:r>
+        <w:rPr>
+          <w:noProof/>
+        </w:rPr>
+        <w:pict w14:anchorId="1ABB31E4">
+          <v:shape id="Picture 110" o:spid="_x0000_i1063" type="#_x0000_t75" style="width:425.0pt;height:286.4pt;visibility:visible;mso-wrap-style:square">
+            <v:imagedata r:id="rId905" o:title=""/>
+          </v:shape>
+        </w:pict>
+      </w:r>
+    </w:p>
+    <w:p>
+      <w:pPr>
+        <w:jc w:val="center"/>
+        <w:rPr>
+          <w:i/>
+          <w:sz w:val="21"/>
+        </w:rPr>
+      </w:pPr>
+      <w:r>
+        <w:rPr>
+          <w:i/>
+          <w:sz w:val="21"/>
+        </w:rPr>
+        <w:t>Figure 4.20 : E-mail automatique de confirmation de candidature reçu par le candidat</w:t>
       </w:r>
     </w:p>
     <w:p>

</xml_diff>

<commit_message>
docs(report): nouvelle mise a jour des rapports PFE docx et pdf
</commit_message>
<xml_diff>
--- a/Rapport-PFE/finalreport/Rapport_PFE_Haythem_Bargaoui_beta.docx
+++ b/Rapport-PFE/finalreport/Rapport_PFE_Haythem_Bargaoui_beta.docx
@@ -1229,7 +1229,7 @@
       <w:r>
         <w:t xml:space="preserve">2.2.6 Description textuelle de quelques cas d’utilisation</w:t>
         <w:tab/>
-        <w:t>25</w:t>
+        <w:t>26</w:t>
       </w:r>
     </w:p>
     <w:p>
@@ -1247,7 +1247,7 @@
       <w:r>
         <w:t xml:space="preserve">2.2.7 Diagramme de séquence système (boîte noire)</w:t>
         <w:tab/>
-        <w:t>26</w:t>
+        <w:t>27</w:t>
       </w:r>
     </w:p>
     <w:p>
@@ -1265,7 +1265,7 @@
       <w:r>
         <w:t xml:space="preserve">2.3 Étude technique</w:t>
         <w:tab/>
-        <w:t>27</w:t>
+        <w:t>28</w:t>
       </w:r>
     </w:p>
     <w:p>
@@ -1283,7 +1283,7 @@
       <w:r>
         <w:t xml:space="preserve">2.3.1 Architecture physique cible</w:t>
         <w:tab/>
-        <w:t>27</w:t>
+        <w:t>28</w:t>
       </w:r>
     </w:p>
     <w:p>
@@ -1301,7 +1301,7 @@
       <w:r>
         <w:t xml:space="preserve">2.3.2 Côté client — Angular</w:t>
         <w:tab/>
-        <w:t>28</w:t>
+        <w:t>29</w:t>
       </w:r>
     </w:p>
     <w:p>
@@ -1319,7 +1319,7 @@
       <w:r>
         <w:t xml:space="preserve">2.3.3 Côté serveur — Spring Boot</w:t>
         <w:tab/>
-        <w:t>28</w:t>
+        <w:t>29</w:t>
       </w:r>
     </w:p>
     <w:p>
@@ -1337,7 +1337,7 @@
       <w:r>
         <w:t xml:space="preserve">2.3.4 La sécurité — Spring Security et JWT</w:t>
         <w:tab/>
-        <w:t>28</w:t>
+        <w:t>29</w:t>
       </w:r>
     </w:p>
     <w:p>
@@ -1355,7 +1355,7 @@
       <w:r>
         <w:t xml:space="preserve">2.4 Conclusion</w:t>
         <w:tab/>
-        <w:t>28</w:t>
+        <w:t>30</w:t>
       </w:r>
     </w:p>
     <w:p>
@@ -1373,7 +1373,7 @@
       <w:r>
         <w:t>Chapitre 3 : Conception</w:t>
         <w:tab/>
-        <w:t>29</w:t>
+        <w:t>31</w:t>
       </w:r>
     </w:p>
     <w:p>
@@ -1391,7 +1391,7 @@
       <w:r>
         <w:t xml:space="preserve">3.1 Introduction</w:t>
         <w:tab/>
-        <w:t>29</w:t>
+        <w:t>31</w:t>
       </w:r>
     </w:p>
     <w:p>
@@ -1409,7 +1409,7 @@
       <w:r>
         <w:t xml:space="preserve">3.2 Diagramme des paquetages</w:t>
         <w:tab/>
-        <w:t>29</w:t>
+        <w:t>31</w:t>
       </w:r>
     </w:p>
     <w:p>
@@ -1427,7 +1427,7 @@
       <w:r>
         <w:t xml:space="preserve">3.3 Diagrammes de classes</w:t>
         <w:tab/>
-        <w:t>30</w:t>
+        <w:t>32</w:t>
       </w:r>
     </w:p>
     <w:p>
@@ -1445,7 +1445,7 @@
       <w:r>
         <w:t xml:space="preserve">3.4 Séquence technique — Soumission asynchrone et scoring IA</w:t>
         <w:tab/>
-        <w:t>33</w:t>
+        <w:t>35</w:t>
       </w:r>
     </w:p>
     <w:p>
@@ -1463,7 +1463,7 @@
       <w:r>
         <w:t xml:space="preserve">3.5 Diagrammes de séquence objet</w:t>
         <w:tab/>
-        <w:t>33</w:t>
+        <w:t>35</w:t>
       </w:r>
     </w:p>
     <w:p>
@@ -1481,7 +1481,7 @@
       <w:r>
         <w:t xml:space="preserve">3.5.1 Planifier un entretien</w:t>
         <w:tab/>
-        <w:t>34</w:t>
+        <w:t>36</w:t>
       </w:r>
     </w:p>
     <w:p>
@@ -1499,7 +1499,7 @@
       <w:r>
         <w:t xml:space="preserve">3.5.2 Décision finale de recrutement</w:t>
         <w:tab/>
-        <w:t>35</w:t>
+        <w:t>37</w:t>
       </w:r>
     </w:p>
     <w:p>
@@ -1517,7 +1517,7 @@
       <w:r>
         <w:t xml:space="preserve">3.5.3 Analyse IA du CV (extraction, scoring via n8n et Cohere)</w:t>
         <w:tab/>
-        <w:t>36</w:t>
+        <w:t>38</w:t>
       </w:r>
     </w:p>
     <w:p>
@@ -1535,7 +1535,7 @@
       <w:r>
         <w:t xml:space="preserve">3.5.4 Passage en évaluation technique — routage et notification des managers</w:t>
         <w:tab/>
-        <w:t>37</w:t>
+        <w:t>39</w:t>
       </w:r>
     </w:p>
     <w:p>
@@ -1553,7 +1553,7 @@
       <w:r>
         <w:t xml:space="preserve">3.6 Diagramme d’états — Cycle de vie d’une candidature</w:t>
         <w:tab/>
-        <w:t>37</w:t>
+        <w:t>40</w:t>
       </w:r>
     </w:p>
     <w:p>
@@ -1571,7 +1571,7 @@
       <w:r>
         <w:t xml:space="preserve">3.7 Conception de la base de données</w:t>
         <w:tab/>
-        <w:t>39</w:t>
+        <w:t>41</w:t>
       </w:r>
     </w:p>
     <w:p>
@@ -1589,7 +1589,7 @@
       <w:r>
         <w:t xml:space="preserve">3.8 Diagramme de composants</w:t>
         <w:tab/>
-        <w:t>40</w:t>
+        <w:t>42</w:t>
       </w:r>
     </w:p>
     <w:p>
@@ -1607,7 +1607,7 @@
       <w:r>
         <w:t xml:space="preserve">3.9 Diagramme de déploiement</w:t>
         <w:tab/>
-        <w:t>42</w:t>
+        <w:t>44</w:t>
       </w:r>
     </w:p>
     <w:p>
@@ -1625,7 +1625,7 @@
       <w:r>
         <w:t xml:space="preserve">3.10 Conclusion</w:t>
         <w:tab/>
-        <w:t>42</w:t>
+        <w:t>44</w:t>
       </w:r>
     </w:p>
     <w:p>
@@ -1643,7 +1643,7 @@
       <w:r>
         <w:t>Chapitre 4 : Réalisation</w:t>
         <w:tab/>
-        <w:t>43</w:t>
+        <w:t>45</w:t>
       </w:r>
     </w:p>
     <w:p>
@@ -1661,7 +1661,7 @@
       <w:r>
         <w:t>4.1 Introduction</w:t>
         <w:tab/>
-        <w:t>43</w:t>
+        <w:t>45</w:t>
       </w:r>
     </w:p>
     <w:p>
@@ -1679,7 +1679,7 @@
       <w:r>
         <w:t>4.2 Environnement de travail</w:t>
         <w:tab/>
-        <w:t>43</w:t>
+        <w:t>45</w:t>
       </w:r>
     </w:p>
     <w:p>
@@ -1697,7 +1697,7 @@
       <w:r>
         <w:t>4.2.1 Environnement matériel</w:t>
         <w:tab/>
-        <w:t>43</w:t>
+        <w:t>45</w:t>
       </w:r>
     </w:p>
     <w:p>
@@ -1715,7 +1715,7 @@
       <w:r>
         <w:t>4.2.2 Environnement logiciel</w:t>
         <w:tab/>
-        <w:t>43</w:t>
+        <w:t>45</w:t>
       </w:r>
     </w:p>
     <w:p>
@@ -1733,7 +1733,7 @@
       <w:r>
         <w:t>4.2.3 Gestion de version</w:t>
         <w:tab/>
-        <w:t>44</w:t>
+        <w:t>46</w:t>
       </w:r>
     </w:p>
     <w:p>
@@ -1751,7 +1751,7 @@
       <w:r>
         <w:t>4.2.4 Sécurité applicative</w:t>
         <w:tab/>
-        <w:t>44</w:t>
+        <w:t>46</w:t>
       </w:r>
     </w:p>
     <w:p>
@@ -1769,7 +1769,7 @@
       <w:r>
         <w:t>4.3 Interfaces graphiques de l’application</w:t>
         <w:tab/>
-        <w:t>44</w:t>
+        <w:t>46</w:t>
       </w:r>
     </w:p>
     <w:p>
@@ -1787,7 +1787,7 @@
       <w:r>
         <w:t>4.4 Tests</w:t>
         <w:tab/>
-        <w:t>58</w:t>
+        <w:t>60</w:t>
       </w:r>
     </w:p>
     <w:p>
@@ -1805,7 +1805,7 @@
       <w:r>
         <w:t>4.4.1 Tests unitaires (JUnit 5 / Mockito)</w:t>
         <w:tab/>
-        <w:t>58</w:t>
+        <w:t>60</w:t>
       </w:r>
     </w:p>
     <w:p>
@@ -1823,7 +1823,7 @@
       <w:r>
         <w:t>4.4.2 Tests fonctionnels manuels</w:t>
         <w:tab/>
-        <w:t>58</w:t>
+        <w:t>60</w:t>
       </w:r>
     </w:p>
     <w:p>
@@ -1841,7 +1841,7 @@
       <w:r>
         <w:t>4.4.3 Tests des API avec Postman et Swagger</w:t>
         <w:tab/>
-        <w:t>60</w:t>
+        <w:t>62</w:t>
       </w:r>
     </w:p>
     <w:p>
@@ -1859,7 +1859,43 @@
       <w:r>
         <w:t>4.4.4 Vérification de bout en bout</w:t>
         <w:tab/>
-        <w:t>60</w:t>
+        <w:t>62</w:t>
+      </w:r>
+    </w:p>
+    <w:p>
+      <w:pPr>
+        <w:pStyle w:val="TM3"/>
+        <w:tabs>
+          <w:tab w:val="right" w:leader="dot" w:pos="9066"/>
+        </w:tabs>
+        <w:rPr>
+          <w:rFonts w:ascii="Aptos" w:eastAsia="Times New Roman" w:hAnsi="Aptos"/>
+          <w:noProof/>
+          <w:lang w:eastAsia="fr-FR"/>
+        </w:rPr>
+      </w:pPr>
+      <w:r>
+        <w:t>4.4.5 Évaluation du matching sur un jeu de référence annoté (Gold Set)</w:t>
+        <w:tab/>
+        <w:t>62</w:t>
+      </w:r>
+    </w:p>
+    <w:p>
+      <w:pPr>
+        <w:pStyle w:val="TM3"/>
+        <w:tabs>
+          <w:tab w:val="right" w:leader="dot" w:pos="9066"/>
+        </w:tabs>
+        <w:rPr>
+          <w:rFonts w:ascii="Aptos" w:eastAsia="Times New Roman" w:hAnsi="Aptos"/>
+          <w:noProof/>
+          <w:lang w:eastAsia="fr-FR"/>
+        </w:rPr>
+      </w:pPr>
+      <w:r>
+        <w:t>4.4.6 Validation humaine du score et explicabilité</w:t>
+        <w:tab/>
+        <w:t>63</w:t>
       </w:r>
     </w:p>
     <w:p>
@@ -1877,7 +1913,7 @@
       <w:r>
         <w:t>4.5 Difficultés rencontrées et solutions apportées</w:t>
         <w:tab/>
-        <w:t>60</w:t>
+        <w:t>64</w:t>
       </w:r>
     </w:p>
     <w:p>
@@ -1895,7 +1931,7 @@
       <w:r>
         <w:t>4.5.1 Notification incomplète des managers</w:t>
         <w:tab/>
-        <w:t>60</w:t>
+        <w:t>64</w:t>
       </w:r>
     </w:p>
     <w:p>
@@ -1913,7 +1949,7 @@
       <w:r>
         <w:t>4.5.2 Distinguer un rejet RH d’un rejet manager</w:t>
         <w:tab/>
-        <w:t>61</w:t>
+        <w:t>64</w:t>
       </w:r>
     </w:p>
     <w:p>
@@ -1931,7 +1967,7 @@
       <w:r>
         <w:t>4.5.3 Cohérence des transitions de statut</w:t>
         <w:tab/>
-        <w:t>61</w:t>
+        <w:t>65</w:t>
       </w:r>
     </w:p>
     <w:p>
@@ -1949,7 +1985,7 @@
       <w:r>
         <w:t>4.5.4 Filtrage incomplet des routes de lecture pour les managers</w:t>
         <w:tab/>
-        <w:t>61</w:t>
+        <w:t>65</w:t>
       </w:r>
     </w:p>
     <w:p>
@@ -1967,7 +2003,7 @@
       <w:r>
         <w:t>4.5.5 Solliciter le manager au bon moment du processus</w:t>
         <w:tab/>
-        <w:t>61</w:t>
+        <w:t>65</w:t>
       </w:r>
     </w:p>
     <w:p>
@@ -1985,7 +2021,7 @@
       <w:r>
         <w:t>4.5.6 Pertinence du matching Job idéal</w:t>
         <w:tab/>
-        <w:t>62</w:t>
+        <w:t>65</w:t>
       </w:r>
     </w:p>
     <w:p>
@@ -2003,7 +2039,7 @@
       <w:r>
         <w:t>4.5.7 Traitement distinct des candidatures retirées</w:t>
         <w:tab/>
-        <w:t>62</w:t>
+        <w:t>66</w:t>
       </w:r>
     </w:p>
     <w:p>
@@ -2021,7 +2057,7 @@
       <w:r>
         <w:t>4.5.8 Entretien téléphonique RH obligatoire avant acceptation</w:t>
         <w:tab/>
-        <w:t>62</w:t>
+        <w:t>66</w:t>
       </w:r>
     </w:p>
     <w:p>
@@ -2039,7 +2075,7 @@
       <w:r>
         <w:t>4.5.9 Découplage entre planification d’entretien et statut du candidat</w:t>
         <w:tab/>
-        <w:t>62</w:t>
+        <w:t>66</w:t>
       </w:r>
     </w:p>
     <w:p>
@@ -2057,7 +2093,7 @@
       <w:r>
         <w:t>4.5.10 Fiabiliser l’intégration Google Meet et le format des webhooks n8n</w:t>
         <w:tab/>
-        <w:t>63</w:t>
+        <w:t>66</w:t>
       </w:r>
     </w:p>
     <w:p>
@@ -2075,7 +2111,7 @@
       <w:r>
         <w:t>4.5.11 Cloisonnement des données dans le chatbot candidat</w:t>
         <w:tab/>
-        <w:t>63</w:t>
+        <w:t>67</w:t>
       </w:r>
     </w:p>
     <w:p>
@@ -2093,7 +2129,7 @@
       <w:r>
         <w:t>4.6 Protection des données et éthique de l’IA</w:t>
         <w:tab/>
-        <w:t>63</w:t>
+        <w:t>67</w:t>
       </w:r>
     </w:p>
     <w:p>
@@ -2111,7 +2147,7 @@
       <w:r>
         <w:t>4.7 Bilan des fonctionnalités réalisées</w:t>
         <w:tab/>
-        <w:t>65</w:t>
+        <w:t>68</w:t>
       </w:r>
     </w:p>
     <w:p>
@@ -2129,7 +2165,7 @@
       <w:r>
         <w:t>4.8 Conclusion</w:t>
         <w:tab/>
-        <w:t>66</w:t>
+        <w:t>70</w:t>
       </w:r>
     </w:p>
     <w:p>
@@ -2147,7 +2183,7 @@
       <w:r>
         <w:t>Conclusion Générale et Perspectives</w:t>
         <w:tab/>
-        <w:t>67</w:t>
+        <w:t>71</w:t>
       </w:r>
     </w:p>
     <w:p>
@@ -2165,7 +2201,7 @@
       <w:r>
         <w:t>Bibliographie</w:t>
         <w:tab/>
-        <w:t>68</w:t>
+        <w:t>73</w:t>
       </w:r>
     </w:p>
     <w:p>
@@ -2183,7 +2219,7 @@
       <w:r>
         <w:t>Glossaire</w:t>
         <w:tab/>
-        <w:t>70</w:t>
+        <w:t>75</w:t>
       </w:r>
     </w:p>
     <w:p>
@@ -2246,7 +2282,7 @@
       <w:r>
         <w:t xml:space="preserve">Figure 2.4 : Diagramme de cas d’utilisation — Processus de Recrutement &amp; Évaluation</w:t>
         <w:tab/>
-        <w:t>24</w:t>
+        <w:t>25</w:t>
       </w:r>
     </w:p>
     <w:p>
@@ -2259,7 +2295,7 @@
       <w:r>
         <w:t xml:space="preserve">Figure 2.5 : Diagramme de cas d’utilisation — Administration &amp; Paramétrage</w:t>
         <w:tab/>
-        <w:t>25</w:t>
+        <w:t>26</w:t>
       </w:r>
     </w:p>
     <w:p>
@@ -2272,7 +2308,7 @@
       <w:r>
         <w:t xml:space="preserve">Figure 2.6 : Diagramme de séquence système — Soumettre une candidature (boîte noire)</w:t>
         <w:tab/>
-        <w:t>26</w:t>
+        <w:t>28</w:t>
       </w:r>
     </w:p>
     <w:p>
@@ -2285,7 +2321,7 @@
       <w:r>
         <w:t xml:space="preserve">Figure 3.1 : Diagramme des paquetages</w:t>
         <w:tab/>
-        <w:t>29</w:t>
+        <w:t>31</w:t>
       </w:r>
     </w:p>
     <w:p>
@@ -2298,7 +2334,7 @@
       <w:r>
         <w:t xml:space="preserve">Figure 3.2 : Diagramme de classes — vue globale du domaine métier</w:t>
         <w:tab/>
-        <w:t>30</w:t>
+        <w:t>32</w:t>
       </w:r>
     </w:p>
     <w:p>
@@ -2311,7 +2347,7 @@
       <w:r>
         <w:t xml:space="preserve">Figure 3.2a : Diagramme de classes — modèle recrutement</w:t>
         <w:tab/>
-        <w:t>31</w:t>
+        <w:t>33</w:t>
       </w:r>
     </w:p>
     <w:p>
@@ -2324,7 +2360,7 @@
       <w:r>
         <w:t xml:space="preserve">Figure 3.2b : Diagramme de classes — utilisateurs et sécurité</w:t>
         <w:tab/>
-        <w:t>32</w:t>
+        <w:t>34</w:t>
       </w:r>
     </w:p>
     <w:p>
@@ -2337,7 +2373,7 @@
       <w:r>
         <w:t xml:space="preserve">Figure 3.3 : Diagramme de séquence technique — Soumission asynchrone et scoring IA</w:t>
         <w:tab/>
-        <w:t>33</w:t>
+        <w:t>35</w:t>
       </w:r>
     </w:p>
     <w:p>
@@ -2350,7 +2386,7 @@
       <w:r>
         <w:t xml:space="preserve">Figure 3.4 : Diagramme de séquence objet — Planifier un entretien</w:t>
         <w:tab/>
-        <w:t>34</w:t>
+        <w:t>36</w:t>
       </w:r>
     </w:p>
     <w:p>
@@ -2363,7 +2399,7 @@
       <w:r>
         <w:t xml:space="preserve">Figure 3.5 : Diagramme de séquence objet — Décision finale de recrutement</w:t>
         <w:tab/>
-        <w:t>35</w:t>
+        <w:t>37</w:t>
       </w:r>
     </w:p>
     <w:p>
@@ -2376,7 +2412,7 @@
       <w:r>
         <w:t xml:space="preserve">Figure 3.6 : Diagramme de séquence objet — Analyse IA du CV</w:t>
         <w:tab/>
-        <w:t>36</w:t>
+        <w:t>38</w:t>
       </w:r>
     </w:p>
     <w:p>
@@ -2389,7 +2425,7 @@
       <w:r>
         <w:t xml:space="preserve">Figure 3.7 : Diagramme de séquence objet — Routage et notification des managers</w:t>
         <w:tab/>
-        <w:t>37</w:t>
+        <w:t>39</w:t>
       </w:r>
     </w:p>
     <w:p>
@@ -2402,7 +2438,7 @@
       <w:r>
         <w:t xml:space="preserve">Figure 3.8 : Diagramme d’états du cycle de vie d’une candidature</w:t>
         <w:tab/>
-        <w:t>38</w:t>
+        <w:t>40</w:t>
       </w:r>
     </w:p>
     <w:p>
@@ -2415,7 +2451,7 @@
       <w:r>
         <w:t xml:space="preserve">Figure 3.9 : Schéma relationnel de la base de données PostgreSQL</w:t>
         <w:tab/>
-        <w:t>40</w:t>
+        <w:t>42</w:t>
       </w:r>
     </w:p>
     <w:p>
@@ -2428,7 +2464,7 @@
       <w:r>
         <w:t xml:space="preserve">Figure 3.10 : Diagramme de composants de la plateforme JOB4YOU</w:t>
         <w:tab/>
-        <w:t>41</w:t>
+        <w:t>43</w:t>
       </w:r>
     </w:p>
     <w:p>
@@ -2441,7 +2477,7 @@
       <w:r>
         <w:t xml:space="preserve">Figure 3.11 : Diagramme de déploiement de la plateforme JOB4YOU</w:t>
         <w:tab/>
-        <w:t>42</w:t>
+        <w:t>44</w:t>
       </w:r>
     </w:p>
     <w:p>
@@ -2453,7 +2489,7 @@
       <w:r>
         <w:t>Figure 4.1 : Page d’accueil publique — recherche d’offres d’emploi</w:t>
         <w:tab/>
-        <w:t>44</w:t>
+        <w:t>46</w:t>
       </w:r>
     </w:p>
     <w:p>
@@ -2465,7 +2501,7 @@
       <w:r>
         <w:t>Figure 4.2 : Page de connexion</w:t>
         <w:tab/>
-        <w:t>45</w:t>
+        <w:t>47</w:t>
       </w:r>
     </w:p>
     <w:p>
@@ -2477,7 +2513,7 @@
       <w:r>
         <w:t>Figure 4.3 : Gestion des offres d’emploi (espace RH)</w:t>
         <w:tab/>
-        <w:t>46</w:t>
+        <w:t>48</w:t>
       </w:r>
     </w:p>
     <w:p>
@@ -2489,7 +2525,7 @@
       <w:r>
         <w:t>Figure 4.4 : Gestion des candidats — vue liste avec score IA</w:t>
         <w:tab/>
-        <w:t>46</w:t>
+        <w:t>48</w:t>
       </w:r>
     </w:p>
     <w:p>
@@ -2501,7 +2537,7 @@
       <w:r>
         <w:t>Figure 4.5 : Modification d’un dossier candidat</w:t>
         <w:tab/>
-        <w:t>47</w:t>
+        <w:t>49</w:t>
       </w:r>
     </w:p>
     <w:p>
@@ -2513,7 +2549,7 @@
       <w:r>
         <w:t>Figure 4.6 : Tableau Kanban du pipeline de recrutement</w:t>
         <w:tab/>
-        <w:t>48</w:t>
+        <w:t>50</w:t>
       </w:r>
     </w:p>
     <w:p>
@@ -2525,7 +2561,7 @@
       <w:r>
         <w:t>Figure 4.7 : Gestion des entretiens</w:t>
         <w:tab/>
-        <w:t>48</w:t>
+        <w:t>50</w:t>
       </w:r>
     </w:p>
     <w:p>
@@ -2537,7 +2573,7 @@
       <w:r>
         <w:t>Figure 4.8 : Gestion des feedbacks</w:t>
         <w:tab/>
-        <w:t>49</w:t>
+        <w:t>51</w:t>
       </w:r>
     </w:p>
     <w:p>
@@ -2549,7 +2585,7 @@
       <w:r>
         <w:t>Figure 4.9 : Gestion des utilisateurs et des rôles (espace Administrateur)</w:t>
         <w:tab/>
-        <w:t>49</w:t>
+        <w:t>51</w:t>
       </w:r>
     </w:p>
     <w:p>
@@ -2561,7 +2597,7 @@
       <w:r>
         <w:t>Figure 4.10 : Paramétrage du scoring IA par famille de métier</w:t>
         <w:tab/>
-        <w:t>50</w:t>
+        <w:t>52</w:t>
       </w:r>
     </w:p>
     <w:p>
@@ -2573,7 +2609,7 @@
       <w:r>
         <w:t>Figure 4.11 : Journal d’audit</w:t>
         <w:tab/>
-        <w:t>50</w:t>
+        <w:t>52</w:t>
       </w:r>
     </w:p>
     <w:p>
@@ -2585,7 +2621,7 @@
       <w:r>
         <w:t>Figure 4.12 : Assistant conversationnel candidat (chatbot)</w:t>
         <w:tab/>
-        <w:t>51</w:t>
+        <w:t>53</w:t>
       </w:r>
     </w:p>
     <w:p>
@@ -2597,7 +2633,7 @@
       <w:r>
         <w:t>Figure 4.13 : Soumission d’une candidature avec dépôt de CV</w:t>
         <w:tab/>
-        <w:t>52</w:t>
+        <w:t>54</w:t>
       </w:r>
     </w:p>
     <w:p>
@@ -2609,7 +2645,7 @@
       <w:r>
         <w:t xml:space="preserve">Figure 4.14 : Fonctionnalité « Job idéal » — suggestions d’offres selon le CV</w:t>
         <w:tab/>
-        <w:t>53</w:t>
+        <w:t>55</w:t>
       </w:r>
     </w:p>
     <w:p>
@@ -2621,7 +2657,7 @@
       <w:r>
         <w:t>Figure 4.15 : Analyse détaillée d’une candidature par intelligence artificielle</w:t>
         <w:tab/>
-        <w:t>54</w:t>
+        <w:t>56</w:t>
       </w:r>
     </w:p>
     <w:p>
@@ -2633,7 +2669,7 @@
       <w:r>
         <w:t>Figure 4.16 : Espace Manager — candidatures relevant du périmètre du manager</w:t>
         <w:tab/>
-        <w:t>55</w:t>
+        <w:t>57</w:t>
       </w:r>
     </w:p>
     <w:p>
@@ -2645,7 +2681,7 @@
       <w:r>
         <w:t>Figure 4.17  : Espace Manager — page « Mon calendrier », entretiens et rappels</w:t>
         <w:tab/>
-        <w:t>56</w:t>
+        <w:t>58</w:t>
       </w:r>
     </w:p>
     <w:p>
@@ -2657,7 +2693,7 @@
       <w:r>
         <w:t>Figure 4.18  : Console n8n — les trois flux d’automatisation publiés et leurs statistiques</w:t>
         <w:tab/>
-        <w:t>56</w:t>
+        <w:t>58</w:t>
       </w:r>
     </w:p>
     <w:p>
@@ -2669,7 +2705,7 @@
       <w:r>
         <w:t>Figure 4.19 : Flux n8n de l’Agent 1 — webhook de candidature, appel du scoring Cohere puis e-mail au candidat</w:t>
         <w:tab/>
-        <w:t>57</w:t>
+        <w:t>59</w:t>
       </w:r>
     </w:p>
     <w:p>
@@ -2681,7 +2717,7 @@
       <w:r>
         <w:t>Figure 4.20 : E-mail automatique de confirmation de candidature reçu par le candidat</w:t>
         <w:tab/>
-        <w:t>57</w:t>
+        <w:t>59</w:t>
       </w:r>
     </w:p>
     <w:p>
@@ -2728,7 +2764,7 @@
       <w:r>
         <w:t xml:space="preserve">Tableau 2.2 : Description textuelle de deux cas d’utilisation représentatifs</w:t>
         <w:tab/>
-        <w:t>25</w:t>
+        <w:t>27</w:t>
       </w:r>
     </w:p>
     <w:p>
@@ -2740,7 +2776,7 @@
       <w:r>
         <w:t xml:space="preserve">Tableau 2.3 : Rôle des agents d’automatisation n8n</w:t>
         <w:tab/>
-        <w:t>27</w:t>
+        <w:t>29</w:t>
       </w:r>
     </w:p>
     <w:p>
@@ -2752,7 +2788,7 @@
       <w:r>
         <w:t>Tableau 4.1 : Synthèse des tests fonctionnels réalisés</w:t>
         <w:tab/>
-        <w:t>59</w:t>
+        <w:t>61</w:t>
       </w:r>
     </w:p>
     <w:p>
@@ -2762,9 +2798,21 @@
         </w:tabs>
       </w:pPr>
       <w:r>
-        <w:t>Tableau 4.2 : Bilan des fonctionnalités réalisées</w:t>
+        <w:t>Tableau 4.2 : Matrice de confusion du Gold Set selon le seuil de décision</w:t>
         <w:tab/>
-        <w:t>65</w:t>
+        <w:t>63</w:t>
+      </w:r>
+    </w:p>
+    <w:p>
+      <w:pPr>
+        <w:tabs>
+          <w:tab w:val="right" w:leader="dot" w:pos="9066"/>
+        </w:tabs>
+      </w:pPr>
+      <w:r>
+        <w:t>Tableau 4.3 : Bilan des fonctionnalités réalisées</w:t>
+        <w:tab/>
+        <w:t>69</w:t>
       </w:r>
     </w:p>
     <w:p>
@@ -4963,7 +5011,7 @@
         </w:numPr>
       </w:pPr>
       <w:r>
-        <w:t xml:space="preserve">Performance : temps de réponse cible inférieur à 500 ms pour les opérations de lecture courantes et inférieur à 2 s pour les opérations d’écriture, chargement asynchrone des traitements longs (scoring IA, envoi d’e-mails) afin de ne pas bloquer l’utilisateur, et taille maximale des CV déposés fixée à 10 Mo (formats PDF, DOC, DOCX).</w:t>
+        <w:t xml:space="preserve">Performance : temps de réponse cible inférieur à 500 ms pour les opérations de lecture courantes et inférieur à 2 s pour les opérations d’écriture, chargement asynchrone des traitements longs (scoring IA, envoi d’e-mails) afin de ne pas bloquer l’utilisateur, et taille maximale des CV déposés fixée à 10 Mo côté serveur (formats PDF, DOC, DOCX), le formulaire de candidature refusant déjà les fichiers de plus de 5 Mo.</w:t>
       </w:r>
     </w:p>
     <w:p>
@@ -5104,7 +5152,7 @@
           <w:noProof/>
         </w:rPr>
         <w:pict>
-          <v:shape id="Img 1051" o:spid="_x0000_i1051" type="#_x0000_t75" style="visibility:visible;mso-wrap-style:square;width:350.3pt;height:478.0pt;visibility:visible">
+          <v:shape id="Img 1051" o:spid="_x0000_i1051" type="#_x0000_t75" style="visibility:visible;mso-wrap-style:square;visibility:visible;width:332.7pt;height:478.0pt;visibility:visible">
             <v:imagedata r:id="rId43" o:title=""/>
             <o:lock v:ext="edit" aspectratio="f"/>
           </v:shape>
@@ -5131,7 +5179,7 @@
     <w:p>
       <w:pPr/>
       <w:r>
-        <w:t xml:space="preserve">L’authentification constitue une fonctionnalité transversale de la plateforme : le cas d’utilisation « S’authentifier » est commun au Candidat, au Responsable RH, au Manager et à l’Administrateur, qui doivent s’identifier avant d’accéder à leur espace sécurisé. Pour ne pas surcharger la figure 2.2, la relation « include » n’y est représentée que pour trois cas représentatifs (planification d’un entretien, consultation et filtrage des candidatures, gestion des utilisateurs) ; elle s’applique à toutes les fonctionnalités des espaces sécurisés. Seules la consultation et la recherche des offres ainsi que les suggestions « Job idéal » demeurent accessibles au visiteur non authentifié, l’assistant conversationnel restant réservé au candidat authentifié. Les autorisations sont ensuite contrôlées côté serveur selon le rôle et le périmètre métier de l’utilisateur. Les diagrammes ne représentent que les cas principaux : la matrice du tableau 2.1 fait foi pour le détail des droits (par exemple, le RH peut aussi saisir un feedback et consulter le journal d’audit).</w:t>
+        <w:t xml:space="preserve">L’authentification constitue une fonctionnalité transversale de la plateforme : le cas d’utilisation « S’authentifier » est commun au Candidat, au Responsable RH, au Manager et à l’Administrateur, qui doivent s’identifier avant d’accéder à leur espace sécurisé. Pour ne pas surcharger la figure 2.2, la relation « include » n’y est représentée que pour sept cas représentatifs (postuler à une offre, suivre l’état de sa candidature, consulter ses entretiens planifiés, échanger avec l’assistant conversationnel, consulter et filtrer les candidatures, trancher la décision finale, gérer les utilisateurs et les rôles) ; elle s’applique à toutes les fonctionnalités des espaces sécurisés. Seules la consultation et la recherche des offres ainsi que les suggestions « Job idéal » demeurent accessibles au visiteur non authentifié, l’assistant conversationnel restant réservé au candidat authentifié. Les autorisations sont ensuite contrôlées côté serveur selon le rôle et le périmètre métier de l’utilisateur. Les diagrammes ne représentent que les cas principaux : la matrice du tableau 2.1 fait foi pour le détail des droits (par exemple, le RH peut aussi saisir un feedback et consulter le journal d’audit).</w:t>
       </w:r>
     </w:p>
     <w:p>
@@ -5151,7 +5199,7 @@
           <w:noProof/>
         </w:rPr>
         <w:pict>
-          <v:shape id="Img 1052" o:spid="_x0000_i1052" type="#_x0000_t75" style="visibility:visible;mso-wrap-style:square;width:453.3pt;height:241.2pt;visibility:visible">
+          <v:shape id="Img 1052" o:spid="_x0000_i1052" type="#_x0000_t75" style="visibility:visible;mso-wrap-style:square;visibility:visible;width:453.3pt;height:362.6pt;visibility:visible">
             <v:imagedata r:id="rId44" o:title=""/>
             <o:lock v:ext="edit" aspectratio="f"/>
           </v:shape>
@@ -5192,7 +5240,7 @@
           <w:noProof/>
         </w:rPr>
         <w:pict>
-          <v:shape id="Img 1053" o:spid="_x0000_i1053" type="#_x0000_t75" style="visibility:visible;mso-wrap-style:square;width:272.3pt;height:203.2pt;visibility:visible">
+          <v:shape id="Img 1053" o:spid="_x0000_i1053" type="#_x0000_t75" style="visibility:visible;mso-wrap-style:square;visibility:visible;width:453.3pt;height:411.6pt;visibility:visible">
             <v:imagedata r:id="rId45" o:title=""/>
             <o:lock v:ext="edit" aspectratio="f"/>
           </v:shape>
@@ -5233,7 +5281,7 @@
           <w:noProof/>
         </w:rPr>
         <w:pict>
-          <v:shape id="Img 1054" o:spid="_x0000_i1054" type="#_x0000_t75" style="visibility:visible;mso-wrap-style:square;width:351.4pt;height:267.3pt;visibility:visible">
+          <v:shape id="Img 1054" o:spid="_x0000_i1054" type="#_x0000_t75" style="visibility:visible;mso-wrap-style:square;visibility:visible;width:425.8pt;height:430.0pt;visibility:visible">
             <v:imagedata r:id="rId46" o:title=""/>
             <o:lock v:ext="edit" aspectratio="f"/>
           </v:shape>
@@ -5314,7 +5362,6 @@
       </w:tblGrid>
       <w:tr>
         <w:trPr>
-          <w:tblHeader/>
           <w:cantSplit/>
         </w:trPr>
         <w:tc>
@@ -5394,6 +5441,7 @@
           </w:tcPr>
           <w:p>
             <w:pPr>
+              <w:keepNext/>
               <w:rPr>
                 <w:sz w:val="21"/>
               </w:rPr>
@@ -5412,6 +5460,7 @@
           </w:tcPr>
           <w:p>
             <w:pPr>
+              <w:keepNext/>
               <w:rPr>
                 <w:sz w:val="21"/>
               </w:rPr>
@@ -5430,6 +5479,7 @@
           </w:tcPr>
           <w:p>
             <w:pPr>
+              <w:keepNext/>
               <w:rPr>
                 <w:sz w:val="21"/>
               </w:rPr>
@@ -5453,6 +5503,7 @@
           </w:tcPr>
           <w:p>
             <w:pPr>
+              <w:keepNext/>
               <w:rPr>
                 <w:sz w:val="21"/>
               </w:rPr>
@@ -5471,6 +5522,7 @@
           </w:tcPr>
           <w:p>
             <w:pPr>
+              <w:keepNext/>
               <w:rPr>
                 <w:sz w:val="21"/>
               </w:rPr>
@@ -5489,6 +5541,7 @@
           </w:tcPr>
           <w:p>
             <w:pPr>
+              <w:keepNext/>
               <w:rPr>
                 <w:sz w:val="21"/>
               </w:rPr>
@@ -5512,6 +5565,7 @@
           </w:tcPr>
           <w:p>
             <w:pPr>
+              <w:keepNext/>
               <w:rPr>
                 <w:sz w:val="21"/>
               </w:rPr>
@@ -5530,6 +5584,7 @@
           </w:tcPr>
           <w:p>
             <w:pPr>
+              <w:keepNext/>
               <w:rPr>
                 <w:sz w:val="21"/>
               </w:rPr>
@@ -5548,6 +5603,7 @@
           </w:tcPr>
           <w:p>
             <w:pPr>
+              <w:keepNext/>
               <w:rPr>
                 <w:sz w:val="21"/>
               </w:rPr>
@@ -5571,6 +5627,7 @@
           </w:tcPr>
           <w:p>
             <w:pPr>
+              <w:keepNext/>
               <w:rPr>
                 <w:sz w:val="21"/>
               </w:rPr>
@@ -5589,6 +5646,7 @@
           </w:tcPr>
           <w:p>
             <w:pPr>
+              <w:keepNext/>
               <w:rPr>
                 <w:sz w:val="21"/>
               </w:rPr>
@@ -5607,6 +5665,7 @@
           </w:tcPr>
           <w:p>
             <w:pPr>
+              <w:keepNext/>
               <w:rPr>
                 <w:sz w:val="21"/>
               </w:rPr>
@@ -5890,7 +5949,7 @@
               <w:rPr>
                 <w:sz w:val="21"/>
               </w:rPr>
-              <w:t xml:space="preserve">Agent 1 — « CV Parser » (scoring IA)</w:t>
+              <w:t xml:space="preserve">Agent 1 — « CV Parser + Score IA + Email Candidat » (scoring IA)</w:t>
             </w:r>
           </w:p>
         </w:tc>
@@ -5949,7 +6008,7 @@
               <w:rPr>
                 <w:sz w:val="21"/>
               </w:rPr>
-              <w:t xml:space="preserve">Agent 2 — « Entretiens » (Google Meet et convocations)</w:t>
+              <w:t xml:space="preserve">Agent 2 — « Planification entretien + Email participants » (Google Meet et convocations)</w:t>
             </w:r>
           </w:p>
         </w:tc>
@@ -6008,7 +6067,7 @@
               <w:rPr>
                 <w:sz w:val="21"/>
               </w:rPr>
-              <w:t xml:space="preserve">Agent 3 — « Décisions et routage managers »</w:t>
+              <w:t xml:space="preserve">Agent 3 — « RH vers Manager (dossier validé) » (décisions et routage des managers)</w:t>
             </w:r>
           </w:p>
         </w:tc>
@@ -6233,7 +6292,7 @@
           <w:noProof/>
         </w:rPr>
         <w:pict w14:anchorId="598E410F">
-          <v:shape id="Image 6" o:spid="_x0000_i1030" type="#_x0000_t75" style="visibility:visible;mso-wrap-style:square;visibility:visible;width:350.8pt;height:500.0pt;visibility:visible">
+          <v:shape id="Image 6" o:spid="_x0000_i1030" type="#_x0000_t75" style="visibility:visible;mso-wrap-style:square;visibility:visible;visibility:visible;width:339.5pt;height:500.0pt;visibility:visible">
             <v:imagedata r:id="rId901" o:title=""/>
           </v:shape>
         </w:pict>
@@ -6267,7 +6326,7 @@
           <w:noProof/>
         </w:rPr>
         <w:pict w14:anchorId="598E410F">
-          <v:shape id="Image 6" o:spid="_x0000_i1030" type="#_x0000_t75" style="visibility:visible;mso-wrap-style:square;width:265.4pt;height:500.0pt;visibility:visible">
+          <v:shape id="Image 6" o:spid="_x0000_i1030" type="#_x0000_t75" style="visibility:visible;mso-wrap-style:square;visibility:visible;width:278.3pt;height:600.0pt;visibility:visible">
             <v:imagedata r:id="rId16" o:title=""/>
           </v:shape>
         </w:pict>
@@ -6313,7 +6372,7 @@
           <w:noProof/>
         </w:rPr>
         <w:pict>
-          <v:shape id="Picture 32b" o:spid="_x0000_i3201" type="#_x0000_t75" style="visibility:visible;mso-wrap-style:square;width:355.6pt;height:430.0pt;visibility:visible">
+          <v:shape id="Picture 32b" o:spid="_x0000_i3201" type="#_x0000_t75" style="visibility:visible;mso-wrap-style:square;visibility:visible;width:345.6pt;height:430.0pt;visibility:visible">
             <v:imagedata r:id="rId48" o:title=""/>
           </v:shape>
         </w:pict>
@@ -6533,7 +6592,7 @@
           <w:noProof/>
         </w:rPr>
         <w:pict w14:anchorId="7537B395">
-          <v:shape id="Picture 1" o:spid="_x0000_i1033" type="#_x0000_t75" style="visibility:visible;mso-wrap-style:square;width:769.9pt;height:398.0pt;visibility:visible">
+          <v:shape id="Picture 1" o:spid="_x0000_i1033" type="#_x0000_t75" style="visibility:visible;mso-wrap-style:square;visibility:visible;width:668.0pt;height:438.5pt;visibility:visible">
             <v:imagedata r:id="rId19" o:title=""/>
           </v:shape>
         </w:pict>
@@ -6562,7 +6621,7 @@
     </w:p>
     <w:p>
       <w:r>
-        <w:t xml:space="preserve">Ce diagramme détaille, au niveau objet, le cheminement du scoring : dès l’enregistrement de la candidature (statut APPLIED), un webhook n8n déclenche l’agent « CV Parser », qui extrait le texte du CV. Cet agent ne contacte pas directement Cohere : il rappelle le back-end via POST /api/candidates/{id}/ai-score/recompute, et c’est le back-end — au travers de son client CohereClient — qui interroge l’API de Cohere, calcule le score et le persiste. Le statut bascule ensuite automatiquement vers CV_REVIEWED ou AUTO_REJECTED selon le seuil configuré, sans intervention humaine à ce stade.</w:t>
+        <w:t xml:space="preserve">Ce diagramme détaille, au niveau objet, le cheminement du scoring : dès l’enregistrement de la candidature (statut APPLIED), un webhook n8n déclenche l’agent « CV Parser », qui extrait le texte du CV. Cet agent ne contacte pas directement Cohere : il rappelle le back-end via POST /api/candidates/{id}/ai-score/recompute, et c’est le back-end — au travers de son client CohereClient — qui interroge l’API de Cohere, calcule le score et le persiste. Le statut bascule ensuite automatiquement vers CV_REVIEWED ou AUTO_REJECTED selon le seuil configuré, sans intervention humaine à ce stade. Deux étapes complémentaires figurent sur le diagramme. Avant l’appel au modèle, SkillNormalizationService harmonise les compétences extraites (k8s devient Kubernetes, postgres devient PostgreSQL) et écarte les termes inconnus, afin que la pondération par profil de scoring ne porte que sur des libellés fiables. Après le calcul, le service positionne le drapeau needsHumanReview lorsque le texte extrait est trop court, lorsque le score tombe dans la zone grise comprise entre 55 et 65, ou lorsque l’API de Cohere est indisponible ; dans ce dernier cas le score est marqué SIMULATED et le dossier est dirigé vers un arbitrage humain plutôt que vers une décision automatique (section 4.4.6).</w:t>
       </w:r>
     </w:p>
     <w:p>
@@ -6737,7 +6796,7 @@
           <w:noProof/>
         </w:rPr>
         <w:pict w14:anchorId="302CA6EE">
-          <v:shape id="Image 10" o:spid="_x0000_i1036" type="#_x0000_t75" style="visibility:visible;mso-wrap-style:square;width:769.9pt;height:392.6pt;visibility:visible">
+          <v:shape id="Image 10" o:spid="_x0000_i1036" type="#_x0000_t75" style="visibility:visible;mso-wrap-style:square;width:769.9pt;height:398.9pt;visibility:visible">
             <v:imagedata r:id="rId22" o:title=""/>
           </v:shape>
         </w:pict>
@@ -7101,7 +7160,7 @@
     <w:p>
       <w:pPr/>
       <w:r>
-        <w:t xml:space="preserve">Plusieurs mécanismes concrets protègent la plateforme et les données des candidats. Les mots de passe ne sont jamais stockés en clair : ils sont hachés avec BCrypt avant persistance. L’authentification s’appuie sur un jeton JWT signé [14], valable 24 heures, transmis à chaque requête et vérifié côté back-end pour en extraire l’identité et les rôles de l’utilisateur. Chaque point d’entrée de l’API REST est protégé par annotation selon le rôle requis (@PreAuthorize), et un contrôle d’accès supplémentaire restreint, pour un manager, la visibilité aux seuls candidats de son périmètre — déterminé prioritairement par son département, la famille de métier ne servant de repli que pour les offres non rattachées à un département. Le dépôt de CV est limité aux formats PDF, DOC et DOCX, avec une taille maximale de 10 Mo, pour limiter les risques liés au téléversement de fichiers. Des mécanismes complémentaires, comme l’analyse antivirus ou une validation plus poussée du contenu au-delà de la seule extension et du type MIME, pourraient compléter ce dispositif en production, conformément aux recommandations de l’OWASP [15].</w:t>
+        <w:t xml:space="preserve">Plusieurs mécanismes concrets protègent la plateforme et les données des candidats. Les mots de passe ne sont jamais stockés en clair : ils sont hachés avec BCrypt avant persistance. L’authentification s’appuie sur un jeton JWT signé [14], valable 24 heures, transmis à chaque requête et vérifié côté back-end pour en extraire l’identité et les rôles de l’utilisateur. Chaque point d’entrée de l’API REST est protégé par annotation selon le rôle requis (@PreAuthorize), et un contrôle d’accès supplémentaire restreint, pour un manager, la visibilité aux seuls candidats de son périmètre — déterminé prioritairement par son département, la famille de métier ne servant de repli que pour les offres non rattachées à un département. Le dépôt de CV est limité aux formats PDF, DOC et DOCX, avec une taille maximale de 10 Mo côté API, resserrée à 5 Mo par la validation du formulaire Angular, pour limiter les risques liés au téléversement de fichiers. Des mécanismes complémentaires, comme l’analyse antivirus ou une validation plus poussée du contenu au-delà de la seule extension et du type MIME, pourraient compléter ce dispositif en production, conformément aux recommandations de l’OWASP [15].</w:t>
       </w:r>
     </w:p>
     <w:p>
@@ -9350,247 +9409,27 @@
     </w:p>
     <w:p>
       <w:pPr>
-        <w:pStyle w:val="Titre2"/>
-      </w:pPr>
-      <w:bookmarkStart w:id="59" w:name="_Toc240315749"/>
-      <w:r>
-        <w:t>4.5 Difficultés rencontrées et solutions apportées</w:t>
-      </w:r>
-      <w:bookmarkEnd w:id="59"/>
-    </w:p>
-    <w:p>
-      <w:r>
-        <w:t>Au-delà des fonctionnalités livrées, le développement de JOB4YOU a été jalonné de plusieurs difficultés concrètes. Je détaille ici les principales, représentatives des problèmes rencontrés sur ce projet.</w:t>
-      </w:r>
-    </w:p>
-    <w:p>
-      <w:pPr>
         <w:pStyle w:val="Titre3"/>
       </w:pPr>
-      <w:bookmarkStart w:id="60" w:name="_Toc240315750"/>
-      <w:r>
-        <w:t>4.5.1 Notification incomplète des managers</w:t>
-      </w:r>
-      <w:bookmarkEnd w:id="60"/>
-    </w:p>
-    <w:p>
-      <w:r>
-        <w:t xml:space="preserve">Un premier bug, découvert tardivement, concernait le routage automatique RH → manager. Lorsqu’une offre d’emploi était rattachée à une famille de métier suivie par plusieurs managers, seul le premier manager trouvé en base recevait la notification de validation RH : les autres n’étaient jamais informés, sans qu’aucune erreur ne soit levée. Le problème venait d’une méthode qui retournait un unique e-mail (le premier résultat de la requête) au lieu de la liste complète des managers concernés. La correction a consisté à faire retourner l’ensemble des adresses correspondantes et à notifier chaque manager individuellement, tout en veillant à ne pas dupliquer l’e-mail envoyé au candidat, qui doit rester unique quel que soit le nombre de managers notifiés. Ce routage a par la suite été affiné pour s’appuyer prioritairement sur le département de l’offre (CS, DevOps, ProdOps, R&amp;D, QA), la famille de métier n’intervenant plus qu’en repli pour les offres non rattachées à un département : un manager ne reçoit et ne voit désormais que les dossiers relevant strictement de son département, sans fuite possible vers un autre périmètre.</w:t>
-      </w:r>
-    </w:p>
-    <w:p>
-      <w:pPr>
-        <w:pStyle w:val="Titre3"/>
-      </w:pPr>
-      <w:bookmarkStart w:id="61" w:name="_Toc240315751"/>
-      <w:r>
-        <w:t>4.5.2 Distinguer un rejet RH d’un rejet manager</w:t>
-      </w:r>
-      <w:bookmarkEnd w:id="61"/>
-    </w:p>
-    <w:p>
-      <w:r>
-        <w:t>Le modèle de données utilise un statut unique, MANAGER_REJECTED, que ce soit le RH ou le manager qui prenne la décision de refus — les deux s’appuient sur le même mécanisme de décision. Or le tableau de bord devait afficher séparément les rejets RH et les rejets manager, ces derniers ventilés par famille de métier. Plutôt que d’introduire un nouveau statut en base (ce qui aurait complexifié le modèle pour un besoin purement d’affichage), j’ai choisi de reconstruire cette information à partir du journal d’audit existant : chaque changement de statut y est déjà associé à l’utilisateur qui l’a effectué, il suffisait de croiser ce nom d’utilisateur avec son rôle réel pour déterminer si la décision provenait du RH ou d’un manager, et dans ce dernier cas, de quelle famille de métier.</w:t>
-      </w:r>
-    </w:p>
-    <w:p>
-      <w:pPr>
-        <w:pStyle w:val="Titre3"/>
-      </w:pPr>
-      <w:bookmarkStart w:id="62" w:name="_Toc240315752"/>
-      <w:r>
-        <w:t>4.5.3 Cohérence des transitions de statut</w:t>
-      </w:r>
-      <w:bookmarkEnd w:id="62"/>
-    </w:p>
-    <w:p>
-      <w:r>
-        <w:t>Le cycle de vie d’une candidature comporte de nombreux états, et plusieurs actions (planifier un entretien, prendre une décision finale) n’ont de sens que si le dossier se trouve dans un état précis. Sans garde-fou, il était possible par exemple de planifier un entretien sur un dossier déjà rejeté, ou de faire valider un candidat par un manager avant même que le RH n’ait examiné son dossier. J’ai donc ajouté, côté back-end, des vérifications explicites avant chaque transition sensible, avec des messages d’erreur clairs renvoyés à l’interface plutôt que des échecs silencieux — un choix qui a nécessité de revenir plusieurs fois sur le diagramme d’états du chapitre 3 pour m’assurer que l’implémentation restait fidèle au modèle.</w:t>
-      </w:r>
-    </w:p>
-    <w:p>
-      <w:pPr>
-        <w:pStyle w:val="Titre3"/>
-      </w:pPr>
-      <w:bookmarkStart w:id="63" w:name="_Toc240315753"/>
-      <w:r>
-        <w:t>4.5.4 Filtrage incomplet des routes de lecture pour les managers</w:t>
-      </w:r>
-      <w:bookmarkEnd w:id="63"/>
-    </w:p>
-    <w:p>
-      <w:r>
-        <w:t>Le garde-fou décrit en 4.5.3 empêchait bien un manager d’agir en écriture (changer un statut) sur un candidat hors de son périmètre, mais je me suis rendu compte, en réexaminant systématiquement chaque route accessible au rôle Manager, que ce n’était pas le cas des routes de lecture : GET /api/candidates, GET /api/candidates/{id}, la recherche par nom et le classement par offre ne filtraient pas par périmètre. Un manager authentifié pouvait donc, en appelant directement l’API (pas via l’interface, qui n’expose pas ce chemin), lister ou consulter des candidats d’un autre département. J’ai corrigé ce point en centralisant la logique de périmètre déjà utilisée pour les écritures dans une méthode réutilisable, appliquée à présent à toutes les routes de lecture concernées, et j’ai ajouté deux tests unitaires dédiés (section 4.4.1) pour figer ce comportement.</w:t>
-      </w:r>
-    </w:p>
-    <w:p>
-      <w:pPr>
-        <w:pStyle w:val="Titre3"/>
-      </w:pPr>
-      <w:bookmarkStart w:id="64" w:name="_Toc240315754"/>
-      <w:r>
-        <w:t>4.5.5 Solliciter le manager au bon moment du processus</w:t>
-      </w:r>
-      <w:bookmarkEnd w:id="64"/>
-    </w:p>
-    <w:p>
-      <w:pPr>
-        <w:jc w:val="both"/>
-      </w:pPr>
-      <w:r>
-        <w:t xml:space="preserve">Dans une première version, le manager destinataire était notifié dès la validation du CV par le RH (statut CV_REVIEWED). À l’usage, cela le sollicitait trop tôt : de nombreux dossiers étaient encore écartés lors du pré-filtrage téléphonique mené par le RH. J’ai donc déplacé la notification du manager à l’entrée en Test technique, c’est-à-dire une fois l’entretien téléphonique franchi ; le candidat, lui, reste informé de la présélection de son CV dès l’étape CV_REVIEWED. En cohérence, la vue des dossiers validés du manager ne fait plus apparaître les candidats qu’à partir du Test technique, ce qui recentre son attention sur les profils réellement en lice.</w:t>
-      </w:r>
-    </w:p>
-    <w:p>
-      <w:pPr>
-        <w:pStyle w:val="Titre3"/>
-      </w:pPr>
-      <w:bookmarkStart w:id="65" w:name="_Toc240315755"/>
-      <w:r>
-        <w:t>4.5.6 Pertinence du matching Job idéal</w:t>
-      </w:r>
-      <w:bookmarkEnd w:id="65"/>
-    </w:p>
-    <w:p>
-      <w:pPr>
-        <w:jc w:val="both"/>
-      </w:pPr>
-      <w:r>
-        <w:t xml:space="preserve">La fonctionnalité de matching inverse, par laquelle un visiteur dépose son CV et le système lui suggère les offres les plus proches, retournait des résultats peu pertinents : un profil DevOps se voyait par exemple proposer des postes de développement back-end. L’analyse a révélé deux causes : le score ne tenait compte que des compétences requises, en ignorant l’intitulé de l’offre, et le jeu de données comportait de nombreuses annonces en double qui saturaient le lot soumis à l’IA. J’ai corrigé les deux points en combinant, dans le score, l’intitulé de l’offre (pondéré à 60 %) et les compétences (40 %), et en dédupliquant les offres identiques avant l’appel à l’IA. Chaque profil (Java, DevOps, ProdOps, QA) ressort désormais sur les offres qui lui correspondent réellement.</w:t>
-      </w:r>
-    </w:p>
-    <w:p>
-      <w:pPr>
-        <w:pStyle w:val="Titre3"/>
-      </w:pPr>
-      <w:bookmarkStart w:id="66" w:name="_Toc240315756"/>
-      <w:r>
-        <w:t>4.5.7 Traitement distinct des candidatures retirées</w:t>
-      </w:r>
-      <w:bookmarkEnd w:id="66"/>
-    </w:p>
-    <w:p>
-      <w:pPr>
-        <w:jc w:val="both"/>
-      </w:pPr>
-      <w:r>
-        <w:t xml:space="preserve">Une candidature retirée (statut WITHDRAWN) était jusque-là confondue avec les candidatures rejetées dans les filtres de la liste, et cette liste ne se mettait à jour qu’après rechargement de la page. J’ai séparé le retrait du rejet en lui dédiant son propre filtre, à l’image du filtre des candidatures rejetées, dans la liste des candidatures comme sur le tableau de bord, et fait en sorte que tout changement de statut rafraîchisse immédiatement la liste : un candidat passé en candidature retirée quitte aussitôt la vue active et le compteur est décrémenté, sans rechargement. Ces candidatures ne sont pas supprimées automatiquement : elles restent consultables via leur filtre, comme les candidatures rejetées. Un candidat peut aussi retirer lui-même sa candidature tant qu’elle n’est pas close, via un endpoint dédié qui ne passe pas par les actions réservées au RH ou au manager.</w:t>
-      </w:r>
-    </w:p>
-    <w:p>
-      <w:pPr>
-        <w:pStyle w:val="Titre3"/>
-      </w:pPr>
-      <w:bookmarkStart w:id="67" w:name="_Toc240315757"/>
-      <w:r>
-        <w:t>4.5.8 Entretien téléphonique RH obligatoire avant acceptation</w:t>
-      </w:r>
-      <w:bookmarkEnd w:id="67"/>
-    </w:p>
-    <w:p>
-      <w:pPr>
-        <w:jc w:val="both"/>
-      </w:pPr>
-      <w:r>
-        <w:t xml:space="preserve">En testant le parcours RH de bout en bout, je me suis rendu compte qu’un candidat pouvait être accepté directement depuis CV_REVIEWED, sans qu’aucun entretien téléphonique n’ait eu lieu : la machine à états ne l’interdisait pas explicitement. Cela allait à l’encontre du processus voulu, où cet entretien constitue le premier vrai filtre humain avant de solliciter le manager. J’ai donc retiré la transition CV_REVIEWED vers ACCEPTED : depuis cette étape, seuls restent possibles le passage en entretien téléphonique, le refus ou le retrait. Un profil manifestement hors sujet peut toujours être écarté sans attendre cet entretien ; c’est uniquement l’acceptation qui exige désormais d’être passé par PHONE_SCREENING.</w:t>
-      </w:r>
-    </w:p>
-    <w:p>
-      <w:pPr>
-        <w:pStyle w:val="Titre3"/>
-      </w:pPr>
-      <w:bookmarkStart w:id="68" w:name="_Toc240315758"/>
-      <w:r>
-        <w:t>4.5.9 Découplage entre planification d’entretien et statut du candidat</w:t>
-      </w:r>
-      <w:bookmarkEnd w:id="68"/>
-    </w:p>
-    <w:p>
-      <w:pPr>
-        <w:jc w:val="both"/>
-      </w:pPr>
-      <w:r>
-        <w:t xml:space="preserve">Ce même exercice a fait remonter un second problème, plus discret : planifier un entretien changeait le statut du candidat selon le type choisi, mais sans passer ni par le garde-fou décrit en 4.5.3, ni par le contrôle de périmètre du manager. Concrètement, planifier un entretien téléphonique sur un dossier déjà en phase technique suffisait à faire régresser son statut, sans qu’aucune vérification ne s’y oppose. J’ai séparé les deux responsabilités : la planification reste une opération de logistique (date, intervieweur, lieu) qui n’a plus aucun effet sur le statut ; seules des actions de statut dédiées, elles-mêmes protégées par des garde-fous, font avancer le dossier. Pour ne pas perdre en confort d’usage, l’interface garde une case à cocher optionnelle qui déclenche la transition correspondante en un clic, mais via l’endpoint protégé par ce même garde-fou, donc sans contourner la règle.</w:t>
-      </w:r>
-    </w:p>
-    <w:p>
-      <w:pPr>
-        <w:pStyle w:val="Titre3"/>
-      </w:pPr>
-      <w:bookmarkStart w:id="69" w:name="_Toc240315759"/>
-      <w:r>
-        <w:t>4.5.10 Fiabiliser l’intégration Google Meet et le format des webhooks n8n</w:t>
-      </w:r>
-      <w:bookmarkEnd w:id="69"/>
-    </w:p>
-    <w:p>
-      <w:r>
-        <w:t xml:space="preserve">Le lien Google Meet envoyé aux candidats et aux managers reposait initialement sur une valeur fictive, générée côté n8n sans appel réel à l’API Google Calendar — une limitation assumée à ce stade du développement. En remplaçant ce mécanisme par une véritable création d’événement Google Calendar (avec génération automatique du lien Meet), un problème plus ancien est remonté : le nœud Webhook de n8n imbrique le corps réel de la requête POST sous un champ body, alors que le workflow lisait les données à la racine. Ce défaut, antérieur à cette évolution, cassait silencieusement à la fois le routage de l’agent d’entretien et, potentiellement, celui de l’agent de décision finale. Je l’ai corrigé aux trois endroits concernés, puis validé le nouveau flux de bout en bout : création réelle de l’événement, ajout des participants, envoi de l’e-mail de convocation, et sauvegarde du lien via un point d’API dédié. Pour que cet appel à n8n reste fiable même en cas d’indisponibilité passagère, le back-end s’appuie sur une file d’attente interne (outbox) : chaque déclenchement est journalisé, puis retenté automatiquement en cas d’échec avec un délai croissant (5 s, 10 s, 20 s, 40 s puis 80 s ; le plafond théorique de 300 s n’est jamais atteint avec cinq relances), soit au plus 6 tentatives au total, ce qui évite de perdre un événement sans pour autant bloquer la requête initiale.</w:t>
-      </w:r>
-    </w:p>
-    <w:p>
-      <w:pPr>
-        <w:pStyle w:val="Titre3"/>
-      </w:pPr>
-      <w:bookmarkStart w:id="70" w:name="_Toc240315760"/>
-      <w:r>
-        <w:t>4.5.11 Cloisonnement des données dans le chatbot candidat</w:t>
-      </w:r>
-      <w:bookmarkEnd w:id="70"/>
-    </w:p>
-    <w:p>
-      <w:r>
-        <w:t xml:space="preserve">L’ajout d’un assistant conversationnel candidat posait un risque spécifique : un modèle de langage peut, si on le laisse faire, être incité par un utilisateur malveillant à révéler des informations qu’il ne devrait pas partager, y compris celles qu’on lui a explicitement fournies en contexte. J’ai donc construit le contexte transmis au modèle en excluant dès la source, avant même l’appel à l’IA, le score et le résumé générés par l’agent de scoring, la correction manuelle du RH, l’identité de l’intervieweur et les notes internes d’entretien — ces champs ne quittent jamais le back-end vers le prompt. Le message système impose en complément au modèle de ne répondre qu’à partir de ce contexte filtré, d’ignorer toute instruction contraire glissée dans la question du candidat, et de ne jamais reproduire ce contexte mot pour mot. Ces deux niveaux de protection — filtrage des données à la source, puis consignes du prompt système — ont été validés par des tests manuels explicites : demande directe du score, de l’identité de l’intervieweur, et tentative d’injection de prompt (« ignore tes instructions précédentes... ») ; dans les trois cas, l’assistant refuse poliment sans jamais divulguer l’information protégée.</w:t>
-      </w:r>
-    </w:p>
-    <w:p>
-      <w:pPr>
-        <w:pStyle w:val="Titre2"/>
-      </w:pPr>
-      <w:bookmarkStart w:id="71" w:name="_Toc240315761"/>
-      <w:r>
-        <w:t>4.6 Protection des données et éthique de l’IA</w:t>
-      </w:r>
-      <w:bookmarkEnd w:id="71"/>
-    </w:p>
-    <w:p>
-      <w:r>
-        <w:t xml:space="preserve">La plateforme manipule des données à caractère personnel : identité, coordonnées, CV et évaluations des candidats. Plusieurs principes ont guidé leur traitement. L’accès aux dossiers est strictement contrôlé selon le rôle de l’utilisateur, comme détaillé au tableau de la section 2.2.1 : un manager ne voit que les candidatures de son périmètre, seuls RH et Administrateur disposant d’une vue d’ensemble. Les mots de passe sont hachés (section 4.2.4), et chaque action sensible sur un dossier candidat est journalisée dans le journal d’audit avec l’identité de son auteur et un horodatage — de quoi retracer qui a modifié un dossier donné. Plusieurs protections techniques complètent ce socle : une limitation du nombre de tentatives de connexion pour freiner les attaques par force brute et un garde-fou contre les redirections internes non autorisées sur le point d’API utilisé pour tester la connectivité des webhooks n8n. Une validation du contenu réel des fichiers déposés, au-delà de la seule extension déclarée, reste en revanche une amélioration prévue pour la mise en production (section 4.2.4).</w:t>
-      </w:r>
-    </w:p>
-    <w:p>
-      <w:r>
-        <w:t xml:space="preserve">Le score attribué par l’agent d’intelligence artificielle est une aide à la présélection, pas une décision autonome : comme détaillé au chapitre 3, un score insuffisant déclenche un rejet automatique, mais ce rejet reste réversible par un RH ou un Administrateur via le mécanisme de surcharge manuelle, avec justification obligatoire et traçabilité complète. Cette conception vise à limiter le risque d’erreur ou de biais algorithmique en gardant un contrôle humain sur toute décision affectant un candidat, dans l’esprit des principes du RGPD [17], [18] relatifs aux décisions individuelles automatisées.</w:t>
-      </w:r>
-    </w:p>
-    <w:p>
-      <w:r>
-        <w:t xml:space="preserve">Ce dispositif comporte néanmoins des limites qu’il convient d’assumer : la dépendance à un service d’IA externe (Cohere) et à sa disponibilité, la sensibilité du score à la qualité et à la structure du CV fourni, le risque de biais inhérent à tout modèle statistique, et l’absence volontaire de décision entièrement autonome — chaque rejet automatique restant réversible par un opérateur humain. Pour ne jamais bloquer le dépôt d’une candidature en cas d’indisponibilité ou d’erreur de l’API de Cohere, un mode dégradé prend automatiquement le relais : le score est alors calculé par une heuristique locale (analyse de mots-clés et de structure du texte), la source du score (COHERE ou SIMULATED) étant conservée pour traçabilité. Ces limites justifient le maintien systématique d’une validation humaine et d’une traçabilité complète des décisions prises. La conception du processus de recrutement doit aussi tenir compte des principes de diversité et d’inclusion, afin de limiter les risques de discrimination dans des processus de sélection automatisés [19]. Par ailleurs, les captures d’écran présentées dans ce rapport (section 4.3) utilisent des données de test fictives ou anonymisées, à l’exception de quelques comptes de démonstration que j’ai moi-même créés à des fins de test.</w:t>
-      </w:r>
-    </w:p>
-    <w:p>
-      <w:r>
-        <w:t xml:space="preserve">Le chatbot candidat introduit en fin de projet (section 4.5.11) applique les mêmes principes : il ne s’appuie que sur les données de candidature du candidat connecté, dérivées côté serveur à partir du jeton JWT plutôt que d’un identifiant transmis par le client, et exclut structurellement les champs à usage interne (score IA, notes RH, identité de l’intervieweur) du contexte envoyé au modèle de langage.</w:t>
-      </w:r>
-    </w:p>
-    <w:p>
-      <w:r>
-        <w:t xml:space="preserve">Le traitement des données des candidats soulève plusieurs points de conformité qu’il convient d’expliciter. Premièrement, des transferts vers des services d’IA tiers ont lieu : le scoring des CV transite par l’API de Cohere et l’assistant conversationnel par l’API OpenRouter ; ces flux doivent être encadrés (clauses contractuelles, minimisation des données transmises, information claire des candidats). Deuxièmement, le modèle de langage (LLM) utilisé pour le chatbot est un modèle expérimental « stealth » (stealth/ox-alpha via OpenRouter), retenu pour la phase de développement : son fournisseur n’étant pas explicitement identifié, ce choix doit être documenté et justifié au regard de la loyauté du traitement, puis remplacé en production par un modèle dont le fournisseur et les conditions de conservation des données sont connus. Troisièmement, la plateforme ne prévoit pas encore de politique explicite de durée de conservation et d’effacement des données des candidats (CV, évaluations) : il faudra la définir et l’outiller (archivage, purge automatique, exercice du droit à l’effacement). Quatrièmement, au niveau national, la loi organique tunisienne n° 2004-63 du 27 juillet 2004 relative à la protection des données à caractère personnel s’applique [20], sous le contrôle de l’Instance nationale de protection des données personnelles (INPDP) : elle impose notamment un consentement éclairé du candidat, recueilli lors du dépôt de candidature par une case à cocher explicite (figure 4.13), dont le libellé devra être complété pour mentionner les traitements par des services d’IA tiers. Cinquièmement, un système de scoring utilisé dans un processus de recrutement est susceptible d’être qualifié de système d’IA à « haut risque » au sens du règlement européen sur l’IA (AI Act, règlement (UE) 2024/1689) [21] ; il appelle à ce titre une traçabilité renforcée, une supervision humaine effective et une documentation du modèle — principes déjà partiellement mis en œuvre ici (surcharge manuelle justifiée, journal d’audit, contrôle humain sur toute décision).</w:t>
-      </w:r>
-    </w:p>
-    <w:p>
-      <w:pPr>
-        <w:pStyle w:val="Titre2"/>
-      </w:pPr>
-      <w:bookmarkStart w:id="72" w:name="_Toc240315762"/>
-      <w:r>
-        <w:t>4.7 Bilan des fonctionnalités réalisées</w:t>
-      </w:r>
-      <w:bookmarkEnd w:id="72"/>
-    </w:p>
-    <w:p>
-      <w:r>
-        <w:t>Le tableau suivant récapitule, par grand domaine fonctionnel, l’état d’avancement des développements à l’issue du projet.</w:t>
+      <w:bookmarkStart w:id="58" w:name="_Toc240315748"/>
+      <w:r>
+        <w:t xml:space="preserve">4.4.5 Évaluation du matching sur un jeu de référence annoté (Gold Set)</w:t>
+      </w:r>
+      <w:bookmarkEnd w:id="58"/>
+    </w:p>
+    <w:p>
+      <w:r>
+        <w:t xml:space="preserve">Les tests décrits ci-dessus vérifient que la plateforme fonctionne ; ils ne disent rien de la pertinence du score attribué par l’IA. J’ai donc constitué un jeu de référence — un Gold Set — de seize curriculum vitæ synthétiques, rédigés pour ce projet à partir de profils réalistes mais fictifs : aucun CV réel d’un collaborateur de Sopra HR n’a été employé, ce qui écarte toute question de confidentialité dans la démarche d’évaluation.</w:t>
+      </w:r>
+    </w:p>
+    <w:p>
+      <w:r>
+        <w:t xml:space="preserve">Les seize profils se répartissent sur les trois familles de métiers visées par la plateforme, chacune rattachée à une offre cible : Développeur Backend Java/Spring (offre 115, six profils), DevOps Engineer (offre 117, cinq profils) et Business Analyst (offre 122, cinq profils). Chaque CV porte une vérité terrain binaire, PERTINENT ou NON_PERTINENT, arrêtée sur des critères objectifs — compétences techniques indispensables et séniorité — et non d’après la sortie du modèle : neuf profils sont pertinents, sept sont volontairement hors cible (compétences d’un autre domaine, séniorité insuffisante, outillage sans rapport avec l’offre).</w:t>
+      </w:r>
+    </w:p>
+    <w:p>
+      <w:r>
+        <w:t xml:space="preserve">Le protocole s’appuie sur le point d’entrée POST /api/matching/evaluate-gold-set, qui reçoit un CV et l’identifiant de l’offre cible, rejoue la chaîne complète (extraction du texte, normalisation des compétences, appel à l’API de Cohere, pondération par profil de scoring) et renvoie le score avec son explication, sans créer de candidature. La décision automatique — le score atteint-il le seuil — est alors confrontée à la vérité terrain, ce qui donne la matrice de confusion du tableau 4.2 pour trois seuils.</w:t>
       </w:r>
     </w:p>
     <w:p>
@@ -9607,7 +9446,1076 @@
           <w:i/>
           <w:sz w:val="21"/>
         </w:rPr>
-        <w:t>Tableau 4.2 : Bilan des fonctionnalités réalisées</w:t>
+        <w:t xml:space="preserve">Tableau 4.2 : Matrice de confusion du Gold Set selon le seuil de décision</w:t>
+      </w:r>
+    </w:p>
+    <w:tbl>
+      <w:tblPr>
+        <w:tblW w:w="9206" w:type="dxa"/>
+        <w:tblBorders>
+          <w:top w:val="single" w:sz="4" w:space="0" w:color="auto"/>
+          <w:left w:val="single" w:sz="4" w:space="0" w:color="auto"/>
+          <w:bottom w:val="single" w:sz="4" w:space="0" w:color="auto"/>
+          <w:right w:val="single" w:sz="4" w:space="0" w:color="auto"/>
+          <w:insideH w:val="single" w:sz="4" w:space="0" w:color="auto"/>
+          <w:insideV w:val="single" w:sz="4" w:space="0" w:color="auto"/>
+        </w:tblBorders>
+        <w:tblLayout w:type="fixed"/>
+        <w:tblCellMar>
+          <w:left w:w="70" w:type="dxa"/>
+          <w:right w:w="70" w:type="dxa"/>
+        </w:tblCellMar>
+        <w:tblLook w:val="0000" w:firstRow="0" w:lastRow="0" w:firstColumn="0" w:lastColumn="0" w:noHBand="0" w:noVBand="0"/>
+      </w:tblPr>
+      <w:tblGrid>
+        <w:gridCol w:w="2761"/>
+        <w:gridCol w:w="2163"/>
+        <w:gridCol w:w="2163"/>
+        <w:gridCol w:w="2119"/>
+      </w:tblGrid>
+      <w:tr>
+        <w:trPr>
+          <w:tblHeader/>
+          <w:cantSplit/>
+        </w:trPr>
+        <w:tc>
+          <w:tcPr>
+            <w:tcW w:w="2761" w:type="dxa"/>
+            <w:shd w:val="clear" w:color="auto" w:fill="D9D9D9"/>
+          </w:tcPr>
+          <w:p>
+            <w:pPr>
+              <w:keepNext/>
+              <w:rPr>
+                <w:b/>
+                <w:sz w:val="21"/>
+              </w:rPr>
+            </w:pPr>
+            <w:r>
+              <w:rPr>
+                <w:b/>
+                <w:sz w:val="21"/>
+              </w:rPr>
+              <w:t xml:space="preserve">Critère</w:t>
+            </w:r>
+          </w:p>
+        </w:tc>
+        <w:tc>
+          <w:tcPr>
+            <w:tcW w:w="2163" w:type="dxa"/>
+            <w:shd w:val="clear" w:color="auto" w:fill="D9D9D9"/>
+          </w:tcPr>
+          <w:p>
+            <w:pPr>
+              <w:keepNext/>
+              <w:rPr>
+                <w:b/>
+                <w:sz w:val="21"/>
+              </w:rPr>
+              <w:jc w:val="center"/>
+            </w:pPr>
+            <w:r>
+              <w:rPr>
+                <w:b/>
+                <w:sz w:val="21"/>
+              </w:rPr>
+              <w:t xml:space="preserve">Seuil = 50</w:t>
+            </w:r>
+          </w:p>
+        </w:tc>
+        <w:tc>
+          <w:tcPr>
+            <w:tcW w:w="2163" w:type="dxa"/>
+            <w:shd w:val="clear" w:color="auto" w:fill="D9D9D9"/>
+          </w:tcPr>
+          <w:p>
+            <w:pPr>
+              <w:keepNext/>
+              <w:rPr>
+                <w:b/>
+                <w:sz w:val="21"/>
+              </w:rPr>
+              <w:jc w:val="center"/>
+            </w:pPr>
+            <w:r>
+              <w:rPr>
+                <w:b/>
+                <w:sz w:val="21"/>
+              </w:rPr>
+              <w:t xml:space="preserve">Seuil = 60 (retenu)</w:t>
+            </w:r>
+          </w:p>
+        </w:tc>
+        <w:tc>
+          <w:tcPr>
+            <w:tcW w:w="2119" w:type="dxa"/>
+            <w:shd w:val="clear" w:color="auto" w:fill="D9D9D9"/>
+          </w:tcPr>
+          <w:p>
+            <w:pPr>
+              <w:keepNext/>
+              <w:rPr>
+                <w:b/>
+                <w:sz w:val="21"/>
+              </w:rPr>
+              <w:jc w:val="center"/>
+            </w:pPr>
+            <w:r>
+              <w:rPr>
+                <w:b/>
+                <w:sz w:val="21"/>
+              </w:rPr>
+              <w:t xml:space="preserve">Seuil = 70</w:t>
+            </w:r>
+          </w:p>
+        </w:tc>
+      </w:tr>
+      <w:tr>
+        <w:trPr>
+          <w:cantSplit/>
+        </w:trPr>
+        <w:tc>
+          <w:tcPr>
+            <w:tcW w:w="2761" w:type="dxa"/>
+          </w:tcPr>
+          <w:p>
+            <w:pPr>
+              <w:rPr>
+                <w:sz w:val="21"/>
+              </w:rPr>
+            </w:pPr>
+            <w:r>
+              <w:rPr>
+                <w:sz w:val="21"/>
+              </w:rPr>
+              <w:t xml:space="preserve">Vrais positifs (TP)</w:t>
+            </w:r>
+          </w:p>
+        </w:tc>
+        <w:tc>
+          <w:tcPr>
+            <w:tcW w:w="2163" w:type="dxa"/>
+          </w:tcPr>
+          <w:p>
+            <w:pPr>
+              <w:rPr>
+                <w:sz w:val="21"/>
+              </w:rPr>
+              <w:jc w:val="center"/>
+            </w:pPr>
+            <w:r>
+              <w:rPr>
+                <w:sz w:val="21"/>
+              </w:rPr>
+              <w:t xml:space="preserve">9</w:t>
+            </w:r>
+          </w:p>
+        </w:tc>
+        <w:tc>
+          <w:tcPr>
+            <w:tcW w:w="2163" w:type="dxa"/>
+          </w:tcPr>
+          <w:p>
+            <w:pPr>
+              <w:rPr>
+                <w:sz w:val="21"/>
+              </w:rPr>
+              <w:jc w:val="center"/>
+            </w:pPr>
+            <w:r>
+              <w:rPr>
+                <w:sz w:val="21"/>
+              </w:rPr>
+              <w:t xml:space="preserve">9</w:t>
+            </w:r>
+          </w:p>
+        </w:tc>
+        <w:tc>
+          <w:tcPr>
+            <w:tcW w:w="2119" w:type="dxa"/>
+          </w:tcPr>
+          <w:p>
+            <w:pPr>
+              <w:rPr>
+                <w:sz w:val="21"/>
+              </w:rPr>
+              <w:jc w:val="center"/>
+            </w:pPr>
+            <w:r>
+              <w:rPr>
+                <w:sz w:val="21"/>
+              </w:rPr>
+              <w:t xml:space="preserve">8</w:t>
+            </w:r>
+          </w:p>
+        </w:tc>
+      </w:tr>
+      <w:tr>
+        <w:trPr>
+          <w:cantSplit/>
+        </w:trPr>
+        <w:tc>
+          <w:tcPr>
+            <w:tcW w:w="2761" w:type="dxa"/>
+          </w:tcPr>
+          <w:p>
+            <w:pPr>
+              <w:rPr>
+                <w:sz w:val="21"/>
+              </w:rPr>
+            </w:pPr>
+            <w:r>
+              <w:rPr>
+                <w:sz w:val="21"/>
+              </w:rPr>
+              <w:t xml:space="preserve">Faux positifs (FP)</w:t>
+            </w:r>
+          </w:p>
+        </w:tc>
+        <w:tc>
+          <w:tcPr>
+            <w:tcW w:w="2163" w:type="dxa"/>
+          </w:tcPr>
+          <w:p>
+            <w:pPr>
+              <w:rPr>
+                <w:sz w:val="21"/>
+              </w:rPr>
+              <w:jc w:val="center"/>
+            </w:pPr>
+            <w:r>
+              <w:rPr>
+                <w:sz w:val="21"/>
+              </w:rPr>
+              <w:t xml:space="preserve">0</w:t>
+            </w:r>
+          </w:p>
+        </w:tc>
+        <w:tc>
+          <w:tcPr>
+            <w:tcW w:w="2163" w:type="dxa"/>
+          </w:tcPr>
+          <w:p>
+            <w:pPr>
+              <w:rPr>
+                <w:sz w:val="21"/>
+              </w:rPr>
+              <w:jc w:val="center"/>
+            </w:pPr>
+            <w:r>
+              <w:rPr>
+                <w:sz w:val="21"/>
+              </w:rPr>
+              <w:t xml:space="preserve">0</w:t>
+            </w:r>
+          </w:p>
+        </w:tc>
+        <w:tc>
+          <w:tcPr>
+            <w:tcW w:w="2119" w:type="dxa"/>
+          </w:tcPr>
+          <w:p>
+            <w:pPr>
+              <w:rPr>
+                <w:sz w:val="21"/>
+              </w:rPr>
+              <w:jc w:val="center"/>
+            </w:pPr>
+            <w:r>
+              <w:rPr>
+                <w:sz w:val="21"/>
+              </w:rPr>
+              <w:t xml:space="preserve">0</w:t>
+            </w:r>
+          </w:p>
+        </w:tc>
+      </w:tr>
+      <w:tr>
+        <w:trPr>
+          <w:cantSplit/>
+        </w:trPr>
+        <w:tc>
+          <w:tcPr>
+            <w:tcW w:w="2761" w:type="dxa"/>
+          </w:tcPr>
+          <w:p>
+            <w:pPr>
+              <w:rPr>
+                <w:sz w:val="21"/>
+              </w:rPr>
+            </w:pPr>
+            <w:r>
+              <w:rPr>
+                <w:sz w:val="21"/>
+              </w:rPr>
+              <w:t xml:space="preserve">Vrais négatifs (TN)</w:t>
+            </w:r>
+          </w:p>
+        </w:tc>
+        <w:tc>
+          <w:tcPr>
+            <w:tcW w:w="2163" w:type="dxa"/>
+          </w:tcPr>
+          <w:p>
+            <w:pPr>
+              <w:rPr>
+                <w:sz w:val="21"/>
+              </w:rPr>
+              <w:jc w:val="center"/>
+            </w:pPr>
+            <w:r>
+              <w:rPr>
+                <w:sz w:val="21"/>
+              </w:rPr>
+              <w:t xml:space="preserve">7</w:t>
+            </w:r>
+          </w:p>
+        </w:tc>
+        <w:tc>
+          <w:tcPr>
+            <w:tcW w:w="2163" w:type="dxa"/>
+          </w:tcPr>
+          <w:p>
+            <w:pPr>
+              <w:rPr>
+                <w:sz w:val="21"/>
+              </w:rPr>
+              <w:jc w:val="center"/>
+            </w:pPr>
+            <w:r>
+              <w:rPr>
+                <w:sz w:val="21"/>
+              </w:rPr>
+              <w:t xml:space="preserve">7</w:t>
+            </w:r>
+          </w:p>
+        </w:tc>
+        <w:tc>
+          <w:tcPr>
+            <w:tcW w:w="2119" w:type="dxa"/>
+          </w:tcPr>
+          <w:p>
+            <w:pPr>
+              <w:rPr>
+                <w:sz w:val="21"/>
+              </w:rPr>
+              <w:jc w:val="center"/>
+            </w:pPr>
+            <w:r>
+              <w:rPr>
+                <w:sz w:val="21"/>
+              </w:rPr>
+              <w:t xml:space="preserve">7</w:t>
+            </w:r>
+          </w:p>
+        </w:tc>
+      </w:tr>
+      <w:tr>
+        <w:trPr>
+          <w:cantSplit/>
+        </w:trPr>
+        <w:tc>
+          <w:tcPr>
+            <w:tcW w:w="2761" w:type="dxa"/>
+          </w:tcPr>
+          <w:p>
+            <w:pPr>
+              <w:rPr>
+                <w:sz w:val="21"/>
+              </w:rPr>
+            </w:pPr>
+            <w:r>
+              <w:rPr>
+                <w:sz w:val="21"/>
+              </w:rPr>
+              <w:t xml:space="preserve">Faux négatifs (FN)</w:t>
+            </w:r>
+          </w:p>
+        </w:tc>
+        <w:tc>
+          <w:tcPr>
+            <w:tcW w:w="2163" w:type="dxa"/>
+          </w:tcPr>
+          <w:p>
+            <w:pPr>
+              <w:rPr>
+                <w:sz w:val="21"/>
+              </w:rPr>
+              <w:jc w:val="center"/>
+            </w:pPr>
+            <w:r>
+              <w:rPr>
+                <w:sz w:val="21"/>
+              </w:rPr>
+              <w:t xml:space="preserve">0</w:t>
+            </w:r>
+          </w:p>
+        </w:tc>
+        <w:tc>
+          <w:tcPr>
+            <w:tcW w:w="2163" w:type="dxa"/>
+          </w:tcPr>
+          <w:p>
+            <w:pPr>
+              <w:rPr>
+                <w:sz w:val="21"/>
+              </w:rPr>
+              <w:jc w:val="center"/>
+            </w:pPr>
+            <w:r>
+              <w:rPr>
+                <w:sz w:val="21"/>
+              </w:rPr>
+              <w:t xml:space="preserve">0</w:t>
+            </w:r>
+          </w:p>
+        </w:tc>
+        <w:tc>
+          <w:tcPr>
+            <w:tcW w:w="2119" w:type="dxa"/>
+          </w:tcPr>
+          <w:p>
+            <w:pPr>
+              <w:rPr>
+                <w:sz w:val="21"/>
+              </w:rPr>
+              <w:jc w:val="center"/>
+            </w:pPr>
+            <w:r>
+              <w:rPr>
+                <w:sz w:val="21"/>
+              </w:rPr>
+              <w:t xml:space="preserve">1</w:t>
+            </w:r>
+          </w:p>
+        </w:tc>
+      </w:tr>
+      <w:tr>
+        <w:trPr>
+          <w:cantSplit/>
+        </w:trPr>
+        <w:tc>
+          <w:tcPr>
+            <w:tcW w:w="2761" w:type="dxa"/>
+          </w:tcPr>
+          <w:p>
+            <w:pPr>
+              <w:rPr>
+                <w:sz w:val="21"/>
+              </w:rPr>
+            </w:pPr>
+            <w:r>
+              <w:rPr>
+                <w:sz w:val="21"/>
+              </w:rPr>
+              <w:t xml:space="preserve">Précision</w:t>
+            </w:r>
+          </w:p>
+        </w:tc>
+        <w:tc>
+          <w:tcPr>
+            <w:tcW w:w="2163" w:type="dxa"/>
+          </w:tcPr>
+          <w:p>
+            <w:pPr>
+              <w:rPr>
+                <w:sz w:val="21"/>
+              </w:rPr>
+              <w:jc w:val="center"/>
+            </w:pPr>
+            <w:r>
+              <w:rPr>
+                <w:sz w:val="21"/>
+              </w:rPr>
+              <w:t xml:space="preserve">100 %</w:t>
+            </w:r>
+          </w:p>
+        </w:tc>
+        <w:tc>
+          <w:tcPr>
+            <w:tcW w:w="2163" w:type="dxa"/>
+          </w:tcPr>
+          <w:p>
+            <w:pPr>
+              <w:rPr>
+                <w:sz w:val="21"/>
+              </w:rPr>
+              <w:jc w:val="center"/>
+            </w:pPr>
+            <w:r>
+              <w:rPr>
+                <w:sz w:val="21"/>
+              </w:rPr>
+              <w:t xml:space="preserve">100 %</w:t>
+            </w:r>
+          </w:p>
+        </w:tc>
+        <w:tc>
+          <w:tcPr>
+            <w:tcW w:w="2119" w:type="dxa"/>
+          </w:tcPr>
+          <w:p>
+            <w:pPr>
+              <w:rPr>
+                <w:sz w:val="21"/>
+              </w:rPr>
+              <w:jc w:val="center"/>
+            </w:pPr>
+            <w:r>
+              <w:rPr>
+                <w:sz w:val="21"/>
+              </w:rPr>
+              <w:t xml:space="preserve">100 %</w:t>
+            </w:r>
+          </w:p>
+        </w:tc>
+      </w:tr>
+      <w:tr>
+        <w:trPr>
+          <w:cantSplit/>
+        </w:trPr>
+        <w:tc>
+          <w:tcPr>
+            <w:tcW w:w="2761" w:type="dxa"/>
+          </w:tcPr>
+          <w:p>
+            <w:pPr>
+              <w:rPr>
+                <w:sz w:val="21"/>
+              </w:rPr>
+            </w:pPr>
+            <w:r>
+              <w:rPr>
+                <w:sz w:val="21"/>
+              </w:rPr>
+              <w:t xml:space="preserve">Rappel</w:t>
+            </w:r>
+          </w:p>
+        </w:tc>
+        <w:tc>
+          <w:tcPr>
+            <w:tcW w:w="2163" w:type="dxa"/>
+          </w:tcPr>
+          <w:p>
+            <w:pPr>
+              <w:rPr>
+                <w:sz w:val="21"/>
+              </w:rPr>
+              <w:jc w:val="center"/>
+            </w:pPr>
+            <w:r>
+              <w:rPr>
+                <w:sz w:val="21"/>
+              </w:rPr>
+              <w:t xml:space="preserve">100 %</w:t>
+            </w:r>
+          </w:p>
+        </w:tc>
+        <w:tc>
+          <w:tcPr>
+            <w:tcW w:w="2163" w:type="dxa"/>
+          </w:tcPr>
+          <w:p>
+            <w:pPr>
+              <w:rPr>
+                <w:sz w:val="21"/>
+              </w:rPr>
+              <w:jc w:val="center"/>
+            </w:pPr>
+            <w:r>
+              <w:rPr>
+                <w:sz w:val="21"/>
+              </w:rPr>
+              <w:t xml:space="preserve">100 %</w:t>
+            </w:r>
+          </w:p>
+        </w:tc>
+        <w:tc>
+          <w:tcPr>
+            <w:tcW w:w="2119" w:type="dxa"/>
+          </w:tcPr>
+          <w:p>
+            <w:pPr>
+              <w:rPr>
+                <w:sz w:val="21"/>
+              </w:rPr>
+              <w:jc w:val="center"/>
+            </w:pPr>
+            <w:r>
+              <w:rPr>
+                <w:sz w:val="21"/>
+              </w:rPr>
+              <w:t xml:space="preserve">88,9 %</w:t>
+            </w:r>
+          </w:p>
+        </w:tc>
+      </w:tr>
+      <w:tr>
+        <w:trPr>
+          <w:cantSplit/>
+        </w:trPr>
+        <w:tc>
+          <w:tcPr>
+            <w:tcW w:w="2761" w:type="dxa"/>
+          </w:tcPr>
+          <w:p>
+            <w:pPr>
+              <w:rPr>
+                <w:sz w:val="21"/>
+              </w:rPr>
+            </w:pPr>
+            <w:r>
+              <w:rPr>
+                <w:sz w:val="21"/>
+              </w:rPr>
+              <w:t xml:space="preserve">F1-score</w:t>
+            </w:r>
+          </w:p>
+        </w:tc>
+        <w:tc>
+          <w:tcPr>
+            <w:tcW w:w="2163" w:type="dxa"/>
+          </w:tcPr>
+          <w:p>
+            <w:pPr>
+              <w:rPr>
+                <w:sz w:val="21"/>
+              </w:rPr>
+              <w:jc w:val="center"/>
+            </w:pPr>
+            <w:r>
+              <w:rPr>
+                <w:sz w:val="21"/>
+              </w:rPr>
+              <w:t xml:space="preserve">100 %</w:t>
+            </w:r>
+          </w:p>
+        </w:tc>
+        <w:tc>
+          <w:tcPr>
+            <w:tcW w:w="2163" w:type="dxa"/>
+          </w:tcPr>
+          <w:p>
+            <w:pPr>
+              <w:rPr>
+                <w:sz w:val="21"/>
+              </w:rPr>
+              <w:jc w:val="center"/>
+            </w:pPr>
+            <w:r>
+              <w:rPr>
+                <w:sz w:val="21"/>
+              </w:rPr>
+              <w:t xml:space="preserve">100 %</w:t>
+            </w:r>
+          </w:p>
+        </w:tc>
+        <w:tc>
+          <w:tcPr>
+            <w:tcW w:w="2119" w:type="dxa"/>
+          </w:tcPr>
+          <w:p>
+            <w:pPr>
+              <w:rPr>
+                <w:sz w:val="21"/>
+              </w:rPr>
+              <w:jc w:val="center"/>
+            </w:pPr>
+            <w:r>
+              <w:rPr>
+                <w:sz w:val="21"/>
+              </w:rPr>
+              <w:t xml:space="preserve">94,1 %</w:t>
+            </w:r>
+          </w:p>
+        </w:tc>
+      </w:tr>
+      <w:tr>
+        <w:trPr>
+          <w:cantSplit/>
+        </w:trPr>
+        <w:tc>
+          <w:tcPr>
+            <w:tcW w:w="2761" w:type="dxa"/>
+          </w:tcPr>
+          <w:p>
+            <w:pPr>
+              <w:rPr>
+                <w:sz w:val="21"/>
+              </w:rPr>
+            </w:pPr>
+            <w:r>
+              <w:rPr>
+                <w:sz w:val="21"/>
+              </w:rPr>
+              <w:t xml:space="preserve">Exactitude</w:t>
+            </w:r>
+          </w:p>
+        </w:tc>
+        <w:tc>
+          <w:tcPr>
+            <w:tcW w:w="2163" w:type="dxa"/>
+          </w:tcPr>
+          <w:p>
+            <w:pPr>
+              <w:rPr>
+                <w:sz w:val="21"/>
+              </w:rPr>
+              <w:jc w:val="center"/>
+            </w:pPr>
+            <w:r>
+              <w:rPr>
+                <w:sz w:val="21"/>
+              </w:rPr>
+              <w:t xml:space="preserve">100 %</w:t>
+            </w:r>
+          </w:p>
+        </w:tc>
+        <w:tc>
+          <w:tcPr>
+            <w:tcW w:w="2163" w:type="dxa"/>
+          </w:tcPr>
+          <w:p>
+            <w:pPr>
+              <w:rPr>
+                <w:sz w:val="21"/>
+              </w:rPr>
+              <w:jc w:val="center"/>
+            </w:pPr>
+            <w:r>
+              <w:rPr>
+                <w:sz w:val="21"/>
+              </w:rPr>
+              <w:t xml:space="preserve">100 %</w:t>
+            </w:r>
+          </w:p>
+        </w:tc>
+        <w:tc>
+          <w:tcPr>
+            <w:tcW w:w="2119" w:type="dxa"/>
+          </w:tcPr>
+          <w:p>
+            <w:pPr>
+              <w:rPr>
+                <w:sz w:val="21"/>
+              </w:rPr>
+              <w:jc w:val="center"/>
+            </w:pPr>
+            <w:r>
+              <w:rPr>
+                <w:sz w:val="21"/>
+              </w:rPr>
+              <w:t xml:space="preserve">93,8 %</w:t>
+            </w:r>
+          </w:p>
+        </w:tc>
+      </w:tr>
+    </w:tbl>
+    <w:p>
+      <w:r>
+        <w:t xml:space="preserve">Avec le seuil retenu de 60/100, le système prend seize bonnes décisions sur seize : aucun profil pertinent n’est écarté (rappel de 100 %) et aucun profil hors cible n’est retenu (précision de 100 %). Abaisser le seuil à 50 ne change rien sur ce jeu mais laisserait passer des profils périphériques dès que les volumes augmentent ; le relever à 70 fait apparaître un faux négatif — le profil GOLD_14, développeuse Java dont le dossier est pourtant jugé pertinent et scoré 69/100 — et fait chuter le rappel à 88,9 %.</w:t>
+      </w:r>
+    </w:p>
+    <w:p>
+      <w:r>
+        <w:t xml:space="preserve">Le seuil de 60 est cohérent avec la distribution des scores obtenus : le meilleur profil non pertinent s’arrête à 47/100, soit treize points sous le seuil, tandis que le plus faible profil pertinent est à 69/100, soit neuf points au-dessus. Sur ce jeu, les deux populations ne se chevauchent donc pas.</w:t>
+      </w:r>
+    </w:p>
+    <w:p>
+      <w:r>
+        <w:t xml:space="preserve">Ces résultats demandent à être lus avec prudence : seize cas construits pour l’évaluation ne constituent pas une mesure de performance en conditions réelles. Le Gold Set valide un mécanisme de décision et un calibrage de seuil ; il ne remplace pas le suivi, en production, des faux positifs et des faux négatifs effectivement constatés par les recruteurs sur les candidatures réelles.</w:t>
+      </w:r>
+    </w:p>
+    <w:p>
+      <w:pPr>
+        <w:pStyle w:val="Titre3"/>
+      </w:pPr>
+      <w:bookmarkStart w:id="58" w:name="_Toc240315748"/>
+      <w:r>
+        <w:t xml:space="preserve">4.4.6 Validation humaine du score et explicabilité</w:t>
+      </w:r>
+      <w:bookmarkEnd w:id="58"/>
+    </w:p>
+    <w:p>
+      <w:r>
+        <w:t xml:space="preserve">Un moteur de présélection n’est fiable que s’il sait dire quand il ne l’est pas. Le service de scoring positionne le drapeau needsHumanReview et un motif lisible dans trois situations : texte extrait du CV trop court — moins de cinquante caractères, ce qui correspond à un scan, à une image ou à un fichier dégradé ; score en zone grise entre 55 et 65, c’est-à-dire de part et d’autre du seuil ; mode dégradé enfin, lorsque l’API de Cohere est indisponible ou renvoie une réponse inexploitable et que le score, calculé localement, est marqué avec la source SIMULATED. Le dossier signalé est présenté au recruteur comme demandant un arbitrage, au lieu d’être accepté ou rejeté automatiquement.</w:t>
+      </w:r>
+    </w:p>
+    <w:p>
+      <w:r>
+        <w:t xml:space="preserve">L’explicabilité est produite par le service SkillNormalizationService, appelé avant le modèle de langage : il harmonise les alias (k8s devient Kubernetes, postgres devient PostgreSQL) et refuse les fusions abusives — Spring Boot n’est pas Spring Cloud, Angular n’est pas AngularJS, Java n’est pas JavaScript — puis restitue les compétences validées (matchedSkills) et manquantes (missingSkills) avec un taux de recouvrement technique qui ne peut pas descendre sous 30/100. Ces éléments alimentent les badges affichés dans le détail d’une candidature (figure 4.15) et la synthèse enregistrée dans aiSummary.</w:t>
+      </w:r>
+    </w:p>
+    <w:p>
+      <w:r>
+        <w:t xml:space="preserve">L’arbitrage du recruteur est lui aussi tracé. Le point d’entrée PATCH /api/candidates/{id}/ai-score/override, réservé aux rôles RH et Administrateur, exige un score compris entre 0 et 100 et une justification non vide. Il conserve le score original dans aiScore, enregistre la correction dans manualScore, manualScoreReason, manualScoreBy et manualScoreDate, réinitialise needsHumanReview et écrit une entrée d’audit de type SCORE_OVERRIDE mentionnant la valeur précédente, la valeur nouvelle et le motif. Le statut est ensuite recalculé à partir du score effectif, ce qui permet à un dossier bloqué en zone grise de repartir normalement dans le pipeline.</w:t>
+      </w:r>
+    </w:p>
+    <w:p>
+      <w:r>
+        <w:t xml:space="preserve">J’ai vérifié ce parcours de bout en bout sur un dossier volontairement placé en zone grise : signalement dans l’interface, correction justifiée depuis un compte RH, puis contrôle de la ligne correspondante dans le journal d’audit (figure 4.11). Le score produit par l’IA restant consultable après coup, l’écart entre l’évaluation automatique et l’expertise humaine peut être mesuré et documenté.</w:t>
+      </w:r>
+    </w:p>
+    <w:p>
+      <w:pPr>
+        <w:pStyle w:val="Titre2"/>
+      </w:pPr>
+      <w:bookmarkStart w:id="59" w:name="_Toc240315749"/>
+      <w:r>
+        <w:t>4.5 Difficultés rencontrées et solutions apportées</w:t>
+      </w:r>
+      <w:bookmarkEnd w:id="59"/>
+    </w:p>
+    <w:p>
+      <w:r>
+        <w:t>Au-delà des fonctionnalités livrées, le développement de JOB4YOU a été jalonné de plusieurs difficultés concrètes. Je détaille ici les principales, représentatives des problèmes rencontrés sur ce projet.</w:t>
+      </w:r>
+    </w:p>
+    <w:p>
+      <w:pPr>
+        <w:pStyle w:val="Titre3"/>
+      </w:pPr>
+      <w:bookmarkStart w:id="60" w:name="_Toc240315750"/>
+      <w:r>
+        <w:t>4.5.1 Notification incomplète des managers</w:t>
+      </w:r>
+      <w:bookmarkEnd w:id="60"/>
+    </w:p>
+    <w:p>
+      <w:r>
+        <w:t xml:space="preserve">Un premier bug, découvert tardivement, concernait le routage automatique RH → manager. Lorsqu’une offre d’emploi était rattachée à une famille de métier suivie par plusieurs managers, seul le premier manager trouvé en base recevait la notification de validation RH : les autres n’étaient jamais informés, sans qu’aucune erreur ne soit levée. Le problème venait d’une méthode qui retournait un unique e-mail (le premier résultat de la requête) au lieu de la liste complète des managers concernés. La correction a consisté à faire retourner l’ensemble des adresses correspondantes et à notifier chaque manager individuellement, tout en veillant à ne pas dupliquer l’e-mail envoyé au candidat, qui doit rester unique quel que soit le nombre de managers notifiés. Ce routage a par la suite été affiné pour s’appuyer prioritairement sur le département de l’offre (CS, DevOps, ProdOps, R&amp;D, QA), la famille de métier n’intervenant plus qu’en repli pour les offres non rattachées à un département : un manager ne reçoit et ne voit désormais que les dossiers relevant strictement de son département, sans fuite possible vers un autre périmètre.</w:t>
+      </w:r>
+    </w:p>
+    <w:p>
+      <w:pPr>
+        <w:pStyle w:val="Titre3"/>
+      </w:pPr>
+      <w:bookmarkStart w:id="61" w:name="_Toc240315751"/>
+      <w:r>
+        <w:t>4.5.2 Distinguer un rejet RH d’un rejet manager</w:t>
+      </w:r>
+      <w:bookmarkEnd w:id="61"/>
+    </w:p>
+    <w:p>
+      <w:r>
+        <w:t>Le modèle de données utilise un statut unique, MANAGER_REJECTED, que ce soit le RH ou le manager qui prenne la décision de refus — les deux s’appuient sur le même mécanisme de décision. Or le tableau de bord devait afficher séparément les rejets RH et les rejets manager, ces derniers ventilés par famille de métier. Plutôt que d’introduire un nouveau statut en base (ce qui aurait complexifié le modèle pour un besoin purement d’affichage), j’ai choisi de reconstruire cette information à partir du journal d’audit existant : chaque changement de statut y est déjà associé à l’utilisateur qui l’a effectué, il suffisait de croiser ce nom d’utilisateur avec son rôle réel pour déterminer si la décision provenait du RH ou d’un manager, et dans ce dernier cas, de quelle famille de métier.</w:t>
+      </w:r>
+    </w:p>
+    <w:p>
+      <w:pPr>
+        <w:pStyle w:val="Titre3"/>
+      </w:pPr>
+      <w:bookmarkStart w:id="62" w:name="_Toc240315752"/>
+      <w:r>
+        <w:t>4.5.3 Cohérence des transitions de statut</w:t>
+      </w:r>
+      <w:bookmarkEnd w:id="62"/>
+    </w:p>
+    <w:p>
+      <w:r>
+        <w:t>Le cycle de vie d’une candidature comporte de nombreux états, et plusieurs actions (planifier un entretien, prendre une décision finale) n’ont de sens que si le dossier se trouve dans un état précis. Sans garde-fou, il était possible par exemple de planifier un entretien sur un dossier déjà rejeté, ou de faire valider un candidat par un manager avant même que le RH n’ait examiné son dossier. J’ai donc ajouté, côté back-end, des vérifications explicites avant chaque transition sensible, avec des messages d’erreur clairs renvoyés à l’interface plutôt que des échecs silencieux — un choix qui a nécessité de revenir plusieurs fois sur le diagramme d’états du chapitre 3 pour m’assurer que l’implémentation restait fidèle au modèle.</w:t>
+      </w:r>
+    </w:p>
+    <w:p>
+      <w:pPr>
+        <w:pStyle w:val="Titre3"/>
+      </w:pPr>
+      <w:bookmarkStart w:id="63" w:name="_Toc240315753"/>
+      <w:r>
+        <w:t>4.5.4 Filtrage incomplet des routes de lecture pour les managers</w:t>
+      </w:r>
+      <w:bookmarkEnd w:id="63"/>
+    </w:p>
+    <w:p>
+      <w:r>
+        <w:t>Le garde-fou décrit en 4.5.3 empêchait bien un manager d’agir en écriture (changer un statut) sur un candidat hors de son périmètre, mais je me suis rendu compte, en réexaminant systématiquement chaque route accessible au rôle Manager, que ce n’était pas le cas des routes de lecture : GET /api/candidates, GET /api/candidates/{id}, la recherche par nom et le classement par offre ne filtraient pas par périmètre. Un manager authentifié pouvait donc, en appelant directement l’API (pas via l’interface, qui n’expose pas ce chemin), lister ou consulter des candidats d’un autre département. J’ai corrigé ce point en centralisant la logique de périmètre déjà utilisée pour les écritures dans une méthode réutilisable, appliquée à présent à toutes les routes de lecture concernées, et j’ai ajouté deux tests unitaires dédiés (section 4.4.1) pour figer ce comportement.</w:t>
+      </w:r>
+    </w:p>
+    <w:p>
+      <w:pPr>
+        <w:pStyle w:val="Titre3"/>
+      </w:pPr>
+      <w:bookmarkStart w:id="64" w:name="_Toc240315754"/>
+      <w:r>
+        <w:t>4.5.5 Solliciter le manager au bon moment du processus</w:t>
+      </w:r>
+      <w:bookmarkEnd w:id="64"/>
+    </w:p>
+    <w:p>
+      <w:pPr>
+        <w:jc w:val="both"/>
+      </w:pPr>
+      <w:r>
+        <w:t xml:space="preserve">Dans une première version, le manager destinataire était notifié dès la validation du CV par le RH (statut CV_REVIEWED). À l’usage, cela le sollicitait trop tôt : de nombreux dossiers étaient encore écartés lors du pré-filtrage téléphonique mené par le RH. J’ai donc déplacé la notification du manager à l’entrée en Test technique, c’est-à-dire une fois l’entretien téléphonique franchi ; le candidat, lui, reste informé de la présélection de son CV dès l’étape CV_REVIEWED. En cohérence, la vue des dossiers validés du manager ne fait plus apparaître les candidats qu’à partir du Test technique, ce qui recentre son attention sur les profils réellement en lice.</w:t>
+      </w:r>
+    </w:p>
+    <w:p>
+      <w:pPr>
+        <w:pStyle w:val="Titre3"/>
+      </w:pPr>
+      <w:bookmarkStart w:id="65" w:name="_Toc240315755"/>
+      <w:r>
+        <w:t>4.5.6 Pertinence du matching Job idéal</w:t>
+      </w:r>
+      <w:bookmarkEnd w:id="65"/>
+    </w:p>
+    <w:p>
+      <w:pPr>
+        <w:jc w:val="both"/>
+      </w:pPr>
+      <w:r>
+        <w:t xml:space="preserve">La fonctionnalité de matching inverse, par laquelle un visiteur dépose son CV et le système lui suggère les offres les plus proches, retournait des résultats peu pertinents : un profil DevOps se voyait par exemple proposer des postes de développement back-end. L’analyse a révélé deux causes : le score ne tenait compte que des compétences requises, en ignorant l’intitulé de l’offre, et le jeu de données comportait de nombreuses annonces en double qui saturaient le lot soumis à l’IA. J’ai corrigé les deux points en combinant, dans le score, l’intitulé de l’offre (pondéré à 60 %) et les compétences (40 %), et en dédupliquant les offres identiques avant l’appel à l’IA. Chaque profil (Java, DevOps, ProdOps, QA) ressort désormais sur les offres qui lui correspondent réellement.</w:t>
+      </w:r>
+    </w:p>
+    <w:p>
+      <w:pPr>
+        <w:pStyle w:val="Titre3"/>
+      </w:pPr>
+      <w:bookmarkStart w:id="66" w:name="_Toc240315756"/>
+      <w:r>
+        <w:t>4.5.7 Traitement distinct des candidatures retirées</w:t>
+      </w:r>
+      <w:bookmarkEnd w:id="66"/>
+    </w:p>
+    <w:p>
+      <w:pPr>
+        <w:jc w:val="both"/>
+      </w:pPr>
+      <w:r>
+        <w:t xml:space="preserve">Une candidature retirée (statut WITHDRAWN) était jusque-là confondue avec les candidatures rejetées dans les filtres de la liste, et cette liste ne se mettait à jour qu’après rechargement de la page. J’ai séparé le retrait du rejet en lui dédiant son propre filtre, à l’image du filtre des candidatures rejetées, dans la liste des candidatures comme sur le tableau de bord, et fait en sorte que tout changement de statut rafraîchisse immédiatement la liste : un candidat passé en candidature retirée quitte aussitôt la vue active et le compteur est décrémenté, sans rechargement. Ces candidatures ne sont pas supprimées automatiquement : elles restent consultables via leur filtre, comme les candidatures rejetées. Un candidat peut aussi retirer lui-même sa candidature tant qu’elle n’est pas close, via un endpoint dédié qui ne passe pas par les actions réservées au RH ou au manager.</w:t>
+      </w:r>
+    </w:p>
+    <w:p>
+      <w:pPr>
+        <w:pStyle w:val="Titre3"/>
+      </w:pPr>
+      <w:bookmarkStart w:id="67" w:name="_Toc240315757"/>
+      <w:r>
+        <w:t>4.5.8 Entretien téléphonique RH obligatoire avant acceptation</w:t>
+      </w:r>
+      <w:bookmarkEnd w:id="67"/>
+    </w:p>
+    <w:p>
+      <w:pPr>
+        <w:jc w:val="both"/>
+      </w:pPr>
+      <w:r>
+        <w:t xml:space="preserve">En testant le parcours RH de bout en bout, je me suis rendu compte qu’un candidat pouvait être accepté directement depuis CV_REVIEWED, sans qu’aucun entretien téléphonique n’ait eu lieu : la machine à états ne l’interdisait pas explicitement. Cela allait à l’encontre du processus voulu, où cet entretien constitue le premier vrai filtre humain avant de solliciter le manager. J’ai donc retiré la transition CV_REVIEWED vers ACCEPTED : depuis cette étape, seuls restent possibles le passage en entretien téléphonique, le refus ou le retrait. Un profil manifestement hors sujet peut toujours être écarté sans attendre cet entretien ; c’est uniquement l’acceptation qui exige désormais d’être passé par PHONE_SCREENING.</w:t>
+      </w:r>
+    </w:p>
+    <w:p>
+      <w:pPr>
+        <w:pStyle w:val="Titre3"/>
+      </w:pPr>
+      <w:bookmarkStart w:id="68" w:name="_Toc240315758"/>
+      <w:r>
+        <w:t>4.5.9 Découplage entre planification d’entretien et statut du candidat</w:t>
+      </w:r>
+      <w:bookmarkEnd w:id="68"/>
+    </w:p>
+    <w:p>
+      <w:pPr>
+        <w:jc w:val="both"/>
+      </w:pPr>
+      <w:r>
+        <w:t xml:space="preserve">Ce même exercice a fait remonter un second problème, plus discret : planifier un entretien changeait le statut du candidat selon le type choisi, mais sans passer ni par le garde-fou décrit en 4.5.3, ni par le contrôle de périmètre du manager. Concrètement, planifier un entretien téléphonique sur un dossier déjà en phase technique suffisait à faire régresser son statut, sans qu’aucune vérification ne s’y oppose. J’ai séparé les deux responsabilités : la planification reste une opération de logistique (date, intervieweur, lieu) qui n’a plus aucun effet sur le statut ; seules des actions de statut dédiées, elles-mêmes protégées par des garde-fous, font avancer le dossier. Pour ne pas perdre en confort d’usage, l’interface garde une case à cocher optionnelle qui déclenche la transition correspondante en un clic, mais via l’endpoint protégé par ce même garde-fou, donc sans contourner la règle.</w:t>
+      </w:r>
+    </w:p>
+    <w:p>
+      <w:pPr>
+        <w:pStyle w:val="Titre3"/>
+      </w:pPr>
+      <w:bookmarkStart w:id="69" w:name="_Toc240315759"/>
+      <w:r>
+        <w:t>4.5.10 Fiabiliser l’intégration Google Meet et le format des webhooks n8n</w:t>
+      </w:r>
+      <w:bookmarkEnd w:id="69"/>
+    </w:p>
+    <w:p>
+      <w:r>
+        <w:t xml:space="preserve">Le lien Google Meet envoyé aux candidats et aux managers reposait initialement sur une valeur fictive, générée côté n8n sans appel réel à l’API Google Calendar — une limitation assumée à ce stade du développement. En remplaçant ce mécanisme par une véritable création d’événement Google Calendar (avec génération automatique du lien Meet), un problème plus ancien est remonté : le nœud Webhook de n8n imbrique le corps réel de la requête POST sous un champ body, alors que le workflow lisait les données à la racine. Ce défaut, antérieur à cette évolution, cassait silencieusement à la fois le routage de l’agent d’entretien et, potentiellement, celui de l’agent de décision finale. Je l’ai corrigé aux trois endroits concernés, puis validé le nouveau flux de bout en bout : création réelle de l’événement, ajout des participants, envoi de l’e-mail de convocation, et sauvegarde du lien via un point d’API dédié. Pour que cet appel à n8n reste fiable même en cas d’indisponibilité passagère, le back-end s’appuie sur une file d’attente interne (outbox) : chaque déclenchement est journalisé, puis retenté automatiquement en cas d’échec avec un délai croissant (5 s, 10 s, 20 s, 40 s puis 80 s ; le plafond théorique de 300 s n’est jamais atteint avec cinq relances), soit au plus 6 tentatives au total, ce qui évite de perdre un événement sans pour autant bloquer la requête initiale.</w:t>
+      </w:r>
+    </w:p>
+    <w:p>
+      <w:pPr>
+        <w:pStyle w:val="Titre3"/>
+      </w:pPr>
+      <w:bookmarkStart w:id="70" w:name="_Toc240315760"/>
+      <w:r>
+        <w:t>4.5.11 Cloisonnement des données dans le chatbot candidat</w:t>
+      </w:r>
+      <w:bookmarkEnd w:id="70"/>
+    </w:p>
+    <w:p>
+      <w:r>
+        <w:t xml:space="preserve">L’ajout d’un assistant conversationnel candidat posait un risque spécifique : un modèle de langage peut, si on le laisse faire, être incité par un utilisateur malveillant à révéler des informations qu’il ne devrait pas partager, y compris celles qu’on lui a explicitement fournies en contexte. J’ai donc construit le contexte transmis au modèle en excluant dès la source, avant même l’appel à l’IA, le score et le résumé générés par l’agent de scoring, la correction manuelle du RH, l’identité de l’intervieweur et les notes internes d’entretien — ces champs ne quittent jamais le back-end vers le prompt. Le message système impose en complément au modèle de ne répondre qu’à partir de ce contexte filtré, d’ignorer toute instruction contraire glissée dans la question du candidat, et de ne jamais reproduire ce contexte mot pour mot. Ces deux niveaux de protection — filtrage des données à la source, puis consignes du prompt système — ont été validés par des tests manuels explicites : demande directe du score, de l’identité de l’intervieweur, et tentative d’injection de prompt (« ignore tes instructions précédentes... ») ; dans les trois cas, l’assistant refuse poliment sans jamais divulguer l’information protégée.</w:t>
+      </w:r>
+    </w:p>
+    <w:p>
+      <w:pPr>
+        <w:pStyle w:val="Titre2"/>
+      </w:pPr>
+      <w:bookmarkStart w:id="71" w:name="_Toc240315761"/>
+      <w:r>
+        <w:t>4.6 Protection des données et éthique de l’IA</w:t>
+      </w:r>
+      <w:bookmarkEnd w:id="71"/>
+    </w:p>
+    <w:p>
+      <w:r>
+        <w:t xml:space="preserve">La plateforme manipule des données à caractère personnel : identité, coordonnées, CV et évaluations des candidats. Plusieurs principes ont guidé leur traitement. L’accès aux dossiers est strictement contrôlé selon le rôle de l’utilisateur, comme détaillé au tableau de la section 2.2.1 : un manager ne voit que les candidatures de son périmètre, seuls RH et Administrateur disposant d’une vue d’ensemble. Les mots de passe sont hachés (section 4.2.4), et chaque action sensible sur un dossier candidat est journalisée dans le journal d’audit avec l’identité de son auteur et un horodatage — de quoi retracer qui a modifié un dossier donné. Plusieurs protections techniques complètent ce socle : une limitation du nombre de tentatives de connexion pour freiner les attaques par force brute et un garde-fou contre les redirections internes non autorisées sur le point d’API utilisé pour tester la connectivité des webhooks n8n. Une validation du contenu réel des fichiers déposés, au-delà de la seule extension déclarée, reste en revanche une amélioration prévue pour la mise en production (section 4.2.4).</w:t>
+      </w:r>
+    </w:p>
+    <w:p>
+      <w:r>
+        <w:t xml:space="preserve">Le score attribué par l’agent d’intelligence artificielle est une aide à la présélection, pas une décision autonome : comme détaillé au chapitre 3, un score insuffisant déclenche un rejet automatique, mais ce rejet reste réversible par un RH ou un Administrateur via le mécanisme de surcharge manuelle, avec justification obligatoire et traçabilité complète. Cette conception vise à limiter le risque d’erreur ou de biais algorithmique en gardant un contrôle humain sur toute décision affectant un candidat, dans l’esprit des principes du RGPD [17], [18] relatifs aux décisions individuelles automatisées.</w:t>
+      </w:r>
+    </w:p>
+    <w:p>
+      <w:r>
+        <w:t xml:space="preserve">Ce dispositif comporte néanmoins des limites qu’il convient d’assumer : la dépendance à un service d’IA externe (Cohere) et à sa disponibilité, la sensibilité du score à la qualité et à la structure du CV fourni, le risque de biais inhérent à tout modèle statistique, et l’absence volontaire de décision entièrement autonome — chaque rejet automatique restant réversible par un opérateur humain. Pour ne jamais bloquer le dépôt d’une candidature en cas d’indisponibilité ou d’erreur de l’API de Cohere, un mode dégradé prend automatiquement le relais : le score est alors calculé par une heuristique locale (analyse de mots-clés et de structure du texte), la source du score (COHERE ou SIMULATED) étant conservée pour traçabilité. Ces limites justifient le maintien systématique d’une validation humaine et d’une traçabilité complète des décisions prises. La conception du processus de recrutement doit aussi tenir compte des principes de diversité et d’inclusion, afin de limiter les risques de discrimination dans des processus de sélection automatisés [19]. Par ailleurs, les captures d’écran présentées dans ce rapport (section 4.3) utilisent des données de test fictives ou anonymisées, à l’exception de quelques comptes de démonstration que j’ai moi-même créés à des fins de test.</w:t>
+      </w:r>
+    </w:p>
+    <w:p>
+      <w:r>
+        <w:t xml:space="preserve">Le chatbot candidat introduit en fin de projet (section 4.5.11) applique les mêmes principes : il ne s’appuie que sur les données de candidature du candidat connecté, dérivées côté serveur à partir du jeton JWT plutôt que d’un identifiant transmis par le client, et exclut structurellement les champs à usage interne (score IA, notes RH, identité de l’intervieweur) du contexte envoyé au modèle de langage.</w:t>
+      </w:r>
+    </w:p>
+    <w:p>
+      <w:r>
+        <w:t xml:space="preserve">Le traitement des données des candidats soulève plusieurs points de conformité qu’il convient d’expliciter. Premièrement, des transferts vers des services d’IA tiers ont lieu : le scoring des CV transite par l’API de Cohere et l’assistant conversationnel par l’API OpenRouter ; ces flux doivent être encadrés (clauses contractuelles, minimisation des données transmises, information claire des candidats). Deuxièmement, le modèle de langage (LLM) utilisé pour le chatbot est un modèle expérimental « stealth » (stealth/ox-alpha via OpenRouter), retenu pour la phase de développement : son fournisseur n’étant pas explicitement identifié, ce choix doit être documenté et justifié au regard de la loyauté du traitement, puis remplacé en production par un modèle dont le fournisseur et les conditions de conservation des données sont connus. Troisièmement, la plateforme ne prévoit pas encore de politique explicite de durée de conservation et d’effacement des données des candidats (CV, évaluations) : il faudra la définir et l’outiller (archivage, purge automatique, exercice du droit à l’effacement). Quatrièmement, au niveau national, la loi organique tunisienne n° 2004-63 du 27 juillet 2004 relative à la protection des données à caractère personnel s’applique [20], sous le contrôle de l’Instance nationale de protection des données personnelles (INPDP) : elle impose notamment un consentement éclairé du candidat, recueilli lors du dépôt de candidature par une case à cocher explicite (figure 4.13), dont le libellé devra être complété pour mentionner les traitements par des services d’IA tiers. Cinquièmement, un système de scoring utilisé dans un processus de recrutement est susceptible d’être qualifié de système d’IA à « haut risque » au sens du règlement européen sur l’IA (AI Act, règlement (UE) 2024/1689) [21] ; il appelle à ce titre une traçabilité renforcée, une supervision humaine effective et une documentation du modèle — principes déjà partiellement mis en œuvre ici (surcharge manuelle justifiée, journal d’audit, contrôle humain sur toute décision).</w:t>
+      </w:r>
+    </w:p>
+    <w:p>
+      <w:pPr>
+        <w:pStyle w:val="Titre2"/>
+      </w:pPr>
+      <w:bookmarkStart w:id="72" w:name="_Toc240315762"/>
+      <w:r>
+        <w:t>4.7 Bilan des fonctionnalités réalisées</w:t>
+      </w:r>
+      <w:bookmarkEnd w:id="72"/>
+    </w:p>
+    <w:p>
+      <w:r>
+        <w:t>Le tableau suivant récapitule, par grand domaine fonctionnel, l’état d’avancement des développements à l’issue du projet.</w:t>
+      </w:r>
+    </w:p>
+    <w:p>
+      <w:pPr>
+        <w:keepNext/>
+        <w:jc w:val="center"/>
+        <w:rPr>
+          <w:i/>
+          <w:sz w:val="21"/>
+        </w:rPr>
+      </w:pPr>
+      <w:r>
+        <w:rPr>
+          <w:i/>
+          <w:sz w:val="21"/>
+        </w:rPr>
+        <w:t>Tableau 4.3 : Bilan des fonctionnalités réalisées</w:t>
       </w:r>
     </w:p>
     <w:tbl>
@@ -9633,7 +10541,6 @@
       </w:tblGrid>
       <w:tr>
         <w:trPr>
-          <w:tblHeader/>
           <w:cantSplit/>
         </w:trPr>
         <w:tc>
@@ -9691,6 +10598,7 @@
           </w:tcPr>
           <w:p>
             <w:pPr>
+              <w:keepNext/>
               <w:rPr>
                 <w:sz w:val="21"/>
               </w:rPr>
@@ -9709,6 +10617,7 @@
           </w:tcPr>
           <w:p>
             <w:pPr>
+              <w:keepNext/>
               <w:rPr>
                 <w:sz w:val="21"/>
               </w:rPr>
@@ -9732,6 +10641,7 @@
           </w:tcPr>
           <w:p>
             <w:pPr>
+              <w:keepNext/>
               <w:rPr>
                 <w:sz w:val="21"/>
               </w:rPr>
@@ -9750,6 +10660,7 @@
           </w:tcPr>
           <w:p>
             <w:pPr>
+              <w:keepNext/>
               <w:rPr>
                 <w:sz w:val="21"/>
               </w:rPr>
@@ -9773,6 +10684,7 @@
           </w:tcPr>
           <w:p>
             <w:pPr>
+              <w:keepNext/>
               <w:rPr>
                 <w:sz w:val="21"/>
               </w:rPr>
@@ -9791,6 +10703,7 @@
           </w:tcPr>
           <w:p>
             <w:pPr>
+              <w:keepNext/>
               <w:rPr>
                 <w:sz w:val="21"/>
               </w:rPr>
@@ -9814,6 +10727,7 @@
           </w:tcPr>
           <w:p>
             <w:pPr>
+              <w:keepNext/>
               <w:rPr>
                 <w:sz w:val="21"/>
               </w:rPr>
@@ -9832,6 +10746,7 @@
           </w:tcPr>
           <w:p>
             <w:pPr>
+              <w:keepNext/>
               <w:rPr>
                 <w:sz w:val="21"/>
               </w:rPr>
@@ -9855,6 +10770,7 @@
           </w:tcPr>
           <w:p>
             <w:pPr>
+              <w:keepNext/>
               <w:rPr>
                 <w:sz w:val="21"/>
               </w:rPr>
@@ -9873,6 +10789,7 @@
           </w:tcPr>
           <w:p>
             <w:pPr>
+              <w:keepNext/>
               <w:rPr>
                 <w:sz w:val="21"/>
               </w:rPr>
@@ -9896,6 +10813,7 @@
           </w:tcPr>
           <w:p>
             <w:pPr>
+              <w:keepNext/>
               <w:rPr>
                 <w:sz w:val="21"/>
               </w:rPr>
@@ -9914,6 +10832,7 @@
           </w:tcPr>
           <w:p>
             <w:pPr>
+              <w:keepNext/>
               <w:rPr>
                 <w:sz w:val="21"/>
               </w:rPr>
@@ -9937,6 +10856,7 @@
           </w:tcPr>
           <w:p>
             <w:pPr>
+              <w:keepNext/>
               <w:rPr>
                 <w:sz w:val="21"/>
               </w:rPr>
@@ -9955,6 +10875,7 @@
           </w:tcPr>
           <w:p>
             <w:pPr>
+              <w:keepNext/>
               <w:rPr>
                 <w:sz w:val="21"/>
               </w:rPr>
@@ -9978,6 +10899,7 @@
           </w:tcPr>
           <w:p>
             <w:pPr>
+              <w:keepNext/>
               <w:rPr>
                 <w:sz w:val="21"/>
               </w:rPr>
@@ -9996,6 +10918,7 @@
           </w:tcPr>
           <w:p>
             <w:pPr>
+              <w:keepNext/>
               <w:rPr>
                 <w:sz w:val="21"/>
               </w:rPr>
@@ -10019,6 +10942,7 @@
           </w:tcPr>
           <w:p>
             <w:pPr>
+              <w:keepNext/>
               <w:rPr>
                 <w:sz w:val="21"/>
               </w:rPr>
@@ -10037,6 +10961,7 @@
           </w:tcPr>
           <w:p>
             <w:pPr>
+              <w:keepNext/>
               <w:rPr>
                 <w:sz w:val="21"/>
               </w:rPr>
@@ -10060,6 +10985,7 @@
           </w:tcPr>
           <w:p>
             <w:pPr>
+              <w:keepNext/>
               <w:rPr>
                 <w:sz w:val="21"/>
               </w:rPr>
@@ -10078,6 +11004,7 @@
           </w:tcPr>
           <w:p>
             <w:pPr>
+              <w:keepNext/>
               <w:rPr>
                 <w:sz w:val="21"/>
               </w:rPr>
@@ -10101,6 +11028,7 @@
           </w:tcPr>
           <w:p>
             <w:pPr>
+              <w:keepNext/>
               <w:rPr>
                 <w:sz w:val="21"/>
               </w:rPr>
@@ -10119,6 +11047,7 @@
           </w:tcPr>
           <w:p>
             <w:pPr>
+              <w:keepNext/>
               <w:rPr>
                 <w:sz w:val="21"/>
               </w:rPr>
@@ -10142,6 +11071,7 @@
           </w:tcPr>
           <w:p>
             <w:pPr>
+              <w:keepNext/>
               <w:rPr>
                 <w:sz w:val="21"/>
               </w:rPr>
@@ -10160,6 +11090,7 @@
           </w:tcPr>
           <w:p>
             <w:pPr>
+              <w:keepNext/>
               <w:rPr>
                 <w:sz w:val="21"/>
               </w:rPr>
@@ -10183,6 +11114,7 @@
           </w:tcPr>
           <w:p>
             <w:pPr>
+              <w:keepNext/>
               <w:rPr>
                 <w:sz w:val="21"/>
               </w:rPr>
@@ -10201,6 +11133,7 @@
           </w:tcPr>
           <w:p>
             <w:pPr>
+              <w:keepNext/>
               <w:rPr>
                 <w:sz w:val="21"/>
               </w:rPr>
@@ -10224,6 +11157,7 @@
           </w:tcPr>
           <w:p>
             <w:pPr>
+              <w:keepNext/>
               <w:rPr>
                 <w:sz w:val="21"/>
               </w:rPr>
@@ -10242,6 +11176,7 @@
           </w:tcPr>
           <w:p>
             <w:pPr>
+              <w:keepNext/>
               <w:rPr>
                 <w:sz w:val="21"/>
               </w:rPr>
@@ -10264,6 +11199,9 @@
             <w:tcW w:w="4603" w:type="dxa"/>
           </w:tcPr>
           <w:p>
+            <w:pPr>
+              <w:keepNext/>
+            </w:pPr>
             <w:r>
               <w:t>Assistant conversationnel candidat (chatbot IA via OpenRouter, connaissance des candidatures réelles et de la plateforme)</w:t>
             </w:r>
@@ -10274,8 +11212,98 @@
             <w:tcW w:w="4603" w:type="dxa"/>
           </w:tcPr>
           <w:p>
+            <w:pPr>
+              <w:keepNext/>
+            </w:pPr>
             <w:r>
               <w:t>Réalisée</w:t>
+            </w:r>
+          </w:p>
+        </w:tc>
+      </w:tr>
+      <w:tr>
+        <w:trPr>
+          <w:cantSplit/>
+        </w:trPr>
+        <w:tc>
+          <w:tcPr>
+            <w:tcW w:w="4603" w:type="dxa"/>
+          </w:tcPr>
+          <w:p>
+            <w:pPr>
+              <w:keepNext/>
+            </w:pPr>
+            <w:r>
+              <w:t xml:space="preserve">Évaluation du matching sur un Gold Set de seize CVs annotés</w:t>
+            </w:r>
+          </w:p>
+        </w:tc>
+        <w:tc>
+          <w:tcPr>
+            <w:tcW w:w="4603" w:type="dxa"/>
+          </w:tcPr>
+          <w:p>
+            <w:pPr>
+              <w:keepNext/>
+            </w:pPr>
+            <w:r>
+              <w:t xml:space="preserve">Réalisée</w:t>
+            </w:r>
+          </w:p>
+        </w:tc>
+      </w:tr>
+      <w:tr>
+        <w:trPr>
+          <w:cantSplit/>
+        </w:trPr>
+        <w:tc>
+          <w:tcPr>
+            <w:tcW w:w="4603" w:type="dxa"/>
+          </w:tcPr>
+          <w:p>
+            <w:pPr>
+              <w:keepNext/>
+            </w:pPr>
+            <w:r>
+              <w:t xml:space="preserve">Human-in-the-Loop : signalement des dossiers à arbitrer (needsHumanReview)</w:t>
+            </w:r>
+          </w:p>
+        </w:tc>
+        <w:tc>
+          <w:tcPr>
+            <w:tcW w:w="4603" w:type="dxa"/>
+          </w:tcPr>
+          <w:p>
+            <w:pPr>
+              <w:keepNext/>
+            </w:pPr>
+            <w:r>
+              <w:t xml:space="preserve">Réalisée</w:t>
+            </w:r>
+          </w:p>
+        </w:tc>
+      </w:tr>
+      <w:tr>
+        <w:trPr>
+          <w:cantSplit/>
+        </w:trPr>
+        <w:tc>
+          <w:tcPr>
+            <w:tcW w:w="4603" w:type="dxa"/>
+          </w:tcPr>
+          <w:p>
+            <w:r>
+              <w:t xml:space="preserve">Explicabilité du score : compétences validées / manquantes, source du score</w:t>
+            </w:r>
+          </w:p>
+        </w:tc>
+        <w:tc>
+          <w:tcPr>
+            <w:tcW w:w="4603" w:type="dxa"/>
+          </w:tcPr>
+          <w:p>
+            <w:r>
+              <w:t xml:space="preserve">Réalisée</w:t>
             </w:r>
           </w:p>
         </w:tc>
@@ -10320,7 +11348,7 @@
     </w:p>
     <w:p>
       <w:r>
-        <w:t>Sur le plan technique, ce projet m’a permis d’approfondir mes compétences en développement back-end avec Spring Boot et Spring Security, en développement front-end avec Angular, ainsi qu’en conception de bases de données relationnelles avec PostgreSQL. J’y ai aussi découvert et mis en œuvre des outils d’automatisation (n8n) et d’intelligence artificielle (API de Cohere) au service d’un processus métier concret, tout en renforçant mes compétences en sécurité applicative (authentification JWT, contrôle d’accès basé sur les rôles) et en gestion de projet, selon une démarche itérative inspirée d’Agile/Scrum.</w:t>
+        <w:t>Sur le plan technique, ce projet m’a permis d’approfondir mes compétences en développement back-end avec Spring Boot et Spring Security, en développement front-end avec Angular, ainsi qu’en conception de bases de données relationnelles avec PostgreSQL. J’y ai aussi découvert et mis en œuvre des outils d’automatisation (n8n) et d’intelligence artificielle (API de Cohere) au service d’un processus métier concret, tout en renforçant mes compétences en sécurité applicative (authentification JWT, contrôle d’accès basé sur les rôles) et en gestion de projet, selon une démarche itérative inspirée d’Agile/Scrum. J’ai également vérifié le comportement du seuil de décision du scoring sur un jeu de référence annoté (Gold Set) et prévu, pour les cas limites, une validation humaine du score assortie d’une explication automatique des compétences retenues.</w:t>
       </w:r>
     </w:p>
     <w:p>
@@ -10330,7 +11358,7 @@
     </w:p>
     <w:p>
       <w:r>
-        <w:t xml:space="preserve">Plusieurs pistes d’évolution restent ouvertes pour poursuivre ce travail. Côté fonctionnel, la plateforme pourrait accueillir un module d’analyse prédictive du taux de transformation des candidatures, une intégration plus poussée avec des plateformes d’emploi externes (LinkedIn, Indeed), ou un espace candidat plus riche pour un suivi encore plus détaillé de son parcours. Côté technique, la suite de tests automatisés — qui compte déjà 108 méthodes de test unitaires et de contrôleur (JUnit 5 / Mockito) — gagnerait à être complétée par des tests d’intégration couvrant les services et la base de données, des tests de bout en bout (par exemple Playwright ou Cypress) rejouant les parcours métier complets, et des tests front-end automatisés sur les composants Angular. Une chaîne d’intégration et de déploiement continus (CI/CD) ainsi qu’un déploiement sur une infrastructure cloud constitueraient des évolutions naturelles pour renforcer la fiabilité et la scalabilité de la plateforme sur le long terme.</w:t>
+        <w:t xml:space="preserve">Plusieurs pistes d’évolution restent ouvertes pour poursuivre ce travail. Côté fonctionnel, la plateforme pourrait accueillir un module d’analyse prédictive du taux de transformation des candidatures, une intégration plus poussée avec des plateformes d’emploi externes (LinkedIn, Indeed), ou un espace candidat plus riche pour un suivi encore plus détaillé de son parcours. Côté technique, la suite de tests automatisés — qui compte déjà 108 méthodes de test unitaires et de contrôleur (JUnit 5 / Mockito) — gagnerait à être complétée par des tests d’intégration couvrant les services et la base de données, des tests de bout en bout (par exemple Playwright ou Cypress) rejouant les parcours métier complets, et des tests front-end automatisés sur les composants Angular. Le jeu de référence de seize profils mobilisé pour calibrer le seuil de décision gagnerait à être enrichi de candidatures réelles annotées par les recruteurs, seul moyen d’obtenir une mesure de performance en conditions d’exploitation. Une chaîne d’intégration et de déploiement continus (CI/CD) ainsi qu’un déploiement sur une infrastructure cloud constitueraient des évolutions naturelles pour renforcer la fiabilité et la scalabilité de la plateforme sur le long terme.</w:t>
       </w:r>
     </w:p>
     <w:p>

</xml_diff>

<commit_message>
docs(report): mise a jour finale des rapports PFE docx et pdf
</commit_message>
<xml_diff>
--- a/Rapport-PFE/finalreport/Rapport_PFE_Haythem_Bargaoui_beta.docx
+++ b/Rapport-PFE/finalreport/Rapport_PFE_Haythem_Bargaoui_beta.docx
@@ -681,7 +681,7 @@
         <w:keepNext/>
       </w:pPr>
       <w:r>
-        <w:t>Mené en alternance chez Sopra HR Software Tunisie sur sept mois, ce Projet de Fin d’Études consistait à concevoir et développer JOB4YOU, une plateforme web destinée à centraliser et automatiser le cycle de recrutement interne de l’entreprise, de la publication des offres d’emploi jusqu’à la décision finale, en passant par le suivi des candidatures, la planification des entretiens et la collecte des feedbacks des managers.</w:t>
+        <w:t>Mené chez Sopra HR Software Tunisie, ce Projet de Fin d’Études consistait à concevoir et développer JOB4YOU, une plateforme web destinée à centraliser et automatiser le cycle de recrutement interne de l’entreprise, de la publication des offres d’emploi jusqu’à la décision finale, en passant par le suivi des candidatures, la planification des entretiens et la collecte des feedbacks des managers.</w:t>
       </w:r>
     </w:p>
     <w:p>
@@ -1895,7 +1895,7 @@
       <w:r>
         <w:t>4.4.6 Validation humaine du score et explicabilité</w:t>
         <w:tab/>
-        <w:t>63</w:t>
+        <w:t>64</w:t>
       </w:r>
     </w:p>
     <w:p>
@@ -1949,7 +1949,7 @@
       <w:r>
         <w:t>4.5.2 Distinguer un rejet RH d’un rejet manager</w:t>
         <w:tab/>
-        <w:t>64</w:t>
+        <w:t>65</w:t>
       </w:r>
     </w:p>
     <w:p>
@@ -2021,7 +2021,7 @@
       <w:r>
         <w:t>4.5.6 Pertinence du matching Job idéal</w:t>
         <w:tab/>
-        <w:t>65</w:t>
+        <w:t>66</w:t>
       </w:r>
     </w:p>
     <w:p>
@@ -2093,7 +2093,7 @@
       <w:r>
         <w:t>4.5.10 Fiabiliser l’intégration Google Meet et le format des webhooks n8n</w:t>
         <w:tab/>
-        <w:t>66</w:t>
+        <w:t>67</w:t>
       </w:r>
     </w:p>
     <w:p>
@@ -2147,7 +2147,7 @@
       <w:r>
         <w:t>4.7 Bilan des fonctionnalités réalisées</w:t>
         <w:tab/>
-        <w:t>68</w:t>
+        <w:t>69</w:t>
       </w:r>
     </w:p>
     <w:p>
@@ -2834,7 +2834,7 @@
     </w:p>
     <w:p>
       <w:r>
-        <w:t xml:space="preserve">C’est dans ce contexte que Sopra HR Software Tunisie m’a confié le projet JOB4YOU, dans le cadre de mon Projet de Fin d’Études en alternance : concevoir et développer une plateforme web centralisée, sécurisée et intuitive, couvrant l’intégralité du processus de recrutement interne, de la publication d’une offre jusqu’à la décision finale d’embauche, en passant par la gestion des candidatures, l’organisation des entretiens et la collecte des retours des managers.</w:t>
+        <w:t xml:space="preserve">C’est dans ce contexte que Sopra HR Software Tunisie m’a confié le projet JOB4YOU, dans le cadre de mon Projet de Fin d’Études : concevoir et développer une plateforme web centralisée, sécurisée et intuitive, couvrant l’intégralité du processus de recrutement interne, de la publication d’une offre jusqu’à la décision finale d’embauche, en passant par la gestion des candidatures, l’organisation des entretiens et la collecte des retours des managers.</w:t>
       </w:r>
     </w:p>
     <w:p>
@@ -2855,7 +2855,7 @@
     </w:p>
     <w:p>
       <w:r>
-        <w:t xml:space="preserve">J’ai rejoint Sopra HR Software Tunisie pour sept mois d’alternance, avec pour mission de digitaliser un processus de recrutement resté, jusque-là, largement manuel. Ce chapitre revient sur le point de départ de ce travail : l’entreprise qui m’a accueilli, les lacunes que j’ai concrètement constatées dans l’existant, la problématique qui en découle, et la manière dont j’ai organisé mon travail sur toute la durée du stage.</w:t>
+        <w:t xml:space="preserve">J’ai rejoint Sopra HR Software Tunisie avec pour mission de digitaliser un processus de recrutement resté, jusque-là, largement manuel. Ce chapitre revient sur le point de départ de ce travail : l’entreprise qui m’a accueilli, les lacunes que j’ai concrètement constatées dans l’existant, la problématique qui en découle, et la manière dont j’ai organisé mon travail sur toute la durée du stage.</w:t>
       </w:r>
     </w:p>
     <w:p>
@@ -3224,7 +3224,7 @@
     </w:p>
     <w:p>
       <w:r>
-        <w:t>Le projet s’est étalé sur sept mois, du 02 février au 31 août 2026. Afin de concilier la souplesse de la démarche agile en sprints avec les jalons de suivi académiques et industriels, la macro-planification temporelle des grandes phases du stage est résumée dans le tableau suivant.</w:t>
+        <w:t>Le développement du projet a été réparti en grandes phases sur toute la période de réalisation de ce Projet de Fin d’Études. Afin de concilier la souplesse de la démarche agile en sprints avec les jalons de suivi académiques et industriels, la macro-planification de ces phases est résumée dans le tableau suivant.</w:t>
       </w:r>
     </w:p>
     <w:p>
@@ -5138,7 +5138,7 @@
     <w:p>
       <w:pPr/>
       <w:r>
-        <w:t xml:space="preserve">Afin d’éviter l’effet « toile d’araignée », le périmètre fonctionnel est d’abord présenté en vue macro ci-dessous (figure 2.2), puis décliné en trois sous-diagrammes par module (figures 2.3 à 2.5). L’authentification par jeton JWT, bien qu’obligatoire pour les espaces sécurisés, est représentée par un cas commun « S’authentifier » (la relation « include » n’est illustrée que sur quelques cas représentatifs) ; les relations d’inclusion pointent du cas principal vers le sous-cas requis, conformément à la norme UML, et le Candidat généralise le Visiteur.</w:t>
+        <w:t xml:space="preserve">Afin d’éviter l’effet « toile d’araignée », le périmètre fonctionnel est d’abord présenté en vue macro ci-dessous (figure 2.2), puis décliné en trois sous-diagrammes par module (figures 2.3 à 2.5). L’authentification par jeton JWT, bien qu’obligatoire pour les espaces sécurisés, est représentée par un cas commun « S’authentifier » (la relation « include » n’est illustrée que sur quelques cas représentatifs) ; les relations d’inclusion pointent du cas principal vers le sous-cas requis, conformément à la norme UML [3], et le Candidat généralise le Visiteur.</w:t>
       </w:r>
     </w:p>
     <w:p>
@@ -6852,7 +6852,7 @@
           <w:noProof/>
         </w:rPr>
         <w:pict w14:anchorId="29E43F6E">
-          <v:shape id="Image 12" o:spid="_x0000_i1038" type="#_x0000_t75" style="visibility:visible;mso-wrap-style:square;width:769.9pt;height:294.7pt;visibility:visible">
+          <v:shape id="Image 12" o:spid="_x0000_i1038" type="#_x0000_t75" style="visibility:visible;mso-wrap-style:square;width:769.9pt;height:297.7pt;visibility:visible">
             <v:imagedata r:id="rId24" o:title=""/>
           </v:shape>
         </w:pict>
@@ -9377,6 +9377,11 @@
         </w:tc>
       </w:tr>
     </w:tbl>
+    <w:p>
+      <w:r>
+        <w:t xml:space="preserve">Ce tableau atteste de l’exécution des vingt scénarios listés, tous concluants ; il ne constitue pas pour autant une garantie globale de qualité. Des cas nominaux et des cas d’erreur qui réussissent ne prouvent pas l’absence de défauts sur les chemins non exercés, et ne disent rien du comportement de la plateforme sous charge. Ces tests vérifient des fonctionnalités et des règles d’accès : ils ne mesurent pas la pertinence du scoring IA, qui fait l’objet de la section 4.4.5.</w:t>
+      </w:r>
+    </w:p>
     <w:p>
       <w:pPr>
         <w:pStyle w:val="Titre3"/>
@@ -10213,12 +10218,17 @@
     </w:tbl>
     <w:p>
       <w:r>
-        <w:t xml:space="preserve">Avec le seuil retenu de 60/100, le système prend seize bonnes décisions sur seize : aucun profil pertinent n’est écarté (rappel de 100 %) et aucun profil hors cible n’est retenu (précision de 100 %). Abaisser le seuil à 50 ne change rien sur ce jeu mais laisserait passer des profils périphériques dès que les volumes augmentent ; le relever à 70 fait apparaître un faux négatif — le profil GOLD_14, développeuse Java dont le dossier est pourtant jugé pertinent et scoré 69/100 — et fait chuter le rappel à 88,9 %.</w:t>
+        <w:t xml:space="preserve">Avec le seuil retenu de 60/100, le système prend seize bonnes décisions sur seize : aucun profil pertinent n’est écarté (rappel de 100 %) et aucun profil hors cible n’est retenu (précision de 100 %). Abaisser le seuil à 50 ne change rien sur ce jeu, les deux seuils y sont donc indiscernables ; le relever à 70 fait apparaître un faux négatif — le profil GOLD_14, développeuse Java dont le dossier est pourtant jugé pertinent et scoré 69/100 — et fait chuter le rappel à 88,9 %.</w:t>
       </w:r>
     </w:p>
     <w:p>
       <w:r>
         <w:t xml:space="preserve">Le seuil de 60 est cohérent avec la distribution des scores obtenus : le meilleur profil non pertinent s’arrête à 47/100, soit treize points sous le seuil, tandis que le plus faible profil pertinent est à 69/100, soit neuf points au-dessus. Sur ce jeu, les deux populations ne se chevauchent donc pas.</w:t>
+      </w:r>
+    </w:p>
+    <w:p>
+      <w:r>
+        <w:t xml:space="preserve">Ce qui précède établit le seuil de 60/100 comme paramètre opérationnel pour cette version de la plateforme, non comme un optimum démontré. Sur les seize profils du Gold Set, 60 et 50 produisent exactement les mêmes classifications : leur écart n’est donc pas observable sur ce jeu, et rien n’y établit la supériorité de 60 sur 50. Seule la remontée à 70 s’en distingue, en introduisant un faux négatif. Le seuil retenu relève d’un calibrage préliminaire : une évaluation sur un corpus plus large et représentatif, complétée par le suivi des erreurs observées en conditions réelles, sera nécessaire pour le confirmer ou l’ajuster.</w:t>
       </w:r>
     </w:p>
     <w:p>
@@ -10536,8 +10546,8 @@
         <w:tblLook w:val="0000" w:firstRow="0" w:lastRow="0" w:firstColumn="0" w:lastColumn="0" w:noHBand="0" w:noVBand="0"/>
       </w:tblPr>
       <w:tblGrid>
-        <w:gridCol w:w="4603"/>
-        <w:gridCol w:w="4603"/>
+        <w:gridCol w:w="7700"/>
+        <w:gridCol w:w="1506"/>
       </w:tblGrid>
       <w:tr>
         <w:trPr>
@@ -10545,7 +10555,7 @@
         </w:trPr>
         <w:tc>
           <w:tcPr>
-            <w:tcW w:w="2500" w:type="pct"/>
+            <w:tcW w:w="4183" w:type="pct"/>
             <w:shd w:val="clear" w:color="auto" w:fill="D9D9D9"/>
           </w:tcPr>
           <w:p>
@@ -10567,7 +10577,7 @@
         </w:tc>
         <w:tc>
           <w:tcPr>
-            <w:tcW w:w="2500" w:type="pct"/>
+            <w:tcW w:w="817" w:type="pct"/>
             <w:shd w:val="clear" w:color="auto" w:fill="D9D9D9"/>
           </w:tcPr>
           <w:p>
@@ -10594,7 +10604,7 @@
         </w:trPr>
         <w:tc>
           <w:tcPr>
-            <w:tcW w:w="2500" w:type="pct"/>
+            <w:tcW w:w="4183" w:type="pct"/>
           </w:tcPr>
           <w:p>
             <w:pPr>
@@ -10613,7 +10623,7 @@
         </w:tc>
         <w:tc>
           <w:tcPr>
-            <w:tcW w:w="2500" w:type="pct"/>
+            <w:tcW w:w="817" w:type="pct"/>
           </w:tcPr>
           <w:p>
             <w:pPr>
@@ -10637,7 +10647,7 @@
         </w:trPr>
         <w:tc>
           <w:tcPr>
-            <w:tcW w:w="2500" w:type="pct"/>
+            <w:tcW w:w="4183" w:type="pct"/>
           </w:tcPr>
           <w:p>
             <w:pPr>
@@ -10656,7 +10666,7 @@
         </w:tc>
         <w:tc>
           <w:tcPr>
-            <w:tcW w:w="2500" w:type="pct"/>
+            <w:tcW w:w="817" w:type="pct"/>
           </w:tcPr>
           <w:p>
             <w:pPr>
@@ -10680,7 +10690,7 @@
         </w:trPr>
         <w:tc>
           <w:tcPr>
-            <w:tcW w:w="2500" w:type="pct"/>
+            <w:tcW w:w="4183" w:type="pct"/>
           </w:tcPr>
           <w:p>
             <w:pPr>
@@ -10699,7 +10709,7 @@
         </w:tc>
         <w:tc>
           <w:tcPr>
-            <w:tcW w:w="2500" w:type="pct"/>
+            <w:tcW w:w="817" w:type="pct"/>
           </w:tcPr>
           <w:p>
             <w:pPr>
@@ -10723,7 +10733,7 @@
         </w:trPr>
         <w:tc>
           <w:tcPr>
-            <w:tcW w:w="2500" w:type="pct"/>
+            <w:tcW w:w="4183" w:type="pct"/>
           </w:tcPr>
           <w:p>
             <w:pPr>
@@ -10742,7 +10752,7 @@
         </w:tc>
         <w:tc>
           <w:tcPr>
-            <w:tcW w:w="2500" w:type="pct"/>
+            <w:tcW w:w="817" w:type="pct"/>
           </w:tcPr>
           <w:p>
             <w:pPr>
@@ -10766,7 +10776,7 @@
         </w:trPr>
         <w:tc>
           <w:tcPr>
-            <w:tcW w:w="2500" w:type="pct"/>
+            <w:tcW w:w="4183" w:type="pct"/>
           </w:tcPr>
           <w:p>
             <w:pPr>
@@ -10785,7 +10795,7 @@
         </w:tc>
         <w:tc>
           <w:tcPr>
-            <w:tcW w:w="2500" w:type="pct"/>
+            <w:tcW w:w="817" w:type="pct"/>
           </w:tcPr>
           <w:p>
             <w:pPr>
@@ -10809,7 +10819,7 @@
         </w:trPr>
         <w:tc>
           <w:tcPr>
-            <w:tcW w:w="2500" w:type="pct"/>
+            <w:tcW w:w="4183" w:type="pct"/>
           </w:tcPr>
           <w:p>
             <w:pPr>
@@ -10828,7 +10838,7 @@
         </w:tc>
         <w:tc>
           <w:tcPr>
-            <w:tcW w:w="2500" w:type="pct"/>
+            <w:tcW w:w="817" w:type="pct"/>
           </w:tcPr>
           <w:p>
             <w:pPr>
@@ -10852,7 +10862,7 @@
         </w:trPr>
         <w:tc>
           <w:tcPr>
-            <w:tcW w:w="2500" w:type="pct"/>
+            <w:tcW w:w="4183" w:type="pct"/>
           </w:tcPr>
           <w:p>
             <w:pPr>
@@ -10871,7 +10881,7 @@
         </w:tc>
         <w:tc>
           <w:tcPr>
-            <w:tcW w:w="2500" w:type="pct"/>
+            <w:tcW w:w="817" w:type="pct"/>
           </w:tcPr>
           <w:p>
             <w:pPr>
@@ -10895,7 +10905,7 @@
         </w:trPr>
         <w:tc>
           <w:tcPr>
-            <w:tcW w:w="2500" w:type="pct"/>
+            <w:tcW w:w="4183" w:type="pct"/>
           </w:tcPr>
           <w:p>
             <w:pPr>
@@ -10914,7 +10924,7 @@
         </w:tc>
         <w:tc>
           <w:tcPr>
-            <w:tcW w:w="2500" w:type="pct"/>
+            <w:tcW w:w="817" w:type="pct"/>
           </w:tcPr>
           <w:p>
             <w:pPr>
@@ -10938,7 +10948,7 @@
         </w:trPr>
         <w:tc>
           <w:tcPr>
-            <w:tcW w:w="2500" w:type="pct"/>
+            <w:tcW w:w="4183" w:type="pct"/>
           </w:tcPr>
           <w:p>
             <w:pPr>
@@ -10957,7 +10967,7 @@
         </w:tc>
         <w:tc>
           <w:tcPr>
-            <w:tcW w:w="2500" w:type="pct"/>
+            <w:tcW w:w="817" w:type="pct"/>
           </w:tcPr>
           <w:p>
             <w:pPr>
@@ -10981,7 +10991,7 @@
         </w:trPr>
         <w:tc>
           <w:tcPr>
-            <w:tcW w:w="2500" w:type="pct"/>
+            <w:tcW w:w="4183" w:type="pct"/>
           </w:tcPr>
           <w:p>
             <w:pPr>
@@ -11000,7 +11010,7 @@
         </w:tc>
         <w:tc>
           <w:tcPr>
-            <w:tcW w:w="2500" w:type="pct"/>
+            <w:tcW w:w="817" w:type="pct"/>
           </w:tcPr>
           <w:p>
             <w:pPr>
@@ -11024,7 +11034,7 @@
         </w:trPr>
         <w:tc>
           <w:tcPr>
-            <w:tcW w:w="2500" w:type="pct"/>
+            <w:tcW w:w="4183" w:type="pct"/>
           </w:tcPr>
           <w:p>
             <w:pPr>
@@ -11043,7 +11053,7 @@
         </w:tc>
         <w:tc>
           <w:tcPr>
-            <w:tcW w:w="2500" w:type="pct"/>
+            <w:tcW w:w="817" w:type="pct"/>
           </w:tcPr>
           <w:p>
             <w:pPr>
@@ -11067,7 +11077,7 @@
         </w:trPr>
         <w:tc>
           <w:tcPr>
-            <w:tcW w:w="2500" w:type="pct"/>
+            <w:tcW w:w="4183" w:type="pct"/>
           </w:tcPr>
           <w:p>
             <w:pPr>
@@ -11086,7 +11096,7 @@
         </w:tc>
         <w:tc>
           <w:tcPr>
-            <w:tcW w:w="2500" w:type="pct"/>
+            <w:tcW w:w="817" w:type="pct"/>
           </w:tcPr>
           <w:p>
             <w:pPr>
@@ -11110,7 +11120,7 @@
         </w:trPr>
         <w:tc>
           <w:tcPr>
-            <w:tcW w:w="2500" w:type="pct"/>
+            <w:tcW w:w="4183" w:type="pct"/>
           </w:tcPr>
           <w:p>
             <w:pPr>
@@ -11129,7 +11139,7 @@
         </w:tc>
         <w:tc>
           <w:tcPr>
-            <w:tcW w:w="2500" w:type="pct"/>
+            <w:tcW w:w="817" w:type="pct"/>
           </w:tcPr>
           <w:p>
             <w:pPr>
@@ -11153,7 +11163,7 @@
         </w:trPr>
         <w:tc>
           <w:tcPr>
-            <w:tcW w:w="2500" w:type="pct"/>
+            <w:tcW w:w="4183" w:type="pct"/>
           </w:tcPr>
           <w:p>
             <w:pPr>
@@ -11172,7 +11182,7 @@
         </w:tc>
         <w:tc>
           <w:tcPr>
-            <w:tcW w:w="2500" w:type="pct"/>
+            <w:tcW w:w="817" w:type="pct"/>
           </w:tcPr>
           <w:p>
             <w:pPr>
@@ -11196,7 +11206,7 @@
         </w:trPr>
         <w:tc>
           <w:tcPr>
-            <w:tcW w:w="4603" w:type="dxa"/>
+            <w:tcW w:w="4183" w:type="pct"/>
           </w:tcPr>
           <w:p>
             <w:pPr>
@@ -11209,7 +11219,7 @@
         </w:tc>
         <w:tc>
           <w:tcPr>
-            <w:tcW w:w="4603" w:type="dxa"/>
+            <w:tcW w:w="817" w:type="pct"/>
           </w:tcPr>
           <w:p>
             <w:pPr>
@@ -11227,7 +11237,7 @@
         </w:trPr>
         <w:tc>
           <w:tcPr>
-            <w:tcW w:w="4603" w:type="dxa"/>
+            <w:tcW w:w="4183" w:type="pct"/>
           </w:tcPr>
           <w:p>
             <w:pPr>
@@ -11240,7 +11250,7 @@
         </w:tc>
         <w:tc>
           <w:tcPr>
-            <w:tcW w:w="4603" w:type="dxa"/>
+            <w:tcW w:w="817" w:type="pct"/>
           </w:tcPr>
           <w:p>
             <w:pPr>
@@ -11258,7 +11268,7 @@
         </w:trPr>
         <w:tc>
           <w:tcPr>
-            <w:tcW w:w="4603" w:type="dxa"/>
+            <w:tcW w:w="4183" w:type="pct"/>
           </w:tcPr>
           <w:p>
             <w:pPr>
@@ -11271,7 +11281,7 @@
         </w:tc>
         <w:tc>
           <w:tcPr>
-            <w:tcW w:w="4603" w:type="dxa"/>
+            <w:tcW w:w="817" w:type="pct"/>
           </w:tcPr>
           <w:p>
             <w:pPr>
@@ -11289,7 +11299,7 @@
         </w:trPr>
         <w:tc>
           <w:tcPr>
-            <w:tcW w:w="4603" w:type="dxa"/>
+            <w:tcW w:w="4183" w:type="pct"/>
           </w:tcPr>
           <w:p>
             <w:r>
@@ -11299,7 +11309,7 @@
         </w:tc>
         <w:tc>
           <w:tcPr>
-            <w:tcW w:w="4603" w:type="dxa"/>
+            <w:tcW w:w="817" w:type="pct"/>
           </w:tcPr>
           <w:p>
             <w:r>
@@ -11320,6 +11330,9 @@
       <w:bookmarkEnd w:id="73"/>
     </w:p>
     <w:p>
+      <w:pPr>
+        <w:keepLines/>
+      </w:pPr>
       <w:r>
         <w:t>Entre l’environnement de travail, les interfaces effectivement livrées, les tests menés et les difficultés qu’il a fallu résoudre en cours de route, ce chapitre reflète assez fidèlement le quotidien du développement de JOB4YOU. Reste maintenant à prendre du recul sur l’ensemble du projet — c’est l’objet de la conclusion générale qui suit.</w:t>
       </w:r>
@@ -11338,7 +11351,7 @@
     </w:p>
     <w:p>
       <w:r>
-        <w:t>Sept mois après mon arrivée chez Sopra HR Software Tunisie pour ce Projet de Fin d’Études, JOB4YOU est passé d’un simple besoin identifié en tout début de stage à une plateforme fonctionnelle, capable de gérer le processus de recrutement interne de l’entreprise.</w:t>
+        <w:t>Au terme de la période de développement de ce Projet de Fin d’Études, JOB4YOU est passé d’un simple besoin identifié en tout début de stage à une plateforme fonctionnelle, capable de gérer le processus de recrutement interne de l’entreprise.</w:t>
       </w:r>
     </w:p>
     <w:p>
@@ -11353,7 +11366,7 @@
     </w:p>
     <w:p>
       <w:r>
-        <w:t xml:space="preserve">Au-delà de l’aspect purement technique, cette expérience en alternance au sein d’un grand groupe international m’a beaucoup apporté sur le plan professionnel : travail en équipe, communication régulière avec mon encadrant entreprise, prise en compte de contraintes réelles de sécurité et de fiabilité, et nécessité de concevoir une solution robuste et évolutive dans un contexte professionnel réel.</w:t>
+        <w:t xml:space="preserve">Au-delà de l’aspect purement technique, cette expérience au sein d’un grand groupe international m’a beaucoup apporté sur le plan professionnel : travail en équipe, communication régulière avec mon encadrant entreprise, prise en compte de contraintes réelles de sécurité et de fiabilité, et nécessité de concevoir une solution robuste et évolutive dans un contexte professionnel réel.</w:t>
       </w:r>
     </w:p>
     <w:p>

</xml_diff>

<commit_message>
feat(decision): contreseing RH de la decision finale manager
La decision finale n'est plus prise par le manager: ACCEPTED et
MANAGER_REJECTED ne portent plus que son avis, le RH contre-signe par
HIRED (convocation avec date de presentation) ou REJECTED (motif
obligatoire). Un compte purement manager est refuse (403) sur les
statuts finaux, le tableau de bord RH recoit le feedback immediat du
manager, et l'agent n8n n'envoie plus d'e-mail au candidat avant la
contre-signature.

Rapport PFE (beta) aligne sur ce flux: figures 2.x/3.7, tableaux,
garde-fous et suite de tests portee a 121 methodes.
</commit_message>
<xml_diff>
--- a/Rapport-PFE/finalreport/Rapport_PFE_Haythem_Bargaoui_beta.docx
+++ b/Rapport-PFE/finalreport/Rapport_PFE_Haythem_Bargaoui_beta.docx
@@ -1247,7 +1247,7 @@
       <w:r>
         <w:t xml:space="preserve">2.2.7 Diagramme de séquence système (boîte noire)</w:t>
         <w:tab/>
-        <w:t>28</w:t>
+        <w:t>29</w:t>
       </w:r>
     </w:p>
     <w:p>
@@ -1337,7 +1337,7 @@
       <w:r>
         <w:t xml:space="preserve">2.3.4 La sécurité — Spring Security et JWT</w:t>
         <w:tab/>
-        <w:t>30</w:t>
+        <w:t>31</w:t>
       </w:r>
     </w:p>
     <w:p>
@@ -1947,7 +1947,7 @@
         </w:rPr>
       </w:pPr>
       <w:r>
-        <w:t>4.5.2 Distinguer un rejet RH d’un rejet manager</w:t>
+        <w:t>4.5.2 Distinguer un avis manager d’une décision finale RH</w:t>
         <w:tab/>
         <w:t>61</w:t>
       </w:r>
@@ -2165,7 +2165,7 @@
       <w:r>
         <w:t>4.8 Conclusion</w:t>
         <w:tab/>
-        <w:t>65</w:t>
+        <w:t>66</w:t>
       </w:r>
     </w:p>
     <w:p>
@@ -2183,7 +2183,7 @@
       <w:r>
         <w:t>Conclusion Générale et Perspectives</w:t>
         <w:tab/>
-        <w:t>66</w:t>
+        <w:t>67</w:t>
       </w:r>
     </w:p>
     <w:p>
@@ -2201,7 +2201,7 @@
       <w:r>
         <w:t>Annexe A — Captures d’écran complémentaires</w:t>
         <w:tab/>
-        <w:t>68</w:t>
+        <w:t>69</w:t>
       </w:r>
     </w:p>
     <w:p>
@@ -2219,7 +2219,7 @@
       <w:r>
         <w:t>Bibliographie</w:t>
         <w:tab/>
-        <w:t>75</w:t>
+        <w:t>76</w:t>
       </w:r>
     </w:p>
     <w:p>
@@ -2237,7 +2237,7 @@
       <w:r>
         <w:t>Glossaire</w:t>
         <w:tab/>
-        <w:t>77</w:t>
+        <w:t>78</w:t>
       </w:r>
     </w:p>
     <w:p>
@@ -2640,7 +2640,7 @@
       <w:r>
         <w:t xml:space="preserve">Figure A.1 : Page de connexion</w:t>
         <w:tab/>
-        <w:t>68</w:t>
+        <w:t>69</w:t>
       </w:r>
     </w:p>
     <w:p>
@@ -2652,7 +2652,7 @@
       <w:r>
         <w:t xml:space="preserve">Figure A.2 : Modification d’un dossier candidat</w:t>
         <w:tab/>
-        <w:t>69</w:t>
+        <w:t>70</w:t>
       </w:r>
     </w:p>
     <w:p>
@@ -2664,7 +2664,7 @@
       <w:r>
         <w:t xml:space="preserve">Figure A.3 : Gestion des entretiens</w:t>
         <w:tab/>
-        <w:t>70</w:t>
+        <w:t>71</w:t>
       </w:r>
     </w:p>
     <w:p>
@@ -2676,7 +2676,7 @@
       <w:r>
         <w:t xml:space="preserve">Figure A.4 : Gestion des feedbacks</w:t>
         <w:tab/>
-        <w:t>70</w:t>
+        <w:t>71</w:t>
       </w:r>
     </w:p>
     <w:p>
@@ -2688,7 +2688,7 @@
       <w:r>
         <w:t xml:space="preserve">Figure A.5 : Journal d’audit</w:t>
         <w:tab/>
-        <w:t>71</w:t>
+        <w:t>72</w:t>
       </w:r>
     </w:p>
     <w:p>
@@ -2700,7 +2700,7 @@
       <w:r>
         <w:t xml:space="preserve">Figure A.6 : Soumission d’une candidature avec dépôt de CV</w:t>
         <w:tab/>
-        <w:t>71</w:t>
+        <w:t>72</w:t>
       </w:r>
     </w:p>
     <w:p>
@@ -2712,7 +2712,7 @@
       <w:r>
         <w:t xml:space="preserve">Figure A.7 : Espace Manager — candidatures relevant du périmètre du manager</w:t>
         <w:tab/>
-        <w:t>72</w:t>
+        <w:t>73</w:t>
       </w:r>
     </w:p>
     <w:p>
@@ -2724,7 +2724,7 @@
       <w:r>
         <w:t xml:space="preserve">Figure A.8 : Console n8n — les trois flux d’automatisation publiés et leurs statistiques</w:t>
         <w:tab/>
-        <w:t>73</w:t>
+        <w:t>74</w:t>
       </w:r>
     </w:p>
     <w:p>
@@ -2736,7 +2736,7 @@
       <w:r>
         <w:t xml:space="preserve">Figure A.9 : Flux n8n de l’Agent 1 — webhook de candidature, appel du scoring Cohere puis e-mail au candidat</w:t>
         <w:tab/>
-        <w:t>73</w:t>
+        <w:t>74</w:t>
       </w:r>
     </w:p>
     <w:p>
@@ -2748,7 +2748,7 @@
       <w:r>
         <w:t xml:space="preserve">Figure A.10 : E-mail automatique de confirmation de candidature reçu par le candidat</w:t>
         <w:tab/>
-        <w:t>74</w:t>
+        <w:t>75</w:t>
       </w:r>
     </w:p>
     <w:p>
@@ -3208,7 +3208,7 @@
         </w:numPr>
       </w:pPr>
       <w:r>
-        <w:t xml:space="preserve">Le Responsable RH, qui publie et gère les offres d’emploi, examine les candidatures reçues, valide les dossiers, planifie les entretiens et veille à la communication des décisions finales aux candidats, qu’elles soient prises par lui-même ou par le manager concerné.</w:t>
+        <w:t xml:space="preserve">Le Responsable RH, qui publie et gère les offres d’emploi, examine les candidatures reçues, valide les dossiers, planifie les entretiens et contre-signe la décision finale — embauche (avec date de présentation des documents) ou refus motivé —, seule étape qui déclenche l’e-mail de réponse au candidat.</w:t>
       </w:r>
     </w:p>
     <w:p>
@@ -3220,7 +3220,7 @@
         </w:numPr>
       </w:pPr>
       <w:r>
-        <w:t xml:space="preserve">Le Manager, qui intervient à partir de l’entrée du dossier en évaluation technique (statut TECHNICAL_TEST), mène ou participe aux entretiens, fournit un feedback structuré et peut saisir la décision finale (acceptation ou refus) sur les dossiers de son périmètre ; cette saisie est tracée dans le journal d’audit, puis notifiée par la plateforme.</w:t>
+        <w:t xml:space="preserve">Le Manager, qui intervient à partir de l’entrée du dossier en évaluation technique (statut TECHNICAL_TEST), mène ou participe aux entretiens, fournit un feedback structuré et émet un avis — favorable (ACCEPTED) ou refus proposé (MANAGER_REJECTED) — sur les dossiers de son périmètre ; cet avis est tracé dans le journal d’audit et transmis au RH, qui le contre-signe.</w:t>
       </w:r>
     </w:p>
     <w:p>
@@ -4091,7 +4091,7 @@
               <w:rPr>
                 <w:sz w:val="21"/>
               </w:rPr>
-              <w:t>Planifier les entretiens et trancher la décision finale</w:t>
+              <w:t xml:space="preserve">Planifier les entretiens, émettre un avis et le contre-signer</w:t>
             </w:r>
           </w:p>
         </w:tc>
@@ -4484,7 +4484,7 @@
         </w:numPr>
       </w:pPr>
       <w:r>
-        <w:t>Le Responsable RH : acteur central du processus, il publie les offres, examine et valide les candidatures, planifie les entretiens et communique les décisions.</w:t>
+        <w:t xml:space="preserve">Le Responsable RH : acteur central du processus, il publie les offres, examine et valide les candidatures, planifie les entretiens et contre-signe la décision finale (embauche ou refus), seul moment où le candidat est notifié.</w:t>
       </w:r>
     </w:p>
     <w:p>
@@ -4496,7 +4496,7 @@
         </w:numPr>
       </w:pPr>
       <w:r>
-        <w:t xml:space="preserve">Le Manager : intervient à partir de l’entrée du dossier en évaluation technique (statut TECHNICAL_TEST) ; il consulte les candidatures relevant de son périmètre, mène ou participe aux entretiens, fournit un feedback structuré et peut prendre la décision finale (acceptation ou refus) sur les dossiers de son périmètre.</w:t>
+        <w:t xml:space="preserve">Le Manager : intervient à partir de l’entrée du dossier en évaluation technique (statut TECHNICAL_TEST) ; il consulte les candidatures relevant de son périmètre, mène ou participe aux entretiens, fournit un feedback structuré et émet un avis (favorable ou refus proposé) sur les dossiers de son périmètre, qui reste à contre-signer par le RH.</w:t>
       </w:r>
     </w:p>
     <w:p>
@@ -5192,7 +5192,7 @@
               <w:rPr>
                 <w:sz w:val="21"/>
               </w:rPr>
-              <w:t>Décision finale (acceptation / refus)</w:t>
+              <w:t xml:space="preserve">Avis sur la candidature (favorable / refus proposé)</w:t>
             </w:r>
           </w:p>
         </w:tc>
@@ -5292,7 +5292,7 @@
               <w:rPr>
                 <w:sz w:val="21"/>
               </w:rPr>
-              <w:t>Gérer les utilisateurs et les rôles</w:t>
+              <w:t xml:space="preserve">Décision finale contre-signée (HIRED / REJECTED)</w:t>
             </w:r>
           </w:p>
         </w:tc>
@@ -5311,7 +5311,7 @@
               <w:rPr>
                 <w:sz w:val="21"/>
               </w:rPr>
-              <w:t>Non</w:t>
+              <w:t xml:space="preserve">Oui</w:t>
             </w:r>
           </w:p>
         </w:tc>
@@ -5330,7 +5330,7 @@
               <w:rPr>
                 <w:sz w:val="21"/>
               </w:rPr>
-              <w:t>Non</w:t>
+              <w:t xml:space="preserve">Non</w:t>
             </w:r>
           </w:p>
         </w:tc>
@@ -5349,7 +5349,7 @@
               <w:rPr>
                 <w:sz w:val="21"/>
               </w:rPr>
-              <w:t>Oui</w:t>
+              <w:t xml:space="preserve">Oui</w:t>
             </w:r>
           </w:p>
         </w:tc>
@@ -5368,7 +5368,7 @@
               <w:rPr>
                 <w:sz w:val="21"/>
               </w:rPr>
-              <w:t>Non</w:t>
+              <w:t xml:space="preserve">Non</w:t>
             </w:r>
           </w:p>
         </w:tc>
@@ -5392,7 +5392,7 @@
               <w:rPr>
                 <w:sz w:val="21"/>
               </w:rPr>
-              <w:t>Paramétrer le scoring IA</w:t>
+              <w:t>Gérer les utilisateurs et les rôles</w:t>
             </w:r>
           </w:p>
         </w:tc>
@@ -5483,6 +5483,106 @@
           </w:tcPr>
           <w:p>
             <w:pPr>
+              <w:keepNext/>
+              <w:rPr>
+                <w:sz w:val="21"/>
+              </w:rPr>
+            </w:pPr>
+            <w:r>
+              <w:rPr>
+                <w:sz w:val="21"/>
+              </w:rPr>
+              <w:t>Paramétrer le scoring IA</w:t>
+            </w:r>
+          </w:p>
+        </w:tc>
+        <w:tc>
+          <w:tcPr>
+            <w:tcW w:w="1000" w:type="pct"/>
+          </w:tcPr>
+          <w:p>
+            <w:pPr>
+              <w:keepNext/>
+              <w:rPr>
+                <w:sz w:val="21"/>
+              </w:rPr>
+            </w:pPr>
+            <w:r>
+              <w:rPr>
+                <w:sz w:val="21"/>
+              </w:rPr>
+              <w:t>Non</w:t>
+            </w:r>
+          </w:p>
+        </w:tc>
+        <w:tc>
+          <w:tcPr>
+            <w:tcW w:w="1000" w:type="pct"/>
+          </w:tcPr>
+          <w:p>
+            <w:pPr>
+              <w:keepNext/>
+              <w:rPr>
+                <w:sz w:val="21"/>
+              </w:rPr>
+            </w:pPr>
+            <w:r>
+              <w:rPr>
+                <w:sz w:val="21"/>
+              </w:rPr>
+              <w:t>Non</w:t>
+            </w:r>
+          </w:p>
+        </w:tc>
+        <w:tc>
+          <w:tcPr>
+            <w:tcW w:w="1000" w:type="pct"/>
+          </w:tcPr>
+          <w:p>
+            <w:pPr>
+              <w:keepNext/>
+              <w:rPr>
+                <w:sz w:val="21"/>
+              </w:rPr>
+            </w:pPr>
+            <w:r>
+              <w:rPr>
+                <w:sz w:val="21"/>
+              </w:rPr>
+              <w:t>Oui</w:t>
+            </w:r>
+          </w:p>
+        </w:tc>
+        <w:tc>
+          <w:tcPr>
+            <w:tcW w:w="1000" w:type="pct"/>
+          </w:tcPr>
+          <w:p>
+            <w:pPr>
+              <w:keepNext/>
+              <w:rPr>
+                <w:sz w:val="21"/>
+              </w:rPr>
+            </w:pPr>
+            <w:r>
+              <w:rPr>
+                <w:sz w:val="21"/>
+              </w:rPr>
+              <w:t>Non</w:t>
+            </w:r>
+          </w:p>
+        </w:tc>
+      </w:tr>
+      <w:tr>
+        <w:trPr>
+          <w:cantSplit/>
+        </w:trPr>
+        <w:tc>
+          <w:tcPr>
+            <w:tcW w:w="1000" w:type="pct"/>
+          </w:tcPr>
+          <w:p>
+            <w:pPr>
               <w:rPr>
                 <w:sz w:val="21"/>
               </w:rPr>
@@ -5571,7 +5671,7 @@
     </w:tbl>
     <w:p>
       <w:r>
-        <w:t xml:space="preserve">J’ai volontairement donné au RH et à l’Administrateur un droit de décision qui recouvre celui du Manager : un RH peut ainsi corriger ou débloquer un dossier en l’absence du manager concerné, tout en gardant une trace, via le journal d’audit, de qui a réellement pris chaque décision.</w:t>
+        <w:t xml:space="preserve">J’ai volontairement donné au RH et à l’Administrateur la main sur l’ensemble du cycle : ils peuvent enregistrer un avis comme le ferait le manager — pour corriger ou débloquer un dossier en son absence — et sont seuls à pouvoir contre-signer la décision finale. Un compte purement manager ne peut écrire ni l’embauche (HIRED) ni un statut du pipeline : la plateforme le refuse par une erreur 403. Qui a réellement pris chaque décision reste visible dans le journal d’audit.</w:t>
       </w:r>
     </w:p>
     <w:p>
@@ -5670,7 +5770,7 @@
         </w:numPr>
       </w:pPr>
       <w:r>
-        <w:t>Prise de décision finale : validation ou refus d’un candidat par le manager ou par le RH, avec garde-fou empêchant toute décision sur un dossier non encore validé par le RH.</w:t>
+        <w:t xml:space="preserve">Décision à deux niveaux : le manager émet un avis (favorable ou refus proposé) que le RH ou l’Administrateur contre-signe pour produire la décision finale — embauche avec date de présentation des documents, ou refus motivé —, avec garde-fou empêchant toute décision sur un dossier non validé par le RH et toute validation finale par un compte purement manager.</w:t>
       </w:r>
     </w:p>
     <w:p>
@@ -5682,7 +5782,7 @@
         </w:numPr>
       </w:pPr>
       <w:r>
-        <w:t>Notifications automatiques par e-mail à chaque étape clé du processus (confirmation de candidature, invitation à un entretien, décision finale).</w:t>
+        <w:t xml:space="preserve">Notifications automatiques par e-mail à chaque étape clé du processus (confirmation de candidature, invitation à un entretien, décision finale) ; l’e-mail de décision n’est adressé au candidat qu’après le contreseing du RH, l’avis du manager notifiant le RH.</w:t>
       </w:r>
     </w:p>
     <w:p>
@@ -5781,7 +5881,7 @@
         </w:numPr>
       </w:pPr>
       <w:r>
-        <w:t>Fiabilité : garde-fous métier empêchant les transitions de statut incohérentes (ex. décision finale sur un dossier non validé par le RH, entretien planifié sur un dossier clos).</w:t>
+        <w:t xml:space="preserve">Fiabilité : garde-fous métier empêchant les transitions de statut incohérentes (ex. acceptation avant l’entretien téléphonique RH, validation finale sans avis manager en attente, embauche sans date de présentation des documents, entretien planifié sur un dossier clos).</w:t>
       </w:r>
     </w:p>
     <w:p>
@@ -5830,10 +5930,10 @@
         </w:sectPr>
       </w:pPr>
       <w:r>
-        <w:t xml:space="preserve">Le diagramme d’activité de la figure 2.1 (page suivante) rend explicite un point que le texte seul rendait moins visible : l’entretien téléphonique RH est un passage obligé avant toute évaluation technique (section 4.5.8), et le routage vers le ou les managers concernés (ManagerRoutingService, section 3.5.4) n’intervient qu’à ce moment-là, pas dès la validation du CV — conformément à la correction décrite en section 4.5.5.</w:t>
-      </w:r>
-      <w:r>
-        <w:t xml:space="preserve"> Le rejet automatique par l’IA n’y constitue pas une fin de parcours distincte : il rejoint, comme la décision finale du manager, l’étape commune de notification et de journalisation, et reste réversible par un override RH justifié (transition pointillée de la figure 3.8).</w:t>
+        <w:t xml:space="preserve">Le diagramme d’activité de la figure 2.1 (page suivante) rend explicite un point que le texte seul rendait moins visible : l’entretien téléphonique RH est un passage obligé avant toute évaluation technique (section 4.5.8), et le routage vers le ou les managers concernés (ManagerRoutingService, section 3.5.4) n’intervient qu’à ce moment-là, pas dès la validation du CV — conformément à la correction décrite en section 4.5.5. Le rejet automatique par l’IA n’y constitue pas une fin de parcours distincte : il rejoint, comme la contre-signature du RH, l’étape commune de notification et de journalisation, et reste réversible par un override RH justifié (transition pointillée de la figure 3.8).</w:t>
+      </w:r>
+      <w:r>
+        <w:t xml:space="preserve"/>
       </w:r>
     </w:p>
     <w:p>
@@ -5847,7 +5947,7 @@
           <w:noProof/>
         </w:rPr>
         <w:pict w14:anchorId="6BD435BB">
-          <v:shape id="Picture 3" o:spid="_x0000_i1039" type="#_x0000_t75" style="visibility:visible;mso-wrap-style:square;visibility:visible;width:769.9pt;height:439.8pt;visibility:visible">
+          <v:shape id="Picture 3" o:spid="_x0000_i1039" type="#_x0000_t75" style="visibility:visible;mso-wrap-style:square;visibility:visible;width:769.9pt;height:455.3pt;visibility:visible">
             <v:imagedata r:id="rId25" o:title=""/>
           </v:shape>
         </w:pict>
@@ -5901,7 +6001,7 @@
           <w:noProof/>
         </w:rPr>
         <w:pict>
-          <v:shape id="Img 1051" o:spid="_x0000_i1051" type="#_x0000_t75" style="visibility:visible;mso-wrap-style:square;visibility:visible;width:332.7pt;height:478.0pt;visibility:visible">
+          <v:shape id="Img 1051" o:spid="_x0000_i1051" type="#_x0000_t75" style="visibility:visible;mso-wrap-style:square;visibility:visible;width:332.7pt;height:499.2pt;visibility:visible">
             <v:imagedata r:id="rId43" o:title=""/>
             <o:lock v:ext="edit" aspectratio="f"/>
           </v:shape>
@@ -5938,7 +6038,7 @@
     <w:p>
       <w:pPr/>
       <w:r>
-        <w:t xml:space="preserve">L’authentification constitue une fonctionnalité transversale de la plateforme : le cas d’utilisation « S’authentifier » est commun au Candidat, au Responsable RH, au Manager et à l’Administrateur, qui doivent s’identifier avant d’accéder à leur espace sécurisé. Pour ne pas surcharger la figure 2.2, la relation « include » n’y est représentée que pour sept cas représentatifs (postuler à une offre, suivre l’état de sa candidature, consulter ses entretiens planifiés, échanger avec l’assistant conversationnel, consulter et filtrer les candidatures, trancher la décision finale, gérer les utilisateurs et les rôles) ; elle s’applique à toutes les fonctionnalités des espaces sécurisés. Seules la consultation et la recherche des offres ainsi que les suggestions « Job idéal » demeurent accessibles au visiteur non authentifié, l’assistant conversationnel restant réservé au candidat authentifié. Les autorisations sont ensuite contrôlées côté serveur selon le rôle et le périmètre métier de l’utilisateur. Les diagrammes ne représentent que les cas principaux : la matrice du tableau 2.1 fait foi pour le détail des droits (par exemple, le RH peut aussi saisir un feedback et consulter le journal d’audit).</w:t>
+        <w:t xml:space="preserve">L’authentification constitue une fonctionnalité transversale de la plateforme : le cas d’utilisation « S’authentifier » est commun au Candidat, au Responsable RH, au Manager et à l’Administrateur, qui doivent s’identifier avant d’accéder à leur espace sécurisé. Pour ne pas surcharger la figure 2.2, la relation « include » n’y est représentée que pour sept cas représentatifs (postuler à une offre, suivre l’état de sa candidature, consulter ses entretiens planifiés, échanger avec l’assistant conversationnel, consulter et filtrer les candidatures, contre-signer la décision finale, gérer les utilisateurs et les rôles) ; elle s’applique à toutes les fonctionnalités des espaces sécurisés. Seules la consultation et la recherche des offres ainsi que les suggestions « Job idéal » demeurent accessibles au visiteur non authentifié, l’assistant conversationnel restant réservé au candidat authentifié. Les autorisations sont ensuite contrôlées côté serveur selon le rôle et le périmètre métier de l’utilisateur. Les diagrammes ne représentent que les cas principaux : la matrice du tableau 2.1 fait foi pour le détail des droits (par exemple, le RH peut aussi saisir un feedback et consulter le journal d’audit).</w:t>
       </w:r>
     </w:p>
     <w:p>
@@ -5985,7 +6085,7 @@
     <w:p>
       <w:pPr/>
       <w:r>
-        <w:t xml:space="preserve">Le deuxième zoom décrit le cœur du processus côté RH et manager : publication des offres, filtrage, entretiens, feedbacks et décision finale (figure 2.4). L’envoi des notifications par e-mail y est modélisé comme un cas inclus, déclenché par la planification ou par la décision, et non comme un cas autonome.</w:t>
+        <w:t xml:space="preserve">Le deuxième zoom décrit le cœur du processus côté RH et manager : publication des offres, filtrage, entretiens, feedbacks, avis du manager puis contre-signature RH de la décision finale (figure 2.4). L’envoi des notifications par e-mail y est modélisé comme un cas inclus, déclenché par la planification ou par la décision, et non comme un cas autonome.</w:t>
       </w:r>
     </w:p>
     <w:p>
@@ -5999,7 +6099,7 @@
           <w:noProof/>
         </w:rPr>
         <w:pict>
-          <v:shape id="Img 1053" o:spid="_x0000_i1053" type="#_x0000_t75" style="visibility:visible;mso-wrap-style:square;visibility:visible;width:453.3pt;height:411.6pt;visibility:visible">
+          <v:shape id="Img 1053" o:spid="_x0000_i1053" type="#_x0000_t75" style="visibility:visible;mso-wrap-style:square;visibility:visible;width:453.3pt;height:391.1pt;visibility:visible">
             <v:imagedata r:id="rId45" o:title=""/>
             <o:lock v:ext="edit" aspectratio="f"/>
           </v:shape>
@@ -6185,7 +6285,7 @@
                 <w:b/>
                 <w:sz w:val="21"/>
               </w:rPr>
-              <w:t xml:space="preserve">Cas d’utilisation « Décider Accepter / Refuser »</w:t>
+              <w:t xml:space="preserve">Cas d’utilisation « Avis manager, puis décision finale »</w:t>
             </w:r>
           </w:p>
         </w:tc>
@@ -6247,7 +6347,7 @@
               <w:rPr>
                 <w:sz w:val="21"/>
               </w:rPr>
-              <w:t>Manager</w:t>
+              <w:t xml:space="preserve">Manager (avis), puis Responsable RH (contreseing)</w:t>
             </w:r>
           </w:p>
         </w:tc>
@@ -6309,7 +6409,7 @@
               <w:rPr>
                 <w:sz w:val="21"/>
               </w:rPr>
-              <w:t xml:space="preserve">Le dossier est en cours d’évaluation : un refus (MANAGER_REJECTED) est admis dès la présélection du CV (statut CV_REVIEWED ou ultérieur) ; une acceptation (ACCEPTED) exige d’être passé par l’entretien téléphonique RH (PHONE_SCREENING, TECHNICAL_TEST, INTERVIEW ou FINAL_INTERVIEW).</w:t>
+              <w:t xml:space="preserve">Le dossier est en cours d’évaluation : un refus proposé (MANAGER_REJECTED) est admis dès la présélection du CV (statut CV_REVIEWED ou ultérieur) ; un avis favorable (ACCEPTED) exige d’être passé par l’entretien téléphonique RH (PHONE_SCREENING, TECHNICAL_TEST, INTERVIEW ou FINAL_INTERVIEW).</w:t>
             </w:r>
           </w:p>
         </w:tc>
@@ -6371,7 +6471,7 @@
               <w:rPr>
                 <w:sz w:val="21"/>
               </w:rPr>
-              <w:t>Le manager consulte le dossier du candidat, ses scores et éventuels feedbacks, puis valide une décision d’acceptation ou de refus.</w:t>
+              <w:t xml:space="preserve">Le manager consulte le dossier du candidat, ses scores et ses éventuels feedbacks, puis émet un avis — favorable, ou refus proposé accompagné d’un motif. Le RH, averti par e-mail et dans sa liste de candidats, contre-signe cet avis : embauche (HIRED) avec date de présentation des documents, ou refus final (REJECTED) motivé.</w:t>
             </w:r>
           </w:p>
         </w:tc>
@@ -6433,7 +6533,7 @@
               <w:rPr>
                 <w:sz w:val="21"/>
               </w:rPr>
-              <w:t>Le statut du candidat passe à ACCEPTED ou MANAGER_REJECTED et un e-mail de décision est envoyé au candidat.</w:t>
+              <w:t xml:space="preserve">L’avis est enregistré (ACCEPTED ou MANAGER_REJECTED) et notifié au RH ; la décision finale (HIRED ou REJECTED) n’est acquise qu’après son contreseing, seul moment où le candidat reçoit un e-mail.</w:t>
             </w:r>
           </w:p>
         </w:tc>
@@ -6492,7 +6592,7 @@
               <w:rPr>
                 <w:sz w:val="21"/>
               </w:rPr>
-              <w:t>Dossier à un statut qui n’autorise pas la décision demandée — par exemple une acceptation avant l’entretien téléphonique RH : le système refuse la décision et retourne un message d’erreur explicite.</w:t>
+              <w:t xml:space="preserve">Dossier à un statut qui n’autorise pas la décision demandée — par exemple un avis favorable avant l’entretien téléphonique RH — ou refus manager sans motif : le système retourne une erreur 400. Un compte purement manager qui appelle le point d’entrée de validation finale reçoit une erreur 403.</w:t>
             </w:r>
           </w:p>
         </w:tc>
@@ -6826,7 +6926,7 @@
               <w:rPr>
                 <w:sz w:val="21"/>
               </w:rPr>
-              <w:t xml:space="preserve">Agent 3 — « RH vers Manager (dossier validé) » (décisions et routage des managers)</w:t>
+              <w:t xml:space="preserve">Agent 3 — « RH vers Manager (dossier validé) » (routage des managers et décisions automatiques)</w:t>
             </w:r>
           </w:p>
         </w:tc>
@@ -6844,7 +6944,7 @@
               <w:rPr>
                 <w:sz w:val="21"/>
               </w:rPr>
-              <w:t xml:space="preserve">Webhooks déclenchés à l’entrée en évaluation technique (TECHNICAL_TEST) et à la décision finale</w:t>
+              <w:t xml:space="preserve">Webhooks déclenchés à l’entrée en évaluation technique (TECHNICAL_TEST), au rejet automatique et au retrait d’une candidature</w:t>
             </w:r>
           </w:p>
         </w:tc>
@@ -6862,7 +6962,7 @@
               <w:rPr>
                 <w:sz w:val="21"/>
               </w:rPr>
-              <w:t xml:space="preserve">Résout les managers destinataires (ManagerRoutingService) et envoie les notifications de décision au candidat ainsi qu’aux managers concernés, sans dupliquer l’e-mail candidat.</w:t>
+              <w:t xml:space="preserve">Résout les managers destinataires (ManagerRoutingService) et envoie les notifications correspondantes aux managers concernés, sans dupliquer l’e-mail candidat ; les e-mails de décision — avis transmis au RH, convocation ou refus final adressé au candidat — sont émis par le back-end via NotificationService.</w:t>
             </w:r>
           </w:p>
         </w:tc>
@@ -7051,7 +7151,7 @@
           <w:noProof/>
         </w:rPr>
         <w:pict w14:anchorId="598E410F">
-          <v:shape id="Image 6" o:spid="_x0000_i1030" type="#_x0000_t75" style="visibility:visible;mso-wrap-style:square;visibility:visible;visibility:visible;width:339.5pt;height:500.0pt;visibility:visible">
+          <v:shape id="Image 6" o:spid="_x0000_i1030" type="#_x0000_t75" style="visibility:visible;mso-wrap-style:square;visibility:visible;visibility:visible;width:339.5pt;height:514.2pt;visibility:visible">
             <v:imagedata r:id="rId901" o:title=""/>
           </v:shape>
         </w:pict>
@@ -7085,7 +7185,7 @@
           <w:noProof/>
         </w:rPr>
         <w:pict w14:anchorId="598E410F">
-          <v:shape id="Image 6" o:spid="_x0000_i1030" type="#_x0000_t75" style="visibility:visible;mso-wrap-style:square;visibility:visible;width:278.3pt;height:600.0pt;visibility:visible">
+          <v:shape id="Image 6" o:spid="_x0000_i1030" type="#_x0000_t75" style="visibility:visible;mso-wrap-style:square;visibility:visible;width:278.3pt;height:616.4pt;visibility:visible">
             <v:imagedata r:id="rId16" o:title=""/>
           </v:shape>
         </w:pict>
@@ -7295,7 +7395,7 @@
           <w:noProof/>
         </w:rPr>
         <w:pict w14:anchorId="52C8B92C">
-          <v:shape id="Image 8" o:spid="_x0000_i1032" type="#_x0000_t75" style="visibility:visible;mso-wrap-style:square;width:394.7pt;height:263.1pt;visibility:visible">
+          <v:shape id="Image 8" o:spid="_x0000_i1032" type="#_x0000_t75" style="visibility:visible;mso-wrap-style:square;width:394.7pt;height:302.7pt;visibility:visible">
             <v:imagedata r:id="rId18" o:title=""/>
           </v:shape>
         </w:pict>
@@ -7326,7 +7426,7 @@
         </w:sectPr>
       </w:pPr>
       <w:r>
-        <w:t xml:space="preserve">Ce second diagramme illustre un autre garde-fou central de l’application : la prise de décision est soumise aux règles de transition du cycle de vie (section 3.6). Un refus (MANAGER_REJECTED) peut intervenir dès que le dossier a été validé par le RH (statut CV_REVIEWED ou ultérieur), tandis qu’une acceptation (ACCEPTED) exige d’être passé par l’entretien téléphonique RH (statut PHONE_SCREENING) — l’entrée en évaluation technique n’étant pas un prérequis à l’acceptation. Ce garde-fou empêche qu’une candidature soit acceptée sans ce premier filtre humain (section 4.5.8).</w:t>
+        <w:t xml:space="preserve">Ce second diagramme illustre le garde-fou central du processus, dont la décision est désormais répartie sur deux niveaux. Le manager consulte le dossier et émet un avis : un refus proposé (MANAGER_REJECTED) est admis dès que le dossier a été validé par le RH (statut CV_REVIEWED ou ultérieur), à condition d’être motivé, tandis qu’un avis favorable (ACCEPTED) exige d’être passé par l’entretien téléphonique RH (PHONE_SCREENING) — l’entrée en évaluation technique n’étant pas un prérequis. L’avis est journalisé et notifie le RH par e-mail et dans sa liste de candidats, sans aucun envoi au candidat. Le RH ou l’Administrateur contre-signe ensuite via PATCH /api/candidates/{id}/final-validation : HIRED exige la date de présentation des documents et déclenche la convocation, REJECTED exige un motif et déclenche le refus motivé. Un compte purement manager qui appelle ce point d’entrée, écrit HIRED ou un statut du pipeline reçoit une erreur 403. L’ensemble empêche qu’une candidature soit acceptée sans ce premier filtre humain (section 4.5.8), et qu’un manager clôture seul le processus.</w:t>
       </w:r>
     </w:p>
     <w:p>
@@ -7468,7 +7568,7 @@
           <w:noProof/>
         </w:rPr>
         <w:pict w14:anchorId="51AEDC00">
-          <v:shape id="Image 9" o:spid="_x0000_i1035" type="#_x0000_t75" style="visibility:visible;mso-wrap-style:square;visibility:visible;visibility:visible;width:453.3pt;height:444.4pt">
+          <v:shape id="Image 9" o:spid="_x0000_i1035" type="#_x0000_t75" style="visibility:visible;mso-wrap-style:square;visibility:visible;visibility:visible;width:453.3pt;height:557.5pt">
             <v:imagedata r:id="rId21" o:title=""/>
           </v:shape>
         </w:pict>
@@ -7500,13 +7600,13 @@
     </w:p>
     <w:p>
       <w:r>
-        <w:t xml:space="preserve">Note – le statut INTERVIEW_SCHEDULED suit ACCEPTED : il matérialise la confirmation de l’agenda qui suit la décision d’acceptation et précède l’état définitif HIRED ; il ne désigne pas un entretien d’évaluation, ceux du pipeline étant clos aux statuts INTERVIEW et FINAL_INTERVIEW. La plateforme ne modélise pas de type d’entretien dédié à l’onboarding, et la planification d’un entretien ne modifie pas le statut de la candidature : seule la machine à états porte l’enchaînement accepté → agenda confirmé → recruté.</w:t>
+        <w:t xml:space="preserve">Note – le statut INTERVIEW_SCHEDULED suit ACCEPTED : il matérialise la confirmation de l’agenda qui suit l’avis favorable et précède l’état définitif HIRED ; il ne désigne pas un entretien d’évaluation, ceux du pipeline étant clos aux statuts INTERVIEW et FINAL_INTERVIEW. La plateforme ne modélise pas de type d’entretien dédié à l’onboarding, et la planification d’un entretien ne modifie pas le statut de la candidature : seule la machine à états porte l’enchaînement avis favorable → agenda confirmé → validation finale du RH.</w:t>
       </w:r>
     </w:p>
     <w:p>
       <w:pPr/>
       <w:r>
-        <w:t xml:space="preserve">On y distingue notamment un embranchement automatique piloté par le score de l’analyse IA : le dossier passe en CV_REVIEWED lorsque le score atteint le seuil de 60/100, en AUTO_REJECTED lorsqu’il descend sous ce seuil. Les dossiers signalés par le drapeau needsHumanReview — zone grise de 55 à 65, texte de CV inexploitable ou mode dégradé — font exception à cette règle : ils rejoignent CV_REVIEWED pour un arbitrage RH et ne sont jamais rejetés automatiquement (section 4.4.6). Le statut CV_REVIEWED y garde un sens unique, le dossier est prêt pour l’examen humain, mais la plateforme ne distingue pas par un état séparé le cas où le score suffit et le cas où un arbitrage est requis : ces deux situations sont signalées par le drapeau et par le motif enregistrés, non par le statut. Les états véritablement terminaux (HIRED, MANAGER_REJECTED, WITHDRAWN) n’admettent plus aucune modification depuis l’interface d’administration, tandis qu’AUTO_REJECTED reste révisable par la correction manuelle du score décrite ci-après ; la transition vers INTERVIEW_SCHEDULED, qui suit la décision d’acceptation, est définie dans la note sous la figure 3.8.</w:t>
+        <w:t xml:space="preserve">On y distingue notamment un embranchement automatique piloté par le score de l’analyse IA : le dossier passe en CV_REVIEWED lorsque le score atteint le seuil de 60/100, en AUTO_REJECTED lorsqu’il descend sous ce seuil. Les dossiers signalés par le drapeau needsHumanReview — zone grise de 55 à 65, texte de CV inexploitable ou mode dégradé — font exception à cette règle : ils rejoignent CV_REVIEWED pour un arbitrage RH et ne sont jamais rejetés automatiquement (section 4.4.6). Le statut CV_REVIEWED y garde un sens unique, le dossier est prêt pour l’examen humain, mais la plateforme ne distingue pas par un état séparé le cas où le score suffit et le cas où un arbitrage est requis : ces deux situations sont signalées par le drapeau et par le motif enregistrés, non par le statut. La décision elle-même est à deux niveaux : ACCEPTED et MANAGER_REJECTED ne sont que des avis du manager, en attente du contreseing du RH, qui seul atteint HIRED (moyennant la date de présentation des documents) ou REJECTED (moyennant un motif) ; le RH peut aussi prononcer un refus final depuis n’importe quelle étape d’évaluation, et le candidat peut se retirer (WITHDRAWN) tant que le dossier n’est pas clos. Les états véritablement terminaux (HIRED, REJECTED, AUTO_REJECTED, WITHDRAWN) n’admettent plus aucune modification depuis l’interface d’administration, tandis qu’AUTO_REJECTED reste révisable par la correction manuelle du score décrite ci-après ; la transition vers INTERVIEW_SCHEDULED, qui suit l’avis favorable, est définie dans la note sous la figure 3.8.</w:t>
       </w:r>
     </w:p>
     <w:p>
@@ -8431,7 +8531,7 @@
     </w:p>
     <w:p>
       <w:r>
-        <w:t xml:space="preserve">Au-delà des vérifications manuelles, la couche service et une partie de la couche controller sont couvertes par une suite de tests automatisés écrite avec JUnit 5 et Mockito [16], exécutée via Maven. Elle comprend 12 classes de test pour un total de 108 méthodes de test : CandidateServiceTest, JobOfferServiceTest, ManagerRoutingServiceTest, N8nServiceTest, ScoringWeightProfileServiceTest, AiScoringServiceTest, InterviewServiceTest et InterviewServiceManagerCalendarTest en tests unitaires purs (services isolés à l’aide de doublons Mockito), ainsi que CandidateControllerWorkflowTest, CandidateStatusAnonymousSecurityTest, InterviewManagerCalendarSecurityTest et InterviewMeetLinkSecurityTest en tests de contrôleur reposant sur @WebMvcTest et MockMvc, qui vérifient notamment le comportement des routes accessibles de façon anonyme et la sécurité d’accès au lien Google Meet d’un entretien. Ces tests couvrent en particulier le routage des managers par département, l’isolation stricte de la visibilité des dossiers, le calcul du score IA et ses seuils, le découplage entre planification d’entretien et statut du candidat, ainsi que les garde-fous de transition décrits au chapitre 3.</w:t>
+        <w:t xml:space="preserve">Au-delà des vérifications manuelles, la couche service et une partie de la couche controller sont couvertes par une suite de tests automatisés écrite avec JUnit 5 et Mockito [16], exécutée via Maven. Elle comprend 12 classes de test pour un total de 121 méthodes de test : CandidateServiceTest, JobOfferServiceTest, ManagerRoutingServiceTest, N8nServiceTest, ScoringWeightProfileServiceTest, AiScoringServiceTest, InterviewServiceTest et InterviewServiceManagerCalendarTest en tests unitaires purs (services isolés à l’aide de doublons Mockito), ainsi que CandidateControllerWorkflowTest, CandidateStatusAnonymousSecurityTest, InterviewManagerCalendarSecurityTest et InterviewMeetLinkSecurityTest en tests de contrôleur reposant sur @WebMvcTest et MockMvc, qui vérifient notamment le comportement des routes accessibles de façon anonyme et la sécurité d’accès au lien Google Meet d’un entretien. Ces tests couvrent en particulier le routage des managers par département, l’isolation stricte de la visibilité des dossiers, le calcul du score IA et ses seuils, le découplage entre planification d’entretien et statut du candidat, ainsi que les garde-fous de transition décrits au chapitre 3.</w:t>
       </w:r>
     </w:p>
     <w:p>
@@ -9148,7 +9248,7 @@
               <w:rPr>
                 <w:sz w:val="21"/>
               </w:rPr>
-              <w:t>Décision manager sur un dossier non encore validé par le RH</w:t>
+              <w:t xml:space="preserve">Avis manager sur un dossier non encore validé par le RH</w:t>
             </w:r>
           </w:p>
         </w:tc>
@@ -9166,7 +9266,7 @@
               <w:rPr>
                 <w:sz w:val="21"/>
               </w:rPr>
-              <w:t>Erreur 400, décision bloquée par le garde-fou métier</w:t>
+              <w:t xml:space="preserve">Erreur 400, avis bloqué par le garde-fou métier</w:t>
             </w:r>
           </w:p>
         </w:tc>
@@ -9207,7 +9307,7 @@
               <w:rPr>
                 <w:sz w:val="21"/>
               </w:rPr>
-              <w:t>Décision manager après validation RH</w:t>
+              <w:t xml:space="preserve">Avis manager après validation RH</w:t>
             </w:r>
           </w:p>
         </w:tc>
@@ -9225,7 +9325,7 @@
               <w:rPr>
                 <w:sz w:val="21"/>
               </w:rPr>
-              <w:t>Statut mis à jour (ACCEPTED ou MANAGER_REJECTED)</w:t>
+              <w:t xml:space="preserve">Avis enregistré (ACCEPTED ou MANAGER_REJECTED) et notifié au RH, sans e-mail au candidat</w:t>
             </w:r>
           </w:p>
         </w:tc>
@@ -9325,7 +9425,7 @@
               <w:rPr>
                 <w:sz w:val="21"/>
               </w:rPr>
-              <w:t>Notification par e-mail au candidat après décision finale</w:t>
+              <w:t xml:space="preserve">Notification par e-mail au candidat après la décision finale contre-signée par le RH</w:t>
             </w:r>
           </w:p>
         </w:tc>
@@ -9893,7 +9993,7 @@
     </w:p>
     <w:p>
       <w:r>
-        <w:t xml:space="preserve">Au-delà des tests unitaires par fonctionnalité, j’ai mené une vérification de bout en bout du parcours complet de recrutement : soumission d’une candidature, analyse automatique par l’IA, validation par le RH, planification d’un entretien, saisie d’un feedback, puis décision finale du manager — chaque étape déclenchant la notification par e-mail attendue, au candidat et/ou aux parties prenantes internes.</w:t>
+        <w:t xml:space="preserve">Au-delà des tests unitaires par fonctionnalité, j’ai mené une vérification de bout en bout du parcours complet de recrutement : soumission d’une candidature, analyse automatique par l’IA, validation par le RH, planification d’un entretien, saisie d’un feedback, avis du manager puis contre-signature du RH — chaque étape déclenchant la notification par e-mail attendue, au candidat et/ou aux parties prenantes internes. Le fractionnement de la décision en deux niveaux, et les erreurs renvoyées quand un manager tente de trancher seul, sont en outre figés par des tests unitaires côté back-end (classe CandidateServiceTest, section 4.4.1).</w:t>
       </w:r>
     </w:p>
     <w:p>
@@ -10786,13 +10886,13 @@
       </w:pPr>
       <w:bookmarkStart w:id="61" w:name="_Toc240315751"/>
       <w:r>
-        <w:t>4.5.2 Distinguer un rejet RH d’un rejet manager</w:t>
+        <w:t xml:space="preserve">4.5.2 Distinguer un avis manager d’une décision finale RH</w:t>
       </w:r>
       <w:bookmarkEnd w:id="61"/>
     </w:p>
     <w:p>
       <w:r>
-        <w:t>Le modèle de données utilise un statut unique, MANAGER_REJECTED, que ce soit le RH ou le manager qui prenne la décision de refus — les deux s’appuient sur le même mécanisme de décision. Or le tableau de bord devait afficher séparément les rejets RH et les rejets manager, ces derniers ventilés par famille de métier. Plutôt que d’introduire un nouveau statut en base (ce qui aurait complexifié le modèle pour un besoin purement d’affichage), j’ai choisi de reconstruire cette information à partir du journal d’audit existant : chaque changement de statut y est déjà associé à l’utilisateur qui l’a effectué, il suffisait de croiser ce nom d’utilisateur avec son rôle réel pour déterminer si la décision provenait du RH ou d’un manager, et dans ce dernier cas, de quelle famille de métier.</w:t>
+        <w:t xml:space="preserve">Le tableau de bord devait afficher séparément les rejets RH et les rejets manager, ces derniers ventilés par famille de métier, alors que le modèle ne connaissait qu’un statut unique pour les deux. Plutôt que d’empiler des statuts, j’ai fait porter la distinction par le cycle de vie lui-même : MANAGER_REJECTED désigne aujourd’hui un refus proposé par le manager, en attente de contreseing, tandis que REJECTED désigne le refus final prononcé ou contre-signé par le RH, et HIRED l’embauche validée par lui. Le motif enregistré (statusReason) et l’auteur de l’écriture complètent l’information ; le journal d’audit, où chaque changement de statut est déjà associé à l’utilisateur qui l’a effectué, reste croisé avec son rôle réel pour ventiler les rejets manager par famille de métier.</w:t>
       </w:r>
     </w:p>
     <w:p>
@@ -11803,6 +11903,31 @@
           </w:p>
         </w:tc>
       </w:tr>
+      <w:tr>
+        <w:trPr>
+          <w:cantSplit/>
+        </w:trPr>
+        <w:tc>
+          <w:tcPr>
+            <w:tcW w:w="4183" w:type="pct"/>
+          </w:tcPr>
+          <w:p>
+            <w:r>
+              <w:t xml:space="preserve">Décision à deux niveaux : avis manager contre-signé par le RH (convocation ou refus motivé)</w:t>
+            </w:r>
+          </w:p>
+        </w:tc>
+        <w:tc>
+          <w:tcPr>
+            <w:tcW w:w="817" w:type="pct"/>
+          </w:tcPr>
+          <w:p>
+            <w:r>
+              <w:t xml:space="preserve">Réalisée</w:t>
+            </w:r>
+          </w:p>
+        </w:tc>
+      </w:tr>
     </w:tbl>
     <w:p>
       <w:pPr>
@@ -11856,7 +11981,7 @@
     </w:p>
     <w:p>
       <w:r>
-        <w:t xml:space="preserve">Plusieurs pistes d’évolution restent ouvertes pour poursuivre ce travail. Côté fonctionnel, la plateforme pourrait accueillir un module d’analyse prédictive du taux de transformation des candidatures, une intégration plus poussée avec des plateformes d’emploi externes (LinkedIn, Indeed), ou un espace candidat plus riche pour un suivi encore plus détaillé de son parcours. Côté technique, la suite de tests automatisés — qui compte déjà 108 méthodes de test unitaires et de contrôleur (JUnit 5 / Mockito) — gagnerait à être complétée par des tests d’intégration couvrant les services et la base de données, des tests de bout en bout (par exemple Playwright ou Cypress) rejouant les parcours métier complets, et des tests front-end automatisés sur les composants Angular. Le jeu de référence de seize profils mobilisé pour calibrer le seuil de décision gagnerait à être enrichi de candidatures réelles annotées par les recruteurs, seul moyen d’obtenir une mesure de performance en conditions d’exploitation. Une chaîne d’intégration et de déploiement continus (CI/CD) ainsi qu’un déploiement sur une infrastructure cloud constitueraient des évolutions naturelles pour renforcer la fiabilité et la scalabilité de la plateforme sur le long terme.</w:t>
+        <w:t xml:space="preserve">Plusieurs pistes d’évolution restent ouvertes pour poursuivre ce travail. Côté fonctionnel, la plateforme pourrait accueillir un module d’analyse prédictive du taux de transformation des candidatures, une intégration plus poussée avec des plateformes d’emploi externes (LinkedIn, Indeed), ou un espace candidat plus riche pour un suivi encore plus détaillé de son parcours. Côté technique, la suite de tests automatisés — qui compte déjà 121 méthodes de test unitaires et de contrôleur (JUnit 5 / Mockito) — gagnerait à être complétée par des tests d’intégration couvrant les services et la base de données, des tests de bout en bout (par exemple Playwright ou Cypress) rejouant les parcours métier complets, et des tests front-end automatisés sur les composants Angular. Le jeu de référence de seize profils mobilisé pour calibrer le seuil de décision gagnerait à être enrichi de candidatures réelles annotées par les recruteurs, seul moyen d’obtenir une mesure de performance en conditions d’exploitation. Une chaîne d’intégration et de déploiement continus (CI/CD) ainsi qu’un déploiement sur une infrastructure cloud constitueraient des évolutions naturelles pour renforcer la fiabilité et la scalabilité de la plateforme sur le long terme.</w:t>
       </w:r>
     </w:p>
     <w:p>

</xml_diff>

<commit_message>
docs(report): captures de la contre-signature RH et cas de test 21
La section 4.3 gagne les deux modales qui materialisent le contreseing RH
(figure 4.11 « Valider l'embauche » avec la date de presentation reprise dans
la convocation, figure 4.12 « Confirmer le refus » avec motif obligatoire),
prises sur l'application relancee apres la verification bout-en-bout.
Le tableau 4.1 enregistre le cas correspondant, verifie en local le 14/10,
et le commentaire passe de vingt a vingt et un scenarios.
Rapport et PDF alignes : 80 pages, tables des matieres convergees, aucun
nouveau blanc de pagination.
</commit_message>
<xml_diff>
--- a/Rapport-PFE/finalreport/Rapport_PFE_Haythem_Bargaoui_beta.docx
+++ b/Rapport-PFE/finalreport/Rapport_PFE_Haythem_Bargaoui_beta.docx
@@ -1787,7 +1787,7 @@
       <w:r>
         <w:t>4.4 Tests</w:t>
         <w:tab/>
-        <w:t>56</w:t>
+        <w:t>57</w:t>
       </w:r>
     </w:p>
     <w:p>
@@ -1805,7 +1805,7 @@
       <w:r>
         <w:t>4.4.1 Tests unitaires (JUnit 5 / Mockito)</w:t>
         <w:tab/>
-        <w:t>56</w:t>
+        <w:t>57</w:t>
       </w:r>
     </w:p>
     <w:p>
@@ -1823,7 +1823,7 @@
       <w:r>
         <w:t>4.4.2 Tests fonctionnels manuels</w:t>
         <w:tab/>
-        <w:t>56</w:t>
+        <w:t>57</w:t>
       </w:r>
     </w:p>
     <w:p>
@@ -1841,7 +1841,7 @@
       <w:r>
         <w:t>4.4.3 Tests des API avec Postman et Swagger</w:t>
         <w:tab/>
-        <w:t>58</w:t>
+        <w:t>59</w:t>
       </w:r>
     </w:p>
     <w:p>
@@ -1859,7 +1859,7 @@
       <w:r>
         <w:t>4.4.4 Vérification de bout en bout</w:t>
         <w:tab/>
-        <w:t>58</w:t>
+        <w:t>59</w:t>
       </w:r>
     </w:p>
     <w:p>
@@ -1877,7 +1877,7 @@
       <w:r>
         <w:t>4.4.5 Évaluation du matching sur un jeu de référence annoté (Gold Set)</w:t>
         <w:tab/>
-        <w:t>58</w:t>
+        <w:t>60</w:t>
       </w:r>
     </w:p>
     <w:p>
@@ -1895,7 +1895,7 @@
       <w:r>
         <w:t>4.4.6 Validation humaine du score et explicabilité</w:t>
         <w:tab/>
-        <w:t>60</w:t>
+        <w:t>61</w:t>
       </w:r>
     </w:p>
     <w:p>
@@ -1913,7 +1913,7 @@
       <w:r>
         <w:t>4.5 Difficultés rencontrées et solutions apportées</w:t>
         <w:tab/>
-        <w:t>60</w:t>
+        <w:t>62</w:t>
       </w:r>
     </w:p>
     <w:p>
@@ -1931,7 +1931,7 @@
       <w:r>
         <w:t>4.5.1 Notification incomplète des managers</w:t>
         <w:tab/>
-        <w:t>60</w:t>
+        <w:t>62</w:t>
       </w:r>
     </w:p>
     <w:p>
@@ -1949,7 +1949,7 @@
       <w:r>
         <w:t>4.5.2 Distinguer un avis manager d’une décision finale RH</w:t>
         <w:tab/>
-        <w:t>61</w:t>
+        <w:t>62</w:t>
       </w:r>
     </w:p>
     <w:p>
@@ -1967,7 +1967,7 @@
       <w:r>
         <w:t>4.5.3 Cohérence des transitions de statut</w:t>
         <w:tab/>
-        <w:t>61</w:t>
+        <w:t>62</w:t>
       </w:r>
     </w:p>
     <w:p>
@@ -1985,7 +1985,7 @@
       <w:r>
         <w:t>4.5.4 Filtrage incomplet des routes de lecture pour les managers</w:t>
         <w:tab/>
-        <w:t>61</w:t>
+        <w:t>62</w:t>
       </w:r>
     </w:p>
     <w:p>
@@ -2003,7 +2003,7 @@
       <w:r>
         <w:t>4.5.5 Solliciter le manager au bon moment du processus</w:t>
         <w:tab/>
-        <w:t>61</w:t>
+        <w:t>63</w:t>
       </w:r>
     </w:p>
     <w:p>
@@ -2021,7 +2021,7 @@
       <w:r>
         <w:t>4.5.6 Pertinence du matching Job idéal</w:t>
         <w:tab/>
-        <w:t>62</w:t>
+        <w:t>63</w:t>
       </w:r>
     </w:p>
     <w:p>
@@ -2039,7 +2039,7 @@
       <w:r>
         <w:t>4.5.7 Traitement distinct des candidatures retirées</w:t>
         <w:tab/>
-        <w:t>62</w:t>
+        <w:t>63</w:t>
       </w:r>
     </w:p>
     <w:p>
@@ -2057,7 +2057,7 @@
       <w:r>
         <w:t>4.5.8 Entretien téléphonique RH obligatoire avant acceptation</w:t>
         <w:tab/>
-        <w:t>62</w:t>
+        <w:t>63</w:t>
       </w:r>
     </w:p>
     <w:p>
@@ -2075,7 +2075,7 @@
       <w:r>
         <w:t>4.5.9 Découplage entre planification d’entretien et statut du candidat</w:t>
         <w:tab/>
-        <w:t>62</w:t>
+        <w:t>64</w:t>
       </w:r>
     </w:p>
     <w:p>
@@ -2093,7 +2093,7 @@
       <w:r>
         <w:t>4.5.10 Fiabiliser l’intégration Google Meet et le format des webhooks n8n</w:t>
         <w:tab/>
-        <w:t>63</w:t>
+        <w:t>64</w:t>
       </w:r>
     </w:p>
     <w:p>
@@ -2111,7 +2111,7 @@
       <w:r>
         <w:t>4.5.11 Cloisonnement des données dans le chatbot candidat</w:t>
         <w:tab/>
-        <w:t>63</w:t>
+        <w:t>64</w:t>
       </w:r>
     </w:p>
     <w:p>
@@ -2129,7 +2129,7 @@
       <w:r>
         <w:t>4.6 Protection des données et éthique de l’IA</w:t>
         <w:tab/>
-        <w:t>63</w:t>
+        <w:t>65</w:t>
       </w:r>
     </w:p>
     <w:p>
@@ -2147,7 +2147,7 @@
       <w:r>
         <w:t>4.7 Bilan des fonctionnalités réalisées</w:t>
         <w:tab/>
-        <w:t>65</w:t>
+        <w:t>66</w:t>
       </w:r>
     </w:p>
     <w:p>
@@ -2165,7 +2165,7 @@
       <w:r>
         <w:t>4.8 Conclusion</w:t>
         <w:tab/>
-        <w:t>66</w:t>
+        <w:t>67</w:t>
       </w:r>
     </w:p>
     <w:p>
@@ -2183,7 +2183,7 @@
       <w:r>
         <w:t>Conclusion Générale et Perspectives</w:t>
         <w:tab/>
-        <w:t>67</w:t>
+        <w:t>68</w:t>
       </w:r>
     </w:p>
     <w:p>
@@ -2201,7 +2201,7 @@
       <w:r>
         <w:t>Annexe A — Captures d’écran complémentaires</w:t>
         <w:tab/>
-        <w:t>69</w:t>
+        <w:t>70</w:t>
       </w:r>
     </w:p>
     <w:p>
@@ -2219,7 +2219,7 @@
       <w:r>
         <w:t>Bibliographie</w:t>
         <w:tab/>
-        <w:t>76</w:t>
+        <w:t>77</w:t>
       </w:r>
     </w:p>
     <w:p>
@@ -2237,7 +2237,7 @@
       <w:r>
         <w:t>Glossaire</w:t>
         <w:tab/>
-        <w:t>78</w:t>
+        <w:t>79</w:t>
       </w:r>
     </w:p>
     <w:p>
@@ -2638,9 +2638,9 @@
         </w:tabs>
       </w:pPr>
       <w:r>
-        <w:t xml:space="preserve">Figure A.1 : Page de connexion</w:t>
+        <w:t xml:space="preserve">Figure 4.11 : Contre-signature RH d’un avis favorable « Valider l’embauche »</w:t>
         <w:tab/>
-        <w:t>69</w:t>
+        <w:t>56</w:t>
       </w:r>
     </w:p>
     <w:p>
@@ -2650,9 +2650,9 @@
         </w:tabs>
       </w:pPr>
       <w:r>
-        <w:t xml:space="preserve">Figure A.2 : Modification d’un dossier candidat</w:t>
+        <w:t xml:space="preserve">Figure 4.12 : Contre-signature RH d’un refus proposé — modale « Confirmer le refus »</w:t>
         <w:tab/>
-        <w:t>70</w:t>
+        <w:t>56</w:t>
       </w:r>
     </w:p>
     <w:p>
@@ -2662,9 +2662,9 @@
         </w:tabs>
       </w:pPr>
       <w:r>
-        <w:t xml:space="preserve">Figure A.3 : Gestion des entretiens</w:t>
+        <w:t xml:space="preserve">Figure A.1 : Page de connexion</w:t>
         <w:tab/>
-        <w:t>71</w:t>
+        <w:t>70</w:t>
       </w:r>
     </w:p>
     <w:p>
@@ -2674,7 +2674,7 @@
         </w:tabs>
       </w:pPr>
       <w:r>
-        <w:t xml:space="preserve">Figure A.4 : Gestion des feedbacks</w:t>
+        <w:t xml:space="preserve">Figure A.2 : Modification d’un dossier candidat</w:t>
         <w:tab/>
         <w:t>71</w:t>
       </w:r>
@@ -2686,7 +2686,7 @@
         </w:tabs>
       </w:pPr>
       <w:r>
-        <w:t xml:space="preserve">Figure A.5 : Journal d’audit</w:t>
+        <w:t xml:space="preserve">Figure A.3 : Gestion des entretiens</w:t>
         <w:tab/>
         <w:t>72</w:t>
       </w:r>
@@ -2698,7 +2698,7 @@
         </w:tabs>
       </w:pPr>
       <w:r>
-        <w:t xml:space="preserve">Figure A.6 : Soumission d’une candidature avec dépôt de CV</w:t>
+        <w:t xml:space="preserve">Figure A.4 : Gestion des feedbacks</w:t>
         <w:tab/>
         <w:t>72</w:t>
       </w:r>
@@ -2710,7 +2710,7 @@
         </w:tabs>
       </w:pPr>
       <w:r>
-        <w:t xml:space="preserve">Figure A.7 : Espace Manager — candidatures relevant du périmètre du manager</w:t>
+        <w:t xml:space="preserve">Figure A.5 : Journal d’audit</w:t>
         <w:tab/>
         <w:t>73</w:t>
       </w:r>
@@ -2722,9 +2722,9 @@
         </w:tabs>
       </w:pPr>
       <w:r>
-        <w:t xml:space="preserve">Figure A.8 : Console n8n — les trois flux d’automatisation publiés et leurs statistiques</w:t>
+        <w:t xml:space="preserve">Figure A.6 : Soumission d’une candidature avec dépôt de CV</w:t>
         <w:tab/>
-        <w:t>74</w:t>
+        <w:t>73</w:t>
       </w:r>
     </w:p>
     <w:p>
@@ -2734,7 +2734,7 @@
         </w:tabs>
       </w:pPr>
       <w:r>
-        <w:t xml:space="preserve">Figure A.9 : Flux n8n de l’Agent 1 — webhook de candidature, appel du scoring Cohere puis e-mail au candidat</w:t>
+        <w:t xml:space="preserve">Figure A.7 : Espace Manager — candidatures relevant du périmètre du manager</w:t>
         <w:tab/>
         <w:t>74</w:t>
       </w:r>
@@ -2746,21 +2746,10 @@
         </w:tabs>
       </w:pPr>
       <w:r>
-        <w:t xml:space="preserve">Figure A.10 : E-mail automatique de confirmation de candidature reçu par le candidat</w:t>
+        <w:t xml:space="preserve">Figure A.8 : Console n8n — les trois flux d’automatisation publiés et leurs statistiques</w:t>
         <w:tab/>
         <w:t>75</w:t>
       </w:r>
-    </w:p>
-    <w:p>
-      <w:pPr>
-        <w:pStyle w:val="Titre1"/>
-        <w:pageBreakBefore/>
-      </w:pPr>
-      <w:bookmarkStart w:id="2" w:name="_Toc240315692"/>
-      <w:r>
-        <w:t>Liste des tableaux</w:t>
-      </w:r>
-      <w:bookmarkEnd w:id="2"/>
     </w:p>
     <w:p>
       <w:pPr>
@@ -2769,6 +2758,41 @@
         </w:tabs>
       </w:pPr>
       <w:r>
+        <w:t xml:space="preserve">Figure A.9 : Flux n8n de l’Agent 1 — webhook de candidature, appel du scoring Cohere puis e-mail au candidat</w:t>
+        <w:tab/>
+        <w:t>75</w:t>
+      </w:r>
+    </w:p>
+    <w:p>
+      <w:pPr>
+        <w:tabs>
+          <w:tab w:val="right" w:leader="dot" w:pos="9066"/>
+        </w:tabs>
+      </w:pPr>
+      <w:r>
+        <w:t xml:space="preserve">Figure A.10 : E-mail automatique de confirmation de candidature reçu par le candidat</w:t>
+        <w:tab/>
+        <w:t>76</w:t>
+      </w:r>
+    </w:p>
+    <w:p>
+      <w:pPr>
+        <w:pStyle w:val="Titre1"/>
+        <w:pageBreakBefore/>
+      </w:pPr>
+      <w:bookmarkStart w:id="2" w:name="_Toc240315692"/>
+      <w:r>
+        <w:t>Liste des tableaux</w:t>
+      </w:r>
+      <w:bookmarkEnd w:id="2"/>
+    </w:p>
+    <w:p>
+      <w:pPr>
+        <w:tabs>
+          <w:tab w:val="right" w:leader="dot" w:pos="9066"/>
+        </w:tabs>
+      </w:pPr>
+      <w:r>
         <w:t xml:space="preserve">Tableau 1.1 : Macro-planification des phases du projet</w:t>
         <w:tab/>
         <w:t>16</w:t>
@@ -2831,7 +2855,7 @@
       <w:r>
         <w:t>Tableau 4.1 : Synthèse des tests fonctionnels réalisés</w:t>
         <w:tab/>
-        <w:t>57</w:t>
+        <w:t>58</w:t>
       </w:r>
     </w:p>
     <w:p>
@@ -2843,7 +2867,7 @@
       <w:r>
         <w:t>Tableau 4.2 : Matrice de confusion du Gold Set selon le seuil de décision</w:t>
         <w:tab/>
-        <w:t>59</w:t>
+        <w:t>60</w:t>
       </w:r>
     </w:p>
     <w:p>
@@ -2855,7 +2879,7 @@
       <w:r>
         <w:t>Tableau 4.3 : Bilan des fonctionnalités réalisées</w:t>
         <w:tab/>
-        <w:t>65</w:t>
+        <w:t>67</w:t>
       </w:r>
     </w:p>
     <w:p>
@@ -8511,6 +8535,80 @@
     </w:p>
     <w:p>
       <w:pPr>
+        <w:keepNext/>
+        <w:jc w:val="center"/>
+      </w:pPr>
+      <w:r>
+        <w:rPr>
+          <w:noProof/>
+        </w:rPr>
+        <w:pict w14:anchorId="1ABB31E4">
+          <v:shape id="Picture 411" o:spid="_x0000_i1911" type="#_x0000_t75" style="visibility:visible;mso-wrap-style:square;width:264.0pt;height:289.0pt">
+            <v:imagedata r:id="rId960" o:title=""/>
+          </v:shape>
+        </w:pict>
+      </w:r>
+    </w:p>
+    <w:p>
+      <w:pPr>
+        <w:jc w:val="center"/>
+        <w:rPr>
+          <w:i/>
+          <w:sz w:val="21"/>
+        </w:rPr>
+      </w:pPr>
+      <w:r>
+        <w:rPr>
+          <w:i/>
+          <w:sz w:val="21"/>
+        </w:rPr>
+        <w:t xml:space="preserve">Figure 4.11 : Contre-signature RH d’un avis favorable « Valider l’embauche »</w:t>
+      </w:r>
+    </w:p>
+    <w:p>
+      <w:r>
+        <w:t xml:space="preserve">La date de présentation est obligatoire ; elle alimente l’e-mail de convocation.</w:t>
+      </w:r>
+    </w:p>
+    <w:p>
+      <w:pPr>
+        <w:keepNext/>
+        <w:jc w:val="center"/>
+      </w:pPr>
+      <w:r>
+        <w:rPr>
+          <w:noProof/>
+        </w:rPr>
+        <w:pict w14:anchorId="1ABB31E4">
+          <v:shape id="Picture 412" o:spid="_x0000_i1912" type="#_x0000_t75" style="visibility:visible;mso-wrap-style:square;width:264.0pt;height:279.4pt">
+            <v:imagedata r:id="rId961" o:title=""/>
+          </v:shape>
+        </w:pict>
+      </w:r>
+    </w:p>
+    <w:p>
+      <w:pPr>
+        <w:jc w:val="center"/>
+        <w:rPr>
+          <w:i/>
+          <w:sz w:val="21"/>
+        </w:rPr>
+      </w:pPr>
+      <w:r>
+        <w:rPr>
+          <w:i/>
+          <w:sz w:val="21"/>
+        </w:rPr>
+        <w:t xml:space="preserve">Figure 4.12 : Contre-signature RH d’un refus proposé — modale « Confirmer le refus »</w:t>
+      </w:r>
+    </w:p>
+    <w:p>
+      <w:r>
+        <w:t xml:space="preserve">Le motif est obligatoire ; il alimente l’e-mail de refus final.</w:t>
+      </w:r>
+    </w:p>
+    <w:p>
+      <w:pPr>
         <w:pStyle w:val="Titre2"/>
       </w:pPr>
       <w:bookmarkStart w:id="54" w:name="_Toc240315744"/>
@@ -9960,10 +10058,45 @@
           </w:p>
         </w:tc>
       </w:tr>
+      <w:tr>
+        <w:trPr>
+          <w:cantSplit/>
+        </w:trPr>
+        <w:tc>
+          <w:tcPr>
+            <w:tcW w:w="3070" w:type="dxa"/>
+          </w:tcPr>
+          <w:p>
+            <w:r>
+              <w:t xml:space="preserve">Avis manager puis contre-signature RH (HIRED avec date / REJECTED motivé)</w:t>
+            </w:r>
+          </w:p>
+        </w:tc>
+        <w:tc>
+          <w:tcPr>
+            <w:tcW w:w="3069" w:type="dxa"/>
+          </w:tcPr>
+          <w:p>
+            <w:r>
+              <w:t xml:space="preserve">E-mail de convocation ou de refus motivé au candidat ; erreur 400 si la date ou le motif manque</w:t>
+            </w:r>
+          </w:p>
+        </w:tc>
+        <w:tc>
+          <w:tcPr>
+            <w:tcW w:w="3067" w:type="dxa"/>
+          </w:tcPr>
+          <w:p>
+            <w:r>
+              <w:t xml:space="preserve">OK, vérifié le 14/10 en local</w:t>
+            </w:r>
+          </w:p>
+        </w:tc>
+      </w:tr>
     </w:tbl>
     <w:p>
       <w:r>
-        <w:t xml:space="preserve">Ce tableau atteste de l’exécution des vingt scénarios listés, tous concluants ; il ne constitue pas pour autant une garantie globale de qualité. Des cas nominaux et des cas d’erreur qui réussissent ne prouvent pas l’absence de défauts sur les chemins non exercés, et ne disent rien du comportement de la plateforme sous charge. Ces tests vérifient des fonctionnalités et des règles d’accès : ils ne mesurent pas la pertinence du scoring IA, qui fait l’objet de la section 4.4.5. Aucun test de charge n’a mesuré les exigences non fonctionnelles de temps de réponse fixées en section 2.2.3 (moins de 500 ms en lecture, moins de 2 s en écriture) : elles restent à valider en préproduction.</w:t>
+        <w:t xml:space="preserve">Ce tableau atteste de l’exécution des vingt et un scénarios listés, tous concluants ; il ne constitue pas pour autant une garantie globale de qualité. Des cas nominaux et des cas d’erreur qui réussissent ne prouvent ni l’absence de défauts sur les chemins non exercés, ni le comportement de la plateforme sous charge. Ces tests vérifient des fonctionnalités et des règles d’accès : la pertinence du scoring IA, elle, est mesurée en section 4.4.5. Aucun test de charge n’a mesuré les exigences de temps de réponse fixées en section 2.2.3 (moins de 500 ms en lecture, moins de 2 s en écriture), qui restent à valider en préproduction.</w:t>
       </w:r>
     </w:p>
     <w:p>

</xml_diff>

<commit_message>
feat(routage): destination gelée des dossiers managers, rapport et deck alignés
- Routage RH vers les managers par priorité (manager désigné de l'offre,
  département, famille métier, ancien champ e-mail) ; transmission bloquée
  avec erreur 400 et audit ROUTING_FAILED si rien n'est résolu.
- Gel de la destination sur la candidature (routedToManager,
  routedManagerEmails, routingBasis, routedAt) et ManagerScopeService unique
  pour la visibilité des dossiers.
- Clé d'outbox propre à chaque destinataire, routing-preview, routing-status,
  reroute-notification et traçabilité de la transmission côté RH.
- Tests : 16 classes / 166 méthodes, dont la matrice multi-managers et
  multi-candidats.
- Rapport bêta (docx + pdf) : figures 3.2a, 3.2b, 3.7 et 3.9 re-rendues,
  sections 3.5.4 et 4.5.5 et tableaux 4.1 et 4.3 alignés, 80 pages.
- Deck de soutenance : chiffres de vérification et routage gelé, diagramme de
  classes rafraîchi.
</commit_message>
<xml_diff>
--- a/Rapport-PFE/finalreport/Rapport_PFE_Haythem_Bargaoui_beta.docx
+++ b/Rapport-PFE/finalreport/Rapport_PFE_Haythem_Bargaoui_beta.docx
@@ -7209,7 +7209,7 @@
           <w:noProof/>
         </w:rPr>
         <w:pict w14:anchorId="598E410F">
-          <v:shape id="Image 6" o:spid="_x0000_i1030" type="#_x0000_t75" style="visibility:visible;mso-wrap-style:square;visibility:visible;width:278.3pt;height:616.4pt;visibility:visible">
+          <v:shape id="Image 6" o:spid="_x0000_i1030" type="#_x0000_t75" style="visibility:visible;mso-wrap-style:square;visibility:visible;visibility:visible;width:278.3pt;height:641.1pt;visibility:visible">
             <v:imagedata r:id="rId16" o:title=""/>
           </v:shape>
         </w:pict>
@@ -7255,7 +7255,7 @@
           <w:noProof/>
         </w:rPr>
         <w:pict>
-          <v:shape id="Picture 32b" o:spid="_x0000_i3201" type="#_x0000_t75" style="visibility:visible;mso-wrap-style:square;visibility:visible;width:345.6pt;height:430.0pt;visibility:visible">
+          <v:shape id="Picture 32b" o:spid="_x0000_i3201" type="#_x0000_t75" style="visibility:visible;mso-wrap-style:square;visibility:visible;visibility:visible;width:400.6pt;height:430.0pt;visibility:visible">
             <v:imagedata r:id="rId48" o:title=""/>
           </v:shape>
         </w:pict>
@@ -7280,7 +7280,7 @@
     </w:p>
     <w:p>
       <w:r>
-        <w:t xml:space="preserve">La vue sécurité isole les entités d’authentification et d’audit : chaque utilisateur porte un ou plusieurs rôles (ERole) et un rattachement à un département, ManagerRoutingService résout le périmètre de lecture d’un manager, et AuditLog journalise les actions sensibles.</w:t>
+        <w:t xml:space="preserve">La vue sécurité isole les entités d’authentification et d’audit : chaque utilisateur porte un ou plusieurs rôles (ERole) et un rattachement à un département, ManagerRoutingService résout les managers destinataires d’un dossier, ManagerScopeService lit la liste ainsi gelée sur la candidature pour borner la visibilité du manager, et AuditLog journalise les actions sensibles.</w:t>
       </w:r>
     </w:p>
     <w:p>
@@ -7529,7 +7529,7 @@
           <w:noProof/>
         </w:rPr>
         <w:pict w14:anchorId="2E8BE8D4">
-          <v:shape id="Picture 2" o:spid="_x0000_i1034" type="#_x0000_t75" style="visibility:visible;mso-wrap-style:square;width:453.3pt;height:289.7pt;visibility:visible">
+          <v:shape id="Picture 2" o:spid="_x0000_i1034" type="#_x0000_t75" style="visibility:visible;mso-wrap-style:square;visibility:visible;width:427.8pt;height:290.0pt;visibility:visible">
             <v:imagedata r:id="rId20" o:title=""/>
           </v:shape>
         </w:pict>
@@ -7554,7 +7554,7 @@
     </w:p>
     <w:p>
       <w:r>
-        <w:t>Ce diagramme illustre le mécanisme de routage automatique décrit en section 4.5.5 : lorsqu’un dossier passe en évaluation technique, ManagerRoutingService résout les managers destinataires par priorité — d’abord par département de l’offre, à défaut par famille de métier, et en dernier recours via l’e-mail manager saisi manuellement sur l’offre. Chaque manager résolu reçoit ensuite une notification via l’agent n8n dédié.</w:t>
+        <w:t xml:space="preserve">Ce diagramme détaille la résolution de la destination et la notification (section 4.5.5). Au passage en évaluation technique, ManagerRoutingService résout les managers destinataires par priorité et retient le premier niveau non vide : manager désigné sur l’offre, puis département, puis famille de métier, puis ancien champ e-mail de l’offre. Rien n’est inventé : si aucun niveau n’aboutit, la transmission est bloquée (erreur 400) et journalisée en ROUTING_FAILED. La liste retenue est gelée sur la candidature, et c’est elle — non le département courant de l’offre — qui borne la visibilité du manager via ManagerScopeService : modifier le rattachement après coup ne dépossède pas le manager qui a reçu le dossier. Chaque destinataire produit en outre un événement de notification distinct, et la transmission est journalisée (ROUTING) avec le critère retenu.</w:t>
       </w:r>
     </w:p>
     <w:p>
@@ -7674,7 +7674,7 @@
     <w:p>
       <w:pPr/>
       <w:r>
-        <w:t xml:space="preserve">La base de données relationnelle PostgreSQL reflète directement le diagramme de classes présenté en section 3.3 : chaque entité JPA est mappée sur une table, et les relations One-to-Many et Many-to-One sont matérialisées par des clés étrangères (par exemple candidate.job_offer_id, interview.candidate_id, feedback.interview_id). J’ai configuré la génération du schéma en mode « update » (Hibernate ddl-auto) — un choix pratique en phase de développement, qui permet de faire évoluer la structure de la base sans perte de données au fil des itérations. En production, ce mode devrait néanmoins céder la place à un outil de migration versionnée comme Flyway ou Liquibase, seul capable de garantir des évolutions de schéma maîtrisées et reproductibles.</w:t>
+        <w:t xml:space="preserve">La base de données relationnelle PostgreSQL reflète directement le diagramme de classes présenté en section 3.3 : chaque entité JPA est mappée sur une table, et les relations One-to-Many et Many-to-One sont matérialisées par des clés étrangères (par exemple job_offer.hiring_manager_id, candidate.routed_to_manager_id, interview.candidate_id, feedback.interview_id). J’ai configuré la génération du schéma en mode « update » (Hibernate ddl-auto) — un choix pratique en phase de développement, qui permet de faire évoluer la structure de la base sans perte de données au fil des itérations. En production, ce mode devrait néanmoins céder la place à un outil de migration versionnée comme Flyway ou Liquibase, seul capable de garantir des évolutions de schéma maîtrisées et reproductibles.</w:t>
       </w:r>
     </w:p>
     <w:p>
@@ -7702,7 +7702,7 @@
           <w:noProof/>
         </w:rPr>
         <w:pict w14:anchorId="302CA6EE">
-          <v:shape id="Image 10" o:spid="_x0000_i1036" type="#_x0000_t75" style="visibility:visible;mso-wrap-style:square;width:769.9pt;height:398.9pt;visibility:visible">
+          <v:shape id="Image 10" o:spid="_x0000_i1036" type="#_x0000_t75" style="visibility:visible;mso-wrap-style:square;visibility:visible;width:727.3pt;height:450.0pt;visibility:visible">
             <v:imagedata r:id="rId22" o:title=""/>
           </v:shape>
         </w:pict>
@@ -7728,7 +7728,7 @@
     <w:p>
       <w:pPr/>
       <w:r>
-        <w:t xml:space="preserve">Le schéma relationnel reprend fidèlement les entités JPA : les clés primaires sont préfixées d’un astérisque et les clés étrangères suffixées « FK ». On y lit les relations structurantes : un département rattache les utilisateurs et les offres, une offre reçoit les candidatures, chaque candidature dépose un CV et passe des entretiens qui donnent lieu à des feedbacks rédigés par les utilisateurs.</w:t>
+        <w:t xml:space="preserve">Le schéma relationnel reprend fidèlement les entités JPA : clés primaires préfixées d’un astérisque, clés étrangères suffixées « FK ». On y lit les relations structurantes — département, offres, candidatures, CV, entretiens, feedbacks — et la destination du routage, figée sur le dossier au moment de la transmission (routed_to_manager_id, routed_manager_emails, routing_basis, routed_at).</w:t>
       </w:r>
     </w:p>
     <w:p>
@@ -8350,7 +8350,7 @@
     </w:p>
     <w:p>
       <w:r>
-        <w:t xml:space="preserve">J’ai aussi donné à chaque manager une page « Mon calendrier », en lecture seule, qui regroupe ses entretiens du mois et ses trois prochains rendez-vous ; les données y sont filtrées côté serveur selon son département, sa famille de métier ou son affectation directe, le même cloisonnement que pour la liste des dossiers candidats.</w:t>
+        <w:t xml:space="preserve">J’ai aussi donné à chaque manager une page « Mon calendrier », en lecture seule, qui regroupe ses entretiens du mois et ses trois prochains rendez-vous ; les données y sont filtrées côté serveur à partir de la liste des destinataires gelée sur chaque dossier, le même cloisonnement que pour la liste des dossiers candidats.</w:t>
       </w:r>
     </w:p>
     <w:p>
@@ -8475,15 +8475,12 @@
     </w:p>
     <w:p>
       <w:r>
-        <w:t xml:space="preserve">Un manager ne voit que les candidatures relevant de son périmètre (département, ou à défaut famille de métier — voir ManagerRoutingService, section 3.5.4), à partir de leur entrée en évaluation technique (statut TECHNICAL_TEST), et non dès la validation du CV par le RH. Cette vue cloisonnée est distincte de la liste globale accessible au RH et à l’administrateur (Figure 4.3).</w:t>
-      </w:r>
-      <w:r>
-        <w:t xml:space="preserve"> Sa capture est reprise en annexe A (figure A.7).</w:t>
-      </w:r>
-    </w:p>
-    <w:p>
-      <w:r>
-        <w:t>Le manager dispose en outre d’une page « Mon calendrier » qui centralise ses propres entretiens : prochaine session, lien de visioconférence, répartition par statut et vue mensuelle, avec un rappel automatique planifié deux heures avant chaque entretien dont il est intervieweur. La liste reste filtrée côté serveur selon son département, sa famille de métier ou son affectation, de sorte qu’aucun dossier hors de son périmètre ne peut y apparaître.</w:t>
+        <w:t xml:space="preserve">Un manager ne voit que les candidatures relevant de son périmètre — la liste des destinataires gelée sur le dossier au moment de sa transmission, résolue par ManagerRoutingService puis lue par ManagerScopeService (section 3.5.4) —, à partir de leur entrée en évaluation technique (statut TECHNICAL_TEST), et non dès la validation du CV par le RH. Cette vue cloisonnée est distincte de la liste globale accessible au RH et à l’administrateur (Figure 4.3). Sa capture est reprise en annexe A (figure A.7).</w:t>
+      </w:r>
+    </w:p>
+    <w:p>
+      <w:r>
+        <w:t xml:space="preserve">Le manager dispose en outre d’une page « Mon calendrier » qui centralise les entretiens de son périmètre : prochaine session, lien de visioconférence, répartition par statut et vue mensuelle, avec un rappel automatique planifié deux heures avant chaque entretien. La liste reste filtrée côté serveur à partir de la destination gelée sur le dossier, de sorte qu’aucun entretien hors de son périmètre ne peut y apparaître.</w:t>
       </w:r>
     </w:p>
     <w:p>
@@ -8629,7 +8626,7 @@
     </w:p>
     <w:p>
       <w:r>
-        <w:t xml:space="preserve">Au-delà des vérifications manuelles, la couche service et une partie de la couche controller sont couvertes par une suite de tests automatisés écrite avec JUnit 5 et Mockito [16], exécutée via Maven. Elle comprend 12 classes de test pour un total de 121 méthodes de test : CandidateServiceTest, JobOfferServiceTest, ManagerRoutingServiceTest, N8nServiceTest, ScoringWeightProfileServiceTest, AiScoringServiceTest, InterviewServiceTest et InterviewServiceManagerCalendarTest en tests unitaires purs (services isolés à l’aide de doublons Mockito), ainsi que CandidateControllerWorkflowTest, CandidateStatusAnonymousSecurityTest, InterviewManagerCalendarSecurityTest et InterviewMeetLinkSecurityTest en tests de contrôleur reposant sur @WebMvcTest et MockMvc, qui vérifient notamment le comportement des routes accessibles de façon anonyme et la sécurité d’accès au lien Google Meet d’un entretien. Ces tests couvrent en particulier le routage des managers par département, l’isolation stricte de la visibilité des dossiers, le calcul du score IA et ses seuils, le découplage entre planification d’entretien et statut du candidat, ainsi que les garde-fous de transition décrits au chapitre 3.</w:t>
+        <w:t xml:space="preserve">Au-delà des vérifications manuelles, la couche service et une partie de la couche controller sont couvertes par une suite de tests automatisés écrite avec JUnit 5 et Mockito [16], exécutée via Maven. Elle comprend 16 classes de test pour un total de 166 méthodes, toutes exécutées sans échec : CandidateServiceTest, JobOfferServiceTest, ManagerRoutingServiceTest, ManagerScopeServiceTest, CandidateRoutingFanOutTest, DepartmentProposalServiceTest, N8nServiceTest, N8nServiceOutboxKeyTest, ScoringWeightProfileServiceTest, AiScoringServiceTest, InterviewServiceTest et InterviewServiceManagerCalendarTest en tests unitaires purs (services isolés à l’aide de doublons Mockito), ainsi que CandidateControllerWorkflowTest, CandidateStatusAnonymousSecurityTest, InterviewManagerCalendarSecurityTest et InterviewMeetLinkSecurityTest en tests de contrôleur reposant sur @WebMvcTest et MockMvc, qui vérifient notamment le comportement des routes accessibles de façon anonyme et la sécurité d’accès au lien Google Meet d’un entretien. Ces tests couvrent en particulier la chaîne de résolution des managers destinataires et son blocage lorsqu’aucun niveau ne résout de destinataire, la transmission effective à chacun des managers d’un même dossier (une clé d’événement par destinataire, relance comprise), l’isolation stricte de la visibilité des dossiers à la liste gelée, le calcul du score IA et ses seuils, le découplage entre planification d’entretien et statut du candidat, ainsi que les garde-fous de transition décrits au chapitre 3.</w:t>
       </w:r>
     </w:p>
     <w:p>
@@ -9582,7 +9579,7 @@
               <w:rPr>
                 <w:sz w:val="21"/>
               </w:rPr>
-              <w:t xml:space="preserve">Routage RH → manager selon le département de l’offre (repli famille de métier)</w:t>
+              <w:t xml:space="preserve">Routage RH → manager : manager désigné sur l’offre, à défaut département, à défaut famille de métier</w:t>
             </w:r>
           </w:p>
         </w:tc>
@@ -9600,7 +9597,7 @@
               <w:rPr>
                 <w:sz w:val="21"/>
               </w:rPr>
-              <w:t>Seul le manager du département concerné est notifié et voit le dossier</w:t>
+              <w:t xml:space="preserve">Chaque manager destinataire résolu est notifié et voit le dossier ; si aucun niveau ne résout, erreur 400 et ROUTING_FAILED</w:t>
             </w:r>
           </w:p>
         </w:tc>
@@ -9659,7 +9656,7 @@
               <w:rPr>
                 <w:sz w:val="21"/>
               </w:rPr>
-              <w:t>Seul le manager du département est notifié à ce stade, pas avant</w:t>
+              <w:t xml:space="preserve">Chaque manager destinataire résolu est notifié à ce stade, pas avant</w:t>
             </w:r>
           </w:p>
         </w:tc>
@@ -9718,7 +9715,7 @@
               <w:rPr>
                 <w:sz w:val="21"/>
               </w:rPr>
-              <w:t>Aucun dossier hors de son département n’est visible</w:t>
+              <w:t xml:space="preserve">Aucun dossier hors de la liste gelée des destinataires n’est visible</w:t>
             </w:r>
           </w:p>
         </w:tc>
@@ -10093,10 +10090,45 @@
           </w:p>
         </w:tc>
       </w:tr>
+      <w:tr>
+        <w:trPr>
+          <w:cantSplit/>
+        </w:trPr>
+        <w:tc>
+          <w:tcPr>
+            <w:tcW w:w="3070" w:type="dxa"/>
+          </w:tcPr>
+          <w:p>
+            <w:r>
+              <w:t xml:space="preserve">Transmission aux deux managers d’un dossier et relance d’un envoi échoué</w:t>
+            </w:r>
+          </w:p>
+        </w:tc>
+        <w:tc>
+          <w:tcPr>
+            <w:tcW w:w="3069" w:type="dxa"/>
+          </w:tcPr>
+          <w:p>
+            <w:r>
+              <w:t xml:space="preserve">Deux événements distincts, un par destinataire ; la relance émet une nouvelle clé et non un second silence</w:t>
+            </w:r>
+          </w:p>
+        </w:tc>
+        <w:tc>
+          <w:tcPr>
+            <w:tcW w:w="3067" w:type="dxa"/>
+          </w:tcPr>
+          <w:p>
+            <w:r>
+              <w:t xml:space="preserve">OK, vérifié le 14/10 en local</w:t>
+            </w:r>
+          </w:p>
+        </w:tc>
+      </w:tr>
     </w:tbl>
     <w:p>
       <w:r>
-        <w:t xml:space="preserve">Ce tableau atteste de l’exécution des vingt et un scénarios listés, tous concluants ; il ne constitue pas pour autant une garantie globale de qualité. Des cas nominaux et des cas d’erreur qui réussissent ne prouvent ni l’absence de défauts sur les chemins non exercés, ni le comportement de la plateforme sous charge. Ces tests vérifient des fonctionnalités et des règles d’accès : la pertinence du scoring IA, elle, est mesurée en section 4.4.5. Aucun test de charge n’a mesuré les exigences de temps de réponse fixées en section 2.2.3 (moins de 500 ms en lecture, moins de 2 s en écriture), qui restent à valider en préproduction.</w:t>
+        <w:t xml:space="preserve">Ce tableau atteste de l’exécution des vingt-deux scénarios listés, tous concluants ; il ne constitue pas pour autant une garantie globale de qualité. Des cas nominaux et des cas d’erreur qui réussissent ne prouvent ni l’absence de défauts sur les chemins non exercés, ni le comportement de la plateforme sous charge. Ces tests vérifient des fonctionnalités et des règles d’accès : la pertinence du scoring IA, elle, est mesurée en section 4.4.5. Aucun test de charge n’a mesuré les exigences de temps de réponse fixées en section 2.2.3 (moins de 500 ms en lecture, moins de 2 s en écriture), qui restent à valider en préproduction.</w:t>
       </w:r>
     </w:p>
     <w:p>
@@ -11010,7 +11042,7 @@
     </w:p>
     <w:p>
       <w:r>
-        <w:t xml:space="preserve">Un premier bug, découvert tardivement, concernait le routage automatique RH → manager. Lorsqu’une offre d’emploi était rattachée à une famille de métier suivie par plusieurs managers, seul le premier manager trouvé en base recevait la notification de validation RH : les autres n’étaient jamais informés, sans qu’aucune erreur ne soit levée. Le problème venait d’une méthode qui retournait un unique e-mail (le premier résultat de la requête) au lieu de la liste complète des managers concernés. La correction a consisté à faire retourner l’ensemble des adresses correspondantes et à notifier chaque manager individuellement, tout en veillant à ne pas dupliquer l’e-mail envoyé au candidat, qui doit rester unique quel que soit le nombre de managers notifiés. Ce routage a par la suite été affiné pour s’appuyer prioritairement sur le département de l’offre (CS, DevOps, ProdOps, R&amp;D, QA), la famille de métier n’intervenant plus qu’en repli pour les offres non rattachées à un département : un manager ne reçoit et ne voit désormais que les dossiers relevant strictement de son département, sans fuite possible vers un autre périmètre.</w:t>
+        <w:t xml:space="preserve">Un premier bug, découvert tardivement, concernait le routage automatique RH → manager. Lorsqu’une offre d’emploi était rattachée à une famille de métier suivie par plusieurs managers, seul le premier manager trouvé en base recevait la notification de validation RH : les autres n’étaient jamais informés, sans qu’aucune erreur ne soit levée. Le problème venait d’une méthode qui retournait un unique e-mail (le premier résultat de la requête) au lieu de la liste complète des managers concernés. La correction a consisté à faire retourner l’ensemble des adresses correspondantes et à notifier chaque manager individuellement, tout en veillant à ne pas dupliquer l’e-mail envoyé au candidat, qui doit rester unique quel que soit le nombre de managers notifiés. Deux effets de bord du même genre sont apparus au passage : la clé d’idempotence de la file d’attente interne était identique pour tous les managers d’un dossier, ce qui faisait silencieusement absorber le second envoi par la déduplication, et la destination continuait de dépendre d’attributs mutables de l’offre. La clé intègre désormais l’adresse du destinataire, et le routage a été rendu explicite et stable : ManagerRoutingService résout les destinataires par priorité (manager désigné sur l’offre, puis département, puis famille de métier, puis ancien champ e-mail), la transmission est bloquée et journalisée si aucun niveau ne résout de manager, et la liste retenue est gelée sur le dossier, ce qui fige par la même occasion le périmètre de lecture du manager.</w:t>
       </w:r>
     </w:p>
     <w:p>
@@ -11055,7 +11087,7 @@
     </w:p>
     <w:p>
       <w:r>
-        <w:t>Le garde-fou décrit en 4.5.3 empêchait bien un manager d’agir en écriture (changer un statut) sur un candidat hors de son périmètre, mais je me suis rendu compte, en réexaminant systématiquement chaque route accessible au rôle Manager, que ce n’était pas le cas des routes de lecture : GET /api/candidates, GET /api/candidates/{id}, la recherche par nom et le classement par offre ne filtraient pas par périmètre. Un manager authentifié pouvait donc, en appelant directement l’API (pas via l’interface, qui n’expose pas ce chemin), lister ou consulter des candidats d’un autre département. J’ai corrigé ce point en centralisant la logique de périmètre déjà utilisée pour les écritures dans une méthode réutilisable, appliquée à présent à toutes les routes de lecture concernées, et j’ai ajouté deux tests unitaires dédiés (section 4.4.1) pour figer ce comportement.</w:t>
+        <w:t xml:space="preserve">Le garde-fou décrit en 4.5.3 empêchait bien un manager d’agir en écriture (changer un statut) sur un candidat hors de son périmètre, mais je me suis rendu compte, en réexaminant systématiquement chaque route accessible au rôle Manager, que ce n’était pas le cas des routes de lecture : GET /api/candidates, GET /api/candidates/{id}, la recherche par nom et le classement par offre ne filtraient pas par périmètre. Un manager authentifié pouvait donc, en appelant directement l’API (pas via l’interface, qui n’expose pas ce chemin), lister ou consulter des candidats d’un autre département. J’ai corrigé ce point en centralisant la logique de périmètre dans un service unique, ManagerScopeService, qui lit la liste des destinataires gelée sur le dossier plutôt que les attributs toujours modifiables de l’offre : l’aiguillage et la visibilité partagent désormais la même source, et aucune route de lecture ne peut s’en écarter. Des tests unitaires dédiés (section 4.4.1) figent ce comportement.</w:t>
       </w:r>
     </w:p>
     <w:p>
@@ -11073,7 +11105,7 @@
         <w:jc w:val="both"/>
       </w:pPr>
       <w:r>
-        <w:t xml:space="preserve">Dans une première version, le manager destinataire était notifié dès la validation du CV par le RH (statut CV_REVIEWED). À l’usage, cela le sollicitait trop tôt : de nombreux dossiers étaient encore écartés lors du pré-filtrage téléphonique mené par le RH. J’ai donc déplacé la notification du manager à l’entrée en Test technique, c’est-à-dire une fois l’entretien téléphonique franchi ; le candidat, lui, reste informé de la présélection de son CV dès l’étape CV_REVIEWED. En cohérence, la vue des dossiers validés du manager ne fait plus apparaître les candidats qu’à partir du Test technique, ce qui recentre son attention sur les profils réellement en lice.</w:t>
+        <w:t xml:space="preserve">Dans une première version, le manager destinataire était notifié dès la validation du CV par le RH (statut CV_REVIEWED). À l’usage, cela le sollicitait trop tôt : de nombreux dossiers étaient encore écartés lors du pré-filtrage téléphonique mené par le RH. J’ai donc déplacé la notification du manager à l’entrée en Test technique, c’est-à-dire une fois l’entretien téléphonique franchi ; le candidat, lui, reste informé de la présélection de son CV dès l’étape CV_REVIEWED. En cohérence, la vue des dossiers validés du manager ne fait plus apparaître les candidats qu’à partir du Test technique, ce qui recentre son attention sur les profils réellement en lice. Le déplacement du moment ne retire rien au contrôle : avant de valider la transmission, le RH voit les destinataires que la résolution produira (GET /api/candidates/{id}/routing-preview) ; après l’envoi, la liste réellement notifiée lui est confirmée avec l’état de chaque événement (GET /api/candidates/{id}/routing-status : PENDING, SENT ou FAILED, nombre de tentatives, dernière erreur), et un envoi échoué peut être relancé (POST /api/candidates/{id}/reroute-notification) avec une clé renouvelée que la déduplication ne peut pas absorber.</w:t>
       </w:r>
     </w:p>
     <w:p>
@@ -11160,7 +11192,7 @@
     </w:p>
     <w:p>
       <w:r>
-        <w:t xml:space="preserve">Le lien Google Meet envoyé aux candidats et aux managers reposait initialement sur une valeur fictive, générée côté n8n sans appel réel à l’API Google Calendar — une limitation assumée à ce stade du développement. En remplaçant ce mécanisme par une véritable création d’événement Google Calendar (avec génération automatique du lien Meet), un problème plus ancien est remonté : le nœud Webhook de n8n imbrique le corps réel de la requête POST sous un champ body, alors que le workflow lisait les données à la racine. Ce défaut, antérieur à cette évolution, cassait silencieusement à la fois le routage de l’agent d’entretien et, potentiellement, celui de l’agent de décision finale. Je l’ai corrigé aux trois endroits concernés, puis validé le nouveau flux de bout en bout : création réelle de l’événement, ajout des participants, envoi de l’e-mail de convocation, et sauvegarde du lien via un point d’API dédié. Pour que cet appel à n8n reste fiable même en cas d’indisponibilité passagère, le back-end s’appuie sur une file d’attente interne (outbox) : chaque déclenchement est journalisé, puis retenté automatiquement en cas d’échec avec un délai croissant (5 s, 10 s, 20 s, 40 s puis 80 s ; le plafond théorique de 300 s n’est jamais atteint avec cinq relances), soit au plus 6 tentatives au total, ce qui évite de perdre un événement sans pour autant bloquer la requête initiale.</w:t>
+        <w:t xml:space="preserve">Le lien Google Meet envoyé aux candidats et aux managers reposait initialement sur une valeur fictive, générée côté n8n sans appel réel à l’API Google Calendar — une limitation assumée à ce stade du développement. En remplaçant ce mécanisme par une véritable création d’événement Google Calendar (avec génération automatique du lien Meet), un problème plus ancien est remonté : le nœud Webhook de n8n imbrique le corps réel de la requête POST sous un champ body, alors que le workflow lisait les données à la racine. Ce défaut, antérieur à cette évolution, cassait silencieusement à la fois le routage de l’agent d’entretien et, potentiellement, celui de l’agent de décision finale. Je l’ai corrigé aux trois endroits concernés, puis validé le nouveau flux de bout en bout : création réelle de l’événement, ajout des participants, envoi de l’e-mail de convocation, et sauvegarde du lien via un point d’API dédié. Pour que cet appel à n8n reste fiable même en cas d’indisponibilité passagère, le back-end s’appuie sur une file d’attente interne (outbox) : chaque déclenchement est journalisé, puis retenté automatiquement en cas d’échec avec un délai croissant (5 s, 10 s, 20 s, 40 s puis 80 s ; le plafond théorique de 300 s n’est jamais atteint avec cinq relances), soit au plus six tentatives au total, ce qui évite de perdre un événement sans pour autant bloquer la requête initiale. Cette file utilise la clé de l’événement comme clé de déduplication : elle intègre donc l’adresse du manager destinataire, pour que deux managers d’un même dossier produisent deux envois distincts. Une relance manuelle du RH (bouton « Relancer la notification » de la vue détaillée) émet quant à elle une nouvelle clé, que la déduplication ne peut pas avaler ; sans ce suffixe, relancer un envoi échoué aurait été accepté puis silencieusement ignoré.</w:t>
       </w:r>
     </w:p>
     <w:p>
@@ -11190,7 +11222,7 @@
     </w:p>
     <w:p>
       <w:r>
-        <w:t xml:space="preserve">La plateforme manipule des données à caractère personnel : identité, coordonnées, CV et évaluations des candidats. Plusieurs principes ont guidé leur traitement. L’accès aux dossiers est strictement contrôlé selon le rôle de l’utilisateur, comme détaillé au tableau de la section 2.2.1 : un manager ne voit que les candidatures de son périmètre, seuls RH et Administrateur disposant d’une vue d’ensemble. Les mots de passe sont hachés (section 4.2.4), et chaque action sensible sur un dossier candidat est journalisée dans le journal d’audit avec l’identité de son auteur et un horodatage — de quoi retracer qui a modifié un dossier donné. Plusieurs protections techniques complètent ce socle : une limitation du nombre de tentatives de connexion pour freiner les attaques par force brute et un garde-fou contre les redirections internes non autorisées sur le point d’API utilisé pour tester la connectivité des webhooks n8n. Une validation du contenu réel des fichiers déposés, au-delà de la seule extension déclarée, reste en revanche une amélioration prévue pour la mise en production (section 4.2.4).</w:t>
+        <w:t xml:space="preserve">La plateforme manipule des données à caractère personnel : identité, coordonnées, CV et évaluations des candidats. Plusieurs principes ont guidé leur traitement. L’accès aux dossiers est strictement contrôlé selon le rôle de l’utilisateur, comme détaillé au tableau de la section 2.2.1 : un manager ne voit que les candidatures de son périmètre, seuls RH et Administrateur disposant d’une vue d’ensemble. Les mots de passe sont hachés (section 4.2.4), et chaque action sensible sur un dossier candidat est journalisée dans le journal d’audit avec l’identité de son auteur et un horodatage — de quoi retracer qui a modifié un dossier donné, mais aussi à qui il a été transmis et sur quel critère, la transmission aux managers étant journalisée au même titre que les changements de statut et les corrections de score. Plusieurs protections techniques complètent ce socle : une limitation du nombre de tentatives de connexion pour freiner les attaques par force brute et un garde-fou contre les redirections internes non autorisées sur le point d’API utilisé pour tester la connectivité des webhooks n8n. Une validation du contenu réel des fichiers déposés, au-delà de la seule extension déclarée, reste en revanche une amélioration prévue pour la mise en production (section 4.2.4).</w:t>
       </w:r>
     </w:p>
     <w:p>
@@ -11593,7 +11625,7 @@
               <w:rPr>
                 <w:sz w:val="21"/>
               </w:rPr>
-              <w:t xml:space="preserve">Routage automatique RH → manager par département (isolation stricte, repli famille de métier)</w:t>
+              <w:t xml:space="preserve">Routage automatique RH → manager par priorité, liste gelée sur le dossier</w:t>
             </w:r>
           </w:p>
         </w:tc>
@@ -12114,7 +12146,7 @@
     </w:p>
     <w:p>
       <w:r>
-        <w:t xml:space="preserve">Plusieurs pistes d’évolution restent ouvertes pour poursuivre ce travail. Côté fonctionnel, la plateforme pourrait accueillir un module d’analyse prédictive du taux de transformation des candidatures, une intégration plus poussée avec des plateformes d’emploi externes (LinkedIn, Indeed), ou un espace candidat plus riche pour un suivi encore plus détaillé de son parcours. Côté technique, la suite de tests automatisés — qui compte déjà 121 méthodes de test unitaires et de contrôleur (JUnit 5 / Mockito) — gagnerait à être complétée par des tests d’intégration couvrant les services et la base de données, des tests de bout en bout (par exemple Playwright ou Cypress) rejouant les parcours métier complets, et des tests front-end automatisés sur les composants Angular. Le jeu de référence de seize profils mobilisé pour calibrer le seuil de décision gagnerait à être enrichi de candidatures réelles annotées par les recruteurs, seul moyen d’obtenir une mesure de performance en conditions d’exploitation. Une chaîne d’intégration et de déploiement continus (CI/CD) ainsi qu’un déploiement sur une infrastructure cloud constitueraient des évolutions naturelles pour renforcer la fiabilité et la scalabilité de la plateforme sur le long terme.</w:t>
+        <w:t xml:space="preserve">Plusieurs pistes d’évolution restent ouvertes pour poursuivre ce travail. Côté fonctionnel, la plateforme pourrait accueillir un module d’analyse prédictive du taux de transformation des candidatures, une intégration plus poussée avec des plateformes d’emploi externes (LinkedIn, Indeed), ou un espace candidat plus riche pour un suivi encore plus détaillé de son parcours. Côté technique, la suite de tests automatisés — qui compte déjà 166 méthodes de test unitaires et de contrôleur (JUnit 5 / Mockito) — gagnerait à être complétée par des tests d’intégration couvrant les services et la base de données, des tests de bout en bout (par exemple Playwright ou Cypress) rejouant les parcours métier complets, et des tests front-end automatisés sur les composants Angular. Le jeu de référence de seize profils mobilisé pour calibrer le seuil de décision gagnerait à être enrichi de candidatures réelles annotées par les recruteurs, seul moyen d’obtenir une mesure de performance en conditions d’exploitation. Une chaîne d’intégration et de déploiement continus (CI/CD) ainsi qu’un déploiement sur une infrastructure cloud constitueraient des évolutions naturelles pour renforcer la fiabilité et la scalabilité de la plateforme sur le long terme.</w:t>
       </w:r>
     </w:p>
     <w:p>

</xml_diff>

<commit_message>
feat(manager): lien Google Meet reel, popin detail du calendrier et garde-fous SMTP
- agent 2: veritable creation d'evenement Google Calendar avec conferenceData
  (lien Meet), extraction defensive du lien, condition de presence avant le
  PATCH backend et sortie d'alerte quand l'OAuth echoue; correction du corps
  de webhook imbrique sous body sur les trois agents
- backend: endpoint meet-link protege, calendar manager filtre sur
  l'intervieweur issu du JWT, garde-fou EmailService qui ignore l'envoi si
  APP_EMAIL_ENABLED est vrai mais le compte SMTP non rensegne
- frontend: popin detail d'entretien avec ligne « Lien de connexion » toujours
  visible, libelles de statut en francais, bouton « Rejoindre l'entretien »
  conditionnel
- rapport: section 4.5.10 reecrite (OAuth, garde-fou, replay de bout en bout),
  captures et pagination recalculees, 81 pages
</commit_message>
<xml_diff>
--- a/Rapport-PFE/finalreport/Rapport_PFE_Haythem_Bargaoui_beta.docx
+++ b/Rapport-PFE/finalreport/Rapport_PFE_Haythem_Bargaoui_beta.docx
@@ -1823,7 +1823,7 @@
       <w:r>
         <w:t>4.4.2 Tests fonctionnels manuels</w:t>
         <w:tab/>
-        <w:t>57</w:t>
+        <w:t>58</w:t>
       </w:r>
     </w:p>
     <w:p>
@@ -1859,7 +1859,7 @@
       <w:r>
         <w:t>4.4.4 Vérification de bout en bout</w:t>
         <w:tab/>
-        <w:t>59</w:t>
+        <w:t>60</w:t>
       </w:r>
     </w:p>
     <w:p>
@@ -1967,7 +1967,7 @@
       <w:r>
         <w:t>4.5.3 Cohérence des transitions de statut</w:t>
         <w:tab/>
-        <w:t>62</w:t>
+        <w:t>63</w:t>
       </w:r>
     </w:p>
     <w:p>
@@ -1985,7 +1985,7 @@
       <w:r>
         <w:t>4.5.4 Filtrage incomplet des routes de lecture pour les managers</w:t>
         <w:tab/>
-        <w:t>62</w:t>
+        <w:t>63</w:t>
       </w:r>
     </w:p>
     <w:p>
@@ -2039,7 +2039,7 @@
       <w:r>
         <w:t>4.5.7 Traitement distinct des candidatures retirées</w:t>
         <w:tab/>
-        <w:t>63</w:t>
+        <w:t>64</w:t>
       </w:r>
     </w:p>
     <w:p>
@@ -2057,7 +2057,7 @@
       <w:r>
         <w:t>4.5.8 Entretien téléphonique RH obligatoire avant acceptation</w:t>
         <w:tab/>
-        <w:t>63</w:t>
+        <w:t>64</w:t>
       </w:r>
     </w:p>
     <w:p>
@@ -2111,7 +2111,7 @@
       <w:r>
         <w:t>4.5.11 Cloisonnement des données dans le chatbot candidat</w:t>
         <w:tab/>
-        <w:t>64</w:t>
+        <w:t>65</w:t>
       </w:r>
     </w:p>
     <w:p>
@@ -2129,7 +2129,7 @@
       <w:r>
         <w:t>4.6 Protection des données et éthique de l’IA</w:t>
         <w:tab/>
-        <w:t>65</w:t>
+        <w:t>66</w:t>
       </w:r>
     </w:p>
     <w:p>
@@ -2147,7 +2147,7 @@
       <w:r>
         <w:t>4.7 Bilan des fonctionnalités réalisées</w:t>
         <w:tab/>
-        <w:t>66</w:t>
+        <w:t>67</w:t>
       </w:r>
     </w:p>
     <w:p>
@@ -2165,7 +2165,7 @@
       <w:r>
         <w:t>4.8 Conclusion</w:t>
         <w:tab/>
-        <w:t>67</w:t>
+        <w:t>68</w:t>
       </w:r>
     </w:p>
     <w:p>
@@ -2183,7 +2183,7 @@
       <w:r>
         <w:t>Conclusion Générale et Perspectives</w:t>
         <w:tab/>
-        <w:t>68</w:t>
+        <w:t>69</w:t>
       </w:r>
     </w:p>
     <w:p>
@@ -2201,7 +2201,7 @@
       <w:r>
         <w:t>Annexe A — Captures d’écran complémentaires</w:t>
         <w:tab/>
-        <w:t>70</w:t>
+        <w:t>71</w:t>
       </w:r>
     </w:p>
     <w:p>
@@ -2219,7 +2219,7 @@
       <w:r>
         <w:t>Bibliographie</w:t>
         <w:tab/>
-        <w:t>77</w:t>
+        <w:t>78</w:t>
       </w:r>
     </w:p>
     <w:p>
@@ -2237,7 +2237,7 @@
       <w:r>
         <w:t>Glossaire</w:t>
         <w:tab/>
-        <w:t>79</w:t>
+        <w:t>80</w:t>
       </w:r>
     </w:p>
     <w:p>
@@ -2664,7 +2664,7 @@
       <w:r>
         <w:t xml:space="preserve">Figure A.1 : Page de connexion</w:t>
         <w:tab/>
-        <w:t>70</w:t>
+        <w:t>71</w:t>
       </w:r>
     </w:p>
     <w:p>
@@ -2676,7 +2676,7 @@
       <w:r>
         <w:t xml:space="preserve">Figure A.2 : Modification d’un dossier candidat</w:t>
         <w:tab/>
-        <w:t>71</w:t>
+        <w:t>72</w:t>
       </w:r>
     </w:p>
     <w:p>
@@ -2688,7 +2688,7 @@
       <w:r>
         <w:t xml:space="preserve">Figure A.3 : Gestion des entretiens</w:t>
         <w:tab/>
-        <w:t>72</w:t>
+        <w:t>73</w:t>
       </w:r>
     </w:p>
     <w:p>
@@ -2700,7 +2700,7 @@
       <w:r>
         <w:t xml:space="preserve">Figure A.4 : Gestion des feedbacks</w:t>
         <w:tab/>
-        <w:t>72</w:t>
+        <w:t>73</w:t>
       </w:r>
     </w:p>
     <w:p>
@@ -2712,7 +2712,7 @@
       <w:r>
         <w:t xml:space="preserve">Figure A.5 : Journal d’audit</w:t>
         <w:tab/>
-        <w:t>73</w:t>
+        <w:t>74</w:t>
       </w:r>
     </w:p>
     <w:p>
@@ -2724,7 +2724,7 @@
       <w:r>
         <w:t xml:space="preserve">Figure A.6 : Soumission d’une candidature avec dépôt de CV</w:t>
         <w:tab/>
-        <w:t>73</w:t>
+        <w:t>74</w:t>
       </w:r>
     </w:p>
     <w:p>
@@ -2736,7 +2736,7 @@
       <w:r>
         <w:t xml:space="preserve">Figure A.7 : Espace Manager — candidatures relevant du périmètre du manager</w:t>
         <w:tab/>
-        <w:t>74</w:t>
+        <w:t>75</w:t>
       </w:r>
     </w:p>
     <w:p>
@@ -2748,7 +2748,7 @@
       <w:r>
         <w:t xml:space="preserve">Figure A.8 : Console n8n — les trois flux d’automatisation publiés et leurs statistiques</w:t>
         <w:tab/>
-        <w:t>75</w:t>
+        <w:t>76</w:t>
       </w:r>
     </w:p>
     <w:p>
@@ -2760,7 +2760,7 @@
       <w:r>
         <w:t xml:space="preserve">Figure A.9 : Flux n8n de l’Agent 1 — webhook de candidature, appel du scoring Cohere puis e-mail au candidat</w:t>
         <w:tab/>
-        <w:t>75</w:t>
+        <w:t>76</w:t>
       </w:r>
     </w:p>
     <w:p>
@@ -2772,7 +2772,7 @@
       <w:r>
         <w:t xml:space="preserve">Figure A.10 : E-mail automatique de confirmation de candidature reçu par le candidat</w:t>
         <w:tab/>
-        <w:t>76</w:t>
+        <w:t>77</w:t>
       </w:r>
     </w:p>
     <w:p>
@@ -8350,7 +8350,7 @@
     </w:p>
     <w:p>
       <w:r>
-        <w:t xml:space="preserve">J’ai aussi donné à chaque manager une page « Mon calendrier », en lecture seule, qui regroupe ses entretiens du mois et ses trois prochains rendez-vous ; les données y sont filtrées côté serveur à partir de la liste des destinataires gelée sur chaque dossier, le même cloisonnement que pour la liste des dossiers candidats.</w:t>
+        <w:t xml:space="preserve">J’ai aussi donné à chaque manager une page « Mon calendrier », en lecture seule, qui regroupe ses entretiens du mois et ses trois prochains rendez-vous ; les données y sont filtrées côté serveur sur la seule identité de l’intervieweur connecté, reprise du jeton d’authentification, et le même contrôle d’accès au dossier candidat s’applique que pour la liste des dossiers, de sorte qu’un manager ne peut voir que les entretiens où il est nommément désigné.</w:t>
       </w:r>
     </w:p>
     <w:p>
@@ -8480,7 +8480,7 @@
     </w:p>
     <w:p>
       <w:r>
-        <w:t xml:space="preserve">Le manager dispose en outre d’une page « Mon calendrier » qui centralise les entretiens de son périmètre : prochaine session, lien de visioconférence, répartition par statut et vue mensuelle, avec un rappel automatique planifié deux heures avant chaque entretien. La liste reste filtrée côté serveur à partir de la destination gelée sur le dossier, de sorte qu’aucun entretien hors de son périmètre ne peut y apparaître.</w:t>
+        <w:t xml:space="preserve">Le manager dispose en outre d’une page « Mon calendrier » qui centralise les entretiens dont il est l’intervieweur : prochaine session, lien de visioconférence, répartition par statut et vue mensuelle, avec un rappel automatique planifié deux heures avant chaque entretien. Chaque événement de la grille ouvre une fenêtre de détail (candidat, poste, format, date et heure, durée, lieu, notes, lien de connexion) ; le lien Google Meet y est présenté à part, derrière un bouton explicite « Rejoindre l’entretien », et non sur la carte elle-même, pour qu’une simple consultation du planning ne déclenche pas d’appel visio vers le candidat. Lorsque le lien n’a pas encore été produit par l’agent de planification, la fenêtre l’indique au lieu d’afficher un bouton sans effet.</w:t>
       </w:r>
     </w:p>
     <w:p>
@@ -11192,7 +11192,17 @@
     </w:p>
     <w:p>
       <w:r>
-        <w:t xml:space="preserve">Le lien Google Meet envoyé aux candidats et aux managers reposait initialement sur une valeur fictive, générée côté n8n sans appel réel à l’API Google Calendar — une limitation assumée à ce stade du développement. En remplaçant ce mécanisme par une véritable création d’événement Google Calendar (avec génération automatique du lien Meet), un problème plus ancien est remonté : le nœud Webhook de n8n imbrique le corps réel de la requête POST sous un champ body, alors que le workflow lisait les données à la racine. Ce défaut, antérieur à cette évolution, cassait silencieusement à la fois le routage de l’agent d’entretien et, potentiellement, celui de l’agent de décision finale. Je l’ai corrigé aux trois endroits concernés, puis validé le nouveau flux de bout en bout : création réelle de l’événement, ajout des participants, envoi de l’e-mail de convocation, et sauvegarde du lien via un point d’API dédié. Pour que cet appel à n8n reste fiable même en cas d’indisponibilité passagère, le back-end s’appuie sur une file d’attente interne (outbox) : chaque déclenchement est journalisé, puis retenté automatiquement en cas d’échec avec un délai croissant (5 s, 10 s, 20 s, 40 s puis 80 s ; le plafond théorique de 300 s n’est jamais atteint avec cinq relances), soit au plus six tentatives au total, ce qui évite de perdre un événement sans pour autant bloquer la requête initiale. Cette file utilise la clé de l’événement comme clé de déduplication : elle intègre donc l’adresse du manager destinataire, pour que deux managers d’un même dossier produisent deux envois distincts. Une relance manuelle du RH (bouton « Relancer la notification » de la vue détaillée) émet quant à elle une nouvelle clé, que la déduplication ne peut pas avaler ; sans ce suffixe, relancer un envoi échoué aurait été accepté puis silencieusement ignoré.</w:t>
+        <w:t xml:space="preserve">Le lien Google Meet envoyé aux candidats et aux managers reposait initialement sur une valeur fictive, générée côté n8n sans appel réel à l’API Google Calendar — une limitation assumée à ce stade du développement. En remplaçant ce mécanisme par une véritable création d’événement Google Calendar (avec génération automatique du lien Meet), un premier défaut est remonté : le nœud Webhook de n8n imbrique le corps réel de la requête POST sous un champ body, alors que le workflow lisait les données à la racine. Ce défaut, antérieur à cette évolution, cassait silencieusement à la fois le routage de l’agent d’entretien et, potentiellement, celui de l’agent de décision finale. Je l’ai corrigé aux trois endroits concernés.</w:t>
+      </w:r>
+    </w:p>
+    <w:p>
+      <w:r>
+        <w:t xml:space="preserve">La mise à l’épreuve du nouveau flux a révélé une seconde défaillance, plus instructive encore. Quand l’habilitation OAuth2 du compte Google expire ou est révoquée, le nœud Calendar échoue, et l’objet d’erreur qu’il produit se propageait tel quel aux nœuds suivants : le rappel vers le back-end partait alors avec un lien vide, ce que l’API refusait, et l’événement mis en file d’attente épuisait ses cinq tentatives avant de passer en échec définitif. Une simple coupure de connexion Google suffisait donc à encombrer la file de notification. J’ai interposé un nœud d’extraction qui tolère l’échec du nœud Calendar et n’isole un lien que s’il a réellement été produit, puis une condition qui ne déclenche le rappel que dans ce cas ; sinon, le flux journalise un avertissement et poursuit l’envoi des deux e-mails, qui restent utiles même sans lien de visioconférence. Le lien n’est jamais inventé : la colonne correspondante de la base reste nulle tant que l’événement n’a pas été créé.</w:t>
+      </w:r>
+    </w:p>
+    <w:p>
+      <w:r>
+        <w:t xml:space="preserve">Le flux complet a été rejoué de bout en bout sur un entretien de démonstration : création réelle de l’événement avec sa conférence, extraction du lien, rappel accepté par le point d’API dédié et lien persisté, envoi des deux e-mails, puis reprise du même lien dans la fenêtre de détail du calendrier du manager. Ce résultat reste conditionné à l’état de la connexion Google : du côté du fournisseur, un projet maintenu en mode « test » voit son jeton d’actualisation expirer au bout de sept jours, ce qui impose de reconnecter le compte avant toute démonstration ; publier le client OAuth et surveiller l’état de l’habilitation relèvent de la mise en production. Pour que cet appel à n8n reste fiable même en cas d’indisponibilité passagère, le back-end s’appuie sur une file d’attente interne (outbox) : chaque déclenchement est journalisé, puis retenté automatiquement en cas d’échec avec un délai croissant (5 s, 10 s, 20 s, 40 s puis 80 s ; le plafond théorique de 300 s n’est jamais atteint avec cinq relances), soit au plus six tentatives au total, ce qui évite de perdre un événement sans pour autant bloquer la requête initiale. Cette file utilise la clé de l’événement comme clé de déduplication : elle intègre donc l’adresse du manager destinataire, pour que deux managers d’un même dossier produisent deux envois distincts. Une relance manuelle du RH (bouton « Relancer la notification » de la vue détaillée) émet quant à elle une nouvelle clé, que la déduplication ne peut pas avaler ; sans ce suffixe, relancer un envoi échoué aurait été accepté puis silencieusement ignoré.</w:t>
       </w:r>
     </w:p>
     <w:p>
@@ -11310,7 +11320,6 @@
           </w:tcPr>
           <w:p>
             <w:pPr>
-              <w:keepNext/>
               <w:rPr>
                 <w:b/>
                 <w:sz w:val="21"/>
@@ -11332,7 +11341,6 @@
           </w:tcPr>
           <w:p>
             <w:pPr>
-              <w:keepNext/>
               <w:rPr>
                 <w:b/>
                 <w:sz w:val="21"/>
@@ -11358,7 +11366,6 @@
           </w:tcPr>
           <w:p>
             <w:pPr>
-              <w:keepNext/>
               <w:rPr>
                 <w:sz w:val="21"/>
               </w:rPr>
@@ -11377,7 +11384,6 @@
           </w:tcPr>
           <w:p>
             <w:pPr>
-              <w:keepNext/>
               <w:rPr>
                 <w:sz w:val="21"/>
               </w:rPr>
@@ -11401,7 +11407,6 @@
           </w:tcPr>
           <w:p>
             <w:pPr>
-              <w:keepNext/>
               <w:rPr>
                 <w:sz w:val="21"/>
               </w:rPr>
@@ -11420,7 +11425,6 @@
           </w:tcPr>
           <w:p>
             <w:pPr>
-              <w:keepNext/>
               <w:rPr>
                 <w:sz w:val="21"/>
               </w:rPr>
@@ -11444,7 +11448,6 @@
           </w:tcPr>
           <w:p>
             <w:pPr>
-              <w:keepNext/>
               <w:rPr>
                 <w:sz w:val="21"/>
               </w:rPr>
@@ -11463,7 +11466,6 @@
           </w:tcPr>
           <w:p>
             <w:pPr>
-              <w:keepNext/>
               <w:rPr>
                 <w:sz w:val="21"/>
               </w:rPr>
@@ -11487,7 +11489,6 @@
           </w:tcPr>
           <w:p>
             <w:pPr>
-              <w:keepNext/>
               <w:rPr>
                 <w:sz w:val="21"/>
               </w:rPr>
@@ -11506,7 +11507,6 @@
           </w:tcPr>
           <w:p>
             <w:pPr>
-              <w:keepNext/>
               <w:rPr>
                 <w:sz w:val="21"/>
               </w:rPr>
@@ -11530,7 +11530,6 @@
           </w:tcPr>
           <w:p>
             <w:pPr>
-              <w:keepNext/>
               <w:rPr>
                 <w:sz w:val="21"/>
               </w:rPr>
@@ -11549,7 +11548,6 @@
           </w:tcPr>
           <w:p>
             <w:pPr>
-              <w:keepNext/>
               <w:rPr>
                 <w:sz w:val="21"/>
               </w:rPr>
@@ -11573,7 +11571,6 @@
           </w:tcPr>
           <w:p>
             <w:pPr>
-              <w:keepNext/>
               <w:rPr>
                 <w:sz w:val="21"/>
               </w:rPr>
@@ -11592,7 +11589,6 @@
           </w:tcPr>
           <w:p>
             <w:pPr>
-              <w:keepNext/>
               <w:rPr>
                 <w:sz w:val="21"/>
               </w:rPr>
@@ -11616,7 +11612,6 @@
           </w:tcPr>
           <w:p>
             <w:pPr>
-              <w:keepNext/>
               <w:rPr>
                 <w:sz w:val="21"/>
               </w:rPr>
@@ -11635,7 +11630,6 @@
           </w:tcPr>
           <w:p>
             <w:pPr>
-              <w:keepNext/>
               <w:rPr>
                 <w:sz w:val="21"/>
               </w:rPr>
@@ -11659,7 +11653,6 @@
           </w:tcPr>
           <w:p>
             <w:pPr>
-              <w:keepNext/>
               <w:rPr>
                 <w:sz w:val="21"/>
               </w:rPr>
@@ -11678,7 +11671,6 @@
           </w:tcPr>
           <w:p>
             <w:pPr>
-              <w:keepNext/>
               <w:rPr>
                 <w:sz w:val="21"/>
               </w:rPr>
@@ -11702,7 +11694,6 @@
           </w:tcPr>
           <w:p>
             <w:pPr>
-              <w:keepNext/>
               <w:rPr>
                 <w:sz w:val="21"/>
               </w:rPr>
@@ -11721,7 +11712,6 @@
           </w:tcPr>
           <w:p>
             <w:pPr>
-              <w:keepNext/>
               <w:rPr>
                 <w:sz w:val="21"/>
               </w:rPr>
@@ -11745,7 +11735,6 @@
           </w:tcPr>
           <w:p>
             <w:pPr>
-              <w:keepNext/>
               <w:rPr>
                 <w:sz w:val="21"/>
               </w:rPr>
@@ -11764,7 +11753,6 @@
           </w:tcPr>
           <w:p>
             <w:pPr>
-              <w:keepNext/>
               <w:rPr>
                 <w:sz w:val="21"/>
               </w:rPr>
@@ -11788,7 +11776,6 @@
           </w:tcPr>
           <w:p>
             <w:pPr>
-              <w:keepNext/>
               <w:rPr>
                 <w:sz w:val="21"/>
               </w:rPr>
@@ -11807,7 +11794,6 @@
           </w:tcPr>
           <w:p>
             <w:pPr>
-              <w:keepNext/>
               <w:rPr>
                 <w:sz w:val="21"/>
               </w:rPr>
@@ -11831,7 +11817,6 @@
           </w:tcPr>
           <w:p>
             <w:pPr>
-              <w:keepNext/>
               <w:rPr>
                 <w:sz w:val="21"/>
               </w:rPr>
@@ -11850,7 +11835,6 @@
           </w:tcPr>
           <w:p>
             <w:pPr>
-              <w:keepNext/>
               <w:rPr>
                 <w:sz w:val="21"/>
               </w:rPr>
@@ -11874,7 +11858,6 @@
           </w:tcPr>
           <w:p>
             <w:pPr>
-              <w:keepNext/>
               <w:rPr>
                 <w:sz w:val="21"/>
               </w:rPr>
@@ -11893,7 +11876,6 @@
           </w:tcPr>
           <w:p>
             <w:pPr>
-              <w:keepNext/>
               <w:rPr>
                 <w:sz w:val="21"/>
               </w:rPr>
@@ -11917,7 +11899,6 @@
           </w:tcPr>
           <w:p>
             <w:pPr>
-              <w:keepNext/>
               <w:rPr>
                 <w:sz w:val="21"/>
               </w:rPr>
@@ -11936,7 +11917,6 @@
           </w:tcPr>
           <w:p>
             <w:pPr>
-              <w:keepNext/>
               <w:rPr>
                 <w:sz w:val="21"/>
               </w:rPr>
@@ -11959,9 +11939,7 @@
             <w:tcW w:w="4183" w:type="pct"/>
           </w:tcPr>
           <w:p>
-            <w:pPr>
-              <w:keepNext/>
-            </w:pPr>
+            <w:pPr/>
             <w:r>
               <w:t>Assistant conversationnel candidat (chatbot IA via OpenRouter, connaissance des candidatures réelles et de la plateforme)</w:t>
             </w:r>
@@ -11972,9 +11950,7 @@
             <w:tcW w:w="817" w:type="pct"/>
           </w:tcPr>
           <w:p>
-            <w:pPr>
-              <w:keepNext/>
-            </w:pPr>
+            <w:pPr/>
             <w:r>
               <w:t>Réalisée</w:t>
             </w:r>
@@ -11990,9 +11966,7 @@
             <w:tcW w:w="4183" w:type="pct"/>
           </w:tcPr>
           <w:p>
-            <w:pPr>
-              <w:keepNext/>
-            </w:pPr>
+            <w:pPr/>
             <w:r>
               <w:t xml:space="preserve">Évaluation du matching sur un Gold Set de seize CVs annotés</w:t>
             </w:r>
@@ -12003,9 +11977,7 @@
             <w:tcW w:w="817" w:type="pct"/>
           </w:tcPr>
           <w:p>
-            <w:pPr>
-              <w:keepNext/>
-            </w:pPr>
+            <w:pPr/>
             <w:r>
               <w:t xml:space="preserve">Réalisée</w:t>
             </w:r>
@@ -12021,9 +11993,7 @@
             <w:tcW w:w="4183" w:type="pct"/>
           </w:tcPr>
           <w:p>
-            <w:pPr>
-              <w:keepNext/>
-            </w:pPr>
+            <w:pPr/>
             <w:r>
               <w:t xml:space="preserve">Human-in-the-Loop : signalement des dossiers à arbitrer (needsHumanReview)</w:t>
             </w:r>
@@ -12034,9 +12004,7 @@
             <w:tcW w:w="817" w:type="pct"/>
           </w:tcPr>
           <w:p>
-            <w:pPr>
-              <w:keepNext/>
-            </w:pPr>
+            <w:pPr/>
             <w:r>
               <w:t xml:space="preserve">Réalisée</w:t>
             </w:r>

</xml_diff>

<commit_message>
docs(rapport): 167 tests, incident d'en-tete n8n et mention de la video de demo
Le rapport installe (81 p.) et le deck alignes sur l'etat reel du code :
compte de test corrige (166 -> 167 methodes dans 16 classes, verifie dans
JOB4YOU-backend/src/test/java), troisieme defaillance du flux lien Meet
decrite en 4.5.10 (rappel parti sans en-tete d'authentification, reponse 401
silencieuse alors que l'execution n8n affichait success), et verification de
bout en bout accompagnee de la video de demonstration transmise a l'encadrant
en 4.4.4. Pagination et table des matieres inchangees.
</commit_message>
<xml_diff>
--- a/Rapport-PFE/finalreport/Rapport_PFE_Haythem_Bargaoui_beta.docx
+++ b/Rapport-PFE/finalreport/Rapport_PFE_Haythem_Bargaoui_beta.docx
@@ -6700,7 +6700,7 @@
     <w:p>
       <w:pPr/>
       <w:r>
-        <w:t xml:space="preserve">La plateforme cible une architecture distribuée par couches : un front-end Angular servi au navigateur, un back-end Spring Boot exposant des API REST sécurisées, une base PostgreSQL (SGBD) et une couche d’automatisation n8n chargée de la planification des entretiens (Google Calendar [10]) et des notifications (SMTP) ; le back-end appelle directement l’API de Cohere [11] (scoring IA) et l’API OpenRouter [12] (assistant conversationnel). Cette organisation physique est détaillée au chapitre 3 par les diagrammes de composants (figure 3.10) et de déploiement (figure 3.11) ; le tableau ci-dessous précise le rôle de chaque agent d’automatisation.</w:t>
+        <w:t xml:space="preserve">La plateforme cible une architecture distribuée par couches : un front-end Angular servi au navigateur, un back-end Spring Boot exposant des API REST sécurisées, une base PostgreSQL (SGBD) et une couche d’automatisation n8n chargée de la planification des entretiens (Google Calendar [10]) et de l’essentiel des notifications (SMTP) ; le back-end envoie toutefois ses propres courriels, via JavaMailSender, pour la réinitialisation du mot de passe et les rappels d’entretien. Il appelle aussi directement l’API de Cohere [11] (scoring IA) et l’API OpenRouter [12] (assistant conversationnel). Cette organisation physique est détaillée au chapitre 3 (figures 3.10 et 3.11) ; le tableau ci-dessous précise le rôle de chaque agent.</w:t>
       </w:r>
     </w:p>
     <w:p>
@@ -6927,7 +6927,7 @@
               <w:rPr>
                 <w:sz w:val="21"/>
               </w:rPr>
-              <w:t xml:space="preserve">Crée réellement l’événement Google Calendar, génère le lien Google Meet correspondant, ajoute les participants et envoie les invitations et rappels au candidat et à l’intervieweur.</w:t>
+              <w:t xml:space="preserve">Crée réellement l’événement Google Calendar, génère le lien Google Meet correspondant, ajoute les participants et envoie la convocation au candidat comme la confirmation à l’intervieweur.</w:t>
             </w:r>
           </w:p>
         </w:tc>
@@ -8626,7 +8626,7 @@
     </w:p>
     <w:p>
       <w:r>
-        <w:t xml:space="preserve">Au-delà des vérifications manuelles, la couche service et une partie de la couche controller sont couvertes par une suite de tests automatisés écrite avec JUnit 5 et Mockito [16], exécutée via Maven. Elle comprend 16 classes de test pour un total de 166 méthodes, toutes exécutées sans échec : CandidateServiceTest, JobOfferServiceTest, ManagerRoutingServiceTest, ManagerScopeServiceTest, CandidateRoutingFanOutTest, DepartmentProposalServiceTest, N8nServiceTest, N8nServiceOutboxKeyTest, ScoringWeightProfileServiceTest, AiScoringServiceTest, InterviewServiceTest et InterviewServiceManagerCalendarTest en tests unitaires purs (services isolés à l’aide de doublons Mockito), ainsi que CandidateControllerWorkflowTest, CandidateStatusAnonymousSecurityTest, InterviewManagerCalendarSecurityTest et InterviewMeetLinkSecurityTest en tests de contrôleur reposant sur @WebMvcTest et MockMvc, qui vérifient notamment le comportement des routes accessibles de façon anonyme et la sécurité d’accès au lien Google Meet d’un entretien. Ces tests couvrent en particulier la chaîne de résolution des managers destinataires et son blocage lorsqu’aucun niveau ne résout de destinataire, la transmission effective à chacun des managers d’un même dossier (une clé d’événement par destinataire, relance comprise), l’isolation stricte de la visibilité des dossiers à la liste gelée, le calcul du score IA et ses seuils, le découplage entre planification d’entretien et statut du candidat, ainsi que les garde-fous de transition décrits au chapitre 3.</w:t>
+        <w:t xml:space="preserve">Au-delà des vérifications manuelles, la couche service et une partie de la couche controller sont couvertes par une suite de tests automatisés écrite avec JUnit 5 et Mockito [16], exécutée via Maven. Elle comprend 16 classes de test pour un total de 167 méthodes, toutes exécutées sans échec : CandidateServiceTest, JobOfferServiceTest, ManagerRoutingServiceTest, ManagerScopeServiceTest, CandidateRoutingFanOutTest, DepartmentProposalServiceTest, N8nServiceTest, N8nServiceOutboxKeyTest, ScoringWeightProfileServiceTest, AiScoringServiceTest, InterviewServiceTest et InterviewServiceManagerCalendarTest en tests unitaires purs (services isolés à l’aide de doublons Mockito), ainsi que CandidateControllerWorkflowTest, CandidateStatusAnonymousSecurityTest, InterviewManagerCalendarSecurityTest et InterviewMeetLinkSecurityTest en tests de contrôleur reposant sur @WebMvcTest et MockMvc, qui vérifient notamment le comportement des routes accessibles de façon anonyme et la sécurité d’accès au lien Google Meet d’un entretien. Ces tests couvrent en particulier la chaîne de résolution des managers destinataires et son blocage lorsqu’aucun niveau ne résout de destinataire, la transmission effective à chacun des managers d’un même dossier (une clé d’événement par destinataire, relance comprise), l’isolation stricte de la visibilité des dossiers à la liste gelée, le calcul du score IA et ses seuils, le découplage entre planification d’entretien et statut du candidat, ainsi que les garde-fous de transition décrits au chapitre 3.</w:t>
       </w:r>
     </w:p>
     <w:p>
@@ -10158,7 +10158,7 @@
     </w:p>
     <w:p>
       <w:r>
-        <w:t xml:space="preserve">Au-delà des tests unitaires par fonctionnalité, j’ai mené une vérification de bout en bout du parcours complet de recrutement : soumission d’une candidature, analyse automatique par l’IA, validation par le RH, planification d’un entretien, saisie d’un feedback, avis du manager puis contre-signature du RH — chaque étape déclenchant la notification par e-mail attendue, au candidat et/ou aux parties prenantes internes. Le fractionnement de la décision en deux niveaux, et les erreurs renvoyées quand un manager tente de trancher seul, sont en outre figés par des tests unitaires côté back-end (classe CandidateServiceTest, section 4.4.1).</w:t>
+        <w:t xml:space="preserve">Au-delà des tests unitaires par fonctionnalité, j’ai mené une vérification de bout en bout du parcours complet de recrutement : soumission d’une candidature, analyse automatique par l’IA, validation par le RH, planification d’un entretien, saisie d’un feedback, avis du manager puis contre-signature du RH — chaque étape déclenchant la notification par e-mail attendue, au candidat et aux parties prenantes internes. Une vidéo de démonstration commentée de ce parcours, courriels remis à l’appui, a été transmise à l’encadrant. Le fractionnement de la décision en deux niveaux, et les erreurs renvoyées quand un manager tente de trancher seul, sont figés par des tests côté back-end (CandidateServiceTest, section 4.4.1).</w:t>
       </w:r>
     </w:p>
     <w:p>
@@ -11197,12 +11197,12 @@
     </w:p>
     <w:p>
       <w:r>
-        <w:t xml:space="preserve">La mise à l’épreuve du nouveau flux a révélé une seconde défaillance, plus instructive encore. Quand l’habilitation OAuth2 du compte Google expire ou est révoquée, le nœud Calendar échoue, et l’objet d’erreur qu’il produit se propageait tel quel aux nœuds suivants : le rappel vers le back-end partait alors avec un lien vide, ce que l’API refusait, et l’événement mis en file d’attente épuisait ses cinq tentatives avant de passer en échec définitif. Une simple coupure de connexion Google suffisait donc à encombrer la file de notification. J’ai interposé un nœud d’extraction qui tolère l’échec du nœud Calendar et n’isole un lien que s’il a réellement été produit, puis une condition qui ne déclenche le rappel que dans ce cas ; sinon, le flux journalise un avertissement et poursuit l’envoi des deux e-mails, qui restent utiles même sans lien de visioconférence. Le lien n’est jamais inventé : la colonne correspondante de la base reste nulle tant que l’événement n’a pas été créé.</w:t>
-      </w:r>
-    </w:p>
-    <w:p>
-      <w:r>
-        <w:t xml:space="preserve">Le flux complet a été rejoué de bout en bout sur un entretien de démonstration : création réelle de l’événement avec sa conférence, extraction du lien, rappel accepté par le point d’API dédié et lien persisté, envoi des deux e-mails, puis reprise du même lien dans la fenêtre de détail du calendrier du manager. Ce résultat reste conditionné à l’état de la connexion Google : du côté du fournisseur, un projet maintenu en mode « test » voit son jeton d’actualisation expirer au bout de sept jours, ce qui impose de reconnecter le compte avant toute démonstration ; publier le client OAuth et surveiller l’état de l’habilitation relèvent de la mise en production. Pour que cet appel à n8n reste fiable même en cas d’indisponibilité passagère, le back-end s’appuie sur une file d’attente interne (outbox) : chaque déclenchement est journalisé, puis retenté automatiquement en cas d’échec avec un délai croissant (5 s, 10 s, 20 s, 40 s puis 80 s ; le plafond théorique de 300 s n’est jamais atteint avec cinq relances), soit au plus six tentatives au total, ce qui évite de perdre un événement sans pour autant bloquer la requête initiale. Cette file utilise la clé de l’événement comme clé de déduplication : elle intègre donc l’adresse du manager destinataire, pour que deux managers d’un même dossier produisent deux envois distincts. Une relance manuelle du RH (bouton « Relancer la notification » de la vue détaillée) émet quant à elle une nouvelle clé, que la déduplication ne peut pas avaler ; sans ce suffixe, relancer un envoi échoué aurait été accepté puis silencieusement ignoré.</w:t>
+        <w:t xml:space="preserve">La mise à l’épreuve du nouveau flux a révélé une seconde défaillance, plus instructive encore. Quand l’habilitation OAuth2 du compte Google expire ou est révoquée, le nœud Calendar échoue, et son objet d’erreur se propageait tel quel aux nœuds suivants : le rappel vers le back-end partait avec un lien vide, ce que l’API refusait, et l’événement en file épuisait ses cinq tentatives avant de passer en échec définitif — une simple coupure Google suffisait donc à encombrer la file de notification. J’ai interposé un nœud d’extraction qui tolère l’échec du nœud Calendar et n’isole un lien que s’il a réellement été produit, puis une condition qui ne déclenche le rappel que dans ce cas ; sinon, le flux journalise un avertissement et poursuit l’envoi des deux e-mails, qui restent utiles même sans lien de visioconférence. Le lien n’est jamais inventé : la colonne correspondante de la base reste nulle tant que l’événement n’a pas été créé.</w:t>
+      </w:r>
+    </w:p>
+    <w:p>
+      <w:r>
+        <w:t xml:space="preserve">Le flux complet a été rejoué de bout en bout sur un entretien de démonstration : création réelle de l’événement avec sa conférence, extraction du lien, rappel accepté par le point d’API dédié et lien persisté, envoi des deux courriels par n8n, puis reprise du même lien dans la fenêtre de détail du calendrier du manager. Ce rejeu n’a pas abouti du premier coup : le rappel partait sans en-tête d’authentification, car n8n interdit l’expression $env dans un nœud HTTP Request et n’attache la credential d’en-tête que si le nœud déclare explicitement ce mode ; Spring répondait donc 401 pendant que l’exécution affichait « success », et le lien était perdu sans trace. La voie JavaMailSender du back-end a été vérifiée séparément : le courriel de réinitialisation du mot de passe a été remis à 22 h 37, et le rappel d’entretien à J-1 dispatché par le planifieur à 23 h 00, la journalisation « sent successfully » étant corrigée par la réception effective sur la boîte de test. Ce résultat reste conditionné à la connexion Google : un projet maintenu en mode « test » voit son jeton d’actualisation expirer au bout de sept jours, ce qui impose de reconnecter le compte avant toute démonstration. Pour rendre cet appel fiable en cas d’indisponibilité passagère, le back-end s’appuie sur une file interne (outbox) : chaque déclenchement est journalisé puis retenté avec un délai croissant (5 s, puis 10, 20, 40 et 80 s), soit six tentatives au maximum sans bloquer la requête initiale. Cette clé intègre l’adresse du manager destinataire, pour que deux managers d’un même dossier produisent deux envois distincts. Une relance manuelle du RH (bouton « Relancer la notification ») émet une nouvelle clé que la déduplication ne peut pas avaler ; sans ce suffixe, relancer un envoi échoué aurait été accepté puis silencieusement ignoré.</w:t>
       </w:r>
     </w:p>
     <w:p>
@@ -12114,7 +12114,7 @@
     </w:p>
     <w:p>
       <w:r>
-        <w:t xml:space="preserve">Plusieurs pistes d’évolution restent ouvertes pour poursuivre ce travail. Côté fonctionnel, la plateforme pourrait accueillir un module d’analyse prédictive du taux de transformation des candidatures, une intégration plus poussée avec des plateformes d’emploi externes (LinkedIn, Indeed), ou un espace candidat plus riche pour un suivi encore plus détaillé de son parcours. Côté technique, la suite de tests automatisés — qui compte déjà 166 méthodes de test unitaires et de contrôleur (JUnit 5 / Mockito) — gagnerait à être complétée par des tests d’intégration couvrant les services et la base de données, des tests de bout en bout (par exemple Playwright ou Cypress) rejouant les parcours métier complets, et des tests front-end automatisés sur les composants Angular. Le jeu de référence de seize profils mobilisé pour calibrer le seuil de décision gagnerait à être enrichi de candidatures réelles annotées par les recruteurs, seul moyen d’obtenir une mesure de performance en conditions d’exploitation. Une chaîne d’intégration et de déploiement continus (CI/CD) ainsi qu’un déploiement sur une infrastructure cloud constitueraient des évolutions naturelles pour renforcer la fiabilité et la scalabilité de la plateforme sur le long terme.</w:t>
+        <w:t xml:space="preserve">Plusieurs pistes d’évolution restent ouvertes pour poursuivre ce travail. Côté fonctionnel, la plateforme pourrait accueillir un module d’analyse prédictive du taux de transformation des candidatures, une intégration plus poussée avec des plateformes d’emploi externes (LinkedIn, Indeed), ou un espace candidat plus riche pour un suivi encore plus détaillé de son parcours. Côté technique, la suite de tests automatisés — qui compte déjà 167 méthodes de test unitaires et de contrôleur (JUnit 5 / Mockito) — gagnerait à être complétée par des tests d’intégration couvrant les services et la base de données, des tests de bout en bout (par exemple Playwright ou Cypress) rejouant les parcours métier complets, et des tests front-end automatisés sur les composants Angular. Le jeu de référence de seize profils mobilisé pour calibrer le seuil de décision gagnerait à être enrichi de candidatures réelles annotées par les recruteurs, seul moyen d’obtenir une mesure de performance en conditions d’exploitation. Une chaîne d’intégration et de déploiement continus (CI/CD) ainsi qu’un déploiement sur une infrastructure cloud constitueraient des évolutions naturelles pour renforcer la fiabilité et la scalabilité de la plateforme sur le long terme.</w:t>
       </w:r>
     </w:p>
     <w:p>

</xml_diff>

<commit_message>
docs(rapport): captures du chapitre 4 et annexe A refaites sur l'app reelle
Les captures 4.1, 4.2, 4.3, 4.4, 4.5, 4.6, 4.10 et A.3 a A.5 ont ete
reprises sur l'application en fonctionnement, a 1280 px et defilement
remis a zero, avec les donnees du jeu de demonstration annonymise. Les
légendes et les paragraphes de description ont ete alignes sur ce que
l'ecran montre reellement (titre « Mon calendrier d'entretiens »,
historique d'audit, mention du destinataire gelé sur la ligne ROUTING),
et la pagination du chapitre 4 a ete retravaillee pour supprimer les
grandes zones vides. Rapport Word et PDF en phase, table des matieres
verifiee (131 entrees, 0 ecart), 82 pages.
</commit_message>
<xml_diff>
--- a/Rapport-PFE/finalreport/Rapport_PFE_Haythem_Bargaoui_beta.docx
+++ b/Rapport-PFE/finalreport/Rapport_PFE_Haythem_Bargaoui_beta.docx
@@ -2219,7 +2219,7 @@
       <w:r>
         <w:t>Bibliographie</w:t>
         <w:tab/>
-        <w:t>78</w:t>
+        <w:t>79</w:t>
       </w:r>
     </w:p>
     <w:p>
@@ -2237,7 +2237,7 @@
       <w:r>
         <w:t>Glossaire</w:t>
         <w:tab/>
-        <w:t>80</w:t>
+        <w:t>81</w:t>
       </w:r>
     </w:p>
     <w:p>
@@ -2626,7 +2626,7 @@
         </w:tabs>
       </w:pPr>
       <w:r>
-        <w:t xml:space="preserve">Figure 4.10 : Espace Manager — page « Mon calendrier », entretiens et rappels</w:t>
+        <w:t xml:space="preserve">Figure 4.10 : Espace Manager — page « Mon calendrier d’entretiens », prochaines sessions et rappels</w:t>
         <w:tab/>
         <w:t>55</w:t>
       </w:r>
@@ -2710,7 +2710,7 @@
         </w:tabs>
       </w:pPr>
       <w:r>
-        <w:t xml:space="preserve">Figure A.5 : Journal d’audit</w:t>
+        <w:t xml:space="preserve">Figure A.5 : Historique d’audit</w:t>
         <w:tab/>
         <w:t>74</w:t>
       </w:r>
@@ -2724,7 +2724,7 @@
       <w:r>
         <w:t xml:space="preserve">Figure A.6 : Soumission d’une candidature avec dépôt de CV</w:t>
         <w:tab/>
-        <w:t>74</w:t>
+        <w:t>75</w:t>
       </w:r>
     </w:p>
     <w:p>
@@ -2736,7 +2736,7 @@
       <w:r>
         <w:t xml:space="preserve">Figure A.7 : Espace Manager — candidatures relevant du périmètre du manager</w:t>
         <w:tab/>
-        <w:t>75</w:t>
+        <w:t>76</w:t>
       </w:r>
     </w:p>
     <w:p>
@@ -2748,7 +2748,7 @@
       <w:r>
         <w:t xml:space="preserve">Figure A.8 : Console n8n — les trois flux d’automatisation publiés et leurs statistiques</w:t>
         <w:tab/>
-        <w:t>76</w:t>
+        <w:t>77</w:t>
       </w:r>
     </w:p>
     <w:p>
@@ -2760,7 +2760,7 @@
       <w:r>
         <w:t xml:space="preserve">Figure A.9 : Flux n8n de l’Agent 1 — webhook de candidature, appel du scoring Cohere puis e-mail au candidat</w:t>
         <w:tab/>
-        <w:t>76</w:t>
+        <w:t>77</w:t>
       </w:r>
     </w:p>
     <w:p>
@@ -2772,7 +2772,7 @@
       <w:r>
         <w:t xml:space="preserve">Figure A.10 : E-mail automatique de confirmation de candidature reçu par le candidat</w:t>
         <w:tab/>
-        <w:t>77</w:t>
+        <w:t>78</w:t>
       </w:r>
     </w:p>
     <w:p>
@@ -3294,7 +3294,7 @@
     </w:p>
     <w:p>
       <w:r>
-        <w:t>Le développement du projet a été réparti en grandes phases sur toute la période de réalisation de ce Projet de Fin d’Études. Afin de concilier la souplesse de la démarche agile en sprints avec les jalons de suivi académiques et industriels, la macro-planification de ces phases est résumée dans le tableau suivant.</w:t>
+        <w:t xml:space="preserve">Le développement du projet a été réparti en grandes phases sur toute la période de réalisation de ce Projet de Fin d’Études. Afin de concilier la souplesse de la démarche agile en sprints avec les jalons de suivi académiques et industriels, la macro-planification de ces phases est résumée dans le tableau 1.1.</w:t>
       </w:r>
     </w:p>
     <w:p>
@@ -4537,7 +4537,7 @@
     </w:p>
     <w:p>
       <w:r>
-        <w:t>Le tableau ci-dessous précise, action par action, les rôles habilités — une répartition qui correspond exactement aux règles d’autorisation implémentées côté back-end.</w:t>
+        <w:t xml:space="preserve">Le tableau 2.1 précise, action par action, les rôles habilités — une répartition qui correspond exactement aux règles d’autorisation implémentées côté back-end.</w:t>
       </w:r>
     </w:p>
     <w:p>
@@ -6011,7 +6011,7 @@
     <w:p>
       <w:pPr/>
       <w:r>
-        <w:t xml:space="preserve">Afin d’éviter l’effet « toile d’araignée », le périmètre fonctionnel est d’abord présenté en vue macro ci-dessous (figure 2.2), puis décliné en trois sous-diagrammes par module (figures 2.3 à 2.5). L’authentification par jeton JWT, bien qu’obligatoire pour les espaces sécurisés, est représentée par un cas commun « S’authentifier » (la relation « include » n’est illustrée que sur quelques cas représentatifs) ; les relations d’inclusion pointent du cas principal vers le sous-cas requis, conformément à la norme UML [3], et le Candidat généralise le Visiteur.</w:t>
+        <w:t xml:space="preserve">Afin d’éviter l’effet « toile d’araignée », le périmètre fonctionnel est d’abord présenté en vue macro (figure 2.2), puis décliné en trois sous-diagrammes par module (figures 2.3 à 2.5). L’authentification par jeton JWT, bien qu’obligatoire pour les espaces sécurisés, est représentée par un cas commun « S’authentifier » (la relation « include » n’est illustrée que sur quelques cas représentatifs) ; les relations d’inclusion pointent du cas principal vers le sous-cas requis, conformément à la norme UML [3], et le Candidat généralise le Visiteur.</w:t>
       </w:r>
     </w:p>
     <w:p>
@@ -6635,7 +6635,7 @@
     <w:p>
       <w:pPr/>
       <w:r>
-        <w:t xml:space="preserve">Ce diagramme adopte une approche « boîte noire » stricte : il modélise uniquement les échanges entre l’acteur Candidat et le système JOB4YOU considéré comme un tout. Il met en évidence la requête de soumission du formulaire et le retour synchrone de confirmation (HTTP 201 Created), masquant à ce stade l’infrastructure interne et les traitements asynchrones, qui relèvent de la conception détaillée (section 3.4).</w:t>
+        <w:t xml:space="preserve">Le diagramme de la figure 2.6 adopte une approche « boîte noire » stricte : il modélise uniquement les échanges entre l’acteur Candidat et le système JOB4YOU considéré comme un tout. Il met en évidence la requête de soumission du formulaire et le retour synchrone de confirmation (HTTP 201 Created), masquant à ce stade l’infrastructure interne et les traitements asynchrones, qui relèvent de la conception détaillée (section 3.4).</w:t>
       </w:r>
     </w:p>
     <w:p>
@@ -6700,7 +6700,7 @@
     <w:p>
       <w:pPr/>
       <w:r>
-        <w:t xml:space="preserve">La plateforme cible une architecture distribuée par couches : un front-end Angular servi au navigateur, un back-end Spring Boot exposant des API REST sécurisées, une base PostgreSQL (SGBD) et une couche d’automatisation n8n chargée de la planification des entretiens (Google Calendar [10]) et de l’essentiel des notifications (SMTP) ; le back-end envoie toutefois ses propres courriels, via JavaMailSender, pour la réinitialisation du mot de passe et les rappels d’entretien. Il appelle aussi directement l’API de Cohere [11] (scoring IA) et l’API OpenRouter [12] (assistant conversationnel). Cette organisation physique est détaillée au chapitre 3 (figures 3.10 et 3.11) ; le tableau ci-dessous précise le rôle de chaque agent.</w:t>
+        <w:t xml:space="preserve">La plateforme cible une architecture distribuée par couches : un front-end Angular servi au navigateur, un back-end Spring Boot exposant des API REST sécurisées, une base PostgreSQL (SGBD) et une couche d’automatisation n8n chargée de la planification des entretiens (Google Calendar [10]) et de l’essentiel des notifications (SMTP) ; le back-end envoie toutefois ses propres courriels, via JavaMailSender, pour la réinitialisation du mot de passe et les rappels d’entretien. Il appelle aussi directement l’API de Cohere [11] (scoring IA) et l’API OpenRouter [12] (assistant conversationnel). Cette organisation physique est détaillée au chapitre 3 (figures 3.10 et 3.11) ; le tableau 2.3 précise le rôle de chaque agent.</w:t>
       </w:r>
     </w:p>
     <w:p>
@@ -7097,7 +7097,7 @@
     <w:p>
       <w:pPr/>
       <w:r>
-        <w:t xml:space="preserve">La figure suivante illustre l’organisation du back-end en paquetages (configuration, sécurité, contrôleurs, services, repositories, entités). L’organisation du front-end et les interactions avec les services externes sont décrites ensuite, puis détaillées aux sections 3.8 et 3.9.</w:t>
+        <w:t xml:space="preserve">La figure 3.1 illustre l’organisation du back-end en paquetages (configuration, sécurité, contrôleurs, services, repositories, entités). L’organisation du front-end et les interactions avec les services externes sont décrites ensuite, puis détaillées aux sections 3.8 et 3.9.</w:t>
       </w:r>
     </w:p>
     <w:p>
@@ -7161,7 +7161,7 @@
     <w:p>
       <w:pPr/>
       <w:r>
-        <w:t>La figure 3.2 ci-dessous donne une vue d’ensemble du modèle de données : les neuf entités métier principales de la plateforme, leurs attributs caractéristiques et les associations réellement mappées par JPA. Les deux figures suivantes en proposent des zooms thématiques — le recrutement (figure 3.2a), puis les utilisateurs, la sécurité et l’audit (figure 3.2b) — afin d’en conserver une lecture confortable.</w:t>
+        <w:t xml:space="preserve">La figure 3.2 donne une vue d’ensemble du modèle de données : les neuf entités métier principales de la plateforme, leurs attributs caractéristiques et les associations réellement mappées par JPA. Les deux figures suivantes en proposent des zooms thématiques — le recrutement (figure 3.2a), puis les utilisateurs, la sécurité et l’audit (figure 3.2b) — afin d’en conserver une lecture confortable.</w:t>
       </w:r>
     </w:p>
     <w:p>
@@ -7175,7 +7175,7 @@
           <w:noProof/>
         </w:rPr>
         <w:pict w14:anchorId="598E410F">
-          <v:shape id="Image 6" o:spid="_x0000_i1030" type="#_x0000_t75" style="visibility:visible;mso-wrap-style:square;visibility:visible;visibility:visible;width:339.5pt;height:514.2pt;visibility:visible">
+          <v:shape id="Image 6" o:spid="_x0000_i1030" type="#_x0000_t75" style="visibility:visible;mso-wrap-style:square;visibility:visible;visibility:visible;width:398.2pt;height:514.2pt;visibility:visible">
             <v:imagedata r:id="rId901" o:title=""/>
           </v:shape>
         </w:pict>
@@ -7344,7 +7344,7 @@
     <w:p>
       <w:pPr/>
       <w:r>
-        <w:t xml:space="preserve">Les quatre diagrammes qui suivent détaillent, au niveau objet, quatre étapes clés du processus de recrutement : la planification d’un entretien, la décision finale de recrutement, l’analyse IA du CV et le routage des managers.</w:t>
+        <w:t xml:space="preserve">Les quatre diagrammes des figures 3.4, 3.5, 3.6 et 3.7 détaillent, au niveau objet, quatre étapes clés du processus de recrutement : la planification d’un entretien, la décision finale de recrutement, l’analyse IA du CV et le routage des managers.</w:t>
       </w:r>
     </w:p>
     <w:p>
@@ -7369,7 +7369,7 @@
           <w:noProof/>
         </w:rPr>
         <w:pict w14:anchorId="259C4FBE">
-          <v:shape id="Image 7" o:spid="_x0000_i1031" type="#_x0000_t75" style="visibility:visible;mso-wrap-style:square;width:453.3pt;height:299.5pt;visibility:visible">
+          <v:shape id="Image 7" o:spid="_x0000_i1031" type="#_x0000_t75" style="visibility:visible;mso-wrap-style:square;width:453.3pt;height:387.0pt;visibility:visible">
             <v:imagedata r:id="rId17" o:title=""/>
           </v:shape>
         </w:pict>
@@ -7419,7 +7419,7 @@
           <w:noProof/>
         </w:rPr>
         <w:pict w14:anchorId="52C8B92C">
-          <v:shape id="Image 8" o:spid="_x0000_i1032" type="#_x0000_t75" style="visibility:visible;mso-wrap-style:square;visibility:visible;width:453.3pt;height:441.5pt">
+          <v:shape id="Image 8" o:spid="_x0000_i1032" type="#_x0000_t75" style="visibility:visible;mso-wrap-style:square;visibility:visible;width:453.3pt;height:463.2pt">
             <v:imagedata r:id="rId18" o:title=""/>
           </v:shape>
         </w:pict>
@@ -7475,7 +7475,7 @@
           <w:noProof/>
         </w:rPr>
         <w:pict w14:anchorId="7537B395">
-          <v:shape id="Picture 1" o:spid="_x0000_i1033" type="#_x0000_t75" style="visibility:visible;mso-wrap-style:square;visibility:visible;width:668.0pt;height:438.5pt;visibility:visible">
+          <v:shape id="Picture 1" o:spid="_x0000_i1033" type="#_x0000_t75" style="visibility:visible;mso-wrap-style:square;visibility:visible;width:672.0pt;height:460.4pt;visibility:visible">
             <v:imagedata r:id="rId19" o:title=""/>
           </v:shape>
         </w:pict>
@@ -7529,7 +7529,7 @@
           <w:noProof/>
         </w:rPr>
         <w:pict w14:anchorId="2E8BE8D4">
-          <v:shape id="Picture 2" o:spid="_x0000_i1034" type="#_x0000_t75" style="visibility:visible;mso-wrap-style:square;visibility:visible;width:427.8pt;height:290.0pt;visibility:visible">
+          <v:shape id="Picture 2" o:spid="_x0000_i1034" type="#_x0000_t75" style="visibility:visible;mso-wrap-style:square;visibility:visible;width:397.4pt;height:290.0pt;visibility:visible">
             <v:imagedata r:id="rId20" o:title=""/>
           </v:shape>
         </w:pict>
@@ -7578,7 +7578,7 @@
         </w:sectPr>
       </w:pPr>
       <w:r>
-        <w:t>Tout au long du processus de recrutement, le statut d’un candidat évolue selon une machine à états précise, représentée ci-dessous. Cette modélisation garantit la cohérence des transitions et sert de référence pour l’implémentation des contrôles métier côté back-end.</w:t>
+        <w:t xml:space="preserve">Tout au long du processus de recrutement, le statut d’un candidat évolue selon une machine à états précise, représentée à la figure 3.8. Le diagramme ne dessine que les transitions les plus représentatives ; les autres transitions autorisées par le garde-fou métier sont détaillées dans le reste de cette section. Cette modélisation garantit la cohérence des transitions et sert de référence pour l’implémentation des contrôles métier côté back-end.</w:t>
       </w:r>
     </w:p>
     <w:p>
@@ -7592,7 +7592,7 @@
           <w:noProof/>
         </w:rPr>
         <w:pict w14:anchorId="51AEDC00">
-          <v:shape id="Image 9" o:spid="_x0000_i1035" type="#_x0000_t75" style="visibility:visible;mso-wrap-style:square;visibility:visible;visibility:visible;width:453.3pt;height:557.5pt">
+          <v:shape id="Image 9" o:spid="_x0000_i1035" type="#_x0000_t75" style="visibility:visible;mso-wrap-style:square;visibility:visible;visibility:visible;width:370.8pt;height:520.0pt">
             <v:imagedata r:id="rId21" o:title=""/>
           </v:shape>
         </w:pict>
@@ -7688,7 +7688,7 @@
         </w:sectPr>
       </w:pPr>
       <w:r>
-        <w:t>Le schéma relationnel ci-dessous présente l’ensemble des tables générées à partir des entités JPA, avec les clés primaires et étrangères qui matérialisent les relations décrites ci-dessus.</w:t>
+        <w:t xml:space="preserve">Le schéma relationnel de la figure 3.9 présente l’ensemble des tables générées à partir des entités JPA, avec les clés primaires et étrangères qui matérialisent les relations décrites plus haut.</w:t>
       </w:r>
     </w:p>
     <w:p>
@@ -7702,7 +7702,7 @@
           <w:noProof/>
         </w:rPr>
         <w:pict w14:anchorId="302CA6EE">
-          <v:shape id="Image 10" o:spid="_x0000_i1036" type="#_x0000_t75" style="visibility:visible;mso-wrap-style:square;visibility:visible;width:727.3pt;height:450.0pt;visibility:visible">
+          <v:shape id="Image 10" o:spid="_x0000_i1036" type="#_x0000_t75" style="visibility:visible;mso-wrap-style:square;visibility:visible;width:769.9pt;height:426.1pt;visibility:visible">
             <v:imagedata r:id="rId22" o:title=""/>
           </v:shape>
         </w:pict>
@@ -7745,7 +7745,7 @@
     <w:p>
       <w:pPr/>
       <w:r>
-        <w:t xml:space="preserve">Le diagramme ci-dessous détaille l’organisation de la plateforme en composants logiciels (front-end Angular et back-end Spring Boot), ainsi que leurs dépendances.</w:t>
+        <w:t xml:space="preserve">Le diagramme de la figure 3.10 détaille l’organisation de la plateforme en composants logiciels (front-end Angular et back-end Spring Boot), ainsi que leurs dépendances.</w:t>
       </w:r>
     </w:p>
     <w:p>
@@ -7806,7 +7806,7 @@
     <w:p>
       <w:pPr/>
       <w:r>
-        <w:t>Le diagramme suivant représente la répartition physique des composants de la plateforme JOB4YOU sur les nœuds d’exécution, ainsi que leurs protocoles de communication.</w:t>
+        <w:t xml:space="preserve">Le diagramme de la figure 3.11 représente la répartition physique des composants de la plateforme JOB4YOU sur les nœuds d’exécution, ainsi que leurs protocoles de communication.</w:t>
       </w:r>
     </w:p>
     <w:p>
@@ -7817,7 +7817,7 @@
       </w:pPr>
       <w:r>
         <w:pict w14:anchorId="44715DEE">
-          <v:shape id="_x0000_i1037" type="#_x0000_t75" style="visibility:visible;mso-wrap-style:square;width:453.3pt;height:313.7pt;visibility:visible">
+          <v:shape id="_x0000_i1037" type="#_x0000_t75" style="visibility:visible;mso-wrap-style:square;width:453.3pt;height:314.4pt;visibility:visible">
             <v:imagedata r:id="rId23" o:title="image15"/>
           </v:shape>
         </w:pict>
@@ -8083,7 +8083,7 @@
     <w:p>
       <w:pPr/>
       <w:r>
-        <w:t>Cette section présente une sélection des interfaces principales, illustrant les fonctionnalités clés de la plateforme JOB4YOU pour chacun des profils d’utilisateurs.</w:t>
+        <w:t xml:space="preserve">Cette section présente une sélection des interfaces principales (figures 4.1 à 4.12), illustrant les fonctionnalités clés de la plateforme JOB4YOU pour chacun des profils d’utilisateurs.</w:t>
       </w:r>
     </w:p>
     <w:p>
@@ -8096,7 +8096,7 @@
           <w:noProof/>
         </w:rPr>
         <w:pict w14:anchorId="650581FA">
-          <v:shape id="Image 13" o:spid="_x0000_i1040" type="#_x0000_t75" style="width:425.0pt;height:299.4pt;visibility:visible;mso-wrap-style:square">
+          <v:shape id="Image 13" o:spid="_x0000_i1040" type="#_x0000_t75" style="width:453.3pt;height:275.5pt;visibility:visible;mso-wrap-style:square">
             <v:imagedata r:id="rId26" o:title=""/>
           </v:shape>
         </w:pict>
@@ -8120,7 +8120,7 @@
     </w:p>
     <w:p>
       <w:r>
-        <w:t>Accessible sans authentification, la page d’accueil permet à tout visiteur de rechercher une offre par mot-clé et par localisation, et met en avant les offres publiées les plus récentes.</w:t>
+        <w:t>Accessible sans authentification, la page d’accueil de la figure 4.1 propose un cartouche de « Recherche rapide » par mot-clé et par localisation et présente, sous le titre « Offres en vedette » — « Découvrez les dernières opportunités professionnelles » —, les offres les plus récemment publiées : chaque carte porte l’intitulé du poste, son type de contrat, son lieu, sa date de publication, un extrait de la description et un bouton « Voir les détails ».</w:t>
       </w:r>
     </w:p>
     <w:p>
@@ -8141,7 +8141,7 @@
           <w:noProof/>
         </w:rPr>
         <w:pict w14:anchorId="1EEBD083">
-          <v:shape id="Image 15" o:spid="_x0000_i1042" type="#_x0000_t75" style="width:425.0pt;height:236.5pt;visibility:visible;mso-wrap-style:square">
+          <v:shape id="Image 15" o:spid="_x0000_i1042" type="#_x0000_t75" style="width:453.3pt;height:226.7pt;visibility:visible;mso-wrap-style:square">
             <v:imagedata r:id="rId28" o:title=""/>
           </v:shape>
         </w:pict>
@@ -8165,7 +8165,7 @@
     </w:p>
     <w:p>
       <w:r>
-        <w:t xml:space="preserve">Le Responsable RH crée, modifie et suit ici le statut de chaque offre d’emploi (active, fermée, expirée) ; la bascule en « expirée » se fait automatiquement une fois la date limite dépassée.</w:t>
+        <w:t xml:space="preserve">Comme le montre la figure 4.2, le responsable RH crée, modifie et suit le statut de chaque offre depuis une table filtrable par mot-clé, par statut et par type de contrat, avec un accès direct à la consultation, à la modification et à la suppression ; la bascule en « expirée » se fait automatiquement une fois la date limite dépassée.</w:t>
       </w:r>
     </w:p>
     <w:p>
@@ -8178,7 +8178,7 @@
           <w:noProof/>
         </w:rPr>
         <w:pict w14:anchorId="131B476D">
-          <v:shape id="Image 16" o:spid="_x0000_i1043" type="#_x0000_t75" style="width:420pt;height:249.6pt;visibility:visible;mso-wrap-style:square">
+          <v:shape id="Image 16" o:spid="_x0000_i1043" type="#_x0000_t75" style="width:453.3pt;height:226.7pt;visibility:visible;mso-wrap-style:square">
             <v:imagedata r:id="rId29" o:title=""/>
           </v:shape>
         </w:pict>
@@ -8202,15 +8202,15 @@
     </w:p>
     <w:p>
       <w:r>
-        <w:t>Pour chaque dossier, la liste des candidats affiche le statut courant, le score calculé par l’agent IA, ainsi qu’un ensemble d’actions rapides (changement de statut, envoi d’e-mail, consultation, suppression).</w:t>
-      </w:r>
-    </w:p>
-    <w:p>
-      <w:r>
-        <w:t xml:space="preserve">Le RH corrige ici les informations d’un candidat (coordonnées, lettre de motivation, statut, offre associée) via le formulaire de modification ; la fiche de consultation associée regroupe le CV, l’analyse IA détaillée (scores technique, communication, adéquation séniorité) et l’historique des actions des agents n8n sur ce dossier.</w:t>
-      </w:r>
-      <w:r>
-        <w:t xml:space="preserve"> Sa capture est reprise en annexe A (figure A.2).</w:t>
+        <w:t>La figure 4.3 reproduit la liste des dossiers de l’espace RH : pour chacun d’eux apparaissent le contact, l’offre visée, le statut courant du processus, le score calculé par l’agent IA — coloré selon son niveau — et les actions rapides (téléchargement du CV, modification, consultation, envoi d’e-mail, suppression). Le bandeau supérieur donne l’état du vivier en un coup d’œil (à valider, rejetés, retirés, embauchés).</w:t>
+      </w:r>
+    </w:p>
+    <w:p>
+      <w:r>
+        <w:t xml:space="preserve">Le formulaire de modification, reproduit en figure A.2 (annexe A), permet de corriger les informations d’un candidat (coordonnées, lettre de motivation, statut, offre associée) ; la fiche de consultation associée regroupe le CV, l’analyse IA détaillée (scores technique, communication, adéquation séniorité) et l’historique des actions des agents n8n sur ce dossier.</w:t>
+      </w:r>
+      <w:r>
+        <w:t xml:space="preserve"/>
       </w:r>
     </w:p>
     <w:p>
@@ -8223,7 +8223,7 @@
           <w:noProof/>
         </w:rPr>
         <w:pict w14:anchorId="3DE79FED">
-          <v:shape id="Image 18" o:spid="_x0000_i1045" type="#_x0000_t75" style="width:425.0pt;height:264.5pt;visibility:visible;mso-wrap-style:square">
+          <v:shape id="Image 18" o:spid="_x0000_i1045" type="#_x0000_t75" style="width:453.3pt;height:226.7pt;visibility:visible;mso-wrap-style:square">
             <v:imagedata r:id="rId31" o:title=""/>
           </v:shape>
         </w:pict>
@@ -8247,23 +8247,23 @@
     </w:p>
     <w:p>
       <w:r>
-        <w:t xml:space="preserve">Le tableau Kanban donne une vue synthétique et interactive de toutes les candidatures réparties par statut ; glisser une carte d’une colonne à une autre déclenche automatiquement la mise à jour du statut, sous réserve des garde-fous métier décrits au chapitre 3 pour les décisions finales.</w:t>
-      </w:r>
-    </w:p>
-    <w:p>
-      <w:r>
-        <w:t>On planifie, filtre et suit ici les entretiens (type, date, interviewer, statut), avec des actions contextuelles comme le démarrage, l’annulation, la reprogrammation ou l’ajout d’un feedback une fois l’entretien terminé.</w:t>
-      </w:r>
-      <w:r>
-        <w:t xml:space="preserve"> Sa capture est reprise en annexe A (figure A.3).</w:t>
-      </w:r>
-    </w:p>
-    <w:p>
-      <w:r>
-        <w:t>Les feedbacks saisis par les managers sont centralisés ici, avec une étape de validation par le RH avant transmission au candidat.</w:t>
-      </w:r>
-      <w:r>
-        <w:t xml:space="preserve"> Sa capture est reprise en annexe A (figure A.4).</w:t>
+        <w:t xml:space="preserve">Le tableau Kanban de la figure 4.4, intitulé « Pipeline de recrutement », donne une vue synthétique et interactive de toutes les candidatures réparties par statut : chaque colonne porte le nombre de dossiers qu’elle contient et chaque carte le nom du candidat, l’offre visée et son score IA. Toutes les colonnes ne tenant pas à l’écran, le tableau se fait défiler horizontalement. Glisser une carte d’une colonne à une autre déclenche automatiquement la mise à jour du statut, sous réserve des garde-fous métier décrits au chapitre 3 pour les décisions finales.</w:t>
+      </w:r>
+    </w:p>
+    <w:p>
+      <w:r>
+        <w:t>L’écran de gestion des entretiens, reproduit en figure A.3 (annexe A), permet de planifier, filtrer et suivre les entretiens par candidat, offre, type, interviewer et statut, avec des actions contextuelles comme le démarrage, l’annulation, la reprogrammation ou l’ajout d’un feedback une fois l’entretien terminé.</w:t>
+      </w:r>
+      <w:r>
+        <w:t xml:space="preserve"/>
+      </w:r>
+    </w:p>
+    <w:p>
+      <w:r>
+        <w:t>La figure A.4 (annexe A) centralise les feedbacks saisis par les managers, notés de 1 à 5 étoiles et assortis d’un commentaire, avec une étape de validation par le RH avant transmission au candidat.</w:t>
+      </w:r>
+      <w:r>
+        <w:t xml:space="preserve"/>
       </w:r>
     </w:p>
     <w:p>
@@ -8276,7 +8276,7 @@
           <w:noProof/>
         </w:rPr>
         <w:pict w14:anchorId="1C64D113">
-          <v:shape id="Image 21" o:spid="_x0000_i1048" type="#_x0000_t75" style="width:425.0pt;height:240.2pt;visibility:visible;mso-wrap-style:square">
+          <v:shape id="Image 21" o:spid="_x0000_i1048" type="#_x0000_t75" style="width:453.3pt;height:245.5pt;visibility:visible;mso-wrap-style:square">
             <v:imagedata r:id="rId34" o:title=""/>
           </v:shape>
         </w:pict>
@@ -8300,7 +8300,7 @@
     </w:p>
     <w:p>
       <w:r>
-        <w:t>L’administrateur y gère l’ensemble des comptes de la plateforme, leurs rôles, ainsi que leur rattachement à un département ou une famille de métier.</w:t>
+        <w:t>L’écran de la figure 4.5 permet à l’administrateur de gérer l’ensemble des comptes de la plateforme et leurs rôles — un même compte pouvant en cumuler plusieurs —, ainsi que leur rattachement à un département ou, à défaut pour un manager, à une famille de métier.</w:t>
       </w:r>
     </w:p>
     <w:p>
@@ -8313,7 +8313,7 @@
           <w:noProof/>
         </w:rPr>
         <w:pict w14:anchorId="30680820">
-          <v:shape id="Image 22" o:spid="_x0000_i1049" type="#_x0000_t75" style="width:425.0pt;height:278.5pt;visibility:visible;mso-wrap-style:square">
+          <v:shape id="Image 22" o:spid="_x0000_i1049" type="#_x0000_t75" style="width:453.3pt;height:247.9pt;visibility:visible;mso-wrap-style:square">
             <v:imagedata r:id="rId35" o:title=""/>
           </v:shape>
         </w:pict>
@@ -8337,15 +8337,15 @@
     </w:p>
     <w:p>
       <w:r>
-        <w:t>Réservée à l’administrateur, cette interface permet d’ajuster la pondération (technique / communication / séniorité) que l’agent IA utilise pour calculer le score de chaque candidature, selon la famille de métier et le niveau de séniorité de l’offre.</w:t>
-      </w:r>
-    </w:p>
-    <w:p>
-      <w:r>
-        <w:t>Le journal d’audit trace tous les changements de statut significatifs, initiés manuellement par un utilisateur ou automatiquement par le système (agents n8n), ce qui garantit la traçabilité de chaque décision prise sur un dossier.</w:t>
-      </w:r>
-      <w:r>
-        <w:t xml:space="preserve"> Sa capture est reprise en annexe A (figure A.5).</w:t>
+        <w:t>Réservé à l’administrateur, l’écran de la figure 4.6 permet d’ajuster, pour chaque famille de métier et chaque niveau de séniorité, la pondération technique / communication / séniorité utilisée par l’agent IA pour calculer le score d’une candidature ; une colonne de contrôle vérifie avant l’enregistrement que les trois poids somment bien à 100 %.</w:t>
+      </w:r>
+    </w:p>
+    <w:p>
+      <w:r>
+        <w:t>L’historique d’audit reproduit en figure A.5 (annexe A) trace tous les changements significatifs d’un dossier — statut, score, routage vers un manager, contre-signature de la décision finale — en précisant la date, l’entité concernée, la nature de l’action, la valeur précédente, la nouvelle valeur et l’auteur de la modification, qu’elle soit initiée manuellement par un utilisateur ou automatiquement par le système (agents n8n) ; la ligne ROUTING y rappelle le manager destinataire et l’origine de l’aiguillage, ce qui garantit la traçabilité de chaque décision prise sur un dossier.</w:t>
+      </w:r>
+      <w:r>
+        <w:t xml:space="preserve"/>
       </w:r>
     </w:p>
     <w:p>
@@ -8364,7 +8364,7 @@
           <w:noProof/>
         </w:rPr>
         <w:pict w14:anchorId="580FE8B9">
-          <v:shape id="Picture 5" o:spid="_x0000_i1052" type="#_x0000_t75" style="visibility:visible;mso-wrap-style:square;width:387.8pt;height:522.8pt;visibility:visible">
+          <v:shape id="Picture 5" o:spid="_x0000_i1052" type="#_x0000_t75" style="visibility:visible;mso-wrap-style:square;width:363.5pt;height:490.0pt;visibility:visible">
             <v:imagedata r:id="rId900" o:title=""/>
           </v:shape>
         </w:pict>
@@ -8388,15 +8388,15 @@
     </w:p>
     <w:p>
       <w:r>
-        <w:t xml:space="preserve">Disponible uniquement pour un candidat authentifié, ce widget flottant permet de poser des questions en langage naturel sur le suivi de ses propres candidatures ou sur le fonctionnement général de la plateforme (offres, Job idéal, retrait de candidature, etc.). Les réponses sont générées par un modèle de raisonnement (z-ai/glm-5.3-flash, via l’API OpenRouter) à partir d’un contexte constitué côté serveur par une liste blanche de champs : intitulé du poste, libellé du statut, date de candidature, entretiens et, le cas échéant, les feedbacks explicitement transmis au candidat. Les champs internes (score et résumé générés par l’agent de scoring, correction manuelle du RH, identité de l’intervieweur, notes internes d’entretien) n’entrent pas dans cette liste et ne quittent donc pas le back-end vers le prompt ; ce filtre structurel, complété par les consignes du message système, a été vérifié sur les scénarios testés, y compris une tentative d’injection de prompt.</w:t>
-      </w:r>
-    </w:p>
-    <w:p>
-      <w:r>
-        <w:t xml:space="preserve">Un candidat connecté postule directement depuis une offre : le formulaire pré-remplit son e-mail de compte, valide le format du CV (PDF, DOC, DOCX) et confirme visuellement la sélection avant l’envoi. C’est ce dépôt qui déclenche la chaîne décrite en section 3.5.3 (extraction du texte par l’agent n8n, analyse par l’API de Cohere appelée par le back-end, score automatique).</w:t>
-      </w:r>
-      <w:r>
-        <w:t xml:space="preserve"> Sa capture est reprise en annexe A (figure A.6).</w:t>
+        <w:t xml:space="preserve">Disponible uniquement pour un candidat authentifié, le widget de la figure 4.7 permet de poser des questions en langage naturel sur le suivi de ses propres candidatures ou sur le fonctionnement général de la plateforme (offres, Job idéal, retrait de candidature, etc.). Les réponses sont générées par un modèle de raisonnement (z-ai/glm-5.3-flash, via l’API OpenRouter) à partir d’un contexte constitué côté serveur par une liste blanche de champs : intitulé du poste, libellé du statut, date de candidature, entretiens et, le cas échéant, les feedbacks explicitement transmis au candidat. Les champs internes (score et résumé générés par l’agent de scoring, correction manuelle du RH, identité de l’intervieweur, notes internes d’entretien) n’entrent pas dans cette liste et ne quittent donc pas le back-end vers le prompt ; ce filtre structurel, complété par les consignes du message système, a été vérifié sur les scénarios testés, y compris une tentative d’injection de prompt.</w:t>
+      </w:r>
+    </w:p>
+    <w:p>
+      <w:r>
+        <w:t xml:space="preserve">La figure A.6 (annexe A) montre un candidat connecté postulant directement depuis une offre : le formulaire pré-remplit son e-mail de compte, valide le format du CV (PDF, DOC, DOCX) et confirme visuellement la sélection avant l’envoi. C’est ce dépôt qui déclenche la chaîne décrite en section 3.5.3 (extraction du texte par l’agent n8n, analyse par l’API de Cohere appelée par le back-end, score automatique).</w:t>
+      </w:r>
+      <w:r>
+        <w:t xml:space="preserve"/>
       </w:r>
     </w:p>
     <w:p>
@@ -8433,7 +8433,7 @@
     </w:p>
     <w:p>
       <w:r>
-        <w:t xml:space="preserve">Sans postuler à une offre précise, un visiteur ou un candidat dépose son CV et reçoit une liste des offres actives classées par pourcentage de compatibilité, calculé par l’API de Cohere (badge « Analyse IA (Cohere) », avec repli automatique sur un classement par mots-clés si l’IA est indisponible).</w:t>
+        <w:t xml:space="preserve">Comme l’illustre la figure 4.8, un visiteur ou un candidat qui ne postule à aucune offre précise peut déposer son CV et recevoir une liste des offres actives classées par pourcentage de compatibilité, calculée par l’API de Cohere (badge « Analyse IA (Cohere) », avec repli automatique sur un classement par mots-clés si l’IA est indisponible).</w:t>
       </w:r>
     </w:p>
     <w:p>
@@ -8446,7 +8446,7 @@
           <w:noProof/>
         </w:rPr>
         <w:pict w14:anchorId="6E2178D7">
-          <v:shape id="Picture 9" o:spid="_x0000_i1053" type="#_x0000_t75" style="visibility:visible;mso-wrap-style:square;width:284.2pt;height:470.0pt;visibility:visible">
+          <v:shape id="Picture 9" o:spid="_x0000_i1053" type="#_x0000_t75" style="visibility:visible;mso-wrap-style:square;width:332.0pt;height:300.0pt;visibility:visible">
             <v:imagedata r:id="rId39" o:title=""/>
           </v:shape>
         </w:pict>
@@ -8470,17 +8470,17 @@
     </w:p>
     <w:p>
       <w:r>
-        <w:t xml:space="preserve">Au-delà du score global visible en liste (Figure 4.3), le détail d’un dossier expose la répartition par critère — technique, communication, adéquation séniorité — ainsi que, le cas échéant, la correction manuelle appliquée par un RH avec sa justification, conformément au principe de contrôle humain décrit en section 4.6.</w:t>
-      </w:r>
-    </w:p>
-    <w:p>
-      <w:r>
-        <w:t xml:space="preserve">Un manager ne voit que les candidatures relevant de son périmètre — la liste des destinataires gelée sur le dossier au moment de sa transmission, résolue par ManagerRoutingService puis lue par ManagerScopeService (section 3.5.4) —, à partir de leur entrée en évaluation technique (statut TECHNICAL_TEST), et non dès la validation du CV par le RH. Cette vue cloisonnée est distincte de la liste globale accessible au RH et à l’administrateur (Figure 4.3). Sa capture est reprise en annexe A (figure A.7).</w:t>
-      </w:r>
-    </w:p>
-    <w:p>
-      <w:r>
-        <w:t xml:space="preserve">Le manager dispose en outre d’une page « Mon calendrier » qui centralise les entretiens dont il est l’intervieweur : prochaine session, lien de visioconférence, répartition par statut et vue mensuelle, avec un rappel automatique planifié deux heures avant chaque entretien. Chaque événement de la grille ouvre une fenêtre de détail (candidat, poste, format, date et heure, durée, lieu, notes, lien de connexion) ; le lien Google Meet y est présenté à part, derrière un bouton explicite « Rejoindre l’entretien », et non sur la carte elle-même, pour qu’une simple consultation du planning ne déclenche pas d’appel visio vers le candidat. Lorsque le lien n’a pas encore été produit par l’agent de planification, la fenêtre l’indique au lieu d’afficher un bouton sans effet.</w:t>
+        <w:t xml:space="preserve">Le détail d’une candidature, reproduit en figure 4.9, expose, au-delà du score global visible en liste (figure 4.3), la répartition par critère — technique, communication, adéquation séniorité —, le bouton « Corriger le score » et, le cas échéant, la correction manuelle appliquée par un RH avec sa justification, conformément au principe de contrôle humain décrit en section 4.6. Y figurent également les notes internes, réservées aux rôles RH et administrateur, et l’activité des agents n8n sur le dossier.</w:t>
+      </w:r>
+    </w:p>
+    <w:p>
+      <w:r>
+        <w:t xml:space="preserve">Un manager ne voit que les candidatures relevant de son périmètre — la liste des destinataires gelée sur le dossier au moment de sa transmission, résolue par ManagerRoutingService puis lue par ManagerScopeService (section 3.5.4) —, à partir de leur entrée en évaluation technique (statut TECHNICAL_TEST), et non dès la validation du CV par le RH. Cette vue cloisonnée est distincte de la liste globale accessible au RH et à l’administrateur (figure 4.3) ; la figure A.7 (annexe A) en montre un exemple.</w:t>
+      </w:r>
+    </w:p>
+    <w:p>
+      <w:r>
+        <w:t xml:space="preserve">Le manager dispose en outre d’une page « Mon calendrier d’entretiens » qui centralise les entretiens dont il est l’intervieweur : ses prochaines sessions avec le lien de visioconférence, l’encart consacré aux rappels et la vue mensuelle ; un rappel automatique y est annoncé deux heures avant chaque entretien. Chaque événement de la grille ouvre une fenêtre de détail (candidat, poste, format, date et heure, durée, lieu, notes, lien de connexion) ; le lien Google Meet y est présenté à part, derrière un bouton explicite « Rejoindre l’entretien », et non sur la carte elle-même, pour qu’une simple consultation du planning ne déclenche pas d’appel visio vers le candidat. Lorsque le lien n’a pas encore été produit par l’agent de planification, la fenêtre l’indique au lieu d’afficher un bouton sans effet.</w:t>
       </w:r>
     </w:p>
     <w:p>
@@ -8493,7 +8493,7 @@
           <w:noProof/>
         </w:rPr>
         <w:pict w14:anchorId="1ABB31E4">
-          <v:shape id="Picture 17" o:spid="_x0000_i1060" type="#_x0000_t75" style="visibility:visible;mso-wrap-style:square;width:425.0pt;height:295.4pt">
+          <v:shape id="Picture 17" o:spid="_x0000_i1060" type="#_x0000_t75" style="visibility:visible;mso-wrap-style:square;width:453.3pt;height:347.1pt">
             <v:imagedata r:id="rId902" o:title=""/>
           </v:shape>
         </w:pict>
@@ -8512,7 +8512,7 @@
           <w:i/>
           <w:sz w:val="21"/>
         </w:rPr>
-        <w:t xml:space="preserve">Figure 4.10 : Espace Manager — page « Mon calendrier », entretiens et rappels</w:t>
+        <w:t xml:space="preserve">Figure 4.10 : Espace Manager — page « Mon calendrier d’entretiens », prochaines sessions et rappels</w:t>
       </w:r>
     </w:p>
     <w:p>
@@ -8527,7 +8527,7 @@
     </w:p>
     <w:p>
       <w:r>
-        <w:t xml:space="preserve">Côté candidat, la notification produite par ce flux arrive bien dans sa boîte de réception (figure A.10, en annexe) : accusé de réception nominatif pour le poste visé, score d’analyse IA obtenu et horodatage du traitement, avec la mention d’envoi automatique par n8n.</w:t>
+        <w:t xml:space="preserve">Côté candidat, la notification produite par ce flux arrive bien dans sa boîte de réception (figure A.10, en annexe) : accusé de réception nominatif pour le poste visé, score d’analyse IA obtenu et horodatage du traitement, avec la mention « Cet email a été envoyé automatiquement par la plateforme JOB4YOU ».</w:t>
       </w:r>
     </w:p>
     <w:p>
@@ -8564,7 +8564,7 @@
     </w:p>
     <w:p>
       <w:r>
-        <w:t xml:space="preserve">La date de présentation est obligatoire ; elle alimente l’e-mail de convocation.</w:t>
+        <w:t xml:space="preserve">La modale de la figure 4.11 : le RH contre-signe l’avis favorable du manager avant l’embauche ; la date de présentation y est obligatoire, car elle alimente l’e-mail de convocation.</w:t>
       </w:r>
     </w:p>
     <w:p>
@@ -8601,7 +8601,7 @@
     </w:p>
     <w:p>
       <w:r>
-        <w:t xml:space="preserve">Le motif est obligatoire ; il alimente l’e-mail de refus final.</w:t>
+        <w:t xml:space="preserve">La modale « Confirmer le refus » de la figure 4.12 : le RH contre-signe le refus proposé par le manager ; le motif y est obligatoire, car il alimente l’e-mail de refus final.</w:t>
       </w:r>
     </w:p>
     <w:p>
@@ -12211,7 +12211,7 @@
           <w:noProof/>
         </w:rPr>
         <w:pict w14:anchorId="61C2271E">
-          <v:shape id="Image 19" o:spid="_x0000_i1046" type="#_x0000_t75" style="width:425.0pt;height:244.0pt;visibility:visible;mso-wrap-style:square">
+          <v:shape id="Image 19" o:spid="_x0000_i1046" type="#_x0000_t75" style="width:453.3pt;height:290.4pt;visibility:visible;mso-wrap-style:square">
             <v:imagedata r:id="rId32" o:title=""/>
           </v:shape>
         </w:pict>
@@ -12243,7 +12243,7 @@
           <w:noProof/>
         </w:rPr>
         <w:pict w14:anchorId="4A63A72C">
-          <v:shape id="Image 20" o:spid="_x0000_i1047" type="#_x0000_t75" style="width:425.0pt;height:235.5pt;visibility:visible;mso-wrap-style:square">
+          <v:shape id="Image 20" o:spid="_x0000_i1047" type="#_x0000_t75" style="width:453.3pt;height:290.4pt;visibility:visible;mso-wrap-style:square">
             <v:imagedata r:id="rId33" o:title=""/>
           </v:shape>
         </w:pict>
@@ -12275,7 +12275,7 @@
           <w:noProof/>
         </w:rPr>
         <w:pict w14:anchorId="66625CE5">
-          <v:shape id="Image 23" o:spid="_x0000_i1050" type="#_x0000_t75" style="width:425.0pt;height:245.2pt;visibility:visible;mso-wrap-style:square">
+          <v:shape id="Image 23" o:spid="_x0000_i1050" type="#_x0000_t75" style="width:453.3pt;height:290.4pt;visibility:visible;mso-wrap-style:square">
             <v:imagedata r:id="rId36" o:title=""/>
           </v:shape>
         </w:pict>
@@ -12294,7 +12294,7 @@
           <w:i/>
           <w:sz w:val="21"/>
         </w:rPr>
-        <w:t xml:space="preserve">Figure A.5 : Journal d’audit</w:t>
+        <w:t xml:space="preserve">Figure A.5 : Historique d’audit</w:t>
       </w:r>
     </w:p>
     <w:p>

</xml_diff>

<commit_message>
docs(rapport): annexe A fusionnee dans le 4.3 range par acteur
L'annexe A disparait : ses dix captures rejoignent la section 4.3, decoupee en
cinq sous-parties (public et candidat, RH, manager, administrateur, automatisation
n8n) qui suivent l'organisation des exemples de rapports PFE. Vingt-deux figures
renumerotees, liste des figures et table des matières recalculées, references
croisees reecrites. La capture du calendrier manager (figure 4.16) montre desormais
les entretiens passes et l'acces direct a l'avis. Blocs de capture resserrés :
79 pages au lieu de 82.
</commit_message>
<xml_diff>
--- a/Rapport-PFE/finalreport/Rapport_PFE_Haythem_Bargaoui_beta.docx
+++ b/Rapport-PFE/finalreport/Rapport_PFE_Haythem_Bargaoui_beta.docx
@@ -1774,6 +1774,96 @@
     </w:p>
     <w:p>
       <w:pPr>
+        <w:pStyle w:val="TM3"/>
+        <w:tabs>
+          <w:tab w:val="right" w:leader="dot" w:pos="9066"/>
+        </w:tabs>
+        <w:rPr>
+          <w:rFonts w:ascii="Aptos" w:eastAsia="Times New Roman" w:hAnsi="Aptos"/>
+          <w:noProof/>
+          <w:lang w:eastAsia="fr-FR"/>
+        </w:rPr>
+      </w:pPr>
+      <w:r>
+        <w:t>4.3.1 Accès public et espace candidat</w:t>
+        <w:tab/>
+        <w:t>49</w:t>
+      </w:r>
+    </w:p>
+    <w:p>
+      <w:pPr>
+        <w:pStyle w:val="TM3"/>
+        <w:tabs>
+          <w:tab w:val="right" w:leader="dot" w:pos="9066"/>
+        </w:tabs>
+        <w:rPr>
+          <w:rFonts w:ascii="Aptos" w:eastAsia="Times New Roman" w:hAnsi="Aptos"/>
+          <w:noProof/>
+          <w:lang w:eastAsia="fr-FR"/>
+        </w:rPr>
+      </w:pPr>
+      <w:r>
+        <w:t>4.3.2 Espace RH — suivi du processus de recrutement</w:t>
+        <w:tab/>
+        <w:t>52</w:t>
+      </w:r>
+    </w:p>
+    <w:p>
+      <w:pPr>
+        <w:pStyle w:val="TM3"/>
+        <w:tabs>
+          <w:tab w:val="right" w:leader="dot" w:pos="9066"/>
+        </w:tabs>
+        <w:rPr>
+          <w:rFonts w:ascii="Aptos" w:eastAsia="Times New Roman" w:hAnsi="Aptos"/>
+          <w:noProof/>
+          <w:lang w:eastAsia="fr-FR"/>
+        </w:rPr>
+      </w:pPr>
+      <w:r>
+        <w:t>4.3.3 Espace manager</w:t>
+        <w:tab/>
+        <w:t>57</w:t>
+      </w:r>
+    </w:p>
+    <w:p>
+      <w:pPr>
+        <w:pStyle w:val="TM3"/>
+        <w:tabs>
+          <w:tab w:val="right" w:leader="dot" w:pos="9066"/>
+        </w:tabs>
+        <w:rPr>
+          <w:rFonts w:ascii="Aptos" w:eastAsia="Times New Roman" w:hAnsi="Aptos"/>
+          <w:noProof/>
+          <w:lang w:eastAsia="fr-FR"/>
+        </w:rPr>
+      </w:pPr>
+      <w:r>
+        <w:t>4.3.4 Administrateur — comptes, paramétrage et traçabilité</w:t>
+        <w:tab/>
+        <w:t>59</w:t>
+      </w:r>
+    </w:p>
+    <w:p>
+      <w:pPr>
+        <w:pStyle w:val="TM3"/>
+        <w:tabs>
+          <w:tab w:val="right" w:leader="dot" w:pos="9066"/>
+        </w:tabs>
+        <w:rPr>
+          <w:rFonts w:ascii="Aptos" w:eastAsia="Times New Roman" w:hAnsi="Aptos"/>
+          <w:noProof/>
+          <w:lang w:eastAsia="fr-FR"/>
+        </w:rPr>
+      </w:pPr>
+      <w:r>
+        <w:t>4.3.5 Automatisation n8n et notification du candidat</w:t>
+        <w:tab/>
+        <w:t>60</w:t>
+      </w:r>
+    </w:p>
+    <w:p>
+      <w:pPr>
         <w:pStyle w:val="TM2"/>
         <w:tabs>
           <w:tab w:val="right" w:leader="dot" w:pos="9066"/>
@@ -1787,7 +1877,7 @@
       <w:r>
         <w:t>4.4 Tests</w:t>
         <w:tab/>
-        <w:t>57</w:t>
+        <w:t>62</w:t>
       </w:r>
     </w:p>
     <w:p>
@@ -1805,7 +1895,7 @@
       <w:r>
         <w:t>4.4.1 Tests unitaires (JUnit 5 / Mockito)</w:t>
         <w:tab/>
-        <w:t>57</w:t>
+        <w:t>62</w:t>
       </w:r>
     </w:p>
     <w:p>
@@ -1823,7 +1913,7 @@
       <w:r>
         <w:t>4.4.2 Tests fonctionnels manuels</w:t>
         <w:tab/>
-        <w:t>58</w:t>
+        <w:t>63</w:t>
       </w:r>
     </w:p>
     <w:p>
@@ -1841,7 +1931,7 @@
       <w:r>
         <w:t>4.4.3 Tests des API avec Postman et Swagger</w:t>
         <w:tab/>
-        <w:t>59</w:t>
+        <w:t>64</w:t>
       </w:r>
     </w:p>
     <w:p>
@@ -1859,7 +1949,7 @@
       <w:r>
         <w:t>4.4.4 Vérification de bout en bout</w:t>
         <w:tab/>
-        <w:t>60</w:t>
+        <w:t>65</w:t>
       </w:r>
     </w:p>
     <w:p>
@@ -1877,7 +1967,7 @@
       <w:r>
         <w:t>4.4.5 Évaluation du matching sur un jeu de référence annoté (Gold Set)</w:t>
         <w:tab/>
-        <w:t>60</w:t>
+        <w:t>65</w:t>
       </w:r>
     </w:p>
     <w:p>
@@ -1895,7 +1985,7 @@
       <w:r>
         <w:t>4.4.6 Validation humaine du score et explicabilité</w:t>
         <w:tab/>
-        <w:t>61</w:t>
+        <w:t>66</w:t>
       </w:r>
     </w:p>
     <w:p>
@@ -1913,7 +2003,7 @@
       <w:r>
         <w:t>4.5 Difficultés rencontrées et solutions apportées</w:t>
         <w:tab/>
-        <w:t>62</w:t>
+        <w:t>67</w:t>
       </w:r>
     </w:p>
     <w:p>
@@ -1931,7 +2021,7 @@
       <w:r>
         <w:t>4.5.1 Notification incomplète des managers</w:t>
         <w:tab/>
-        <w:t>62</w:t>
+        <w:t>67</w:t>
       </w:r>
     </w:p>
     <w:p>
@@ -1949,7 +2039,7 @@
       <w:r>
         <w:t>4.5.2 Distinguer un avis manager d’une décision finale RH</w:t>
         <w:tab/>
-        <w:t>62</w:t>
+        <w:t>67</w:t>
       </w:r>
     </w:p>
     <w:p>
@@ -1967,7 +2057,7 @@
       <w:r>
         <w:t>4.5.3 Cohérence des transitions de statut</w:t>
         <w:tab/>
-        <w:t>63</w:t>
+        <w:t>68</w:t>
       </w:r>
     </w:p>
     <w:p>
@@ -1985,7 +2075,7 @@
       <w:r>
         <w:t>4.5.4 Filtrage incomplet des routes de lecture pour les managers</w:t>
         <w:tab/>
-        <w:t>63</w:t>
+        <w:t>68</w:t>
       </w:r>
     </w:p>
     <w:p>
@@ -2003,7 +2093,7 @@
       <w:r>
         <w:t>4.5.5 Solliciter le manager au bon moment du processus</w:t>
         <w:tab/>
-        <w:t>63</w:t>
+        <w:t>68</w:t>
       </w:r>
     </w:p>
     <w:p>
@@ -2021,7 +2111,7 @@
       <w:r>
         <w:t>4.5.6 Pertinence du matching Job idéal</w:t>
         <w:tab/>
-        <w:t>63</w:t>
+        <w:t>68</w:t>
       </w:r>
     </w:p>
     <w:p>
@@ -2039,7 +2129,7 @@
       <w:r>
         <w:t>4.5.7 Traitement distinct des candidatures retirées</w:t>
         <w:tab/>
-        <w:t>64</w:t>
+        <w:t>69</w:t>
       </w:r>
     </w:p>
     <w:p>
@@ -2057,7 +2147,7 @@
       <w:r>
         <w:t>4.5.8 Entretien téléphonique RH obligatoire avant acceptation</w:t>
         <w:tab/>
-        <w:t>64</w:t>
+        <w:t>69</w:t>
       </w:r>
     </w:p>
     <w:p>
@@ -2075,7 +2165,7 @@
       <w:r>
         <w:t>4.5.9 Découplage entre planification d’entretien et statut du candidat</w:t>
         <w:tab/>
-        <w:t>64</w:t>
+        <w:t>69</w:t>
       </w:r>
     </w:p>
     <w:p>
@@ -2093,7 +2183,7 @@
       <w:r>
         <w:t>4.5.10 Fiabiliser l’intégration Google Meet et le format des webhooks n8n</w:t>
         <w:tab/>
-        <w:t>64</w:t>
+        <w:t>69</w:t>
       </w:r>
     </w:p>
     <w:p>
@@ -2111,7 +2201,7 @@
       <w:r>
         <w:t>4.5.11 Cloisonnement des données dans le chatbot candidat</w:t>
         <w:tab/>
-        <w:t>65</w:t>
+        <w:t>70</w:t>
       </w:r>
     </w:p>
     <w:p>
@@ -2129,7 +2219,7 @@
       <w:r>
         <w:t>4.6 Protection des données et éthique de l’IA</w:t>
         <w:tab/>
-        <w:t>66</w:t>
+        <w:t>71</w:t>
       </w:r>
     </w:p>
     <w:p>
@@ -2147,7 +2237,7 @@
       <w:r>
         <w:t>4.7 Bilan des fonctionnalités réalisées</w:t>
         <w:tab/>
-        <w:t>67</w:t>
+        <w:t>72</w:t>
       </w:r>
     </w:p>
     <w:p>
@@ -2165,7 +2255,7 @@
       <w:r>
         <w:t>4.8 Conclusion</w:t>
         <w:tab/>
-        <w:t>68</w:t>
+        <w:t>73</w:t>
       </w:r>
     </w:p>
     <w:p>
@@ -2183,7 +2273,7 @@
       <w:r>
         <w:t>Conclusion Générale et Perspectives</w:t>
         <w:tab/>
-        <w:t>69</w:t>
+        <w:t>74</w:t>
       </w:r>
     </w:p>
     <w:p>
@@ -2199,9 +2289,9 @@
         </w:rPr>
       </w:pPr>
       <w:r>
-        <w:t>Annexe A — Captures d’écran complémentaires</w:t>
+        <w:t>Bibliographie</w:t>
         <w:tab/>
-        <w:t>71</w:t>
+        <w:t>76</w:t>
       </w:r>
     </w:p>
     <w:p>
@@ -2217,27 +2307,9 @@
         </w:rPr>
       </w:pPr>
       <w:r>
-        <w:t>Bibliographie</w:t>
-        <w:tab/>
-        <w:t>79</w:t>
-      </w:r>
-    </w:p>
-    <w:p>
-      <w:pPr>
-        <w:pStyle w:val="TM1"/>
-        <w:tabs>
-          <w:tab w:val="right" w:leader="dot" w:pos="9066"/>
-        </w:tabs>
-        <w:rPr>
-          <w:rFonts w:ascii="Aptos" w:eastAsia="Times New Roman" w:hAnsi="Aptos"/>
-          <w:noProof/>
-          <w:lang w:eastAsia="fr-FR"/>
-        </w:rPr>
-      </w:pPr>
-      <w:r>
         <w:t>Glossaire</w:t>
         <w:tab/>
-        <w:t>81</w:t>
+        <w:t>78</w:t>
       </w:r>
     </w:p>
     <w:p>
@@ -2520,7 +2592,7 @@
       <w:r>
         <w:t xml:space="preserve">Figure 4.1 : Page d’accueil publique — recherche d’offres d’emploi</w:t>
         <w:tab/>
-        <w:t>48</w:t>
+        <w:t>49</w:t>
       </w:r>
     </w:p>
     <w:p>
@@ -2530,9 +2602,9 @@
         </w:tabs>
       </w:pPr>
       <w:r>
-        <w:t xml:space="preserve">Figure 4.2 : Gestion des offres d’emploi (espace RH)</w:t>
+        <w:t xml:space="preserve">Figure 4.2 : Page de connexion</w:t>
         <w:tab/>
-        <w:t>49</w:t>
+        <w:t>50</w:t>
       </w:r>
     </w:p>
     <w:p>
@@ -2542,9 +2614,9 @@
         </w:tabs>
       </w:pPr>
       <w:r>
-        <w:t xml:space="preserve">Figure 4.3 : Gestion des candidats — vue liste avec score IA</w:t>
+        <w:t xml:space="preserve">Figure 4.3 : Soumission d’une candidature avec dépôt de CV</w:t>
         <w:tab/>
-        <w:t>49</w:t>
+        <w:t>50</w:t>
       </w:r>
     </w:p>
     <w:p>
@@ -2554,9 +2626,9 @@
         </w:tabs>
       </w:pPr>
       <w:r>
-        <w:t xml:space="preserve">Figure 4.4 : Tableau Kanban du pipeline de recrutement</w:t>
+        <w:t xml:space="preserve">Figure 4.4 : Fonctionnalité « Job idéal » — suggestions d’offres selon le CV</w:t>
         <w:tab/>
-        <w:t>50</w:t>
+        <w:t>51</w:t>
       </w:r>
     </w:p>
     <w:p>
@@ -2566,7 +2638,7 @@
         </w:tabs>
       </w:pPr>
       <w:r>
-        <w:t xml:space="preserve">Figure 4.5 : Gestion des utilisateurs et des rôles (espace Administrateur)</w:t>
+        <w:t xml:space="preserve">Figure 4.5 : Assistant conversationnel candidat (chatbot)</w:t>
         <w:tab/>
         <w:t>51</w:t>
       </w:r>
@@ -2578,9 +2650,9 @@
         </w:tabs>
       </w:pPr>
       <w:r>
-        <w:t xml:space="preserve">Figure 4.6 : Paramétrage du scoring IA par famille de métier</w:t>
+        <w:t xml:space="preserve">Figure 4.6 : Gestion des offres d’emploi (espace RH)</w:t>
         <w:tab/>
-        <w:t>51</w:t>
+        <w:t>52</w:t>
       </w:r>
     </w:p>
     <w:p>
@@ -2590,9 +2662,9 @@
         </w:tabs>
       </w:pPr>
       <w:r>
-        <w:t xml:space="preserve">Figure 4.7 : Assistant conversationnel candidat (chatbot)</w:t>
+        <w:t xml:space="preserve">Figure 4.7 : Gestion des candidats — vue liste avec score IA</w:t>
         <w:tab/>
-        <w:t>52</w:t>
+        <w:t>53</w:t>
       </w:r>
     </w:p>
     <w:p>
@@ -2602,7 +2674,7 @@
         </w:tabs>
       </w:pPr>
       <w:r>
-        <w:t xml:space="preserve">Figure 4.8 : Fonctionnalité « Job idéal » — suggestions d’offres selon le CV</w:t>
+        <w:t xml:space="preserve">Figure 4.8 : Analyse détaillée d’une candidature par intelligence artificielle</w:t>
         <w:tab/>
         <w:t>53</w:t>
       </w:r>
@@ -2614,7 +2686,7 @@
         </w:tabs>
       </w:pPr>
       <w:r>
-        <w:t xml:space="preserve">Figure 4.9 : Analyse détaillée d’une candidature par intelligence artificielle</w:t>
+        <w:t xml:space="preserve">Figure 4.9 : Modification d’un dossier candidat</w:t>
         <w:tab/>
         <w:t>54</w:t>
       </w:r>
@@ -2626,9 +2698,9 @@
         </w:tabs>
       </w:pPr>
       <w:r>
-        <w:t xml:space="preserve">Figure 4.10 : Espace Manager — page « Mon calendrier d’entretiens », prochaines sessions et rappels</w:t>
+        <w:t xml:space="preserve">Figure 4.10 : Tableau Kanban du pipeline de recrutement</w:t>
         <w:tab/>
-        <w:t>55</w:t>
+        <w:t>54</w:t>
       </w:r>
     </w:p>
     <w:p>
@@ -2638,9 +2710,9 @@
         </w:tabs>
       </w:pPr>
       <w:r>
-        <w:t xml:space="preserve">Figure 4.11 : Contre-signature RH d’un avis favorable « Valider l’embauche »</w:t>
+        <w:t xml:space="preserve">Figure 4.11 : Gestion des entretiens (espace RH)</w:t>
         <w:tab/>
-        <w:t>56</w:t>
+        <w:t>55</w:t>
       </w:r>
     </w:p>
     <w:p>
@@ -2650,7 +2722,7 @@
         </w:tabs>
       </w:pPr>
       <w:r>
-        <w:t xml:space="preserve">Figure 4.12 : Contre-signature RH d’un refus proposé — modale « Confirmer le refus »</w:t>
+        <w:t xml:space="preserve">Figure 4.12 : Gestion des feedbacks (espace RH)</w:t>
         <w:tab/>
         <w:t>56</w:t>
       </w:r>
@@ -2662,9 +2734,9 @@
         </w:tabs>
       </w:pPr>
       <w:r>
-        <w:t xml:space="preserve">Figure A.1 : Page de connexion</w:t>
+        <w:t xml:space="preserve">Figure 4.13 : Contre-signature RH d’un avis favorable « Valider l’embauche »</w:t>
         <w:tab/>
-        <w:t>71</w:t>
+        <w:t>56</w:t>
       </w:r>
     </w:p>
     <w:p>
@@ -2674,9 +2746,9 @@
         </w:tabs>
       </w:pPr>
       <w:r>
-        <w:t xml:space="preserve">Figure A.2 : Modification d’un dossier candidat</w:t>
+        <w:t xml:space="preserve">Figure 4.14 : Contre-signature RH d’un refus proposé — modale « Confirmer le refus »</w:t>
         <w:tab/>
-        <w:t>72</w:t>
+        <w:t>57</w:t>
       </w:r>
     </w:p>
     <w:p>
@@ -2686,9 +2758,9 @@
         </w:tabs>
       </w:pPr>
       <w:r>
-        <w:t xml:space="preserve">Figure A.3 : Gestion des entretiens</w:t>
+        <w:t xml:space="preserve">Figure 4.15 : Espace Manager — candidatures relevant du périmètre du manager</w:t>
         <w:tab/>
-        <w:t>73</w:t>
+        <w:t>57</w:t>
       </w:r>
     </w:p>
     <w:p>
@@ -2698,9 +2770,9 @@
         </w:tabs>
       </w:pPr>
       <w:r>
-        <w:t xml:space="preserve">Figure A.4 : Gestion des feedbacks</w:t>
+        <w:t xml:space="preserve">Figure 4.16 : Espace Manager — page « Mon calendrier d’entretiens », prochains entretiens, rappels et entretiens passés</w:t>
         <w:tab/>
-        <w:t>73</w:t>
+        <w:t>58</w:t>
       </w:r>
     </w:p>
     <w:p>
@@ -2710,9 +2782,9 @@
         </w:tabs>
       </w:pPr>
       <w:r>
-        <w:t xml:space="preserve">Figure A.5 : Historique d’audit</w:t>
+        <w:t xml:space="preserve">Figure 4.17 : Gestion des utilisateurs et des rôles (espace Administrateur)</w:t>
         <w:tab/>
-        <w:t>74</w:t>
+        <w:t>59</w:t>
       </w:r>
     </w:p>
     <w:p>
@@ -2722,9 +2794,9 @@
         </w:tabs>
       </w:pPr>
       <w:r>
-        <w:t xml:space="preserve">Figure A.6 : Soumission d’une candidature avec dépôt de CV</w:t>
+        <w:t xml:space="preserve">Figure 4.18 : Paramétrage du scoring IA par famille de métier</w:t>
         <w:tab/>
-        <w:t>75</w:t>
+        <w:t>59</w:t>
       </w:r>
     </w:p>
     <w:p>
@@ -2734,9 +2806,9 @@
         </w:tabs>
       </w:pPr>
       <w:r>
-        <w:t xml:space="preserve">Figure A.7 : Espace Manager — candidatures relevant du périmètre du manager</w:t>
+        <w:t xml:space="preserve">Figure 4.19 : Historique d’audit</w:t>
         <w:tab/>
-        <w:t>76</w:t>
+        <w:t>60</w:t>
       </w:r>
     </w:p>
     <w:p>
@@ -2746,9 +2818,9 @@
         </w:tabs>
       </w:pPr>
       <w:r>
-        <w:t xml:space="preserve">Figure A.8 : Console n8n — les trois flux d’automatisation publiés et leurs statistiques</w:t>
+        <w:t xml:space="preserve">Figure 4.20 : Console n8n — les trois flux d’automatisation publiés et leurs statistiques</w:t>
         <w:tab/>
-        <w:t>77</w:t>
+        <w:t>60</w:t>
       </w:r>
     </w:p>
     <w:p>
@@ -2758,9 +2830,9 @@
         </w:tabs>
       </w:pPr>
       <w:r>
-        <w:t xml:space="preserve">Figure A.9 : Flux n8n de l’Agent 1 — webhook de candidature, appel du scoring Cohere puis e-mail au candidat</w:t>
+        <w:t xml:space="preserve">Figure 4.21 : Flux n8n de l’Agent 1 — webhook de candidature, appel du scoring Cohere puis e-mail au candidat</w:t>
         <w:tab/>
-        <w:t>77</w:t>
+        <w:t>61</w:t>
       </w:r>
     </w:p>
     <w:p>
@@ -2770,9 +2842,9 @@
         </w:tabs>
       </w:pPr>
       <w:r>
-        <w:t xml:space="preserve">Figure A.10 : E-mail automatique de confirmation de candidature reçu par le candidat</w:t>
+        <w:t xml:space="preserve">Figure 4.22 : E-mail automatique de confirmation de candidature reçu par le candidat</w:t>
         <w:tab/>
-        <w:t>78</w:t>
+        <w:t>61</w:t>
       </w:r>
     </w:p>
     <w:p>
@@ -2855,7 +2927,7 @@
       <w:r>
         <w:t>Tableau 4.1 : Synthèse des tests fonctionnels réalisés</w:t>
         <w:tab/>
-        <w:t>58</w:t>
+        <w:t>63</w:t>
       </w:r>
     </w:p>
     <w:p>
@@ -2867,7 +2939,7 @@
       <w:r>
         <w:t>Tableau 4.2 : Matrice de confusion du Gold Set selon le seuil de décision</w:t>
         <w:tab/>
-        <w:t>60</w:t>
+        <w:t>65</w:t>
       </w:r>
     </w:p>
     <w:p>
@@ -2879,7 +2951,7 @@
       <w:r>
         <w:t>Tableau 4.3 : Bilan des fonctionnalités réalisées</w:t>
         <w:tab/>
-        <w:t>67</w:t>
+        <w:t>72</w:t>
       </w:r>
     </w:p>
     <w:p>
@@ -8083,12 +8155,21 @@
     <w:p>
       <w:pPr/>
       <w:r>
-        <w:t xml:space="preserve">Cette section présente une sélection des interfaces principales (figures 4.1 à 4.12), illustrant les fonctionnalités clés de la plateforme JOB4YOU pour chacun des profils d’utilisateurs.</w:t>
+        <w:t xml:space="preserve">Cette section présente les interfaces de la plateforme, regroupées par acteur : l’accès public et l’espace candidat (figures 4.1 à 4.5), l’espace RH et le suivi du processus de recrutement (figures 4.6 à 4.14), l’espace manager (figures 4.15 et 4.16), l’espace administrateur et la traçabilité (figures 4.17 à 4.19), enfin la chaîne d’automatisation n8n (figures 4.20 à 4.22). Toutes ces captures proviennent de l’application en fonctionnement.</w:t>
+      </w:r>
+    </w:p>
+    <w:p>
+      <w:pPr>
+        <w:pStyle w:val="Titre3"/>
+      </w:pPr>
+      <w:r>
+        <w:t>4.3.1 Accès public et espace candidat</w:t>
       </w:r>
     </w:p>
     <w:p>
       <w:pPr>
         <w:keepNext/>
+        <w:spacing w:after="40" w:before="0"/>
         <w:jc w:val="center"/>
       </w:pPr>
       <w:r>
@@ -8124,16 +8205,175 @@
       </w:r>
     </w:p>
     <w:p>
-      <w:r>
-        <w:t xml:space="preserve">L’authentification se fait par nom d’utilisateur et mot de passe ; le jeton JWT renvoyé par le back-end sécurise ensuite l’ensemble des requêtes vers l’API.</w:t>
-      </w:r>
-      <w:r>
-        <w:t xml:space="preserve"> Sa capture est reprise en annexe A (figure A.1).</w:t>
-      </w:r>
-    </w:p>
-    <w:p>
       <w:pPr>
         <w:keepNext/>
+        <w:spacing w:after="40" w:before="0"/>
+        <w:jc w:val="center"/>
+      </w:pPr>
+      <w:r>
+        <w:rPr>
+          <w:noProof/>
+        </w:rPr>
+        <w:pict w14:anchorId="5BF0AF37">
+          <v:shape id="Image 14" o:spid="_x0000_i1041" type="#_x0000_t75" style="width:138.2pt;height:276.0pt;visibility:visible;mso-wrap-style:square">
+            <v:imagedata r:id="rId27" o:title=""/>
+          </v:shape>
+        </w:pict>
+      </w:r>
+    </w:p>
+    <w:p>
+      <w:pPr>
+        <w:jc w:val="center"/>
+        <w:rPr>
+          <w:i/>
+          <w:sz w:val="21"/>
+        </w:rPr>
+      </w:pPr>
+      <w:r>
+        <w:rPr>
+          <w:i/>
+          <w:sz w:val="21"/>
+        </w:rPr>
+        <w:t xml:space="preserve">Figure 4.2 : Page de connexion</w:t>
+      </w:r>
+    </w:p>
+    <w:p>
+      <w:r>
+        <w:t xml:space="preserve">La page de connexion de la figure 4.2 est le point d’entrée des espaces sécurisés : l’authentification s’y fait par nom d’utilisateur et mot de passe, et le jeton JWT renvoyé par le back-end sécurise ensuite l’ensemble des requêtes vers l’API.</w:t>
+      </w:r>
+      <w:r>
+        <w:t xml:space="preserve"/>
+      </w:r>
+    </w:p>
+    <w:p>
+      <w:pPr>
+        <w:keepNext/>
+        <w:spacing w:after="40" w:before="0"/>
+        <w:jc w:val="center"/>
+      </w:pPr>
+      <w:r>
+        <w:rPr>
+          <w:noProof/>
+        </w:rPr>
+        <w:pict w14:anchorId="65301F00">
+          <v:shape id="Picture 8" o:spid="_x0000_i1051" type="#_x0000_t75" style="visibility:visible;mso-wrap-style:square;width:290.1pt;height:294.0pt">
+            <v:imagedata r:id="rId37" o:title=""/>
+          </v:shape>
+        </w:pict>
+      </w:r>
+    </w:p>
+    <w:p>
+      <w:pPr>
+        <w:jc w:val="center"/>
+        <w:rPr>
+          <w:i/>
+          <w:sz w:val="21"/>
+        </w:rPr>
+      </w:pPr>
+      <w:r>
+        <w:rPr>
+          <w:i/>
+          <w:sz w:val="21"/>
+        </w:rPr>
+        <w:t xml:space="preserve">Figure 4.3 : Soumission d’une candidature avec dépôt de CV</w:t>
+      </w:r>
+    </w:p>
+    <w:p>
+      <w:r>
+        <w:t xml:space="preserve">Comme le montre la figure 4.3, un candidat connecté postule directement depuis une offre : le formulaire pré-remplit son e-mail de compte, valide le format du CV (PDF, DOC, DOCX) et confirme visuellement la sélection avant l’envoi. C’est ce dépôt qui déclenche la chaîne décrite en section 3.5.3 (extraction du texte par l’agent n8n, analyse par l’API de Cohere appelée par le back-end, score automatique).</w:t>
+      </w:r>
+      <w:r>
+        <w:t xml:space="preserve"/>
+      </w:r>
+    </w:p>
+    <w:p>
+      <w:pPr>
+        <w:keepNext/>
+        <w:spacing w:after="40" w:before="0"/>
+        <w:jc w:val="center"/>
+      </w:pPr>
+      <w:r>
+        <w:rPr>
+          <w:noProof/>
+        </w:rPr>
+        <w:pict w14:anchorId="580FE8B9">
+          <v:shape id="Picture 5" o:spid="_x0000_i1052" type="#_x0000_t75" style="width:424.8pt;height:191.2pt;visibility:visible;mso-wrap-style:square">
+            <v:imagedata r:id="rId38" o:title=""/>
+          </v:shape>
+        </w:pict>
+      </w:r>
+    </w:p>
+    <w:p>
+      <w:pPr>
+        <w:jc w:val="center"/>
+        <w:rPr>
+          <w:i/>
+          <w:sz w:val="21"/>
+        </w:rPr>
+      </w:pPr>
+      <w:r>
+        <w:rPr>
+          <w:i/>
+          <w:sz w:val="21"/>
+        </w:rPr>
+        <w:t xml:space="preserve">Figure 4.4 : Fonctionnalité « Job idéal » — suggestions d’offres selon le CV</w:t>
+      </w:r>
+    </w:p>
+    <w:p>
+      <w:r>
+        <w:t xml:space="preserve">Comme l’illustre la figure 4.4, un visiteur ou un candidat qui ne postule à aucune offre précise peut déposer son CV et recevoir une liste des offres actives classées par pourcentage de compatibilité, calculée par l’API de Cohere (badge « Analyse IA (Cohere) », avec repli automatique sur un classement par mots-clés si l’IA est indisponible).</w:t>
+      </w:r>
+    </w:p>
+    <w:p>
+      <w:pPr>
+        <w:keepNext/>
+        <w:jc w:val="center"/>
+        <w:spacing w:before="0" w:after="40" w:line="240" w:lineRule="auto"/>
+      </w:pPr>
+      <w:r>
+        <w:rPr>
+          <w:noProof/>
+        </w:rPr>
+        <w:pict w14:anchorId="580FE8B9">
+          <v:shape id="Picture 5" o:spid="_x0000_i1052" type="#_x0000_t75" style="visibility:visible;mso-wrap-style:square;width:222.5pt;height:300.0pt;visibility:visible">
+            <v:imagedata r:id="rId900" o:title=""/>
+          </v:shape>
+        </w:pict>
+      </w:r>
+    </w:p>
+    <w:p>
+      <w:pPr>
+        <w:jc w:val="center"/>
+        <w:rPr>
+          <w:i/>
+          <w:sz w:val="21"/>
+        </w:rPr>
+      </w:pPr>
+      <w:r>
+        <w:rPr>
+          <w:i/>
+          <w:sz w:val="21"/>
+        </w:rPr>
+        <w:t xml:space="preserve">Figure 4.5 : Assistant conversationnel candidat (chatbot)</w:t>
+      </w:r>
+    </w:p>
+    <w:p>
+      <w:r>
+        <w:t xml:space="preserve">Disponible uniquement pour un candidat authentifié, le widget de la figure 4.5 permet de poser des questions en langage naturel sur le suivi de ses propres candidatures ou sur le fonctionnement général de la plateforme (offres, Job idéal, retrait de candidature, etc.). Les réponses sont générées par un modèle de raisonnement (z-ai/glm-5.3-flash, via l’API OpenRouter) à partir d’un contexte constitué côté serveur par une liste blanche de champs : intitulé du poste, libellé du statut, date de candidature, entretiens et, le cas échéant, les feedbacks explicitement transmis au candidat. Les champs internes (score et résumé générés par l’agent de scoring, correction manuelle du RH, identité de l’intervieweur, notes internes d’entretien) n’entrent pas dans cette liste et ne quittent donc pas le back-end vers le prompt ; ce filtre structurel, complété par les consignes du message système, a été vérifié sur les scénarios testés, y compris une tentative d’injection de prompt.</w:t>
+      </w:r>
+    </w:p>
+    <w:p>
+      <w:pPr>
+        <w:pStyle w:val="Titre3"/>
+      </w:pPr>
+      <w:r>
+        <w:t>4.3.2 Espace RH — suivi du processus de recrutement</w:t>
+      </w:r>
+    </w:p>
+    <w:p>
+      <w:pPr>
+        <w:keepNext/>
+        <w:spacing w:after="40" w:before="0"/>
         <w:jc w:val="center"/>
       </w:pPr>
       <w:r>
@@ -8160,17 +8400,18 @@
           <w:i/>
           <w:sz w:val="21"/>
         </w:rPr>
-        <w:t xml:space="preserve">Figure 4.2 : Gestion des offres d’emploi (espace RH)</w:t>
-      </w:r>
-    </w:p>
-    <w:p>
-      <w:r>
-        <w:t xml:space="preserve">Comme le montre la figure 4.2, le responsable RH crée, modifie et suit le statut de chaque offre depuis une table filtrable par mot-clé, par statut et par type de contrat, avec un accès direct à la consultation, à la modification et à la suppression ; la bascule en « expirée » se fait automatiquement une fois la date limite dépassée.</w:t>
+        <w:t xml:space="preserve">Figure 4.6 : Gestion des offres d’emploi (espace RH)</w:t>
+      </w:r>
+    </w:p>
+    <w:p>
+      <w:r>
+        <w:t xml:space="preserve">Comme le montre la figure 4.6, le responsable RH crée, modifie et suit le statut de chaque offre depuis une table filtrable par mot-clé, par statut et par type de contrat, avec un accès direct à la consultation, à la modification et à la suppression ; la bascule en « expirée » se fait automatiquement une fois la date limite dépassée.</w:t>
       </w:r>
     </w:p>
     <w:p>
       <w:pPr>
         <w:keepNext/>
+        <w:spacing w:after="40" w:before="0"/>
         <w:jc w:val="center"/>
       </w:pPr>
       <w:r>
@@ -8197,17 +8438,88 @@
           <w:i/>
           <w:sz w:val="21"/>
         </w:rPr>
-        <w:t xml:space="preserve">Figure 4.3 : Gestion des candidats — vue liste avec score IA</w:t>
-      </w:r>
-    </w:p>
-    <w:p>
-      <w:r>
-        <w:t>La figure 4.3 reproduit la liste des dossiers de l’espace RH : pour chacun d’eux apparaissent le contact, l’offre visée, le statut courant du processus, le score calculé par l’agent IA — coloré selon son niveau — et les actions rapides (téléchargement du CV, modification, consultation, envoi d’e-mail, suppression). Le bandeau supérieur donne l’état du vivier en un coup d’œil (à valider, rejetés, retirés, embauchés).</w:t>
-      </w:r>
-    </w:p>
-    <w:p>
-      <w:r>
-        <w:t xml:space="preserve">Le formulaire de modification, reproduit en figure A.2 (annexe A), permet de corriger les informations d’un candidat (coordonnées, lettre de motivation, statut, offre associée) ; la fiche de consultation associée regroupe le CV, l’analyse IA détaillée (scores technique, communication, adéquation séniorité) et l’historique des actions des agents n8n sur ce dossier.</w:t>
+        <w:t xml:space="preserve">Figure 4.7 : Gestion des candidats — vue liste avec score IA</w:t>
+      </w:r>
+    </w:p>
+    <w:p>
+      <w:r>
+        <w:t>La figure 4.7 reproduit la liste des dossiers de l’espace RH : pour chacun d’eux apparaissent le contact, l’offre visée, le statut courant du processus, le score calculé par l’agent IA — coloré selon son niveau — et les actions rapides (téléchargement du CV, modification, consultation, envoi d’e-mail, suppression). Le bandeau supérieur donne l’état du vivier en un coup d’œil (à valider, rejetés, retirés, embauchés).</w:t>
+      </w:r>
+    </w:p>
+    <w:p>
+      <w:pPr>
+        <w:keepNext/>
+        <w:spacing w:after="40" w:before="0"/>
+        <w:jc w:val="center"/>
+      </w:pPr>
+      <w:r>
+        <w:rPr>
+          <w:noProof/>
+        </w:rPr>
+        <w:pict w14:anchorId="6E2178D7">
+          <v:shape id="Picture 9" o:spid="_x0000_i1053" type="#_x0000_t75" style="visibility:visible;mso-wrap-style:square;width:309.8pt;height:280.0pt;visibility:visible">
+            <v:imagedata r:id="rId39" o:title=""/>
+          </v:shape>
+        </w:pict>
+      </w:r>
+    </w:p>
+    <w:p>
+      <w:pPr>
+        <w:jc w:val="center"/>
+        <w:rPr>
+          <w:i/>
+          <w:sz w:val="21"/>
+        </w:rPr>
+      </w:pPr>
+      <w:r>
+        <w:rPr>
+          <w:i/>
+          <w:sz w:val="21"/>
+        </w:rPr>
+        <w:t xml:space="preserve">Figure 4.8 : Analyse détaillée d’une candidature par intelligence artificielle</w:t>
+      </w:r>
+    </w:p>
+    <w:p>
+      <w:r>
+        <w:t xml:space="preserve">Le détail d’une candidature, reproduit en figure 4.8, expose, au-delà du score global visible en liste (figure 4.7), la répartition par critère — technique, communication, adéquation séniorité —, le bouton « Corriger le score » et, le cas échéant, la correction manuelle appliquée par un RH avec sa justification, conformément au principe de contrôle humain décrit en section 4.6. Y figurent également les notes internes, réservées aux rôles RH et administrateur, et l’activité des agents n8n sur le dossier.</w:t>
+      </w:r>
+    </w:p>
+    <w:p>
+      <w:pPr>
+        <w:keepNext/>
+        <w:spacing w:after="40" w:before="0"/>
+        <w:jc w:val="center"/>
+      </w:pPr>
+      <w:r>
+        <w:rPr>
+          <w:noProof/>
+        </w:rPr>
+        <w:pict w14:anchorId="0B44AC1E">
+          <v:shape id="Image 17" o:spid="_x0000_i1044" type="#_x0000_t75" style="visibility:visible;mso-wrap-style:square;width:277.3pt;height:295.0pt">
+            <v:imagedata r:id="rId30" o:title=""/>
+          </v:shape>
+        </w:pict>
+      </w:r>
+    </w:p>
+    <w:p>
+      <w:pPr>
+        <w:jc w:val="center"/>
+        <w:rPr>
+          <w:i/>
+          <w:sz w:val="21"/>
+        </w:rPr>
+      </w:pPr>
+      <w:r>
+        <w:rPr>
+          <w:i/>
+          <w:sz w:val="21"/>
+        </w:rPr>
+        <w:t xml:space="preserve">Figure 4.9 : Modification d’un dossier candidat</w:t>
+      </w:r>
+    </w:p>
+    <w:p>
+      <w:r>
+        <w:t xml:space="preserve">Le formulaire de modification de la figure 4.9 permet de corriger les informations d’un candidat (coordonnées, lettre de motivation, statut, offre associée) ; la fiche de consultation associée regroupe le CV, l’analyse IA détaillée (scores technique, communication, adéquation séniorité) et l’historique des actions des agents n8n sur ce dossier.</w:t>
       </w:r>
       <w:r>
         <w:t xml:space="preserve"/>
@@ -8216,6 +8528,7 @@
     <w:p>
       <w:pPr>
         <w:keepNext/>
+        <w:spacing w:after="40" w:before="0"/>
         <w:jc w:val="center"/>
       </w:pPr>
       <w:r>
@@ -8242,25 +8555,91 @@
           <w:i/>
           <w:sz w:val="21"/>
         </w:rPr>
-        <w:t xml:space="preserve">Figure 4.4 : Tableau Kanban du pipeline de recrutement</w:t>
-      </w:r>
-    </w:p>
-    <w:p>
-      <w:r>
-        <w:t xml:space="preserve">Le tableau Kanban de la figure 4.4, intitulé « Pipeline de recrutement », donne une vue synthétique et interactive de toutes les candidatures réparties par statut : chaque colonne porte le nombre de dossiers qu’elle contient et chaque carte le nom du candidat, l’offre visée et son score IA. Toutes les colonnes ne tenant pas à l’écran, le tableau se fait défiler horizontalement. Glisser une carte d’une colonne à une autre déclenche automatiquement la mise à jour du statut, sous réserve des garde-fous métier décrits au chapitre 3 pour les décisions finales.</w:t>
-      </w:r>
-    </w:p>
-    <w:p>
-      <w:r>
-        <w:t>L’écran de gestion des entretiens, reproduit en figure A.3 (annexe A), permet de planifier, filtrer et suivre les entretiens par candidat, offre, type, interviewer et statut, avec des actions contextuelles comme le démarrage, l’annulation, la reprogrammation ou l’ajout d’un feedback une fois l’entretien terminé.</w:t>
+        <w:t xml:space="preserve">Figure 4.10 : Tableau Kanban du pipeline de recrutement</w:t>
+      </w:r>
+    </w:p>
+    <w:p>
+      <w:r>
+        <w:t xml:space="preserve">Le tableau Kanban de la figure 4.10, intitulé « Pipeline de recrutement », donne une vue synthétique et interactive de toutes les candidatures réparties par statut : chaque colonne porte le nombre de dossiers qu’elle contient et chaque carte le nom du candidat, l’offre visée et son score IA. Toutes les colonnes ne tenant pas à l’écran, le tableau se fait défiler horizontalement. Glisser une carte d’une colonne à une autre déclenche automatiquement la mise à jour du statut, sous réserve des garde-fous métier décrits au chapitre 3 pour les décisions finales.</w:t>
+      </w:r>
+    </w:p>
+    <w:p>
+      <w:pPr>
+        <w:keepNext/>
+        <w:spacing w:after="40" w:before="0"/>
+        <w:jc w:val="center"/>
+      </w:pPr>
+      <w:r>
+        <w:rPr>
+          <w:noProof/>
+        </w:rPr>
+        <w:pict w14:anchorId="61C2271E">
+          <v:shape id="Image 19" o:spid="_x0000_i1046" type="#_x0000_t75" style="width:453.3pt;height:290.4pt;visibility:visible;mso-wrap-style:square">
+            <v:imagedata r:id="rId32" o:title=""/>
+          </v:shape>
+        </w:pict>
+      </w:r>
+    </w:p>
+    <w:p>
+      <w:pPr>
+        <w:jc w:val="center"/>
+        <w:rPr>
+          <w:i/>
+          <w:sz w:val="21"/>
+        </w:rPr>
+      </w:pPr>
+      <w:r>
+        <w:rPr>
+          <w:i/>
+          <w:sz w:val="21"/>
+        </w:rPr>
+        <w:t xml:space="preserve">Figure 4.11 : Gestion des entretiens (espace RH)</w:t>
+      </w:r>
+    </w:p>
+    <w:p>
+      <w:r>
+        <w:t>L’écran de gestion des entretiens de la figure 4.11 permet de planifier, filtrer et suivre les entretiens par candidat, offre, type, interviewer et statut, avec des actions contextuelles comme le démarrage, l’annulation, la reprogrammation ou l’ajout d’un feedback une fois l’entretien terminé.</w:t>
       </w:r>
       <w:r>
         <w:t xml:space="preserve"/>
       </w:r>
     </w:p>
     <w:p>
-      <w:r>
-        <w:t>La figure A.4 (annexe A) centralise les feedbacks saisis par les managers, notés de 1 à 5 étoiles et assortis d’un commentaire, avec une étape de validation par le RH avant transmission au candidat.</w:t>
+      <w:pPr>
+        <w:keepNext/>
+        <w:spacing w:after="40" w:before="0"/>
+        <w:jc w:val="center"/>
+      </w:pPr>
+      <w:r>
+        <w:rPr>
+          <w:noProof/>
+        </w:rPr>
+        <w:pict w14:anchorId="4A63A72C">
+          <v:shape id="Image 20" o:spid="_x0000_i1047" type="#_x0000_t75" style="width:453.3pt;height:290.4pt;visibility:visible;mso-wrap-style:square">
+            <v:imagedata r:id="rId33" o:title=""/>
+          </v:shape>
+        </w:pict>
+      </w:r>
+    </w:p>
+    <w:p>
+      <w:pPr>
+        <w:jc w:val="center"/>
+        <w:rPr>
+          <w:i/>
+          <w:sz w:val="21"/>
+        </w:rPr>
+      </w:pPr>
+      <w:r>
+        <w:rPr>
+          <w:i/>
+          <w:sz w:val="21"/>
+        </w:rPr>
+        <w:t xml:space="preserve">Figure 4.12 : Gestion des feedbacks (espace RH)</w:t>
+      </w:r>
+    </w:p>
+    <w:p>
+      <w:r>
+        <w:t>La figure 4.12 centralise les feedbacks saisis par les managers, notés de 1 à 5 étoiles et assortis d’un commentaire, avec une étape de validation par le RH avant transmission au candidat.</w:t>
       </w:r>
       <w:r>
         <w:t xml:space="preserve"/>
@@ -8269,6 +8648,180 @@
     <w:p>
       <w:pPr>
         <w:keepNext/>
+        <w:spacing w:after="40" w:before="0"/>
+        <w:jc w:val="center"/>
+      </w:pPr>
+      <w:r>
+        <w:rPr>
+          <w:noProof/>
+        </w:rPr>
+        <w:pict w14:anchorId="1ABB31E4">
+          <v:shape id="Picture 411" o:spid="_x0000_i1911" type="#_x0000_t75" style="visibility:visible;mso-wrap-style:square;width:240.2pt;height:263.0pt">
+            <v:imagedata r:id="rId960" o:title=""/>
+          </v:shape>
+        </w:pict>
+      </w:r>
+    </w:p>
+    <w:p>
+      <w:pPr>
+        <w:jc w:val="center"/>
+        <w:rPr>
+          <w:i/>
+          <w:sz w:val="21"/>
+        </w:rPr>
+      </w:pPr>
+      <w:r>
+        <w:rPr>
+          <w:i/>
+          <w:sz w:val="21"/>
+        </w:rPr>
+        <w:t xml:space="preserve">Figure 4.13 : Contre-signature RH d’un avis favorable « Valider l’embauche »</w:t>
+      </w:r>
+    </w:p>
+    <w:p>
+      <w:r>
+        <w:t xml:space="preserve">La modale de la figure 4.13 : le RH contre-signe l’avis favorable du manager avant l’embauche ; la date de présentation y est obligatoire, car elle alimente l’e-mail de convocation.</w:t>
+      </w:r>
+    </w:p>
+    <w:p>
+      <w:pPr>
+        <w:keepNext/>
+        <w:spacing w:after="40" w:before="0"/>
+        <w:jc w:val="center"/>
+      </w:pPr>
+      <w:r>
+        <w:rPr>
+          <w:noProof/>
+        </w:rPr>
+        <w:pict w14:anchorId="1ABB31E4">
+          <v:shape id="Picture 412" o:spid="_x0000_i1912" type="#_x0000_t75" style="visibility:visible;mso-wrap-style:square;width:240.0pt;height:254.0pt">
+            <v:imagedata r:id="rId961" o:title=""/>
+          </v:shape>
+        </w:pict>
+      </w:r>
+    </w:p>
+    <w:p>
+      <w:pPr>
+        <w:jc w:val="center"/>
+        <w:rPr>
+          <w:i/>
+          <w:sz w:val="21"/>
+        </w:rPr>
+      </w:pPr>
+      <w:r>
+        <w:rPr>
+          <w:i/>
+          <w:sz w:val="21"/>
+        </w:rPr>
+        <w:t xml:space="preserve">Figure 4.14 : Contre-signature RH d’un refus proposé — modale « Confirmer le refus »</w:t>
+      </w:r>
+    </w:p>
+    <w:p>
+      <w:r>
+        <w:t xml:space="preserve">La modale « Confirmer le refus » de la figure 4.14 : le RH contre-signe le refus proposé par le manager ; le motif y est obligatoire, car il alimente l’e-mail de refus final.</w:t>
+      </w:r>
+    </w:p>
+    <w:p>
+      <w:pPr>
+        <w:pStyle w:val="Titre3"/>
+      </w:pPr>
+      <w:r>
+        <w:t>4.3.3 Espace manager</w:t>
+      </w:r>
+    </w:p>
+    <w:p>
+      <w:pPr>
+        <w:keepNext/>
+        <w:spacing w:after="40" w:before="0"/>
+        <w:jc w:val="center"/>
+      </w:pPr>
+      <w:r>
+        <w:rPr>
+          <w:noProof/>
+        </w:rPr>
+        <w:pict w14:anchorId="1ABB31E4">
+          <v:shape id="Picture 7" o:spid="_x0000_i1054" type="#_x0000_t75" style="visibility:visible;mso-wrap-style:square;width:453.3pt;height:252.5pt">
+            <v:imagedata r:id="rId40" o:title=""/>
+          </v:shape>
+        </w:pict>
+      </w:r>
+    </w:p>
+    <w:p>
+      <w:pPr>
+        <w:jc w:val="center"/>
+        <w:rPr>
+          <w:i/>
+          <w:sz w:val="21"/>
+        </w:rPr>
+      </w:pPr>
+      <w:r>
+        <w:rPr>
+          <w:i/>
+          <w:sz w:val="21"/>
+        </w:rPr>
+        <w:t xml:space="preserve">Figure 4.15 : Espace Manager — candidatures relevant du périmètre du manager</w:t>
+      </w:r>
+    </w:p>
+    <w:p>
+      <w:r>
+        <w:t xml:space="preserve">Un manager ne voit que les candidatures relevant de son périmètre — la liste des destinataires gelée sur le dossier au moment de sa transmission, résolue par ManagerRoutingService puis lue par ManagerScopeService (section 3.5.4) —, à partir de leur entrée en évaluation technique (statut TECHNICAL_TEST), et non dès la validation du CV par le RH. Cette vue cloisonnée est distincte de la liste globale accessible au RH et à l’administrateur (figure 4.3) ; la figure 4.15 en montre un exemple.</w:t>
+      </w:r>
+    </w:p>
+    <w:p>
+      <w:pPr>
+        <w:keepNext/>
+        <w:spacing w:after="40" w:before="0"/>
+        <w:jc w:val="center"/>
+      </w:pPr>
+      <w:r>
+        <w:rPr>
+          <w:noProof/>
+        </w:rPr>
+        <w:pict w14:anchorId="1ABB31E4">
+          <v:shape id="Picture 17" o:spid="_x0000_i1060" type="#_x0000_t75" style="visibility:visible;mso-wrap-style:square;width:453.3pt;height:298.5pt">
+            <v:imagedata r:id="rId902" o:title=""/>
+          </v:shape>
+        </w:pict>
+      </w:r>
+    </w:p>
+    <w:p>
+      <w:pPr>
+        <w:jc w:val="center"/>
+        <w:rPr>
+          <w:i/>
+          <w:sz w:val="21"/>
+        </w:rPr>
+      </w:pPr>
+      <w:r>
+        <w:rPr>
+          <w:i/>
+          <w:sz w:val="21"/>
+        </w:rPr>
+        <w:t xml:space="preserve">Figure 4.16 : Espace Manager — page « Mon calendrier d’entretiens », prochains entretiens, rappels et entretiens passés</w:t>
+      </w:r>
+    </w:p>
+    <w:p>
+      <w:r>
+        <w:t xml:space="preserve">La page « Mon calendrier d’entretiens », reproduite en figure 4.16, est en lecture seule : les données y sont filtrées côté serveur sur la seule identité de l’intervieweur connecté, reprise du jeton d’authentification, et le même contrôle d’accès au dossier candidat s’applique que pour la liste des dossiers, de sorte qu’un manager ne voit que les entretiens où il est nommément désigné.</w:t>
+      </w:r>
+    </w:p>
+    <w:p>
+      <w:r>
+        <w:t xml:space="preserve">La partie haute de la figure 4.16 donne les trois prochains rendez-vous actifs, chacun avec l’heure, la date, le candidat, le poste, le format et, une fois le lien produit par l’agent de planification, le bouton « Rejoindre le lien Google Meet » ; l’encart « Rappels » y rappelle qu’un e-mail de rappel est planifié deux heures avant chaque entretien dont l’utilisateur est l’intervieweur. La section « Entretiens passés ce mois-ci » permet de reprendre un dossier déjà vu : le manager peut y marquer l’entretien comme effectué et, tant que le dossier est encore en cours d’instruction, l’ouvrir directement par le bouton « Donner mon avis », qui amène la fiche du dossier où l’avis se saisit. Lorsque l’avis a déjà été rendu ou que le dossier est clôturé, ce bouton disparaît et la carte affiche l’état courant (« Dossier clôturé : candidat embauché », « Dossier clôturé : refus validé par le RH »), pour ne jamais laisser le manager devant une commande sans effet. Plus bas, une grille mensuelle — non reproduite ici — complète la page : chaque événement qu’elle affiche ouvre une fenêtre de détail (candidat, poste, format, date et heure, durée, lieu, notes, lien de connexion), où le lien Google Meet est présenté à part, derrière un bouton explicite « Rejoindre l’entretien », et non sur la carte elle-même, pour qu’une simple consultation du planning ne déclenche pas d’appel visio vers le candidat ; lorsque le lien n’a pas encore été produit par l’agent de planification, la fenêtre l’indique au lieu d’afficher un bouton sans effet.</w:t>
+      </w:r>
+    </w:p>
+    <w:p>
+      <w:pPr>
+        <w:pStyle w:val="Titre3"/>
+      </w:pPr>
+      <w:r>
+        <w:t>4.3.4 Administrateur — comptes, paramétrage et traçabilité</w:t>
+      </w:r>
+    </w:p>
+    <w:p>
+      <w:pPr>
+        <w:keepNext/>
+        <w:spacing w:after="40" w:before="0"/>
         <w:jc w:val="center"/>
       </w:pPr>
       <w:r>
@@ -8295,17 +8848,18 @@
           <w:i/>
           <w:sz w:val="21"/>
         </w:rPr>
-        <w:t xml:space="preserve">Figure 4.5 : Gestion des utilisateurs et des rôles (espace Administrateur)</w:t>
-      </w:r>
-    </w:p>
-    <w:p>
-      <w:r>
-        <w:t>L’écran de la figure 4.5 permet à l’administrateur de gérer l’ensemble des comptes de la plateforme et leurs rôles — un même compte pouvant en cumuler plusieurs —, ainsi que leur rattachement à un département ou, à défaut pour un manager, à une famille de métier.</w:t>
+        <w:t xml:space="preserve">Figure 4.17 : Gestion des utilisateurs et des rôles (espace Administrateur)</w:t>
+      </w:r>
+    </w:p>
+    <w:p>
+      <w:r>
+        <w:t>L’écran de la figure 4.17 permet à l’administrateur de gérer l’ensemble des comptes de la plateforme et leurs rôles — un même compte pouvant en cumuler plusieurs —, ainsi que leur rattachement à un département ou, à défaut pour un manager, à une famille de métier.</w:t>
       </w:r>
     </w:p>
     <w:p>
       <w:pPr>
         <w:keepNext/>
+        <w:spacing w:after="40" w:before="0"/>
         <w:jc w:val="center"/>
       </w:pPr>
       <w:r>
@@ -8332,40 +8886,27 @@
           <w:i/>
           <w:sz w:val="21"/>
         </w:rPr>
-        <w:t xml:space="preserve">Figure 4.6 : Paramétrage du scoring IA par famille de métier</w:t>
-      </w:r>
-    </w:p>
-    <w:p>
-      <w:r>
-        <w:t>Réservé à l’administrateur, l’écran de la figure 4.6 permet d’ajuster, pour chaque famille de métier et chaque niveau de séniorité, la pondération technique / communication / séniorité utilisée par l’agent IA pour calculer le score d’une candidature ; une colonne de contrôle vérifie avant l’enregistrement que les trois poids somment bien à 100 %.</w:t>
-      </w:r>
-    </w:p>
-    <w:p>
-      <w:r>
-        <w:t>L’historique d’audit reproduit en figure A.5 (annexe A) trace tous les changements significatifs d’un dossier — statut, score, routage vers un manager, contre-signature de la décision finale — en précisant la date, l’entité concernée, la nature de l’action, la valeur précédente, la nouvelle valeur et l’auteur de la modification, qu’elle soit initiée manuellement par un utilisateur ou automatiquement par le système (agents n8n) ; la ligne ROUTING y rappelle le manager destinataire et l’origine de l’aiguillage, ce qui garantit la traçabilité de chaque décision prise sur un dossier.</w:t>
-      </w:r>
-      <w:r>
-        <w:t xml:space="preserve"/>
-      </w:r>
-    </w:p>
-    <w:p>
-      <w:r>
-        <w:t xml:space="preserve">J’ai aussi donné à chaque manager une page « Mon calendrier », en lecture seule, qui regroupe ses entretiens du mois et ses trois prochains rendez-vous ; les données y sont filtrées côté serveur sur la seule identité de l’intervieweur connecté, reprise du jeton d’authentification, et le même contrôle d’accès au dossier candidat s’applique que pour la liste des dossiers, de sorte qu’un manager ne peut voir que les entretiens où il est nommément désigné.</w:t>
+        <w:t xml:space="preserve">Figure 4.18 : Paramétrage du scoring IA par famille de métier</w:t>
+      </w:r>
+    </w:p>
+    <w:p>
+      <w:r>
+        <w:t>Réservé à l’administrateur, l’écran de la figure 4.18 permet d’ajuster, pour chaque famille de métier et chaque niveau de séniorité, la pondération technique / communication / séniorité utilisée par l’agent IA pour calculer le score d’une candidature ; une colonne de contrôle vérifie avant l’enregistrement que les trois poids somment bien à 100 %.</w:t>
       </w:r>
     </w:p>
     <w:p>
       <w:pPr>
         <w:keepNext/>
+        <w:spacing w:after="40" w:before="0"/>
         <w:jc w:val="center"/>
-        <w:spacing w:before="40" w:after="0" w:line="240" w:lineRule="auto"/>
       </w:pPr>
       <w:r>
         <w:rPr>
           <w:noProof/>
         </w:rPr>
-        <w:pict w14:anchorId="580FE8B9">
-          <v:shape id="Picture 5" o:spid="_x0000_i1052" type="#_x0000_t75" style="visibility:visible;mso-wrap-style:square;width:363.5pt;height:490.0pt;visibility:visible">
-            <v:imagedata r:id="rId900" o:title=""/>
+        <w:pict w14:anchorId="66625CE5">
+          <v:shape id="Image 23" o:spid="_x0000_i1050" type="#_x0000_t75" style="width:453.3pt;height:290.4pt;visibility:visible;mso-wrap-style:square">
+            <v:imagedata r:id="rId36" o:title=""/>
           </v:shape>
         </w:pict>
       </w:r>
@@ -8383,17 +8924,12 @@
           <w:i/>
           <w:sz w:val="21"/>
         </w:rPr>
-        <w:t xml:space="preserve">Figure 4.7 : Assistant conversationnel candidat (chatbot)</w:t>
-      </w:r>
-    </w:p>
-    <w:p>
-      <w:r>
-        <w:t xml:space="preserve">Disponible uniquement pour un candidat authentifié, le widget de la figure 4.7 permet de poser des questions en langage naturel sur le suivi de ses propres candidatures ou sur le fonctionnement général de la plateforme (offres, Job idéal, retrait de candidature, etc.). Les réponses sont générées par un modèle de raisonnement (z-ai/glm-5.3-flash, via l’API OpenRouter) à partir d’un contexte constitué côté serveur par une liste blanche de champs : intitulé du poste, libellé du statut, date de candidature, entretiens et, le cas échéant, les feedbacks explicitement transmis au candidat. Les champs internes (score et résumé générés par l’agent de scoring, correction manuelle du RH, identité de l’intervieweur, notes internes d’entretien) n’entrent pas dans cette liste et ne quittent donc pas le back-end vers le prompt ; ce filtre structurel, complété par les consignes du message système, a été vérifié sur les scénarios testés, y compris une tentative d’injection de prompt.</w:t>
-      </w:r>
-    </w:p>
-    <w:p>
-      <w:r>
-        <w:t xml:space="preserve">La figure A.6 (annexe A) montre un candidat connecté postulant directement depuis une offre : le formulaire pré-remplit son e-mail de compte, valide le format du CV (PDF, DOC, DOCX) et confirme visuellement la sélection avant l’envoi. C’est ce dépôt qui déclenche la chaîne décrite en section 3.5.3 (extraction du texte par l’agent n8n, analyse par l’API de Cohere appelée par le back-end, score automatique).</w:t>
+        <w:t xml:space="preserve">Figure 4.19 : Historique d’audit</w:t>
+      </w:r>
+    </w:p>
+    <w:p>
+      <w:r>
+        <w:t>L’historique d’audit reproduit en figure 4.19 trace tous les changements significatifs d’un dossier — statut, score, routage vers un manager, contre-signature de la décision finale — en précisant la date, l’entité concernée, la nature de l’action, la valeur précédente, la nouvelle valeur et l’auteur de la modification, qu’elle soit initiée manuellement par un utilisateur ou automatiquement par le système (agents n8n) ; la ligne ROUTING y rappelle le manager destinataire et l’origine de l’aiguillage, ce qui garantit la traçabilité de chaque décision prise sur un dossier.</w:t>
       </w:r>
       <w:r>
         <w:t xml:space="preserve"/>
@@ -8401,16 +8937,25 @@
     </w:p>
     <w:p>
       <w:pPr>
+        <w:pStyle w:val="Titre3"/>
+      </w:pPr>
+      <w:r>
+        <w:t>4.3.5 Automatisation n8n et notification du candidat</w:t>
+      </w:r>
+    </w:p>
+    <w:p>
+      <w:pPr>
         <w:keepNext/>
+        <w:spacing w:after="40" w:before="0"/>
         <w:jc w:val="center"/>
       </w:pPr>
       <w:r>
         <w:rPr>
           <w:noProof/>
         </w:rPr>
-        <w:pict w14:anchorId="580FE8B9">
-          <v:shape id="Picture 5" o:spid="_x0000_i1052" type="#_x0000_t75" style="width:424.8pt;height:191.4pt;visibility:visible;mso-wrap-style:square">
-            <v:imagedata r:id="rId38" o:title=""/>
+        <w:pict w14:anchorId="1ABB31E4">
+          <v:shape id="Picture 18" o:spid="_x0000_i1061" type="#_x0000_t75" style="width:425.0pt;height:215.3pt;visibility:visible;mso-wrap-style:square">
+            <v:imagedata r:id="rId903" o:title=""/>
           </v:shape>
         </w:pict>
       </w:r>
@@ -8428,26 +8973,27 @@
           <w:i/>
           <w:sz w:val="21"/>
         </w:rPr>
-        <w:t xml:space="preserve">Figure 4.8 : Fonctionnalité « Job idéal » — suggestions d’offres selon le CV</w:t>
-      </w:r>
-    </w:p>
-    <w:p>
-      <w:r>
-        <w:t xml:space="preserve">Comme l’illustre la figure 4.8, un visiteur ou un candidat qui ne postule à aucune offre précise peut déposer son CV et recevoir une liste des offres actives classées par pourcentage de compatibilité, calculée par l’API de Cohere (badge « Analyse IA (Cohere) », avec repli automatique sur un classement par mots-clés si l’IA est indisponible).</w:t>
+        <w:t xml:space="preserve">Figure 4.20 : Console n8n — les trois flux d’automatisation publiés et leurs statistiques</w:t>
+      </w:r>
+    </w:p>
+    <w:p>
+      <w:r>
+        <w:t xml:space="preserve">Au-delà des interfaces de la plateforme, la chaîne d’automatisation a été vérifiée dans la console n8n elle-même. La figure 4.20 montre les trois flux déclarés dans l’application — « Agent 1 — CV Parser + Score IA + Email Candidat », « Agent 2 — Planification entretien + Email participants » et « Agent 3 — RH vers Manager (dossier validé) » — tous trois à l’état Publié, avec quinze exécutions sur l’instance locale ayant servi à la démonstration, aucun échec dans cet échantillon (taux d’échec 0 %) et une durée moyenne d’exécution de 3,61 s. Ces mesures relèvent d’un environnement local et non d’une exploitation en production ; l’échantillon reste trop limité pour valoir test de charge ou garantie de disponibilité.</w:t>
       </w:r>
     </w:p>
     <w:p>
       <w:pPr>
         <w:keepNext/>
+        <w:spacing w:after="40" w:before="0"/>
         <w:jc w:val="center"/>
       </w:pPr>
       <w:r>
         <w:rPr>
           <w:noProof/>
         </w:rPr>
-        <w:pict w14:anchorId="6E2178D7">
-          <v:shape id="Picture 9" o:spid="_x0000_i1053" type="#_x0000_t75" style="visibility:visible;mso-wrap-style:square;width:332.0pt;height:300.0pt;visibility:visible">
-            <v:imagedata r:id="rId39" o:title=""/>
+        <w:pict w14:anchorId="1ABB31E4">
+          <v:shape id="Picture 19" o:spid="_x0000_i1062" type="#_x0000_t75" style="width:425.0pt;height:189.3pt;visibility:visible;mso-wrap-style:square">
+            <v:imagedata r:id="rId904" o:title=""/>
           </v:shape>
         </w:pict>
       </w:r>
@@ -8465,27 +9011,18 @@
           <w:i/>
           <w:sz w:val="21"/>
         </w:rPr>
-        <w:t xml:space="preserve">Figure 4.9 : Analyse détaillée d’une candidature par intelligence artificielle</w:t>
-      </w:r>
-    </w:p>
-    <w:p>
-      <w:r>
-        <w:t xml:space="preserve">Le détail d’une candidature, reproduit en figure 4.9, expose, au-delà du score global visible en liste (figure 4.3), la répartition par critère — technique, communication, adéquation séniorité —, le bouton « Corriger le score » et, le cas échéant, la correction manuelle appliquée par un RH avec sa justification, conformément au principe de contrôle humain décrit en section 4.6. Y figurent également les notes internes, réservées aux rôles RH et administrateur, et l’activité des agents n8n sur le dossier.</w:t>
-      </w:r>
-    </w:p>
-    <w:p>
-      <w:r>
-        <w:t xml:space="preserve">Un manager ne voit que les candidatures relevant de son périmètre — la liste des destinataires gelée sur le dossier au moment de sa transmission, résolue par ManagerRoutingService puis lue par ManagerScopeService (section 3.5.4) —, à partir de leur entrée en évaluation technique (statut TECHNICAL_TEST), et non dès la validation du CV par le RH. Cette vue cloisonnée est distincte de la liste globale accessible au RH et à l’administrateur (figure 4.3) ; la figure A.7 (annexe A) en montre un exemple.</w:t>
-      </w:r>
-    </w:p>
-    <w:p>
-      <w:r>
-        <w:t xml:space="preserve">Le manager dispose en outre d’une page « Mon calendrier d’entretiens » qui centralise les entretiens dont il est l’intervieweur : ses prochaines sessions avec le lien de visioconférence, l’encart consacré aux rappels et la vue mensuelle ; un rappel automatique y est annoncé deux heures avant chaque entretien. Chaque événement de la grille ouvre une fenêtre de détail (candidat, poste, format, date et heure, durée, lieu, notes, lien de connexion) ; le lien Google Meet y est présenté à part, derrière un bouton explicite « Rejoindre l’entretien », et non sur la carte elle-même, pour qu’une simple consultation du planning ne déclenche pas d’appel visio vers le candidat. Lorsque le lien n’a pas encore été produit par l’agent de planification, la fenêtre l’indique au lieu d’afficher un bouton sans effet.</w:t>
+        <w:t xml:space="preserve">Figure 4.21 : Flux n8n de l’Agent 1 — webhook de candidature, appel du scoring Cohere puis e-mail au candidat</w:t>
+      </w:r>
+    </w:p>
+    <w:p>
+      <w:r>
+        <w:t xml:space="preserve">Le détail de l’Agent 1 (figure 4.21) confirme le découpage des responsabilités décrit au chapitre 3 : le webhook « Nouvelle candidature » reçoit l’événement POST émis par Spring Boot, le nœud « Cohere — Score IA (Spring Boot) » rappelle le back-end qui interroge réellement l’API de Cohere et persiste le score, puis « Préparer données email » alimente le nœud d’envoi de la confirmation au candidat.</w:t>
       </w:r>
     </w:p>
     <w:p>
       <w:pPr>
         <w:keepNext/>
+        <w:spacing w:after="40" w:before="0"/>
         <w:jc w:val="center"/>
       </w:pPr>
       <w:r>
@@ -8493,8 +9030,8 @@
           <w:noProof/>
         </w:rPr>
         <w:pict w14:anchorId="1ABB31E4">
-          <v:shape id="Picture 17" o:spid="_x0000_i1060" type="#_x0000_t75" style="visibility:visible;mso-wrap-style:square;width:453.3pt;height:347.1pt">
-            <v:imagedata r:id="rId902" o:title=""/>
+          <v:shape id="Picture 110" o:spid="_x0000_i1063" type="#_x0000_t75" style="width:371.0pt;height:250.0pt;visibility:visible;mso-wrap-style:square">
+            <v:imagedata r:id="rId905" o:title=""/>
           </v:shape>
         </w:pict>
       </w:r>
@@ -8512,96 +9049,12 @@
           <w:i/>
           <w:sz w:val="21"/>
         </w:rPr>
-        <w:t xml:space="preserve">Figure 4.10 : Espace Manager — page « Mon calendrier d’entretiens », prochaines sessions et rappels</w:t>
-      </w:r>
-    </w:p>
-    <w:p>
-      <w:r>
-        <w:t xml:space="preserve">Au-delà des interfaces de la plateforme, la chaîne d’automatisation a été vérifiée dans la console n8n elle-même. La figure A.8, en annexe, montre les trois flux déclarés dans l’application — « Agent 1 — CV Parser + Score IA + Email Candidat », « Agent 2 — Planification entretien + Email participants » et « Agent 3 — RH vers Manager (dossier validé) » — tous trois à l’état Publié, avec quinze exécutions sur l’instance locale ayant servi à la démonstration, aucun échec dans cet échantillon (taux d’échec 0 %) et une durée moyenne d’exécution de 3,61 s. Ces mesures relèvent d’un environnement local et non d’une exploitation en production ; l’échantillon reste trop limité pour valoir test de charge ou garantie de disponibilité.</w:t>
-      </w:r>
-    </w:p>
-    <w:p>
-      <w:r>
-        <w:t xml:space="preserve">Le détail de l’Agent 1 (figure A.9, en annexe) confirme le découpage des responsabilités décrit au chapitre 3 : le webhook « Nouvelle candidature » reçoit l’événement POST émis par Spring Boot, le nœud « Cohere — Score IA (Spring Boot) » rappelle le back-end qui interroge réellement l’API de Cohere et persiste le score, puis « Préparer données email » alimente le nœud d’envoi de la confirmation au candidat.</w:t>
-      </w:r>
-    </w:p>
-    <w:p>
-      <w:r>
-        <w:t xml:space="preserve">Côté candidat, la notification produite par ce flux arrive bien dans sa boîte de réception (figure A.10, en annexe) : accusé de réception nominatif pour le poste visé, score d’analyse IA obtenu et horodatage du traitement, avec la mention « Cet email a été envoyé automatiquement par la plateforme JOB4YOU ».</w:t>
-      </w:r>
-    </w:p>
-    <w:p>
-      <w:pPr>
-        <w:keepNext/>
-        <w:jc w:val="center"/>
-      </w:pPr>
-      <w:r>
-        <w:rPr>
-          <w:noProof/>
-        </w:rPr>
-        <w:pict w14:anchorId="1ABB31E4">
-          <v:shape id="Picture 411" o:spid="_x0000_i1911" type="#_x0000_t75" style="visibility:visible;mso-wrap-style:square;width:264.0pt;height:289.0pt">
-            <v:imagedata r:id="rId960" o:title=""/>
-          </v:shape>
-        </w:pict>
-      </w:r>
-    </w:p>
-    <w:p>
-      <w:pPr>
-        <w:jc w:val="center"/>
-        <w:rPr>
-          <w:i/>
-          <w:sz w:val="21"/>
-        </w:rPr>
-      </w:pPr>
-      <w:r>
-        <w:rPr>
-          <w:i/>
-          <w:sz w:val="21"/>
-        </w:rPr>
-        <w:t xml:space="preserve">Figure 4.11 : Contre-signature RH d’un avis favorable « Valider l’embauche »</w:t>
-      </w:r>
-    </w:p>
-    <w:p>
-      <w:r>
-        <w:t xml:space="preserve">La modale de la figure 4.11 : le RH contre-signe l’avis favorable du manager avant l’embauche ; la date de présentation y est obligatoire, car elle alimente l’e-mail de convocation.</w:t>
-      </w:r>
-    </w:p>
-    <w:p>
-      <w:pPr>
-        <w:keepNext/>
-        <w:jc w:val="center"/>
-      </w:pPr>
-      <w:r>
-        <w:rPr>
-          <w:noProof/>
-        </w:rPr>
-        <w:pict w14:anchorId="1ABB31E4">
-          <v:shape id="Picture 412" o:spid="_x0000_i1912" type="#_x0000_t75" style="visibility:visible;mso-wrap-style:square;width:264.0pt;height:279.4pt">
-            <v:imagedata r:id="rId961" o:title=""/>
-          </v:shape>
-        </w:pict>
-      </w:r>
-    </w:p>
-    <w:p>
-      <w:pPr>
-        <w:jc w:val="center"/>
-        <w:rPr>
-          <w:i/>
-          <w:sz w:val="21"/>
-        </w:rPr>
-      </w:pPr>
-      <w:r>
-        <w:rPr>
-          <w:i/>
-          <w:sz w:val="21"/>
-        </w:rPr>
-        <w:t xml:space="preserve">Figure 4.12 : Contre-signature RH d’un refus proposé — modale « Confirmer le refus »</w:t>
-      </w:r>
-    </w:p>
-    <w:p>
-      <w:r>
-        <w:t xml:space="preserve">La modale « Confirmer le refus » de la figure 4.12 : le RH contre-signe le refus proposé par le manager ; le motif y est obligatoire, car il alimente l’e-mail de refus final.</w:t>
+        <w:t xml:space="preserve">Figure 4.22 : E-mail automatique de confirmation de candidature reçu par le candidat</w:t>
+      </w:r>
+    </w:p>
+    <w:p>
+      <w:r>
+        <w:t xml:space="preserve">Côté candidat, la notification produite par ce flux arrive bien dans sa boîte de réception (figure 4.22) : accusé de réception nominatif pour le poste visé, score d’analyse IA obtenu et horodatage du traitement, avec la mention « Cet email a été envoyé automatiquement par la plateforme JOB4YOU ».</w:t>
       </w:r>
     </w:p>
     <w:p>
@@ -11002,7 +11455,7 @@
     </w:p>
     <w:p>
       <w:r>
-        <w:t xml:space="preserve">L’explicabilité est produite par le service SkillNormalizationService, appelé avant le modèle de langage : il harmonise les alias (k8s devient Kubernetes, postgres devient PostgreSQL) et refuse les fusions abusives — Spring Boot n’est pas Spring Cloud, Angular n’est pas AngularJS, Java n’est pas JavaScript — puis restitue les compétences validées (matchedSkills) et manquantes (missingSkills) avec un taux de recouvrement technique qui ne peut pas descendre sous 30/100. Ces éléments alimentent les badges affichés dans le détail d’une candidature (figure 4.9) et la synthèse enregistrée dans aiSummary [23].</w:t>
+        <w:t xml:space="preserve">L’explicabilité est produite par le service SkillNormalizationService, appelé avant le modèle de langage : il harmonise les alias (k8s devient Kubernetes, postgres devient PostgreSQL) et refuse les fusions abusives — Spring Boot n’est pas Spring Cloud, Angular n’est pas AngularJS, Java n’est pas JavaScript — puis restitue les compétences validées (matchedSkills) et manquantes (missingSkills) avec un taux de recouvrement technique qui ne peut pas descendre sous 30/100. Ces éléments alimentent les badges affichés dans le détail d’une candidature (figure 4.8) et la synthèse enregistrée dans aiSummary [23].</w:t>
       </w:r>
     </w:p>
     <w:p>
@@ -11012,7 +11465,7 @@
     </w:p>
     <w:p>
       <w:r>
-        <w:t xml:space="preserve">J’ai vérifié ce parcours de bout en bout sur un dossier volontairement placé en zone grise : signalement dans l’interface, correction justifiée depuis un compte RH, puis contrôle de la ligne correspondante dans le journal d’audit (figure A.5). Le score produit par l’IA restant consultable après coup, l’écart entre l’évaluation automatique et l’expertise humaine peut être mesuré et documenté.</w:t>
+        <w:t xml:space="preserve">J’ai vérifié ce parcours de bout en bout sur un dossier volontairement placé en zone grise : signalement dans l’interface, correction justifiée depuis un compte RH, puis contrôle de la ligne correspondante dans l’historique d’audit (figure 4.19). Le score produit par l’IA restant consultable après coup, l’écart entre l’évaluation automatique et l’expertise humaine peut être mesuré et documenté.</w:t>
       </w:r>
     </w:p>
     <w:p>
@@ -12120,355 +12573,6 @@
     <w:p>
       <w:r>
         <w:t xml:space="preserve">Les principales fonctionnalités prévues pour ce projet ont été développées et vérifiées à l’aide des scénarios décrits dans ce rapport : JOB4YOU répond aux besoins identifiés et couvre l’ensemble du cycle, de la publication d’une offre jusqu’à la décision finale. Les objectifs de performance restent en revanche à mesurer, et plusieurs mesures de sécurité et de gouvernance des données doivent être finalisées avant une mise en préproduction — validation du contenu des fichiers téléversés, politique de rétention et d’effacement des données, encadrement des transferts vers Cohere et OpenRouter. Le système constitue donc un prototype fonctionnel, appelé à être industrialisé pour un déploiement chez Sopra HR Software Tunisie, plutôt qu’une solution dont l’aptitude à la production serait déjà démontrée. Cette expérience m’a permis de concevoir, sécuriser, tester et faire évoluer une solution logicielle complète.</w:t>
-      </w:r>
-    </w:p>
-    <w:p>
-      <w:pPr>
-        <w:pStyle w:val="Titre1"/>
-        <w:pageBreakBefore/>
-      </w:pPr>
-      <w:r>
-        <w:t xml:space="preserve">Annexe A — Captures d’écran complémentaires</w:t>
-      </w:r>
-    </w:p>
-    <w:p>
-      <w:pPr/>
-      <w:r>
-        <w:t xml:space="preserve">Cette annexe regroupe dix captures complémentaires de la plateforme, citées dans le chapitre 4 mais non reproduites dans le corps du rapport afin d’en préserver la lisibilité. Comme les figures du corps, elles proviennent de l’application en fonctionnement.</w:t>
-      </w:r>
-    </w:p>
-    <w:p>
-      <w:pPr>
-        <w:keepNext/>
-        <w:jc w:val="center"/>
-      </w:pPr>
-      <w:r>
-        <w:rPr>
-          <w:noProof/>
-        </w:rPr>
-        <w:pict w14:anchorId="5BF0AF37">
-          <v:shape id="Image 14" o:spid="_x0000_i1041" type="#_x0000_t75" style="width:235.3pt;height:470.0pt;visibility:visible;mso-wrap-style:square">
-            <v:imagedata r:id="rId27" o:title=""/>
-          </v:shape>
-        </w:pict>
-      </w:r>
-    </w:p>
-    <w:p>
-      <w:pPr>
-        <w:jc w:val="center"/>
-        <w:rPr>
-          <w:i/>
-          <w:sz w:val="21"/>
-        </w:rPr>
-      </w:pPr>
-      <w:r>
-        <w:rPr>
-          <w:i/>
-          <w:sz w:val="21"/>
-        </w:rPr>
-        <w:t xml:space="preserve">Figure A.1 : Page de connexion</w:t>
-      </w:r>
-    </w:p>
-    <w:p>
-      <w:pPr>
-        <w:keepNext/>
-        <w:jc w:val="center"/>
-      </w:pPr>
-      <w:r>
-        <w:rPr>
-          <w:noProof/>
-        </w:rPr>
-        <w:pict w14:anchorId="0B44AC1E">
-          <v:shape id="Image 17" o:spid="_x0000_i1044" type="#_x0000_t75" style="visibility:visible;mso-wrap-style:square;width:425.0pt;height:452.2pt">
-            <v:imagedata r:id="rId30" o:title=""/>
-          </v:shape>
-        </w:pict>
-      </w:r>
-    </w:p>
-    <w:p>
-      <w:pPr>
-        <w:jc w:val="center"/>
-        <w:rPr>
-          <w:i/>
-          <w:sz w:val="21"/>
-        </w:rPr>
-      </w:pPr>
-      <w:r>
-        <w:rPr>
-          <w:i/>
-          <w:sz w:val="21"/>
-        </w:rPr>
-        <w:t xml:space="preserve">Figure A.2 : Modification d’un dossier candidat</w:t>
-      </w:r>
-    </w:p>
-    <w:p>
-      <w:pPr>
-        <w:keepNext/>
-        <w:jc w:val="center"/>
-      </w:pPr>
-      <w:r>
-        <w:rPr>
-          <w:noProof/>
-        </w:rPr>
-        <w:pict w14:anchorId="61C2271E">
-          <v:shape id="Image 19" o:spid="_x0000_i1046" type="#_x0000_t75" style="width:453.3pt;height:290.4pt;visibility:visible;mso-wrap-style:square">
-            <v:imagedata r:id="rId32" o:title=""/>
-          </v:shape>
-        </w:pict>
-      </w:r>
-    </w:p>
-    <w:p>
-      <w:pPr>
-        <w:jc w:val="center"/>
-        <w:rPr>
-          <w:i/>
-          <w:sz w:val="21"/>
-        </w:rPr>
-      </w:pPr>
-      <w:r>
-        <w:rPr>
-          <w:i/>
-          <w:sz w:val="21"/>
-        </w:rPr>
-        <w:t xml:space="preserve">Figure A.3 : Gestion des entretiens</w:t>
-      </w:r>
-    </w:p>
-    <w:p>
-      <w:pPr>
-        <w:keepNext/>
-        <w:jc w:val="center"/>
-      </w:pPr>
-      <w:r>
-        <w:rPr>
-          <w:noProof/>
-        </w:rPr>
-        <w:pict w14:anchorId="4A63A72C">
-          <v:shape id="Image 20" o:spid="_x0000_i1047" type="#_x0000_t75" style="width:453.3pt;height:290.4pt;visibility:visible;mso-wrap-style:square">
-            <v:imagedata r:id="rId33" o:title=""/>
-          </v:shape>
-        </w:pict>
-      </w:r>
-    </w:p>
-    <w:p>
-      <w:pPr>
-        <w:jc w:val="center"/>
-        <w:rPr>
-          <w:i/>
-          <w:sz w:val="21"/>
-        </w:rPr>
-      </w:pPr>
-      <w:r>
-        <w:rPr>
-          <w:i/>
-          <w:sz w:val="21"/>
-        </w:rPr>
-        <w:t xml:space="preserve">Figure A.4 : Gestion des feedbacks</w:t>
-      </w:r>
-    </w:p>
-    <w:p>
-      <w:pPr>
-        <w:keepNext/>
-        <w:jc w:val="center"/>
-      </w:pPr>
-      <w:r>
-        <w:rPr>
-          <w:noProof/>
-        </w:rPr>
-        <w:pict w14:anchorId="66625CE5">
-          <v:shape id="Image 23" o:spid="_x0000_i1050" type="#_x0000_t75" style="width:453.3pt;height:290.4pt;visibility:visible;mso-wrap-style:square">
-            <v:imagedata r:id="rId36" o:title=""/>
-          </v:shape>
-        </w:pict>
-      </w:r>
-    </w:p>
-    <w:p>
-      <w:pPr>
-        <w:jc w:val="center"/>
-        <w:rPr>
-          <w:i/>
-          <w:sz w:val="21"/>
-        </w:rPr>
-      </w:pPr>
-      <w:r>
-        <w:rPr>
-          <w:i/>
-          <w:sz w:val="21"/>
-        </w:rPr>
-        <w:t xml:space="preserve">Figure A.5 : Historique d’audit</w:t>
-      </w:r>
-    </w:p>
-    <w:p>
-      <w:pPr>
-        <w:keepNext/>
-        <w:jc w:val="center"/>
-      </w:pPr>
-      <w:r>
-        <w:rPr>
-          <w:noProof/>
-        </w:rPr>
-        <w:pict w14:anchorId="65301F00">
-          <v:shape id="Picture 8" o:spid="_x0000_i1051" type="#_x0000_t75" style="visibility:visible;mso-wrap-style:square;width:384.9pt;height:390.0pt">
-            <v:imagedata r:id="rId37" o:title=""/>
-          </v:shape>
-        </w:pict>
-      </w:r>
-    </w:p>
-    <w:p>
-      <w:pPr>
-        <w:sectPr>
-          <w:type w:val="nextPage"/>
-          <w:pgSz w:w="11906" w:h="16838"/>
-          <w:pgMar w:top="1420" w:right="1140" w:bottom="1420" w:left="1700" w:header="708" w:footer="708" w:gutter="0"/>
-          <w:cols w:space="708"/>
-          <w:docGrid w:linePitch="360"/>
-        </w:sectPr>
-        <w:jc w:val="center"/>
-        <w:rPr>
-          <w:i/>
-          <w:sz w:val="21"/>
-        </w:rPr>
-      </w:pPr>
-      <w:r>
-        <w:rPr>
-          <w:i/>
-          <w:sz w:val="21"/>
-        </w:rPr>
-        <w:t xml:space="preserve">Figure A.6 : Soumission d’une candidature avec dépôt de CV</w:t>
-      </w:r>
-    </w:p>
-    <w:p>
-      <w:pPr>
-        <w:keepNext/>
-        <w:jc w:val="center"/>
-      </w:pPr>
-      <w:r>
-        <w:rPr>
-          <w:noProof/>
-        </w:rPr>
-        <w:pict w14:anchorId="1ABB31E4">
-          <v:shape id="Picture 7" o:spid="_x0000_i1054" type="#_x0000_t75" style="visibility:visible;mso-wrap-style:square;width:700.0pt;height:389.9pt">
-            <v:imagedata r:id="rId40" o:title=""/>
-          </v:shape>
-        </w:pict>
-      </w:r>
-    </w:p>
-    <w:p>
-      <w:pPr>
-        <w:sectPr>
-          <w:type w:val="nextPage"/>
-          <w:pgSz w:w="16838" w:h="11906" w:orient="landscape"/>
-          <w:pgMar w:top="1420" w:right="1140" w:bottom="1420" w:left="1140" w:header="708" w:footer="708" w:gutter="0"/>
-          <w:cols w:space="708"/>
-          <w:docGrid w:linePitch="360"/>
-        </w:sectPr>
-        <w:jc w:val="center"/>
-        <w:rPr>
-          <w:i/>
-          <w:sz w:val="21"/>
-        </w:rPr>
-      </w:pPr>
-      <w:r>
-        <w:rPr>
-          <w:i/>
-          <w:sz w:val="21"/>
-        </w:rPr>
-        <w:t xml:space="preserve">Figure A.7 : Espace Manager — candidatures relevant du périmètre du manager</w:t>
-      </w:r>
-    </w:p>
-    <w:p>
-      <w:pPr>
-        <w:keepNext/>
-        <w:jc w:val="center"/>
-      </w:pPr>
-      <w:r>
-        <w:rPr>
-          <w:noProof/>
-        </w:rPr>
-        <w:pict w14:anchorId="1ABB31E4">
-          <v:shape id="Picture 18" o:spid="_x0000_i1061" type="#_x0000_t75" style="width:425.0pt;height:215.3pt;visibility:visible;mso-wrap-style:square">
-            <v:imagedata r:id="rId903" o:title=""/>
-          </v:shape>
-        </w:pict>
-      </w:r>
-    </w:p>
-    <w:p>
-      <w:pPr>
-        <w:jc w:val="center"/>
-        <w:rPr>
-          <w:i/>
-          <w:sz w:val="21"/>
-        </w:rPr>
-      </w:pPr>
-      <w:r>
-        <w:rPr>
-          <w:i/>
-          <w:sz w:val="21"/>
-        </w:rPr>
-        <w:t xml:space="preserve">Figure A.8 : Console n8n — les trois flux d’automatisation publiés et leurs statistiques</w:t>
-      </w:r>
-    </w:p>
-    <w:p>
-      <w:pPr>
-        <w:keepNext/>
-        <w:jc w:val="center"/>
-      </w:pPr>
-      <w:r>
-        <w:rPr>
-          <w:noProof/>
-        </w:rPr>
-        <w:pict w14:anchorId="1ABB31E4">
-          <v:shape id="Picture 19" o:spid="_x0000_i1062" type="#_x0000_t75" style="width:425.0pt;height:189.3pt;visibility:visible;mso-wrap-style:square">
-            <v:imagedata r:id="rId904" o:title=""/>
-          </v:shape>
-        </w:pict>
-      </w:r>
-    </w:p>
-    <w:p>
-      <w:pPr>
-        <w:jc w:val="center"/>
-        <w:rPr>
-          <w:i/>
-          <w:sz w:val="21"/>
-        </w:rPr>
-      </w:pPr>
-      <w:r>
-        <w:rPr>
-          <w:i/>
-          <w:sz w:val="21"/>
-        </w:rPr>
-        <w:t xml:space="preserve">Figure A.9 : Flux n8n de l’Agent 1 — webhook de candidature, appel du scoring Cohere puis e-mail au candidat</w:t>
-      </w:r>
-    </w:p>
-    <w:p>
-      <w:pPr>
-        <w:keepNext/>
-        <w:jc w:val="center"/>
-      </w:pPr>
-      <w:r>
-        <w:rPr>
-          <w:noProof/>
-        </w:rPr>
-        <w:pict w14:anchorId="1ABB31E4">
-          <v:shape id="Picture 110" o:spid="_x0000_i1063" type="#_x0000_t75" style="width:425.0pt;height:286.4pt;visibility:visible;mso-wrap-style:square">
-            <v:imagedata r:id="rId905" o:title=""/>
-          </v:shape>
-        </w:pict>
-      </w:r>
-    </w:p>
-    <w:p>
-      <w:pPr>
-        <w:jc w:val="center"/>
-        <w:rPr>
-          <w:i/>
-          <w:sz w:val="21"/>
-        </w:rPr>
-      </w:pPr>
-      <w:r>
-        <w:rPr>
-          <w:i/>
-          <w:sz w:val="21"/>
-        </w:rPr>
-        <w:t xml:space="preserve">Figure A.10 : E-mail automatique de confirmation de candidature reçu par le candidat</w:t>
       </w:r>
     </w:p>
     <w:p>

</xml_diff>

<commit_message>
fix(scoring): noyau de scoring et de matching fiabilise, rapport et deck alignes sur le Gold Set 20 cas
- SkillNormalizationService: une competence citee sous une negation n'est plus
  comptee comme acquise dans matchedSkills (justification XAI lue par le RH)
- CandidateService: saveAiScore et recomputeAiScore partagent le meme chemin de
  decision (seuil, zone grise,needsHumanReview)
- AiScoringService / CohereClient / MatchingService: parsing de score plus
  strict et bornes explicites
- 3 nouvelles classes de test + tests de non-regression: 190 methodes dans 19
  classes
- gold_set: 4 cas limites (GOLD_17..20) et benchmark re-mesure sur 20 CV
  annotes (19 decisions justes sur 20, faux positif GOLD_18 assume)
- rapport Word/PDF: chapitre 4 re-aligne sur la re-mesure, zone grise jamais
  declenchee sur le Gold Set, compte des tests 190/19 (79 pages, TOC verifie)
- deck de soutenance: meme chiffres, conformite sans loi nationale
</commit_message>
<xml_diff>
--- a/Rapport-PFE/finalreport/Rapport_PFE_Haythem_Bargaoui_beta.docx
+++ b/Rapport-PFE/finalreport/Rapport_PFE_Haythem_Bargaoui_beta.docx
@@ -1913,7 +1913,7 @@
       <w:r>
         <w:t>4.4.2 Tests fonctionnels manuels</w:t>
         <w:tab/>
-        <w:t>63</w:t>
+        <w:t>62</w:t>
       </w:r>
     </w:p>
     <w:p>
@@ -1949,7 +1949,7 @@
       <w:r>
         <w:t>4.4.4 Vérification de bout en bout</w:t>
         <w:tab/>
-        <w:t>65</w:t>
+        <w:t>64</w:t>
       </w:r>
     </w:p>
     <w:p>
@@ -2039,7 +2039,7 @@
       <w:r>
         <w:t>4.5.2 Distinguer un avis manager d’une décision finale RH</w:t>
         <w:tab/>
-        <w:t>67</w:t>
+        <w:t>68</w:t>
       </w:r>
     </w:p>
     <w:p>
@@ -2111,7 +2111,7 @@
       <w:r>
         <w:t>4.5.6 Pertinence du matching Job idéal</w:t>
         <w:tab/>
-        <w:t>68</w:t>
+        <w:t>69</w:t>
       </w:r>
     </w:p>
     <w:p>
@@ -2183,7 +2183,7 @@
       <w:r>
         <w:t>4.5.10 Fiabiliser l’intégration Google Meet et le format des webhooks n8n</w:t>
         <w:tab/>
-        <w:t>69</w:t>
+        <w:t>70</w:t>
       </w:r>
     </w:p>
     <w:p>
@@ -9079,7 +9079,7 @@
     </w:p>
     <w:p>
       <w:r>
-        <w:t xml:space="preserve">Au-delà des vérifications manuelles, la couche service et une partie de la couche controller sont couvertes par une suite de tests automatisés écrite avec JUnit 5 et Mockito [16], exécutée via Maven. Elle comprend 16 classes de test pour un total de 167 méthodes, toutes exécutées sans échec : CandidateServiceTest, JobOfferServiceTest, ManagerRoutingServiceTest, ManagerScopeServiceTest, CandidateRoutingFanOutTest, DepartmentProposalServiceTest, N8nServiceTest, N8nServiceOutboxKeyTest, ScoringWeightProfileServiceTest, AiScoringServiceTest, InterviewServiceTest et InterviewServiceManagerCalendarTest en tests unitaires purs (services isolés à l’aide de doublons Mockito), ainsi que CandidateControllerWorkflowTest, CandidateStatusAnonymousSecurityTest, InterviewManagerCalendarSecurityTest et InterviewMeetLinkSecurityTest en tests de contrôleur reposant sur @WebMvcTest et MockMvc, qui vérifient notamment le comportement des routes accessibles de façon anonyme et la sécurité d’accès au lien Google Meet d’un entretien. Ces tests couvrent en particulier la chaîne de résolution des managers destinataires et son blocage lorsqu’aucun niveau ne résout de destinataire, la transmission effective à chacun des managers d’un même dossier (une clé d’événement par destinataire, relance comprise), l’isolation stricte de la visibilité des dossiers à la liste gelée, le calcul du score IA et ses seuils, le découplage entre planification d’entretien et statut du candidat, ainsi que les garde-fous de transition décrits au chapitre 3.</w:t>
+        <w:t xml:space="preserve">Au-delà des vérifications manuelles, la couche service et une partie de la couche controller sont couvertes par une suite de tests automatisés écrite avec JUnit 5 et Mockito [16], exécutée via Maven. Elle comprend 19 classes de test pour un total de 190 méthodes, toutes exécutées sans échec : CandidateServiceTest, JobOfferServiceTest, ManagerRoutingServiceTest, ManagerScopeServiceTest, CandidateRoutingFanOutTest, DepartmentProposalServiceTest, N8nServiceTest, N8nServiceOutboxKeyTest, ScoringWeightProfileServiceTest, AiScoringServiceTest, SkillNormalizationServiceTest, CohereClientParsingTest, MatchingServiceTest, InterviewServiceTest et InterviewServiceManagerCalendarTest en tests unitaires purs (services isolés à l’aide de doublons Mockito), ainsi que CandidateControllerWorkflowTest, CandidateStatusAnonymousSecurityTest, InterviewManagerCalendarSecurityTest et InterviewMeetLinkSecurityTest en tests de contrôleur reposant sur @WebMvcTest et MockMvc, qui vérifient notamment le comportement des routes accessibles de façon anonyme et la sécurité d’accès au lien Google Meet d’un entretien. Ces tests couvrent en particulier la chaîne de résolution des managers destinataires et son blocage lorsqu’aucun niveau ne résout de destinataire, la transmission effective à chacun des managers d’un même dossier (une clé d’événement par destinataire, relance comprise), l’isolation stricte de la visibilité des dossiers à la liste gelée, le calcul du score IA et ses seuils, la neutralisation d’une compétence que le CV nie explicitement, l’orientation de tout score transmis en zone grise vers un arbitrage humain, le découplage entre planification d’entretien et statut du candidat, ainsi que les garde-fous de transition décrits au chapitre 3.</w:t>
       </w:r>
     </w:p>
     <w:p>
@@ -9117,6 +9117,7 @@
           </w:tcPr>
           <w:p>
             <w:pPr>
+              <w:spacing w:before="0" w:after="0" w:line="240" w:lineRule="auto"/>
               <w:rPr>
                 <w:rFonts w:ascii="Consolas" w:hAnsi="Consolas"/>
                 <w:sz w:val="18"/>
@@ -9132,6 +9133,7 @@
           </w:p>
           <w:p>
             <w:pPr>
+              <w:spacing w:before="0" w:after="0" w:line="240" w:lineRule="auto"/>
               <w:rPr>
                 <w:rFonts w:ascii="Consolas" w:hAnsi="Consolas"/>
                 <w:sz w:val="18"/>
@@ -9147,6 +9149,7 @@
           </w:p>
           <w:p>
             <w:pPr>
+              <w:spacing w:before="0" w:after="0" w:line="240" w:lineRule="auto"/>
               <w:rPr>
                 <w:rFonts w:ascii="Consolas" w:hAnsi="Consolas"/>
                 <w:sz w:val="18"/>
@@ -9162,6 +9165,7 @@
           </w:p>
           <w:p>
             <w:pPr>
+              <w:spacing w:before="0" w:after="0" w:line="240" w:lineRule="auto"/>
               <w:rPr>
                 <w:rFonts w:ascii="Consolas" w:hAnsi="Consolas"/>
                 <w:sz w:val="18"/>
@@ -9177,6 +9181,7 @@
           </w:p>
           <w:p>
             <w:pPr>
+              <w:spacing w:before="0" w:after="0" w:line="240" w:lineRule="auto"/>
               <w:rPr>
                 <w:rFonts w:ascii="Consolas" w:hAnsi="Consolas"/>
                 <w:sz w:val="18"/>
@@ -9192,6 +9197,7 @@
           </w:p>
           <w:p>
             <w:pPr>
+              <w:spacing w:before="0" w:after="0" w:line="240" w:lineRule="auto"/>
               <w:rPr>
                 <w:rFonts w:ascii="Consolas" w:hAnsi="Consolas"/>
                 <w:sz w:val="18"/>
@@ -9207,6 +9213,7 @@
           </w:p>
           <w:p>
             <w:pPr>
+              <w:spacing w:before="0" w:after="0" w:line="240" w:lineRule="auto"/>
               <w:rPr>
                 <w:rFonts w:ascii="Consolas" w:hAnsi="Consolas"/>
                 <w:sz w:val="18"/>
@@ -9222,6 +9229,7 @@
           </w:p>
           <w:p>
             <w:pPr>
+              <w:spacing w:before="0" w:after="0" w:line="240" w:lineRule="auto"/>
               <w:rPr>
                 <w:rFonts w:ascii="Consolas" w:hAnsi="Consolas"/>
                 <w:sz w:val="18"/>
@@ -9237,6 +9245,7 @@
           </w:p>
           <w:p>
             <w:pPr>
+              <w:spacing w:before="0" w:after="0" w:line="240" w:lineRule="auto"/>
               <w:rPr>
                 <w:rFonts w:ascii="Consolas" w:hAnsi="Consolas"/>
                 <w:sz w:val="18"/>
@@ -9252,6 +9261,7 @@
           </w:p>
           <w:p>
             <w:pPr>
+              <w:spacing w:before="0" w:after="0" w:line="240" w:lineRule="auto"/>
               <w:rPr>
                 <w:rFonts w:ascii="Consolas" w:hAnsi="Consolas"/>
                 <w:sz w:val="18"/>
@@ -9267,6 +9277,7 @@
           </w:p>
           <w:p>
             <w:pPr>
+              <w:spacing w:before="0" w:after="0" w:line="240" w:lineRule="auto"/>
               <w:rPr>
                 <w:rFonts w:ascii="Consolas" w:hAnsi="Consolas"/>
                 <w:sz w:val="18"/>
@@ -9282,6 +9293,7 @@
           </w:p>
           <w:p>
             <w:pPr>
+              <w:spacing w:before="0" w:after="0" w:line="240" w:lineRule="auto"/>
               <w:rPr>
                 <w:rFonts w:ascii="Consolas" w:hAnsi="Consolas"/>
                 <w:sz w:val="18"/>
@@ -10626,12 +10638,12 @@
     </w:p>
     <w:p>
       <w:r>
-        <w:t xml:space="preserve">Les tests décrits ci-dessus vérifient que la plateforme fonctionne ; ils ne disent rien de la pertinence du score attribué par l’IA. J’ai donc constitué un jeu de référence — un Gold Set [21] — de seize curriculum vitæ synthétiques, rédigés pour ce projet à partir de profils réalistes mais fictifs : aucun CV réel d’un collaborateur de Sopra HR n’a été employé, ce qui écarte toute question de confidentialité dans la démarche d’évaluation.</w:t>
-      </w:r>
-    </w:p>
-    <w:p>
-      <w:r>
-        <w:t xml:space="preserve">Les seize profils se répartissent sur les trois familles de métiers visées par la plateforme, chacune rattachée à une offre cible : Développeur Backend Java/Spring (offre 115, six profils), DevOps Engineer (offre 117, cinq profils) et Business Analyst (offre 122, cinq profils). Chaque CV porte une vérité terrain binaire, PERTINENT ou NON_PERTINENT, arrêtée sur des critères objectifs — compétences techniques indispensables et séniorité — et non d’après la sortie du modèle : neuf profils sont pertinents, sept sont volontairement hors cible (compétences d’un autre domaine, séniorité insuffisante, outillage sans rapport avec l’offre).</w:t>
+        <w:t xml:space="preserve">Les tests décrits ci-dessus vérifient que la plateforme fonctionne ; ils ne disent rien de la pertinence du score attribué par l’IA. J’ai donc constitué un jeu de référence — un Gold Set [21] — de vingt curriculum vitæ synthétiques, rédigés pour ce projet à partir de profils réalistes mais fictifs : aucun CV réel d’un collaborateur de Sopra HR n’a été employé, ce qui écarte toute question de confidentialité dans la démarche d’évaluation.</w:t>
+      </w:r>
+    </w:p>
+    <w:p>
+      <w:r>
+        <w:t xml:space="preserve">Les vingt profils se répartissent sur les trois familles de métiers visées par la plateforme, chacune rattachée à une offre cible : Développeur Backend Java/Spring (offre 115, sept profils), DevOps Engineer (offre 117, six profils) et Business Analyst (offre 122, sept profils). Chaque CV porte une vérité terrain binaire, PERTINENT ou NON_PERTINENT, arrêtée sur des critères objectifs — compétences techniques indispensables et séniorité — et non d’après la sortie du modèle : onze profils sont pertinents, neuf sont volontairement hors cible (compétences d’un autre domaine, séniorité insuffisante, outillage sans rapport avec l’offre). Quatre cas (GOLD_17 à GOLD_20) ont été écrits pour cette re-evaluation, dont deux construits pour se situer au voisinage immédiat du seuil de décision.</w:t>
       </w:r>
     </w:p>
     <w:p>
@@ -10814,7 +10826,7 @@
               <w:rPr>
                 <w:sz w:val="21"/>
               </w:rPr>
-              <w:t xml:space="preserve">9</w:t>
+              <w:t xml:space="preserve">11</w:t>
             </w:r>
           </w:p>
         </w:tc>
@@ -10833,7 +10845,7 @@
               <w:rPr>
                 <w:sz w:val="21"/>
               </w:rPr>
-              <w:t xml:space="preserve">9</w:t>
+              <w:t xml:space="preserve">11</w:t>
             </w:r>
           </w:p>
         </w:tc>
@@ -10852,7 +10864,7 @@
               <w:rPr>
                 <w:sz w:val="21"/>
               </w:rPr>
-              <w:t xml:space="preserve">8</w:t>
+              <w:t xml:space="preserve">10</w:t>
             </w:r>
           </w:p>
         </w:tc>
@@ -10894,7 +10906,7 @@
               <w:rPr>
                 <w:sz w:val="21"/>
               </w:rPr>
-              <w:t xml:space="preserve">0</w:t>
+              <w:t xml:space="preserve">1</w:t>
             </w:r>
           </w:p>
         </w:tc>
@@ -10913,7 +10925,7 @@
               <w:rPr>
                 <w:sz w:val="21"/>
               </w:rPr>
-              <w:t xml:space="preserve">0</w:t>
+              <w:t xml:space="preserve">1</w:t>
             </w:r>
           </w:p>
         </w:tc>
@@ -10932,7 +10944,7 @@
               <w:rPr>
                 <w:sz w:val="21"/>
               </w:rPr>
-              <w:t xml:space="preserve">0</w:t>
+              <w:t xml:space="preserve">1</w:t>
             </w:r>
           </w:p>
         </w:tc>
@@ -10974,7 +10986,7 @@
               <w:rPr>
                 <w:sz w:val="21"/>
               </w:rPr>
-              <w:t xml:space="preserve">7</w:t>
+              <w:t xml:space="preserve">8</w:t>
             </w:r>
           </w:p>
         </w:tc>
@@ -10993,7 +11005,7 @@
               <w:rPr>
                 <w:sz w:val="21"/>
               </w:rPr>
-              <w:t xml:space="preserve">7</w:t>
+              <w:t xml:space="preserve">8</w:t>
             </w:r>
           </w:p>
         </w:tc>
@@ -11012,7 +11024,7 @@
               <w:rPr>
                 <w:sz w:val="21"/>
               </w:rPr>
-              <w:t xml:space="preserve">7</w:t>
+              <w:t xml:space="preserve">8</w:t>
             </w:r>
           </w:p>
         </w:tc>
@@ -11134,7 +11146,7 @@
               <w:rPr>
                 <w:sz w:val="21"/>
               </w:rPr>
-              <w:t xml:space="preserve">100 %</w:t>
+              <w:t xml:space="preserve">91,7 %</w:t>
             </w:r>
           </w:p>
         </w:tc>
@@ -11153,7 +11165,7 @@
               <w:rPr>
                 <w:sz w:val="21"/>
               </w:rPr>
-              <w:t xml:space="preserve">100 %</w:t>
+              <w:t xml:space="preserve">91,7 %</w:t>
             </w:r>
           </w:p>
         </w:tc>
@@ -11172,7 +11184,7 @@
               <w:rPr>
                 <w:sz w:val="21"/>
               </w:rPr>
-              <w:t xml:space="preserve">100 %</w:t>
+              <w:t xml:space="preserve">90,9 %</w:t>
             </w:r>
           </w:p>
         </w:tc>
@@ -11252,7 +11264,7 @@
               <w:rPr>
                 <w:sz w:val="21"/>
               </w:rPr>
-              <w:t xml:space="preserve">88,9 %</w:t>
+              <w:t xml:space="preserve">90,9 %</w:t>
             </w:r>
           </w:p>
         </w:tc>
@@ -11294,7 +11306,7 @@
               <w:rPr>
                 <w:sz w:val="21"/>
               </w:rPr>
-              <w:t xml:space="preserve">100 %</w:t>
+              <w:t xml:space="preserve">95,7 %</w:t>
             </w:r>
           </w:p>
         </w:tc>
@@ -11313,7 +11325,7 @@
               <w:rPr>
                 <w:sz w:val="21"/>
               </w:rPr>
-              <w:t xml:space="preserve">100 %</w:t>
+              <w:t xml:space="preserve">95,7 %</w:t>
             </w:r>
           </w:p>
         </w:tc>
@@ -11332,7 +11344,7 @@
               <w:rPr>
                 <w:sz w:val="21"/>
               </w:rPr>
-              <w:t xml:space="preserve">94,1 %</w:t>
+              <w:t xml:space="preserve">90,9 %</w:t>
             </w:r>
           </w:p>
         </w:tc>
@@ -11374,7 +11386,7 @@
               <w:rPr>
                 <w:sz w:val="21"/>
               </w:rPr>
-              <w:t xml:space="preserve">100 %</w:t>
+              <w:t xml:space="preserve">95 %</w:t>
             </w:r>
           </w:p>
         </w:tc>
@@ -11393,7 +11405,7 @@
               <w:rPr>
                 <w:sz w:val="21"/>
               </w:rPr>
-              <w:t xml:space="preserve">100 %</w:t>
+              <w:t xml:space="preserve">95 %</w:t>
             </w:r>
           </w:p>
         </w:tc>
@@ -11412,7 +11424,7 @@
               <w:rPr>
                 <w:sz w:val="21"/>
               </w:rPr>
-              <w:t xml:space="preserve">93,8 %</w:t>
+              <w:t xml:space="preserve">90 %</w:t>
             </w:r>
           </w:p>
         </w:tc>
@@ -11420,22 +11432,22 @@
     </w:tbl>
     <w:p>
       <w:r>
-        <w:t xml:space="preserve">Avec le seuil retenu de 60/100, le système prend seize bonnes décisions sur seize : aucun profil pertinent n’est écarté (rappel de 100 %) et aucun profil hors cible n’est retenu (précision de 100 %). Abaisser le seuil à 50 ne change rien sur ce jeu, les deux seuils y sont donc indiscernables ; le relever à 70 fait apparaître un faux négatif — le profil GOLD_14, développeuse Java dont le dossier est pourtant jugé pertinent et scoré 69/100 — et fait chuter le rappel à 88,9 %.</w:t>
-      </w:r>
-    </w:p>
-    <w:p>
-      <w:r>
-        <w:t xml:space="preserve">Le seuil de 60 est cohérent avec la distribution des scores obtenus : le meilleur profil non pertinent s’arrête à 47/100, soit treize points sous le seuil, tandis que le plus faible profil pertinent est à 69/100, soit neuf points au-dessus. Sur ce jeu, les deux populations ne se chevauchent donc pas.</w:t>
-      </w:r>
-    </w:p>
-    <w:p>
-      <w:r>
-        <w:t xml:space="preserve">Ce qui précède établit le seuil de 60/100 comme paramètre opérationnel pour cette version de la plateforme, non comme un optimum démontré. Sur les seize profils du Gold Set, 60 et 50 produisent exactement les mêmes classifications : leur écart n’est donc pas observable sur ce jeu, et rien n’y établit la supériorité de 60 sur 50. Seule la remontée à 70 s’en distingue, en introduisant un faux négatif. Le seuil retenu relève d’un calibrage préliminaire : une évaluation sur un corpus plus large et représentatif, complétée par le suivi des erreurs observées en conditions réelles, sera nécessaire pour le confirmer ou l’ajuster.</w:t>
-      </w:r>
-    </w:p>
-    <w:p>
-      <w:r>
-        <w:t xml:space="preserve">Ces résultats demandent à être lus avec prudence : seize cas construits pour l’évaluation ne constituent pas une mesure de performance en conditions réelles. Le Gold Set valide un mécanisme de décision et un calibrage de seuil ; il ne remplace pas le suivi, en production, des faux positifs et des faux négatifs effectivement constatés par les recruteurs sur les candidatures réelles.</w:t>
+        <w:t xml:space="preserve">Avec le seuil retenu de 60/100, le système prend dix-neuf bonnes décisions sur vingt : aucun profil pertinent n’est écarté (rappel de 100 %). Un profil volontairement hors cible est en revanche retenu à 71/100 — GOLD_18, ingénieure DevOps dont l’outillage d’intégration continue recouvre une large part des compétences attendues par l’offre, alors que son dossier déclare aucune expérience des plateformes cloud managées —, d’où une précision de 91,7 %. Abaisser le seuil à 50 ne change rien sur ce jeu, les deux seuils y sont donc indiscernables ; le relever à 70, outre ce même faux positif, fait apparaître un faux négatif — le profil GOLD_14, développeuse Java dont le dossier est pourtant jugé pertinent et scoré 67/100 — et fait chuter le rappel à 90,9 %.</w:t>
+      </w:r>
+    </w:p>
+    <w:p>
+      <w:r>
+        <w:t xml:space="preserve">Le seuil de 60 est cohérent avec la distribution des scores obtenus, à une exception près : huit des neuf profils hors cible s’arrêtent à 47/100 ou moins, soit treize points au moins sous le seuil, tandis que le plus faible profil pertinent atteint 67/100, soit sept points au-dessus. Les deux familles sont donc nettement séparées de part et d’autre de la frontière, sauf GOLD_18, dont l’outillage recouvre celui de l’offre visée.</w:t>
+      </w:r>
+    </w:p>
+    <w:p>
+      <w:r>
+        <w:t xml:space="preserve">Ce qui précède établit le seuil de 60/100 comme paramètre opérationnel pour cette version de la plateforme, non comme un optimum démontré. Sur les vingt profils du Gold Set, 60 et 50 produisent exactement les mêmes classifications, faux positif compris : leur écart n’est donc pas observable sur ce jeu, et rien n’y établit la supériorité de 60 sur 50. Seule la remontée à 70 s’en distingue, en introduisant un faux négatif. Le faux positif de GOLD_18, lui, se retrouve aux trois seuils : il ne relève pas du réglage de la frontière, mais de la proximité sémantique entre deux métiers voisins, que seul l’arbitrage du recruteur tranche. Le seuil retenu relève d’un calibrage préliminaire : une évaluation sur un corpus plus large et représentatif, complétée par le suivi des erreurs observées en conditions réelles, sera nécessaire pour le confirmer ou l’ajuster.</w:t>
+      </w:r>
+    </w:p>
+    <w:p>
+      <w:r>
+        <w:t xml:space="preserve">Ces résultats demandent à être lus avec prudence : vingt cas construits pour l’évaluation ne constituent pas une mesure de performance en conditions réelles. Le Gold Set valide un mécanisme de décision et un calibrage de seuil ; il ne remplace pas le suivi, en production, des faux positifs et des faux négatifs effectivement constatés par les recruteurs sur les candidatures réelles.</w:t>
       </w:r>
     </w:p>
     <w:p>
@@ -11450,12 +11462,12 @@
     </w:p>
     <w:p>
       <w:r>
-        <w:t xml:space="preserve">Un moteur de présélection n’est fiable que s’il sait dire quand il ne l’est pas. Le service de scoring positionne le drapeau needsHumanReview et un motif lisible dans trois situations : texte extrait du CV trop court — moins de cinquante caractères, ce qui correspond à un scan, à une image ou à un fichier dégradé ; score en zone grise entre 55 et 65, c’est-à-dire de part et d’autre du seuil ; mode dégradé enfin, lorsque l’API de Cohere est indisponible ou renvoie une réponse inexploitable et que le score, calculé localement, est marqué avec la source SIMULATED. Le dossier signalé est présenté au recruteur comme demandant un arbitrage, au lieu d’être accepté ou rejeté automatiquement. Les deux mécanismes sont complémentaires et non contradictoires : un score de 62 franchit le seuil de décision et bascule la candidature en CV_REVIEWED, tout en tombant dans la zone grise, ce qui allume également le drapeau d’arbitrage ; inversement, un score de 57 reste sous le seuil mais, signalé en zone grise, il est lui aussi orienté vers CV_REVIEWED plutôt que vers AUTO_REJECTED, pour être tranché par un recruteur.</w:t>
-      </w:r>
-    </w:p>
-    <w:p>
-      <w:r>
-        <w:t xml:space="preserve">L’explicabilité est produite par le service SkillNormalizationService, appelé avant le modèle de langage : il harmonise les alias (k8s devient Kubernetes, postgres devient PostgreSQL) et refuse les fusions abusives — Spring Boot n’est pas Spring Cloud, Angular n’est pas AngularJS, Java n’est pas JavaScript — puis restitue les compétences validées (matchedSkills) et manquantes (missingSkills) avec un taux de recouvrement technique qui ne peut pas descendre sous 30/100. Ces éléments alimentent les badges affichés dans le détail d’une candidature (figure 4.8) et la synthèse enregistrée dans aiSummary [23].</w:t>
+        <w:t xml:space="preserve">Un moteur de présélection n’est fiable que s’il sait dire quand il ne l’est pas. Le service de scoring positionne le drapeau needsHumanReview et un motif lisible dans trois situations : texte extrait du CV trop court — moins de cinquante caractères, ce qui correspond à un scan, à une image ou à un fichier dégradé ; score en zone grise entre 55 et 65, c’est-à-dire de part et d’autre du seuil ; mode dégradé enfin, lorsque l’API de Cohere est indisponible ou renvoie une réponse inexploitable et que le score, calculé localement, est marqué avec la source SIMULATED. Le dossier signalé est présenté au recruteur comme demandant un arbitrage, au lieu d’être accepté ou rejeté automatiquement. Les deux mécanismes sont complémentaires et non contradictoires : un score de 62 franchit le seuil de décision et bascule la candidature en CV_REVIEWED, tout en tombant dans la zone grise, ce qui allume également le drapeau d’arbitrage ; inversement, un score de 57 reste sous le seuil mais, signalé en zone grise, il est lui aussi orienté vers CV_REVIEWED plutôt que vers AUTO_REJECTED, pour être tranché par un recruteur. Ce second chemin est désormais le même que le score provienne du recalcul complet du dossier ou de la transmission d’un score calculé hors platforme : les deux entrées partagent la même règle de décision et la même bande d’incertitude, définie par deux constantes uniques dans le service de scoring. Reste à en mesurer l’effet réel : sur les vingt cas du Gold Set, aucun n’est tombé dans la bande 55-65, le score le plus proche du seuil s’arrêtant à 67/100. La zone grise est donc un filet de sécurité établi par test unitaire en mode simulé, non une étape effectivement rencontrée par le jeu de référence.</w:t>
+      </w:r>
+    </w:p>
+    <w:p>
+      <w:r>
+        <w:t xml:space="preserve">L’explicabilité est produite par le service SkillNormalizationService, appelé avant le modèle de langage : il harmonise les alias (k8s devient Kubernetes, postgres devient PostgreSQL) et refuse les fusions abusives — Spring Boot n’est pas Spring Cloud, Angular n’est pas AngularJS, Java n’est pas JavaScript — puis restitue les compétences validées (matchedSkills) et manquantes (missingSkills) avec un taux de recouvrement technique qui ne peut pas descendre sous 30/100. La présence d’une compétence est en outre examinée segment par segment : une mention placée sous une négation — « aucune expérience des plateformes cloud managées » — n’est plus comptée comme acquise, ce qui évite que la liste présentée au recruteur crédite un candidat d’une compétence dont son propre CV déclare l’absence. Ces éléments alimentent les badges affichés dans le détail d’une candidature (figure 4.8) et la synthèse enregistrée dans aiSummary [23].</w:t>
       </w:r>
     </w:p>
     <w:p>
@@ -12421,7 +12433,7 @@
           <w:p>
             <w:pPr/>
             <w:r>
-              <w:t xml:space="preserve">Évaluation du matching sur un Gold Set de seize CVs annotés</w:t>
+              <w:t xml:space="preserve">Évaluation du matching sur un Gold Set de vingt CVs annotés</w:t>
             </w:r>
           </w:p>
         </w:tc>
@@ -12567,7 +12579,7 @@
     </w:p>
     <w:p>
       <w:r>
-        <w:t xml:space="preserve">Plusieurs pistes d’évolution restent ouvertes pour poursuivre ce travail. Côté fonctionnel, la plateforme pourrait accueillir un module d’analyse prédictive du taux de transformation des candidatures, une intégration plus poussée avec des plateformes d’emploi externes (LinkedIn, Indeed), ou un espace candidat plus riche pour un suivi encore plus détaillé de son parcours. Côté technique, la suite de tests automatisés — qui compte déjà 167 méthodes de test unitaires et de contrôleur (JUnit 5 / Mockito) — gagnerait à être complétée par des tests d’intégration couvrant les services et la base de données, des tests de bout en bout (par exemple Playwright ou Cypress) rejouant les parcours métier complets, et des tests front-end automatisés sur les composants Angular. Le jeu de référence de seize profils mobilisé pour calibrer le seuil de décision gagnerait à être enrichi de candidatures réelles annotées par les recruteurs, seul moyen d’obtenir une mesure de performance en conditions d’exploitation. Une chaîne d’intégration et de déploiement continus (CI/CD) ainsi qu’un déploiement sur une infrastructure cloud constitueraient des évolutions naturelles pour renforcer la fiabilité et la scalabilité de la plateforme sur le long terme.</w:t>
+        <w:t xml:space="preserve">Plusieurs pistes d’évolution restent ouvertes pour poursuivre ce travail. Côté fonctionnel, la plateforme pourrait accueillir un module d’analyse prédictive du taux de transformation des candidatures, une intégration plus poussée avec des plateformes d’emploi externes (LinkedIn, Indeed), ou un espace candidat plus riche pour un suivi encore plus détaillé de son parcours. Côté technique, la suite de tests automatisés — qui compte déjà 190 méthodes de test unitaires et de contrôleur (JUnit 5 / Mockito) — gagnerait à être complétée par des tests d’intégration couvrant les services et la base de données, des tests de bout en bout (par exemple Playwright ou Cypress) rejouant les parcours métier complets, et des tests front-end automatisés sur les composants Angular. Le jeu de référence de vingt profils mobilisé pour calibrer le seuil de décision gagnerait à être enrichi de candidatures réelles annotées par les recruteurs, seul moyen d’obtenir une mesure de performance en conditions d’exploitation. Une chaîne d’intégration et de déploiement continus (CI/CD) ainsi qu’un déploiement sur une infrastructure cloud constitueraient des évolutions naturelles pour renforcer la fiabilité et la scalabilité de la plateforme sur le long terme.</w:t>
       </w:r>
     </w:p>
     <w:p>

</xml_diff>

<commit_message>
docs(rapport): rapport et deck alignes sur l'arbitrage RH du rejet IA
Rapport beta44 (79 p., pagination et table des matieres inchangees) : 194 methodes de
test, 23 cas manuels avec la ligne d'arbitrage du rejet automatique, figures 2.4, 3.8
et 3.11 rendues a nouveau, et conclusion qui expose le score retenu dans la liste RH.
Deck de soutenance : diapositives 11, 16 et 18 et leurs notes, machine a etats remplacee.
Version precedente conservee dans finalreport/backup_beta42_avant_hitl_194_tests_2026-10-17/.
</commit_message>
<xml_diff>
--- a/Rapport-PFE/finalreport/Rapport_PFE_Haythem_Bargaoui_beta.docx
+++ b/Rapport-PFE/finalreport/Rapport_PFE_Haythem_Bargaoui_beta.docx
@@ -1913,7 +1913,7 @@
       <w:r>
         <w:t>4.4.2 Tests fonctionnels manuels</w:t>
         <w:tab/>
-        <w:t>62</w:t>
+        <w:t>63</w:t>
       </w:r>
     </w:p>
     <w:p>
@@ -1931,7 +1931,7 @@
       <w:r>
         <w:t>4.4.3 Tests des API avec Postman et Swagger</w:t>
         <w:tab/>
-        <w:t>64</w:t>
+        <w:t>65</w:t>
       </w:r>
     </w:p>
     <w:p>
@@ -1949,7 +1949,7 @@
       <w:r>
         <w:t>4.4.4 Vérification de bout en bout</w:t>
         <w:tab/>
-        <w:t>64</w:t>
+        <w:t>65</w:t>
       </w:r>
     </w:p>
     <w:p>
@@ -2021,7 +2021,7 @@
       <w:r>
         <w:t>4.5.1 Notification incomplète des managers</w:t>
         <w:tab/>
-        <w:t>67</w:t>
+        <w:t>68</w:t>
       </w:r>
     </w:p>
     <w:p>
@@ -2093,7 +2093,7 @@
       <w:r>
         <w:t>4.5.5 Solliciter le manager au bon moment du processus</w:t>
         <w:tab/>
-        <w:t>68</w:t>
+        <w:t>69</w:t>
       </w:r>
     </w:p>
     <w:p>
@@ -2165,7 +2165,7 @@
       <w:r>
         <w:t>4.5.9 Découplage entre planification d’entretien et statut du candidat</w:t>
         <w:tab/>
-        <w:t>69</w:t>
+        <w:t>70</w:t>
       </w:r>
     </w:p>
     <w:p>
@@ -2201,7 +2201,7 @@
       <w:r>
         <w:t>4.5.11 Cloisonnement des données dans le chatbot candidat</w:t>
         <w:tab/>
-        <w:t>70</w:t>
+        <w:t>71</w:t>
       </w:r>
     </w:p>
     <w:p>
@@ -2939,7 +2939,7 @@
       <w:r>
         <w:t>Tableau 4.2 : Matrice de confusion du Gold Set selon le seuil de décision</w:t>
         <w:tab/>
-        <w:t>65</w:t>
+        <w:t>66</w:t>
       </w:r>
     </w:p>
     <w:p>
@@ -2951,7 +2951,7 @@
       <w:r>
         <w:t>Tableau 4.3 : Bilan des fonctionnalités réalisées</w:t>
         <w:tab/>
-        <w:t>72</w:t>
+        <w:t>73</w:t>
       </w:r>
     </w:p>
     <w:p>
@@ -5878,7 +5878,7 @@
         </w:numPr>
       </w:pPr>
       <w:r>
-        <w:t xml:space="preserve">Notifications automatiques par e-mail à chaque étape clé du processus (confirmation de candidature, invitation à un entretien, décision finale) ; l’e-mail de décision n’est adressé au candidat qu’après le contreseing du RH, l’avis du manager notifiant le RH.</w:t>
+        <w:t xml:space="preserve">Notifications automatiques par e-mail à chaque étape clé du processus (confirmation de candidature, invitation à un entretien, décision finale) ; l’e-mail de décision finale n’est adressé au candidat qu’après le contreseing du RH, l’avis du manager notifiant le RH ; seule exception, le refus prononcé par l’agent IA, notifié dès le statut AUTO_REJECTED et qui n’est pas doublé lorsque le RH se borne à le confirmer.</w:t>
       </w:r>
     </w:p>
     <w:p>
@@ -6026,7 +6026,7 @@
         </w:sectPr>
       </w:pPr>
       <w:r>
-        <w:t xml:space="preserve">Le diagramme d’activité de la figure 2.1 (page suivante) rend explicite un point que le texte seul rendait moins visible : l’entretien téléphonique RH est un passage obligé avant toute évaluation technique (section 4.5.8), et le routage vers le ou les managers concernés (ManagerRoutingService, section 3.5.4) n’intervient qu’à ce moment-là, pas dès la validation du CV — conformément à la correction décrite en section 4.5.5. Le rejet automatique par l’IA n’y constitue pas une fin de parcours distincte : il rejoint, comme la contre-signature du RH, l’étape commune de notification et de journalisation, et reste réversible par un override RH justifié (transition pointillée de la figure 3.8).</w:t>
+        <w:t xml:space="preserve">Le diagramme d’activité de la figure 2.1 (page suivante) rend explicite un point que le texte seul rendait moins visible : l’entretien téléphonique RH est un passage obligé avant toute évaluation technique (section 4.5.8), et le routage vers le ou les managers concernés (ManagerRoutingService, section 3.5.4) n’intervient qu’à ce moment-là, pas dès la validation du CV — conformément à la correction décrite en section 4.5.5. Le rejet automatique par l’IA n’y constitue pas une fin de parcours distincte : il rejoint, comme la contre-signature du RH, l’étape commune de notification et de journalisation, et admet deux issues humaines distinctes, toutes deux portées par la transition « AUTO_REJECTED » de la figure 3.8 : le RH confirme le refus après examen, ou le conteste par un override justifié qui réintègre le dossier dans le pipeline.</w:t>
       </w:r>
       <w:r>
         <w:t xml:space="preserve"/>
@@ -6043,7 +6043,7 @@
           <w:noProof/>
         </w:rPr>
         <w:pict w14:anchorId="6BD435BB">
-          <v:shape id="Picture 3" o:spid="_x0000_i1039" type="#_x0000_t75" style="visibility:visible;mso-wrap-style:square;visibility:visible;width:769.9pt;height:455.3pt;visibility:visible">
+          <v:shape id="Picture 3" o:spid="_x0000_i1039" type="#_x0000_t75" style="visibility:visible;mso-wrap-style:square;visibility:visible;width:769.9pt;height:455.7pt;visibility:visible">
             <v:imagedata r:id="rId25" o:title=""/>
           </v:shape>
         </w:pict>
@@ -6195,7 +6195,7 @@
           <w:noProof/>
         </w:rPr>
         <w:pict>
-          <v:shape id="Img 1053" o:spid="_x0000_i1053" type="#_x0000_t75" style="visibility:visible;mso-wrap-style:square;visibility:visible;width:453.3pt;height:391.1pt;visibility:visible">
+          <v:shape id="Img 1053" o:spid="_x0000_i1053" type="#_x0000_t75" style="visibility:visible;mso-wrap-style:square;visibility:visible;width:453.3pt;height:405.6pt;visibility:visible">
             <v:imagedata r:id="rId45" o:title=""/>
             <o:lock v:ext="edit" aspectratio="f"/>
           </v:shape>
@@ -7664,7 +7664,7 @@
           <w:noProof/>
         </w:rPr>
         <w:pict w14:anchorId="51AEDC00">
-          <v:shape id="Image 9" o:spid="_x0000_i1035" type="#_x0000_t75" style="visibility:visible;mso-wrap-style:square;visibility:visible;visibility:visible;width:370.8pt;height:520.0pt">
+          <v:shape id="Image 9" o:spid="_x0000_i1035" type="#_x0000_t75" style="visibility:visible;mso-wrap-style:square;visibility:visible;visibility:visible;width:453.3pt;height:477.2pt">
             <v:imagedata r:id="rId21" o:title=""/>
           </v:shape>
         </w:pict>
@@ -7702,12 +7702,12 @@
     <w:p>
       <w:pPr/>
       <w:r>
-        <w:t xml:space="preserve">On y distingue notamment un embranchement automatique piloté par le score de l’analyse IA : le dossier passe en CV_REVIEWED lorsque le score atteint le seuil de 60/100, en AUTO_REJECTED lorsqu’il descend sous ce seuil. Les dossiers signalés par le drapeau needsHumanReview — zone grise de 55 à 65, texte de CV inexploitable ou mode dégradé — font exception à cette règle : ils rejoignent CV_REVIEWED pour un arbitrage RH et ne sont jamais rejetés automatiquement (section 4.4.6). Le statut CV_REVIEWED y garde un sens unique, le dossier est prêt pour l’examen humain, mais la plateforme ne distingue pas par un état séparé le cas où le score suffit et le cas où un arbitrage est requis : ces deux situations sont signalées par le drapeau et par le motif enregistrés, non par le statut. La décision elle-même est à deux niveaux : ACCEPTED et MANAGER_REJECTED ne sont que des avis du manager, en attente du contreseing du RH, qui seul atteint HIRED (moyennant la date de présentation des documents) ou REJECTED (moyennant un motif) ; le RH peut aussi prononcer un refus final depuis n’importe quelle étape d’évaluation, et le candidat peut se retirer (WITHDRAWN) tant que le dossier n’est pas clos. Les états véritablement terminaux (HIRED, REJECTED, AUTO_REJECTED, WITHDRAWN) n’admettent plus aucune modification depuis l’interface d’administration, tandis qu’AUTO_REJECTED reste révisable par la correction manuelle du score décrite ci-après ; la transition vers INTERVIEW_SCHEDULED, qui suit l’avis favorable, est définie dans la note sous la figure 3.8.</w:t>
-      </w:r>
-    </w:p>
-    <w:p>
-      <w:r>
-        <w:t xml:space="preserve">Ce rejet automatique n’a rien de définitif, ni d’entièrement hors de contrôle humain : à tout moment, le RH ou l’Administrateur peut corriger manuellement le score d’un candidat via un mécanisme de surcharge (manualScore), qui exige une justification et journalise systématiquement la correction dans l’audit. Le score IA joue ainsi un rôle de filtre de présélection assisté — pas celui d’une autorité décisionnelle autonome.</w:t>
+        <w:t xml:space="preserve">On y distingue notamment un embranchement automatique piloté par le score de l’analyse IA : le dossier passe en CV_REVIEWED lorsque le score atteint le seuil de 60/100, en AUTO_REJECTED lorsqu’il descend sous ce seuil. Les dossiers signalés par le drapeau needsHumanReview — zone grise de 55 à 65, texte de CV inexploitable ou mode dégradé — font exception à cette règle : ils rejoignent CV_REVIEWED pour un arbitrage RH et ne sont jamais rejetés automatiquement (section 4.4.6). Le statut CV_REVIEWED y garde un sens unique, le dossier est prêt pour l’examen humain, mais la plateforme ne distingue pas par un état séparé le cas où le score suffit et le cas où un arbitrage est requis : ces deux situations sont signalées par le drapeau et par le motif enregistrés, non par le statut. La décision elle-même est à deux niveaux : ACCEPTED et MANAGER_REJECTED ne sont que des avis du manager, en attente du contreseing du RH, qui seul atteint HIRED (moyennant la date de présentation des documents) ou REJECTED (moyennant un motif) ; le RH peut aussi prononcer un refus final depuis n’importe quelle étape d’évaluation, et le candidat peut se retirer (WITHDRAWN) tant que le dossier n’est pas clos. Les états véritablement terminaux (HIRED, REJECTED, WITHDRAWN) n’admettent plus aucune modification depuis l’interface d’administration ; AUTO_REJECTED ne fait plus partie de cette liste et reste entièrement révisable par le RH, qui confirme le refus après examen — REJECTED motivé, sans seconde notification au candidat — ou corrige le score, ce qui réintègre le dossier en CV_REVIEWED ; la transition vers INTERVIEW_SCHEDULED, qui suit l’avis favorable, est définie dans la note sous la figure 3.8.</w:t>
+      </w:r>
+    </w:p>
+    <w:p>
+      <w:r>
+        <w:t xml:space="preserve">Ce rejet automatique n’a rien de définitif, ni d’entièrement hors de contrôle humain : à tout moment, le RH ou l’Administrateur dispose de deux issues. Soit il confirme le refus après examen : le dossier passe alors en REJECTED avec un motif obligatoire, et le candidat ne reçoit pas second e-mail, la notification ayant déjà été émise par l’agent IA. Soit il corrige manuellement le score via un mécanisme de surcharge (manualScore) : la justification y est obligatoire, la correction est journalisée dans l’audit, et le dossier, réintégré en CV_REVIEWED, repart normalement dans le pipeline. Le score IA joue ainsi un rôle de filtre de présélection assisté — pas celui d’une autorité décisionnelle autonome.</w:t>
       </w:r>
     </w:p>
     <w:p>
@@ -9079,7 +9079,7 @@
     </w:p>
     <w:p>
       <w:r>
-        <w:t xml:space="preserve">Au-delà des vérifications manuelles, la couche service et une partie de la couche controller sont couvertes par une suite de tests automatisés écrite avec JUnit 5 et Mockito [16], exécutée via Maven. Elle comprend 19 classes de test pour un total de 190 méthodes, toutes exécutées sans échec : CandidateServiceTest, JobOfferServiceTest, ManagerRoutingServiceTest, ManagerScopeServiceTest, CandidateRoutingFanOutTest, DepartmentProposalServiceTest, N8nServiceTest, N8nServiceOutboxKeyTest, ScoringWeightProfileServiceTest, AiScoringServiceTest, SkillNormalizationServiceTest, CohereClientParsingTest, MatchingServiceTest, InterviewServiceTest et InterviewServiceManagerCalendarTest en tests unitaires purs (services isolés à l’aide de doublons Mockito), ainsi que CandidateControllerWorkflowTest, CandidateStatusAnonymousSecurityTest, InterviewManagerCalendarSecurityTest et InterviewMeetLinkSecurityTest en tests de contrôleur reposant sur @WebMvcTest et MockMvc, qui vérifient notamment le comportement des routes accessibles de façon anonyme et la sécurité d’accès au lien Google Meet d’un entretien. Ces tests couvrent en particulier la chaîne de résolution des managers destinataires et son blocage lorsqu’aucun niveau ne résout de destinataire, la transmission effective à chacun des managers d’un même dossier (une clé d’événement par destinataire, relance comprise), l’isolation stricte de la visibilité des dossiers à la liste gelée, le calcul du score IA et ses seuils, la neutralisation d’une compétence que le CV nie explicitement, l’orientation de tout score transmis en zone grise vers un arbitrage humain, le découplage entre planification d’entretien et statut du candidat, ainsi que les garde-fous de transition décrits au chapitre 3.</w:t>
+        <w:t xml:space="preserve">Au-delà des vérifications manuelles, la couche service et une partie de la couche controller sont couvertes par une suite de tests automatisés écrite avec JUnit 5 et Mockito [16], exécutée via Maven. Elle comprend 19 classes de test pour un total de 194 méthodes, toutes exécutées sans échec : CandidateServiceTest, JobOfferServiceTest, ManagerRoutingServiceTest, ManagerScopeServiceTest, CandidateRoutingFanOutTest, DepartmentProposalServiceTest, N8nServiceTest, N8nServiceOutboxKeyTest, ScoringWeightProfileServiceTest, AiScoringServiceTest, SkillNormalizationServiceTest, CohereClientParsingTest, MatchingServiceTest, InterviewServiceTest et InterviewServiceManagerCalendarTest en tests unitaires purs (services isolés à l’aide de doublons Mockito), ainsi que CandidateControllerWorkflowTest, CandidateStatusAnonymousSecurityTest, InterviewManagerCalendarSecurityTest et InterviewMeetLinkSecurityTest en tests de contrôleur reposant sur @WebMvcTest et MockMvc, qui vérifient notamment le comportement des routes accessibles de façon anonyme et la sécurité d’accès au lien Google Meet d’un entretien. Ces tests couvrent en particulier la chaîne de résolution des managers destinataires et son blocage lorsqu’aucun niveau ne résout de destinataire, la transmission effective à chacun des managers d’un même dossier (une clé d’événement par destinataire, relance comprise), l’isolation stricte de la visibilité des dossiers à la liste gelée, le calcul du score IA et ses seuils, la neutralisation d’une compétence que le CV nie explicitement, l’orientation de tout score transmis en zone grise vers un arbitrage humain, le découplage entre planification d’entretien et statut du candidat, l’arbitrage humain d’un dossier rejeté par l’agent IA — confirmation motivée du refus ou correction du score —, l’absence de double notification lorsque le RH se borne à confirmer un refus déjà notifié par l’IA, ainsi que les garde-fous de transition décrits au chapitre 3.</w:t>
       </w:r>
     </w:p>
     <w:p>
@@ -10590,10 +10590,45 @@
           </w:p>
         </w:tc>
       </w:tr>
+      <w:tr>
+        <w:trPr>
+          <w:cantSplit/>
+        </w:trPr>
+        <w:tc>
+          <w:tcPr>
+            <w:tcW w:w="3070" w:type="dxa"/>
+          </w:tcPr>
+          <w:p>
+            <w:r>
+              <w:t xml:space="preserve">Arbitrage RH d’un dossier rejeté automatiquement par l’agent IA</w:t>
+            </w:r>
+          </w:p>
+        </w:tc>
+        <w:tc>
+          <w:tcPr>
+            <w:tcW w:w="3069" w:type="dxa"/>
+          </w:tcPr>
+          <w:p>
+            <w:r>
+              <w:t xml:space="preserve">Confirmation du refus (REJECTED motivé, sans second e-mail au candidat) ou correction du score (retour en CV_REVIEWED) ; erreur 400 si le motif manque</w:t>
+            </w:r>
+          </w:p>
+        </w:tc>
+        <w:tc>
+          <w:tcPr>
+            <w:tcW w:w="3067" w:type="dxa"/>
+          </w:tcPr>
+          <w:p>
+            <w:r>
+              <w:t xml:space="preserve">OK, vérifié le 17/10 en local</w:t>
+            </w:r>
+          </w:p>
+        </w:tc>
+      </w:tr>
     </w:tbl>
     <w:p>
       <w:r>
-        <w:t xml:space="preserve">Ce tableau atteste de l’exécution des vingt-deux scénarios listés, tous concluants ; il ne constitue pas pour autant une garantie globale de qualité. Des cas nominaux et des cas d’erreur qui réussissent ne prouvent ni l’absence de défauts sur les chemins non exercés, ni le comportement de la plateforme sous charge. Ces tests vérifient des fonctionnalités et des règles d’accès : la pertinence du scoring IA, elle, est mesurée en section 4.4.5. Aucun test de charge n’a mesuré les exigences de temps de réponse fixées en section 2.2.3 (moins de 500 ms en lecture, moins de 2 s en écriture), qui restent à valider en préproduction.</w:t>
+        <w:t xml:space="preserve">Ce tableau atteste de l’exécution des vingt-trois scénarios listés, tous concluants ; il ne constitue pas pour autant une garantie globale de qualité. Des cas nominaux et des cas d’erreur qui réussissent ne prouvent ni l’absence de défauts sur les chemins non exercés, ni le comportement de la plateforme sous charge. Ces tests vérifient des fonctionnalités et des règles d’accès : la pertinence du scoring IA, elle, est mesurée en section 4.4.5. Aucun test de charge n’a mesuré les exigences de temps de réponse fixées en section 2.2.3 (moins de 500 ms en lecture, moins de 2 s en écriture), qui restent à valider en préproduction.</w:t>
       </w:r>
     </w:p>
     <w:p>
@@ -11472,7 +11507,7 @@
     </w:p>
     <w:p>
       <w:r>
-        <w:t xml:space="preserve">L’arbitrage du recruteur est lui aussi tracé. Le point d’entrée PATCH /api/candidates/{id}/ai-score/override, réservé aux rôles RH et Administrateur, exige un score compris entre 0 et 100 et une justification non vide. Il conserve le score original dans aiScore, enregistre la correction dans manualScore, manualScoreReason, manualScoreBy et manualScoreDate, réinitialise needsHumanReview et écrit une entrée d’audit de type SCORE_OVERRIDE mentionnant la valeur précédente, la valeur nouvelle et le motif. Le statut est ensuite recalculé à partir du score effectif, ce qui permet à un dossier bloqué en zone grise de repartir normalement dans le pipeline.</w:t>
+        <w:t xml:space="preserve">L’arbitrage du recruteur est lui aussi tracé. Le point d’entrée PATCH /api/candidates/{id}/ai-score/override, réservé aux rôles RH et Administrateur, exige un score compris entre 0 et 100 et une justification non vide. Il conserve le score original dans aiScore, enregistre la correction dans manualScore, manualScoreReason, manualScoreBy et manualScoreDate, réinitialise needsHumanReview et écrit une entrée d’audit de type SCORE_OVERRIDE mentionnant la valeur précédente, la valeur nouvelle et le motif. Le statut est ensuite recalculé à partir du score effectif : un dossier bloqué en zone grise repart ainsi normalement dans le pipeline, tandis qu’une correction ramenant le score sous le seuil le maintient en AUTO_REJECTED sans nouvelle notification au candidat, le refus ayant déjà été envoyé par l’agent IA.</w:t>
       </w:r>
     </w:p>
     <w:p>
@@ -11702,7 +11737,7 @@
     </w:p>
     <w:p>
       <w:r>
-        <w:t xml:space="preserve">Le score attribué par l’agent d’intelligence artificielle est une aide à la présélection : selon la règle configurée, il oriente automatiquement le dossier, un score insuffisant déclenchant un rejet automatique qui, à ce stade, n’est pas précédé d’un examen humain. Ce rejet reste réversible par un RH ou un Administrateur via le mécanisme de surcharge manuelle, avec justification obligatoire et trace dans le journal d’audit, tandis que les dossiers signalés needsHumanReview ne sont jamais rejetés automatiquement. Cette conception limite le risque d’erreur ou de biais algorithmique sans équivaloir à une validation humaine de chaque décision, dans l’esprit des principes du RGPD [17], [18] relatifs aux décisions individuelles automatisées.</w:t>
+        <w:t xml:space="preserve">Le score attribué par l’agent d’intelligence artificielle est une aide à la présélection : selon la règle configurée, il oriente automatiquement le dossier, un score insuffisant déclenchant un rejet automatique qui, à ce stade, n’est pas précédé d’un examen humain. Ce rejet reste réversible par un RH ou un Administrateur, qui confirme le refus après examen — avec motif obligatoire et sans seconde notification au candidat — ou le conteste par le mécanisme de surcharge manuelle, avec justification obligatoire et trace dans le journal d’audit ; les dossiers signalés needsHumanReview, eux, ne sont jamais rejetés automatiquement. Cette conception limite le risque d’erreur ou de biais algorithmique sans équivaloir à une validation humaine de chaque décision, dans l’esprit des principes du RGPD [17], [18] relatifs aux décisions individuelles automatisées.</w:t>
       </w:r>
     </w:p>
     <w:p>
@@ -12579,7 +12614,7 @@
     </w:p>
     <w:p>
       <w:r>
-        <w:t xml:space="preserve">Plusieurs pistes d’évolution restent ouvertes pour poursuivre ce travail. Côté fonctionnel, la plateforme pourrait accueillir un module d’analyse prédictive du taux de transformation des candidatures, une intégration plus poussée avec des plateformes d’emploi externes (LinkedIn, Indeed), ou un espace candidat plus riche pour un suivi encore plus détaillé de son parcours. Côté technique, la suite de tests automatisés — qui compte déjà 190 méthodes de test unitaires et de contrôleur (JUnit 5 / Mockito) — gagnerait à être complétée par des tests d’intégration couvrant les services et la base de données, des tests de bout en bout (par exemple Playwright ou Cypress) rejouant les parcours métier complets, et des tests front-end automatisés sur les composants Angular. Le jeu de référence de vingt profils mobilisé pour calibrer le seuil de décision gagnerait à être enrichi de candidatures réelles annotées par les recruteurs, seul moyen d’obtenir une mesure de performance en conditions d’exploitation. Une chaîne d’intégration et de déploiement continus (CI/CD) ainsi qu’un déploiement sur une infrastructure cloud constitueraient des évolutions naturelles pour renforcer la fiabilité et la scalabilité de la plateforme sur le long terme.</w:t>
+        <w:t xml:space="preserve">Plusieurs pistes d’évolution restent ouvertes pour poursuivre ce travail. Côté fonctionnel, la plateforme pourrait accueillir un module d’analyse prédictive du taux de transformation des candidatures, une intégration plus poussée avec des plateformes d’emploi externes (LinkedIn, Indeed), ou un espace candidat plus riche pour un suivi encore plus détaillé de son parcours. La liste des candidatures côté RH expose désormais cette valeur effective (badge du score retenu, mention « corrigé RH », relance de l’analyse depuis une ligne non scorée) ; son tri, exécuté côté client, reste à reporter côté serveur pour qu’il porte sur l’ensemble des dossiers et non sur la seule page affichée. Côté technique, la suite de tests automatisés — qui compte déjà 194 méthodes de test unitaires et de contrôleur (JUnit 5 / Mockito) — gagnerait à être complétée par des tests d’intégration couvrant les services et la base de données, des tests de bout en bout (par exemple Playwright ou Cypress) rejouant les parcours métier complets, et des tests front-end automatisés sur les composants Angular. Le jeu de référence de vingt profils mobilisé pour calibrer le seuil de décision gagnerait à être enrichi de candidatures réelles annotées par les recruteurs, seul moyen d’obtenir une mesure de performance en conditions d’exploitation. Une chaîne d’intégration et de déploiement continus (CI/CD) ainsi qu’un déploiement sur une infrastructure cloud constitueraient des évolutions naturelles pour renforcer la fiabilité et la scalabilité de la plateforme sur le long terme.</w:t>
       </w:r>
     </w:p>
     <w:p>

</xml_diff>

<commit_message>
docs(rapport): perimetre d'avis manager et compteur de tests alignes
Le tableau de cas d'utilisation et le commentaire de la figure 3.5 decrivaient
l'ancienne regle (refus admis des la lecture du CV, avis favorable des l'entretien
telephonique) ; ils annoncent desormais les seuls statuts transmis au manager.
Le total de la suite de tests passe de 194 a 196 methodes. Pagination inchangee :
79 pages, table des matieres identique, aucune page blanche ajoutee.
</commit_message>
<xml_diff>
--- a/Rapport-PFE/finalreport/Rapport_PFE_Haythem_Bargaoui_beta.docx
+++ b/Rapport-PFE/finalreport/Rapport_PFE_Haythem_Bargaoui_beta.docx
@@ -6505,7 +6505,7 @@
               <w:rPr>
                 <w:sz w:val="21"/>
               </w:rPr>
-              <w:t xml:space="preserve">Le dossier est en cours d’évaluation : un refus proposé (MANAGER_REJECTED) est admis dès la présélection du CV (statut CV_REVIEWED ou ultérieur) ; un avis favorable (ACCEPTED) exige d’être passé par l’entretien téléphonique RH (PHONE_SCREENING, TECHNICAL_TEST, INTERVIEW ou FINAL_INTERVIEW).</w:t>
+              <w:t xml:space="preserve">Le dossier a été transmis au manager pour évaluation technique : un avis favorable (ACCEPTED) comme un refus proposé (MANAGER_REJECTED) sont admis sur les seuls statuts TECHNICAL_TEST, INTERVIEW et FINAL_INTERVIEW, c’est-à-dire après le pré-filtrage téléphonique du RH.</w:t>
             </w:r>
           </w:p>
         </w:tc>
@@ -7522,7 +7522,7 @@
         </w:sectPr>
       </w:pPr>
       <w:r>
-        <w:t xml:space="preserve">Ce second diagramme illustre le garde-fou central du processus, dont la décision est désormais répartie sur deux niveaux. Le manager consulte le dossier et émet un avis : un refus proposé (MANAGER_REJECTED) est admis dès que le dossier a été validé par le RH (statut CV_REVIEWED ou ultérieur), à condition d’être motivé, tandis qu’un avis favorable (ACCEPTED) exige d’être passé par l’entretien téléphonique RH (PHONE_SCREENING) — l’entrée en évaluation technique n’étant pas un prérequis. L’avis est journalisé et notifie le RH par e-mail et dans sa liste de candidats, sans aucun envoi au candidat. Le RH ou l’Administrateur contre-signe ensuite via PATCH /api/candidates/{id}/final-validation : HIRED exige la date de présentation des documents et déclenche la convocation, REJECTED exige un motif et déclenche le refus motivé. Un compte purement manager qui appelle ce point d’entrée, écrit HIRED ou un statut du pipeline reçoit une erreur 403. L’ensemble empêche qu’une candidature soit acceptée sans ce premier filtre humain (section 4.5.8), et qu’un manager clôture seul le processus.</w:t>
+        <w:t xml:space="preserve">Ce second diagramme illustre le garde-fou central du processus, dont la décision est désormais répartie sur deux niveaux. Le manager consulte le dossier et émet un avis : un refus proposé (MANAGER_REJECTED), à condition d’être motivé, comme un avis favorable (ACCEPTED), ne sont admis que sur un dossier transmis pour évaluation technique (TECHNICAL_TEST, INTERVIEW ou FINAL_INTERVIEW) — les étapes encore côté RH, dont la présélection du CV, ne sont pas instruites par le manager. L’avis est journalisé et notifie le RH par e-mail et dans sa liste de candidats, sans aucun envoi au candidat. Le RH ou l’Administrateur contre-signe ensuite via PATCH /api/candidates/{id}/final-validation : HIRED exige la date de présentation des documents et déclenche la convocation, REJECTED exige un motif et déclenche le refus motivé. Un compte purement manager qui appelle ce point d’entrée, écrit HIRED ou un statut du pipeline reçoit une erreur 403. L’ensemble empêche qu’une candidature soit acceptée sans ce premier filtre humain (section 4.5.8), et qu’un manager clôture seul le processus.</w:t>
       </w:r>
     </w:p>
     <w:p>
@@ -9079,7 +9079,7 @@
     </w:p>
     <w:p>
       <w:r>
-        <w:t xml:space="preserve">Au-delà des vérifications manuelles, la couche service et une partie de la couche controller sont couvertes par une suite de tests automatisés écrite avec JUnit 5 et Mockito [16], exécutée via Maven. Elle comprend 19 classes de test pour un total de 194 méthodes, toutes exécutées sans échec : CandidateServiceTest, JobOfferServiceTest, ManagerRoutingServiceTest, ManagerScopeServiceTest, CandidateRoutingFanOutTest, DepartmentProposalServiceTest, N8nServiceTest, N8nServiceOutboxKeyTest, ScoringWeightProfileServiceTest, AiScoringServiceTest, SkillNormalizationServiceTest, CohereClientParsingTest, MatchingServiceTest, InterviewServiceTest et InterviewServiceManagerCalendarTest en tests unitaires purs (services isolés à l’aide de doublons Mockito), ainsi que CandidateControllerWorkflowTest, CandidateStatusAnonymousSecurityTest, InterviewManagerCalendarSecurityTest et InterviewMeetLinkSecurityTest en tests de contrôleur reposant sur @WebMvcTest et MockMvc, qui vérifient notamment le comportement des routes accessibles de façon anonyme et la sécurité d’accès au lien Google Meet d’un entretien. Ces tests couvrent en particulier la chaîne de résolution des managers destinataires et son blocage lorsqu’aucun niveau ne résout de destinataire, la transmission effective à chacun des managers d’un même dossier (une clé d’événement par destinataire, relance comprise), l’isolation stricte de la visibilité des dossiers à la liste gelée, le calcul du score IA et ses seuils, la neutralisation d’une compétence que le CV nie explicitement, l’orientation de tout score transmis en zone grise vers un arbitrage humain, le découplage entre planification d’entretien et statut du candidat, l’arbitrage humain d’un dossier rejeté par l’agent IA — confirmation motivée du refus ou correction du score —, l’absence de double notification lorsque le RH se borne à confirmer un refus déjà notifié par l’IA, ainsi que les garde-fous de transition décrits au chapitre 3.</w:t>
+        <w:t xml:space="preserve">Au-delà des vérifications manuelles, la couche service et une partie de la couche controller sont couvertes par une suite de tests automatisés écrite avec JUnit 5 et Mockito [16], exécutée via Maven. Elle comprend 19 classes de test pour un total de 196 méthodes, toutes exécutées sans échec : CandidateServiceTest, JobOfferServiceTest, ManagerRoutingServiceTest, ManagerScopeServiceTest, CandidateRoutingFanOutTest, DepartmentProposalServiceTest, N8nServiceTest, N8nServiceOutboxKeyTest, ScoringWeightProfileServiceTest, AiScoringServiceTest, SkillNormalizationServiceTest, CohereClientParsingTest, MatchingServiceTest, InterviewServiceTest et InterviewServiceManagerCalendarTest en tests unitaires purs (services isolés à l’aide de doublons Mockito), ainsi que CandidateControllerWorkflowTest, CandidateStatusAnonymousSecurityTest, InterviewManagerCalendarSecurityTest et InterviewMeetLinkSecurityTest en tests de contrôleur reposant sur @WebMvcTest et MockMvc, qui vérifient notamment le comportement des routes accessibles de façon anonyme et la sécurité d’accès au lien Google Meet d’un entretien. Ces tests couvrent en particulier la chaîne de résolution des managers destinataires et son blocage lorsqu’aucun niveau ne résout de destinataire, la transmission effective à chacun des managers d’un même dossier (une clé d’événement par destinataire, relance comprise), l’isolation stricte de la visibilité des dossiers à la liste gelée, le calcul du score IA et ses seuils, la neutralisation d’une compétence que le CV nie explicitement, l’orientation de tout score transmis en zone grise vers un arbitrage humain, le découplage entre planification d’entretien et statut du candidat, l’arbitrage humain d’un dossier rejeté par l’agent IA — confirmation motivée du refus ou correction du score —, l’absence de double notification lorsque le RH se borne à confirmer un refus déjà notifié par l’IA, ainsi que les garde-fous de transition décrits au chapitre 3.</w:t>
       </w:r>
     </w:p>
     <w:p>
@@ -12614,7 +12614,7 @@
     </w:p>
     <w:p>
       <w:r>
-        <w:t xml:space="preserve">Plusieurs pistes d’évolution restent ouvertes pour poursuivre ce travail. Côté fonctionnel, la plateforme pourrait accueillir un module d’analyse prédictive du taux de transformation des candidatures, une intégration plus poussée avec des plateformes d’emploi externes (LinkedIn, Indeed), ou un espace candidat plus riche pour un suivi encore plus détaillé de son parcours. La liste des candidatures côté RH expose désormais cette valeur effective (badge du score retenu, mention « corrigé RH », relance de l’analyse depuis une ligne non scorée) ; son tri, exécuté côté client, reste à reporter côté serveur pour qu’il porte sur l’ensemble des dossiers et non sur la seule page affichée. Côté technique, la suite de tests automatisés — qui compte déjà 194 méthodes de test unitaires et de contrôleur (JUnit 5 / Mockito) — gagnerait à être complétée par des tests d’intégration couvrant les services et la base de données, des tests de bout en bout (par exemple Playwright ou Cypress) rejouant les parcours métier complets, et des tests front-end automatisés sur les composants Angular. Le jeu de référence de vingt profils mobilisé pour calibrer le seuil de décision gagnerait à être enrichi de candidatures réelles annotées par les recruteurs, seul moyen d’obtenir une mesure de performance en conditions d’exploitation. Une chaîne d’intégration et de déploiement continus (CI/CD) ainsi qu’un déploiement sur une infrastructure cloud constitueraient des évolutions naturelles pour renforcer la fiabilité et la scalabilité de la plateforme sur le long terme.</w:t>
+        <w:t xml:space="preserve">Plusieurs pistes d’évolution restent ouvertes pour poursuivre ce travail. Côté fonctionnel, la plateforme pourrait accueillir un module d’analyse prédictive du taux de transformation des candidatures, une intégration plus poussée avec des plateformes d’emploi externes (LinkedIn, Indeed), ou un espace candidat plus riche pour un suivi encore plus détaillé de son parcours. La liste des candidatures côté RH expose désormais cette valeur effective (badge du score retenu, mention « corrigé RH », relance de l’analyse depuis une ligne non scorée) ; son tri, exécuté côté client, reste à reporter côté serveur pour qu’il porte sur l’ensemble des dossiers et non sur la seule page affichée. Côté technique, la suite de tests automatisés — qui compte déjà 196 méthodes de test unitaires et de contrôleur (JUnit 5 / Mockito) — gagnerait à être complétée par des tests d’intégration couvrant les services et la base de données, des tests de bout en bout (par exemple Playwright ou Cypress) rejouant les parcours métier complets, et des tests front-end automatisés sur les composants Angular. Le jeu de référence de vingt profils mobilisé pour calibrer le seuil de décision gagnerait à être enrichi de candidatures réelles annotées par les recruteurs, seul moyen d’obtenir une mesure de performance en conditions d’exploitation. Une chaîne d’intégration et de déploiement continus (CI/CD) ainsi qu’un déploiement sur une infrastructure cloud constitueraient des évolutions naturelles pour renforcer la fiabilité et la scalabilité de la plateforme sur le long terme.</w:t>
       </w:r>
     </w:p>
     <w:p>

</xml_diff>